<commit_message>
fix: center kan rumus matematis, font Times New Roman untuk seluruh dokumen, perbaiki judul 1.5.2, rapihkan sitasi daftar pustaka
</commit_message>
<xml_diff>
--- a/docs/PROPOSAL_PROTOTIPE_FELIX_ENRIQUE_2305110019.docx
+++ b/docs/PROPOSAL_PROTOTIPE_FELIX_ENRIQUE_2305110019.docx
@@ -338,7 +338,7 @@
       </w:r>
       <w:r>
         <w:rPr>
-          <w:rFonts w:ascii="Times New Roman" w:hAnsi="Times New Roman"/>
+          <w:rFonts w:ascii="Times New Roman" w:hAnsi="Times New Roman" w:cs="Times New Roman"/>
           <w:b/>
           <w:sz w:val="32"/>
         </w:rPr>
@@ -346,7 +346,7 @@
       </w:r>
       <w:r>
         <w:rPr>
-          <w:rFonts w:ascii="Times New Roman" w:hAnsi="Times New Roman"/>
+          <w:rFonts w:ascii="Times New Roman" w:hAnsi="Times New Roman" w:cs="Times New Roman"/>
           <w:b/>
           <w:sz w:val="32"/>
         </w:rPr>
@@ -379,255 +379,255 @@
       </w:pPr>
       <w:r>
         <w:rPr>
+          <w:rFonts w:ascii="Times New Roman" w:hAnsi="Times New Roman" w:cs="Times New Roman"/>
+          <w:b/>
+          <w:color w:val="000000"/>
+          <w:sz w:val="28"/>
+        </w:rPr>
+        <w:t xml:space="preserve">Proposal </w:t>
+      </w:r>
+      <w:proofErr w:type="spellStart"/>
+      <w:r>
+        <w:rPr>
+          <w:rFonts w:ascii="Times New Roman" w:hAnsi="Times New Roman" w:cs="Times New Roman"/>
+          <w:b/>
+          <w:color w:val="000000"/>
+          <w:sz w:val="28"/>
+        </w:rPr>
+        <w:t>Prototipe</w:t>
+      </w:r>
+      <w:proofErr w:type="spellEnd"/>
+    </w:p>
+    <w:p>
+      <w:pPr>
+        <w:spacing w:line="276" w:lineRule="auto"/>
+        <w:jc w:val="center"/>
+        <w:rPr>
           <w:rFonts w:ascii="Times New Roman" w:hAnsi="Times New Roman"/>
           <w:b/>
           <w:color w:val="000000"/>
           <w:sz w:val="28"/>
         </w:rPr>
-        <w:t xml:space="preserve">Proposal </w:t>
-      </w:r>
-      <w:proofErr w:type="spellStart"/>
-      <w:r>
-        <w:rPr>
-          <w:rFonts w:ascii="Times New Roman" w:hAnsi="Times New Roman"/>
-          <w:b/>
-          <w:color w:val="000000"/>
-          <w:sz w:val="28"/>
-        </w:rPr>
-        <w:t>Prototipe</w:t>
-      </w:r>
-      <w:proofErr w:type="spellEnd"/>
+      </w:pPr>
     </w:p>
     <w:p>
       <w:pPr>
-        <w:spacing w:line="276" w:lineRule="auto"/>
+        <w:spacing w:before="120" w:after="720" w:line="360" w:lineRule="auto"/>
         <w:jc w:val="center"/>
         <w:rPr>
           <w:rFonts w:ascii="Times New Roman" w:hAnsi="Times New Roman"/>
-          <w:b/>
           <w:color w:val="000000"/>
-          <w:sz w:val="28"/>
-        </w:rPr>
-      </w:pPr>
+        </w:rPr>
+      </w:pPr>
+      <w:proofErr w:type="spellStart"/>
+      <w:r>
+        <w:rPr>
+          <w:rFonts w:ascii="Times New Roman" w:hAnsi="Times New Roman" w:cs="Times New Roman"/>
+          <w:color w:val="000000"/>
+          <w:sz w:val="24"/>
+        </w:rPr>
+        <w:t>diajukan</w:t>
+      </w:r>
+      <w:proofErr w:type="spellEnd"/>
+      <w:r>
+        <w:rPr>
+          <w:rFonts w:ascii="Times New Roman" w:hAnsi="Times New Roman" w:cs="Times New Roman"/>
+          <w:color w:val="000000"/>
+          <w:sz w:val="24"/>
+        </w:rPr>
+        <w:t xml:space="preserve"> </w:t>
+      </w:r>
+      <w:proofErr w:type="spellStart"/>
+      <w:r>
+        <w:rPr>
+          <w:rFonts w:ascii="Times New Roman" w:hAnsi="Times New Roman" w:cs="Times New Roman"/>
+          <w:color w:val="000000"/>
+          <w:sz w:val="24"/>
+        </w:rPr>
+        <w:t>sebagai</w:t>
+      </w:r>
+      <w:proofErr w:type="spellEnd"/>
+      <w:r>
+        <w:rPr>
+          <w:rFonts w:ascii="Times New Roman" w:hAnsi="Times New Roman" w:cs="Times New Roman"/>
+          <w:color w:val="000000"/>
+          <w:sz w:val="24"/>
+        </w:rPr>
+        <w:t xml:space="preserve"> salah </w:t>
+      </w:r>
+      <w:proofErr w:type="spellStart"/>
+      <w:r>
+        <w:rPr>
+          <w:rFonts w:ascii="Times New Roman" w:hAnsi="Times New Roman" w:cs="Times New Roman"/>
+          <w:color w:val="000000"/>
+          <w:sz w:val="24"/>
+        </w:rPr>
+        <w:t>satu</w:t>
+      </w:r>
+      <w:proofErr w:type="spellEnd"/>
+      <w:r>
+        <w:rPr>
+          <w:rFonts w:ascii="Times New Roman" w:hAnsi="Times New Roman" w:cs="Times New Roman"/>
+          <w:color w:val="000000"/>
+          <w:sz w:val="24"/>
+        </w:rPr>
+        <w:t xml:space="preserve"> </w:t>
+      </w:r>
+      <w:proofErr w:type="spellStart"/>
+      <w:r>
+        <w:rPr>
+          <w:rFonts w:ascii="Times New Roman" w:hAnsi="Times New Roman" w:cs="Times New Roman"/>
+          <w:color w:val="000000"/>
+          <w:sz w:val="24"/>
+        </w:rPr>
+        <w:t>syarat</w:t>
+      </w:r>
+      <w:proofErr w:type="spellEnd"/>
+      <w:r>
+        <w:rPr>
+          <w:rFonts w:ascii="Times New Roman" w:hAnsi="Times New Roman" w:cs="Times New Roman"/>
+          <w:color w:val="000000"/>
+          <w:sz w:val="24"/>
+        </w:rPr>
+        <w:t xml:space="preserve"> </w:t>
+      </w:r>
+      <w:proofErr w:type="spellStart"/>
+      <w:r>
+        <w:rPr>
+          <w:rFonts w:ascii="Times New Roman" w:hAnsi="Times New Roman" w:cs="Times New Roman"/>
+          <w:color w:val="000000"/>
+          <w:sz w:val="24"/>
+        </w:rPr>
+        <w:t>untuk</w:t>
+      </w:r>
+      <w:proofErr w:type="spellEnd"/>
+      <w:r>
+        <w:rPr>
+          <w:rFonts w:ascii="Times New Roman" w:hAnsi="Times New Roman" w:cs="Times New Roman"/>
+          <w:color w:val="000000"/>
+          <w:sz w:val="24"/>
+        </w:rPr>
+        <w:t xml:space="preserve"> </w:t>
+      </w:r>
+      <w:proofErr w:type="spellStart"/>
+      <w:r>
+        <w:rPr>
+          <w:rFonts w:ascii="Times New Roman" w:hAnsi="Times New Roman" w:cs="Times New Roman"/>
+          <w:color w:val="000000"/>
+          <w:sz w:val="24"/>
+        </w:rPr>
+        <w:t>memperoleh</w:t>
+      </w:r>
+      <w:proofErr w:type="spellEnd"/>
+      <w:r>
+        <w:rPr>
+          <w:rFonts w:ascii="Times New Roman" w:hAnsi="Times New Roman" w:cs="Times New Roman"/>
+          <w:color w:val="000000"/>
+          <w:sz w:val="24"/>
+        </w:rPr>
+        <w:t xml:space="preserve"> </w:t>
+      </w:r>
+      <w:proofErr w:type="spellStart"/>
+      <w:r>
+        <w:rPr>
+          <w:rFonts w:ascii="Times New Roman" w:hAnsi="Times New Roman" w:cs="Times New Roman"/>
+          <w:color w:val="000000"/>
+          <w:sz w:val="24"/>
+        </w:rPr>
+        <w:t>gelar</w:t>
+      </w:r>
+      <w:proofErr w:type="spellEnd"/>
+      <w:r>
+        <w:rPr>
+          <w:rFonts w:ascii="Times New Roman" w:hAnsi="Times New Roman" w:cs="Times New Roman"/>
+          <w:color w:val="000000"/>
+          <w:sz w:val="24"/>
+        </w:rPr>
+        <w:t xml:space="preserve"> </w:t>
+      </w:r>
+      <w:r>
+        <w:rPr>
+          <w:rFonts w:ascii="Times New Roman" w:hAnsi="Times New Roman" w:cs="Times New Roman"/>
+          <w:color w:val="000000"/>
+          <w:sz w:val="24"/>
+        </w:rPr>
+        <w:br/>
+      </w:r>
+      <w:r>
+        <w:rPr>
+          <w:rFonts w:ascii="Times New Roman" w:hAnsi="Times New Roman" w:cs="Times New Roman"/>
+          <w:color w:val="000000"/>
+          <w:sz w:val="24"/>
+        </w:rPr>
+        <w:t>Sarjana Teknik</w:t>
+      </w:r>
     </w:p>
     <w:p>
       <w:pPr>
-        <w:spacing w:before="120" w:after="720" w:line="360" w:lineRule="auto"/>
+        <w:spacing w:before="280" w:after="400" w:line="360" w:lineRule="auto"/>
+        <w:jc w:val="center"/>
+        <w:rPr>
+          <w:rFonts w:ascii="Times New Roman" w:hAnsi="Times New Roman"/>
+        </w:rPr>
+      </w:pPr>
+      <w:r>
+        <w:rPr>
+          <w:rFonts w:ascii="Times New Roman" w:hAnsi="Times New Roman" w:cs="Times New Roman"/>
+          <w:sz w:val="24"/>
+        </w:rPr>
+        <w:t>oleh</w:t>
+      </w:r>
+      <w:r>
+        <w:rPr>
+          <w:rFonts w:ascii="Times New Roman" w:hAnsi="Times New Roman" w:cs="Times New Roman"/>
+          <w:sz w:val="24"/>
+        </w:rPr>
+        <w:br/>
+      </w:r>
+      <w:r>
+        <w:rPr>
+          <w:rFonts w:ascii="Times New Roman" w:hAnsi="Times New Roman" w:cs="Times New Roman"/>
+          <w:sz w:val="24"/>
+        </w:rPr>
+        <w:br/>
+        <w:t xml:space="preserve">Felix Enrique </w:t>
+      </w:r>
+      <w:r>
+        <w:rPr>
+          <w:rFonts w:ascii="Times New Roman" w:hAnsi="Times New Roman" w:cs="Times New Roman"/>
+          <w:sz w:val="24"/>
+        </w:rPr>
+        <w:br/>
+        <w:t>NIM. 2305110019</w:t>
+      </w:r>
+    </w:p>
+    <w:p>
+      <w:pPr>
+        <w:spacing w:before="280" w:after="400"/>
+        <w:jc w:val="center"/>
+        <w:rPr>
+          <w:rFonts w:ascii="Times New Roman" w:hAnsi="Times New Roman"/>
+        </w:rPr>
+      </w:pPr>
+    </w:p>
+    <w:p>
+      <w:pPr>
+        <w:spacing w:before="280" w:after="400"/>
         <w:jc w:val="center"/>
         <w:rPr>
           <w:rFonts w:ascii="Times New Roman" w:hAnsi="Times New Roman"/>
           <w:color w:val="000000"/>
         </w:rPr>
       </w:pPr>
-      <w:proofErr w:type="spellStart"/>
-      <w:r>
-        <w:rPr>
-          <w:rFonts w:ascii="Times New Roman" w:hAnsi="Times New Roman"/>
-          <w:color w:val="000000"/>
-          <w:sz w:val="24"/>
-        </w:rPr>
-        <w:t>diajukan</w:t>
-      </w:r>
-      <w:proofErr w:type="spellEnd"/>
-      <w:r>
-        <w:rPr>
-          <w:rFonts w:ascii="Times New Roman" w:hAnsi="Times New Roman"/>
-          <w:color w:val="000000"/>
-          <w:sz w:val="24"/>
-        </w:rPr>
-        <w:t xml:space="preserve"> </w:t>
-      </w:r>
-      <w:proofErr w:type="spellStart"/>
-      <w:r>
-        <w:rPr>
-          <w:rFonts w:ascii="Times New Roman" w:hAnsi="Times New Roman"/>
-          <w:color w:val="000000"/>
-          <w:sz w:val="24"/>
-        </w:rPr>
-        <w:t>sebagai</w:t>
-      </w:r>
-      <w:proofErr w:type="spellEnd"/>
-      <w:r>
-        <w:rPr>
-          <w:rFonts w:ascii="Times New Roman" w:hAnsi="Times New Roman"/>
-          <w:color w:val="000000"/>
-          <w:sz w:val="24"/>
-        </w:rPr>
-        <w:t xml:space="preserve"> salah </w:t>
-      </w:r>
-      <w:proofErr w:type="spellStart"/>
-      <w:r>
-        <w:rPr>
-          <w:rFonts w:ascii="Times New Roman" w:hAnsi="Times New Roman"/>
-          <w:color w:val="000000"/>
-          <w:sz w:val="24"/>
-        </w:rPr>
-        <w:t>satu</w:t>
-      </w:r>
-      <w:proofErr w:type="spellEnd"/>
-      <w:r>
-        <w:rPr>
-          <w:rFonts w:ascii="Times New Roman" w:hAnsi="Times New Roman"/>
-          <w:color w:val="000000"/>
-          <w:sz w:val="24"/>
-        </w:rPr>
-        <w:t xml:space="preserve"> </w:t>
-      </w:r>
-      <w:proofErr w:type="spellStart"/>
-      <w:r>
-        <w:rPr>
-          <w:rFonts w:ascii="Times New Roman" w:hAnsi="Times New Roman"/>
-          <w:color w:val="000000"/>
-          <w:sz w:val="24"/>
-        </w:rPr>
-        <w:t>syarat</w:t>
-      </w:r>
-      <w:proofErr w:type="spellEnd"/>
-      <w:r>
-        <w:rPr>
-          <w:rFonts w:ascii="Times New Roman" w:hAnsi="Times New Roman"/>
-          <w:color w:val="000000"/>
-          <w:sz w:val="24"/>
-        </w:rPr>
-        <w:t xml:space="preserve"> </w:t>
-      </w:r>
-      <w:proofErr w:type="spellStart"/>
-      <w:r>
-        <w:rPr>
-          <w:rFonts w:ascii="Times New Roman" w:hAnsi="Times New Roman"/>
-          <w:color w:val="000000"/>
-          <w:sz w:val="24"/>
-        </w:rPr>
-        <w:t>untuk</w:t>
-      </w:r>
-      <w:proofErr w:type="spellEnd"/>
-      <w:r>
-        <w:rPr>
-          <w:rFonts w:ascii="Times New Roman" w:hAnsi="Times New Roman"/>
-          <w:color w:val="000000"/>
-          <w:sz w:val="24"/>
-        </w:rPr>
-        <w:t xml:space="preserve"> </w:t>
-      </w:r>
-      <w:proofErr w:type="spellStart"/>
-      <w:r>
-        <w:rPr>
-          <w:rFonts w:ascii="Times New Roman" w:hAnsi="Times New Roman"/>
-          <w:color w:val="000000"/>
-          <w:sz w:val="24"/>
-        </w:rPr>
-        <w:t>memperoleh</w:t>
-      </w:r>
-      <w:proofErr w:type="spellEnd"/>
-      <w:r>
-        <w:rPr>
-          <w:rFonts w:ascii="Times New Roman" w:hAnsi="Times New Roman"/>
-          <w:color w:val="000000"/>
-          <w:sz w:val="24"/>
-        </w:rPr>
-        <w:t xml:space="preserve"> </w:t>
-      </w:r>
-      <w:proofErr w:type="spellStart"/>
-      <w:r>
-        <w:rPr>
-          <w:rFonts w:ascii="Times New Roman" w:hAnsi="Times New Roman"/>
-          <w:color w:val="000000"/>
-          <w:sz w:val="24"/>
-        </w:rPr>
-        <w:t>gelar</w:t>
-      </w:r>
-      <w:proofErr w:type="spellEnd"/>
-      <w:r>
-        <w:rPr>
-          <w:rFonts w:ascii="Times New Roman" w:hAnsi="Times New Roman"/>
-          <w:color w:val="000000"/>
-          <w:sz w:val="24"/>
-        </w:rPr>
-        <w:t xml:space="preserve"> </w:t>
-      </w:r>
-      <w:r>
-        <w:rPr>
-          <w:rFonts w:ascii="Times New Roman" w:hAnsi="Times New Roman"/>
-          <w:color w:val="000000"/>
-          <w:sz w:val="24"/>
-        </w:rPr>
-        <w:br/>
-      </w:r>
-      <w:r>
-        <w:rPr>
-          <w:rFonts w:ascii="Times New Roman" w:hAnsi="Times New Roman"/>
-          <w:color w:val="000000"/>
-          <w:sz w:val="24"/>
-        </w:rPr>
-        <w:t>Sarjana Teknik</w:t>
-      </w:r>
     </w:p>
     <w:p>
       <w:pPr>
-        <w:spacing w:before="280" w:after="400" w:line="360" w:lineRule="auto"/>
-        <w:jc w:val="center"/>
-        <w:rPr>
-          <w:rFonts w:ascii="Times New Roman" w:hAnsi="Times New Roman"/>
-        </w:rPr>
-      </w:pPr>
-      <w:r>
-        <w:rPr>
-          <w:rFonts w:ascii="Times New Roman" w:hAnsi="Times New Roman"/>
-          <w:sz w:val="24"/>
-        </w:rPr>
-        <w:t>oleh</w:t>
-      </w:r>
-      <w:r>
-        <w:rPr>
-          <w:rFonts w:ascii="Times New Roman" w:hAnsi="Times New Roman"/>
-          <w:sz w:val="24"/>
-        </w:rPr>
-        <w:br/>
-      </w:r>
-      <w:r>
-        <w:rPr>
-          <w:rFonts w:ascii="Times New Roman" w:hAnsi="Times New Roman"/>
-          <w:sz w:val="24"/>
-        </w:rPr>
-        <w:br/>
-        <w:t xml:space="preserve">Felix Enrique </w:t>
-      </w:r>
-      <w:r>
-        <w:rPr>
-          <w:rFonts w:ascii="Times New Roman" w:hAnsi="Times New Roman"/>
-          <w:sz w:val="24"/>
-        </w:rPr>
-        <w:br/>
-        <w:t>NIM. 2305110019</w:t>
-      </w:r>
-    </w:p>
-    <w:p>
-      <w:pPr>
-        <w:spacing w:before="280" w:after="400"/>
-        <w:jc w:val="center"/>
-        <w:rPr>
-          <w:rFonts w:ascii="Times New Roman" w:hAnsi="Times New Roman"/>
-        </w:rPr>
-      </w:pPr>
-    </w:p>
-    <w:p>
-      <w:pPr>
-        <w:spacing w:before="280" w:after="400"/>
-        <w:jc w:val="center"/>
-        <w:rPr>
-          <w:rFonts w:ascii="Times New Roman" w:hAnsi="Times New Roman"/>
-          <w:color w:val="000000"/>
-        </w:rPr>
-      </w:pPr>
-    </w:p>
-    <w:p>
-      <w:pPr>
         <w:spacing w:before="400" w:after="0" w:line="360" w:lineRule="auto"/>
         <w:jc w:val="center"/>
       </w:pPr>
       <w:r>
         <w:rPr>
-          <w:rFonts w:ascii="Times New Roman" w:hAnsi="Times New Roman"/>
+          <w:rFonts w:ascii="Times New Roman" w:hAnsi="Times New Roman" w:cs="Times New Roman"/>
           <w:b/>
           <w:sz w:val="24"/>
         </w:rPr>
@@ -635,7 +635,7 @@
       </w:r>
       <w:r>
         <w:rPr>
-          <w:rFonts w:ascii="Times New Roman" w:hAnsi="Times New Roman"/>
+          <w:rFonts w:ascii="Times New Roman" w:hAnsi="Times New Roman" w:cs="Times New Roman"/>
           <w:b/>
           <w:sz w:val="24"/>
         </w:rPr>
@@ -644,7 +644,7 @@
       </w:r>
       <w:r>
         <w:rPr>
-          <w:rFonts w:ascii="Times New Roman" w:hAnsi="Times New Roman"/>
+          <w:rFonts w:ascii="Times New Roman" w:hAnsi="Times New Roman" w:cs="Times New Roman"/>
           <w:b/>
           <w:sz w:val="24"/>
         </w:rPr>
@@ -653,7 +653,7 @@
       </w:r>
       <w:r>
         <w:rPr>
-          <w:rFonts w:ascii="Times New Roman" w:hAnsi="Times New Roman"/>
+          <w:rFonts w:ascii="Times New Roman" w:hAnsi="Times New Roman" w:cs="Times New Roman"/>
           <w:b/>
           <w:sz w:val="24"/>
         </w:rPr>
@@ -681,7 +681,7 @@
       </w:pPr>
       <w:r>
         <w:rPr>
-          <w:rFonts w:ascii="Times New Roman" w:hAnsi="Times New Roman"/>
+          <w:rFonts w:ascii="Times New Roman" w:hAnsi="Times New Roman" w:cs="Times New Roman"/>
           <w:b/>
           <w:color w:val="000000"/>
           <w:sz w:val="28"/>
@@ -842,6 +842,9 @@
           </w:tcPr>
           <w:p>
             <w:r>
+              <w:rPr>
+                <w:rFonts w:ascii="Times New Roman" w:hAnsi="Times New Roman" w:cs="Times New Roman"/>
+              </w:rPr>
               <w:t>Felix Enrique</w:t>
             </w:r>
           </w:p>
@@ -897,6 +900,9 @@
           </w:tcPr>
           <w:p>
             <w:r>
+              <w:rPr>
+                <w:rFonts w:ascii="Times New Roman" w:hAnsi="Times New Roman" w:cs="Times New Roman"/>
+              </w:rPr>
               <w:t>2305110019</w:t>
             </w:r>
           </w:p>
@@ -1231,6 +1237,7 @@
     <w:p>
       <w:r>
         <w:rPr>
+          <w:rFonts w:ascii="Times New Roman" w:hAnsi="Times New Roman" w:cs="Times New Roman"/>
           <w:color w:val="000000"/>
         </w:rPr>
         <w:br w:type="page"/>
@@ -1269,10 +1276,16 @@
         </w:tabs>
       </w:pPr>
       <w:r>
+        <w:rPr>
+          <w:rFonts w:ascii="Times New Roman" w:hAnsi="Times New Roman" w:cs="Times New Roman"/>
+        </w:rPr>
         <w:t>HALAMAN JUDUL</w:t>
         <w:tab/>
       </w:r>
       <w:r>
+        <w:rPr>
+          <w:rFonts w:ascii="Times New Roman" w:hAnsi="Times New Roman" w:cs="Times New Roman"/>
+        </w:rPr>
         <w:t>i</w:t>
       </w:r>
     </w:p>
@@ -1286,10 +1299,16 @@
         </w:tabs>
       </w:pPr>
       <w:r>
+        <w:rPr>
+          <w:rFonts w:ascii="Times New Roman" w:hAnsi="Times New Roman" w:cs="Times New Roman"/>
+        </w:rPr>
         <w:t>PERSETUJUAN PEMBIMBING</w:t>
         <w:tab/>
       </w:r>
       <w:r>
+        <w:rPr>
+          <w:rFonts w:ascii="Times New Roman" w:hAnsi="Times New Roman" w:cs="Times New Roman"/>
+        </w:rPr>
         <w:t>ii</w:t>
       </w:r>
     </w:p>
@@ -1303,10 +1322,16 @@
         </w:tabs>
       </w:pPr>
       <w:r>
+        <w:rPr>
+          <w:rFonts w:ascii="Times New Roman" w:hAnsi="Times New Roman" w:cs="Times New Roman"/>
+        </w:rPr>
         <w:t>DAFTAR ISI</w:t>
         <w:tab/>
       </w:r>
       <w:r>
+        <w:rPr>
+          <w:rFonts w:ascii="Times New Roman" w:hAnsi="Times New Roman" w:cs="Times New Roman"/>
+        </w:rPr>
         <w:t>iii</w:t>
       </w:r>
     </w:p>
@@ -1320,10 +1345,16 @@
         </w:tabs>
       </w:pPr>
       <w:r>
+        <w:rPr>
+          <w:rFonts w:ascii="Times New Roman" w:hAnsi="Times New Roman" w:cs="Times New Roman"/>
+        </w:rPr>
         <w:t>DAFTAR TABEL</w:t>
         <w:tab/>
       </w:r>
       <w:r>
+        <w:rPr>
+          <w:rFonts w:ascii="Times New Roman" w:hAnsi="Times New Roman" w:cs="Times New Roman"/>
+        </w:rPr>
         <w:t>v</w:t>
       </w:r>
     </w:p>
@@ -1337,10 +1368,16 @@
         </w:tabs>
       </w:pPr>
       <w:r>
+        <w:rPr>
+          <w:rFonts w:ascii="Times New Roman" w:hAnsi="Times New Roman" w:cs="Times New Roman"/>
+        </w:rPr>
         <w:t>DAFTAR GAMBAR</w:t>
         <w:tab/>
       </w:r>
       <w:r>
+        <w:rPr>
+          <w:rFonts w:ascii="Times New Roman" w:hAnsi="Times New Roman" w:cs="Times New Roman"/>
+        </w:rPr>
         <w:t>vi</w:t>
       </w:r>
     </w:p>
@@ -1354,10 +1391,16 @@
         </w:tabs>
       </w:pPr>
       <w:r>
+        <w:rPr>
+          <w:rFonts w:ascii="Times New Roman" w:hAnsi="Times New Roman" w:cs="Times New Roman"/>
+        </w:rPr>
         <w:t>DAFTAR ISTILAH DAN SINGKATAN</w:t>
         <w:tab/>
       </w:r>
       <w:r>
+        <w:rPr>
+          <w:rFonts w:ascii="Times New Roman" w:hAnsi="Times New Roman" w:cs="Times New Roman"/>
+        </w:rPr>
         <w:t>vii</w:t>
       </w:r>
     </w:p>
@@ -1371,10 +1414,16 @@
         </w:tabs>
       </w:pPr>
       <w:r>
+        <w:rPr>
+          <w:rFonts w:ascii="Times New Roman" w:hAnsi="Times New Roman" w:cs="Times New Roman"/>
+        </w:rPr>
         <w:t>BAB I  PENDAHULUAN</w:t>
         <w:tab/>
       </w:r>
       <w:r>
+        <w:rPr>
+          <w:rFonts w:ascii="Times New Roman" w:hAnsi="Times New Roman" w:cs="Times New Roman"/>
+        </w:rPr>
         <w:t>1</w:t>
       </w:r>
     </w:p>
@@ -1389,10 +1438,16 @@
         </w:tabs>
       </w:pPr>
       <w:r>
+        <w:rPr>
+          <w:rFonts w:ascii="Times New Roman" w:hAnsi="Times New Roman" w:cs="Times New Roman"/>
+        </w:rPr>
         <w:t>1.1  Latar Belakang</w:t>
         <w:tab/>
       </w:r>
       <w:r>
+        <w:rPr>
+          <w:rFonts w:ascii="Times New Roman" w:hAnsi="Times New Roman" w:cs="Times New Roman"/>
+        </w:rPr>
         <w:t>1</w:t>
       </w:r>
     </w:p>
@@ -1407,10 +1462,16 @@
         </w:tabs>
       </w:pPr>
       <w:r>
+        <w:rPr>
+          <w:rFonts w:ascii="Times New Roman" w:hAnsi="Times New Roman" w:cs="Times New Roman"/>
+        </w:rPr>
         <w:t>1.2  Rumusan Masalah</w:t>
         <w:tab/>
       </w:r>
       <w:r>
+        <w:rPr>
+          <w:rFonts w:ascii="Times New Roman" w:hAnsi="Times New Roman" w:cs="Times New Roman"/>
+        </w:rPr>
         <w:t>2</w:t>
       </w:r>
     </w:p>
@@ -1425,10 +1486,16 @@
         </w:tabs>
       </w:pPr>
       <w:r>
+        <w:rPr>
+          <w:rFonts w:ascii="Times New Roman" w:hAnsi="Times New Roman" w:cs="Times New Roman"/>
+        </w:rPr>
         <w:t>1.3  Tujuan Prototipe</w:t>
         <w:tab/>
       </w:r>
       <w:r>
+        <w:rPr>
+          <w:rFonts w:ascii="Times New Roman" w:hAnsi="Times New Roman" w:cs="Times New Roman"/>
+        </w:rPr>
         <w:t>3</w:t>
       </w:r>
     </w:p>
@@ -1443,10 +1510,16 @@
         </w:tabs>
       </w:pPr>
       <w:r>
+        <w:rPr>
+          <w:rFonts w:ascii="Times New Roman" w:hAnsi="Times New Roman" w:cs="Times New Roman"/>
+        </w:rPr>
         <w:t>1.4  Manfaat Prototipe</w:t>
         <w:tab/>
       </w:r>
       <w:r>
+        <w:rPr>
+          <w:rFonts w:ascii="Times New Roman" w:hAnsi="Times New Roman" w:cs="Times New Roman"/>
+        </w:rPr>
         <w:t>3</w:t>
       </w:r>
     </w:p>
@@ -1461,10 +1534,16 @@
         </w:tabs>
       </w:pPr>
       <w:r>
+        <w:rPr>
+          <w:rFonts w:ascii="Times New Roman" w:hAnsi="Times New Roman" w:cs="Times New Roman"/>
+        </w:rPr>
         <w:t>1.5  Potensi Dampak Fungsional/Komersial</w:t>
         <w:tab/>
       </w:r>
       <w:r>
+        <w:rPr>
+          <w:rFonts w:ascii="Times New Roman" w:hAnsi="Times New Roman" w:cs="Times New Roman"/>
+        </w:rPr>
         <w:t>5</w:t>
       </w:r>
     </w:p>
@@ -1478,10 +1557,16 @@
         </w:tabs>
       </w:pPr>
       <w:r>
+        <w:rPr>
+          <w:rFonts w:ascii="Times New Roman" w:hAnsi="Times New Roman" w:cs="Times New Roman"/>
+        </w:rPr>
         <w:t>BAB II  KAJIAN PUSTAKA</w:t>
         <w:tab/>
       </w:r>
       <w:r>
+        <w:rPr>
+          <w:rFonts w:ascii="Times New Roman" w:hAnsi="Times New Roman" w:cs="Times New Roman"/>
+        </w:rPr>
         <w:t>7</w:t>
       </w:r>
     </w:p>
@@ -1496,10 +1581,16 @@
         </w:tabs>
       </w:pPr>
       <w:r>
+        <w:rPr>
+          <w:rFonts w:ascii="Times New Roman" w:hAnsi="Times New Roman" w:cs="Times New Roman"/>
+        </w:rPr>
         <w:t>2.1  Tinjauan Pustaka</w:t>
         <w:tab/>
       </w:r>
       <w:r>
+        <w:rPr>
+          <w:rFonts w:ascii="Times New Roman" w:hAnsi="Times New Roman" w:cs="Times New Roman"/>
+        </w:rPr>
         <w:t>7</w:t>
       </w:r>
     </w:p>
@@ -1514,10 +1605,16 @@
         </w:tabs>
       </w:pPr>
       <w:r>
+        <w:rPr>
+          <w:rFonts w:ascii="Times New Roman" w:hAnsi="Times New Roman" w:cs="Times New Roman"/>
+        </w:rPr>
         <w:t>2.2  Landasan Teoretik</w:t>
         <w:tab/>
       </w:r>
       <w:r>
+        <w:rPr>
+          <w:rFonts w:ascii="Times New Roman" w:hAnsi="Times New Roman" w:cs="Times New Roman"/>
+        </w:rPr>
         <w:t>8</w:t>
       </w:r>
     </w:p>
@@ -1532,10 +1629,16 @@
         </w:tabs>
       </w:pPr>
       <w:r>
+        <w:rPr>
+          <w:rFonts w:ascii="Times New Roman" w:hAnsi="Times New Roman" w:cs="Times New Roman"/>
+        </w:rPr>
         <w:t>2.2.1  Deteksi Tepi Canny dan Aproksimasi Quad</w:t>
         <w:tab/>
       </w:r>
       <w:r>
+        <w:rPr>
+          <w:rFonts w:ascii="Times New Roman" w:hAnsi="Times New Roman" w:cs="Times New Roman"/>
+        </w:rPr>
         <w:t>8</w:t>
       </w:r>
     </w:p>
@@ -1550,10 +1653,16 @@
         </w:tabs>
       </w:pPr>
       <w:r>
+        <w:rPr>
+          <w:rFonts w:ascii="Times New Roman" w:hAnsi="Times New Roman" w:cs="Times New Roman"/>
+        </w:rPr>
         <w:t>2.2.2  Ruang Warna HSV dan Segmentasi Vegetasi</w:t>
         <w:tab/>
       </w:r>
       <w:r>
+        <w:rPr>
+          <w:rFonts w:ascii="Times New Roman" w:hAnsi="Times New Roman" w:cs="Times New Roman"/>
+        </w:rPr>
         <w:t>8</w:t>
       </w:r>
     </w:p>
@@ -1568,10 +1677,16 @@
         </w:tabs>
       </w:pPr>
       <w:r>
+        <w:rPr>
+          <w:rFonts w:ascii="Times New Roman" w:hAnsi="Times New Roman" w:cs="Times New Roman"/>
+        </w:rPr>
         <w:t>2.2.3  Adaptasi Iluminasi dan Perata Temporal EMA</w:t>
         <w:tab/>
       </w:r>
       <w:r>
+        <w:rPr>
+          <w:rFonts w:ascii="Times New Roman" w:hAnsi="Times New Roman" w:cs="Times New Roman"/>
+        </w:rPr>
         <w:t>9</w:t>
       </w:r>
     </w:p>
@@ -1586,10 +1701,16 @@
         </w:tabs>
       </w:pPr>
       <w:r>
+        <w:rPr>
+          <w:rFonts w:ascii="Times New Roman" w:hAnsi="Times New Roman" w:cs="Times New Roman"/>
+        </w:rPr>
         <w:t>2.2.4  Liputan Kanopi dan Indeks Stres Tanaman</w:t>
         <w:tab/>
       </w:r>
       <w:r>
+        <w:rPr>
+          <w:rFonts w:ascii="Times New Roman" w:hAnsi="Times New Roman" w:cs="Times New Roman"/>
+        </w:rPr>
         <w:t>9</w:t>
       </w:r>
     </w:p>
@@ -1604,10 +1725,16 @@
         </w:tabs>
       </w:pPr>
       <w:r>
+        <w:rPr>
+          <w:rFonts w:ascii="Times New Roman" w:hAnsi="Times New Roman" w:cs="Times New Roman"/>
+        </w:rPr>
         <w:t>2.2.5  Metrik Evaluasi Segmentasi</w:t>
         <w:tab/>
       </w:r>
       <w:r>
+        <w:rPr>
+          <w:rFonts w:ascii="Times New Roman" w:hAnsi="Times New Roman" w:cs="Times New Roman"/>
+        </w:rPr>
         <w:t>9</w:t>
       </w:r>
     </w:p>
@@ -1621,10 +1748,16 @@
         </w:tabs>
       </w:pPr>
       <w:r>
+        <w:rPr>
+          <w:rFonts w:ascii="Times New Roman" w:hAnsi="Times New Roman" w:cs="Times New Roman"/>
+        </w:rPr>
         <w:t>BAB III  METODE PELAKSANAAN</w:t>
         <w:tab/>
       </w:r>
       <w:r>
+        <w:rPr>
+          <w:rFonts w:ascii="Times New Roman" w:hAnsi="Times New Roman" w:cs="Times New Roman"/>
+        </w:rPr>
         <w:t>11</w:t>
       </w:r>
     </w:p>
@@ -1639,10 +1772,16 @@
         </w:tabs>
       </w:pPr>
       <w:r>
+        <w:rPr>
+          <w:rFonts w:ascii="Times New Roman" w:hAnsi="Times New Roman" w:cs="Times New Roman"/>
+        </w:rPr>
         <w:t>3.1  Pendekatan Perancangan</w:t>
         <w:tab/>
       </w:r>
       <w:r>
+        <w:rPr>
+          <w:rFonts w:ascii="Times New Roman" w:hAnsi="Times New Roman" w:cs="Times New Roman"/>
+        </w:rPr>
         <w:t>11</w:t>
       </w:r>
     </w:p>
@@ -1657,10 +1796,16 @@
         </w:tabs>
       </w:pPr>
       <w:r>
+        <w:rPr>
+          <w:rFonts w:ascii="Times New Roman" w:hAnsi="Times New Roman" w:cs="Times New Roman"/>
+        </w:rPr>
         <w:t>3.2  Lokasi dan Waktu</w:t>
         <w:tab/>
       </w:r>
       <w:r>
+        <w:rPr>
+          <w:rFonts w:ascii="Times New Roman" w:hAnsi="Times New Roman" w:cs="Times New Roman"/>
+        </w:rPr>
         <w:t>11</w:t>
       </w:r>
     </w:p>
@@ -1675,10 +1820,16 @@
         </w:tabs>
       </w:pPr>
       <w:r>
+        <w:rPr>
+          <w:rFonts w:ascii="Times New Roman" w:hAnsi="Times New Roman" w:cs="Times New Roman"/>
+        </w:rPr>
         <w:t>3.3  Prosedur Perancangan</w:t>
         <w:tab/>
       </w:r>
       <w:r>
+        <w:rPr>
+          <w:rFonts w:ascii="Times New Roman" w:hAnsi="Times New Roman" w:cs="Times New Roman"/>
+        </w:rPr>
         <w:t>11</w:t>
       </w:r>
     </w:p>
@@ -1693,10 +1844,16 @@
         </w:tabs>
       </w:pPr>
       <w:r>
+        <w:rPr>
+          <w:rFonts w:ascii="Times New Roman" w:hAnsi="Times New Roman" w:cs="Times New Roman"/>
+        </w:rPr>
         <w:t>3.3.1  Arsitektur Sistem</w:t>
         <w:tab/>
       </w:r>
       <w:r>
+        <w:rPr>
+          <w:rFonts w:ascii="Times New Roman" w:hAnsi="Times New Roman" w:cs="Times New Roman"/>
+        </w:rPr>
         <w:t>12</w:t>
       </w:r>
     </w:p>
@@ -1711,10 +1868,16 @@
         </w:tabs>
       </w:pPr>
       <w:r>
+        <w:rPr>
+          <w:rFonts w:ascii="Times New Roman" w:hAnsi="Times New Roman" w:cs="Times New Roman"/>
+        </w:rPr>
         <w:t>3.3.2  Diagram Alir</w:t>
         <w:tab/>
       </w:r>
       <w:r>
+        <w:rPr>
+          <w:rFonts w:ascii="Times New Roman" w:hAnsi="Times New Roman" w:cs="Times New Roman"/>
+        </w:rPr>
         <w:t>12</w:t>
       </w:r>
     </w:p>
@@ -1729,10 +1892,16 @@
         </w:tabs>
       </w:pPr>
       <w:r>
+        <w:rPr>
+          <w:rFonts w:ascii="Times New Roman" w:hAnsi="Times New Roman" w:cs="Times New Roman"/>
+        </w:rPr>
         <w:t>3.3.3  Skema Pemasangan</w:t>
         <w:tab/>
       </w:r>
       <w:r>
+        <w:rPr>
+          <w:rFonts w:ascii="Times New Roman" w:hAnsi="Times New Roman" w:cs="Times New Roman"/>
+        </w:rPr>
         <w:t>13</w:t>
       </w:r>
     </w:p>
@@ -1747,10 +1916,16 @@
         </w:tabs>
       </w:pPr>
       <w:r>
+        <w:rPr>
+          <w:rFonts w:ascii="Times New Roman" w:hAnsi="Times New Roman" w:cs="Times New Roman"/>
+        </w:rPr>
         <w:t>3.3.4  Prinsip Kerja Algoritma</w:t>
         <w:tab/>
       </w:r>
       <w:r>
+        <w:rPr>
+          <w:rFonts w:ascii="Times New Roman" w:hAnsi="Times New Roman" w:cs="Times New Roman"/>
+        </w:rPr>
         <w:t>14</w:t>
       </w:r>
     </w:p>
@@ -1765,10 +1940,16 @@
         </w:tabs>
       </w:pPr>
       <w:r>
+        <w:rPr>
+          <w:rFonts w:ascii="Times New Roman" w:hAnsi="Times New Roman" w:cs="Times New Roman"/>
+        </w:rPr>
         <w:t>3.4  Bahan dan Alat</w:t>
         <w:tab/>
       </w:r>
       <w:r>
+        <w:rPr>
+          <w:rFonts w:ascii="Times New Roman" w:hAnsi="Times New Roman" w:cs="Times New Roman"/>
+        </w:rPr>
         <w:t>14</w:t>
       </w:r>
     </w:p>
@@ -1783,10 +1964,16 @@
         </w:tabs>
       </w:pPr>
       <w:r>
+        <w:rPr>
+          <w:rFonts w:ascii="Times New Roman" w:hAnsi="Times New Roman" w:cs="Times New Roman"/>
+        </w:rPr>
         <w:t>3.5  Metrik dan Skenario Pengujian</w:t>
         <w:tab/>
       </w:r>
       <w:r>
+        <w:rPr>
+          <w:rFonts w:ascii="Times New Roman" w:hAnsi="Times New Roman" w:cs="Times New Roman"/>
+        </w:rPr>
         <w:t>15</w:t>
       </w:r>
     </w:p>
@@ -1800,10 +1987,16 @@
         </w:tabs>
       </w:pPr>
       <w:r>
+        <w:rPr>
+          <w:rFonts w:ascii="Times New Roman" w:hAnsi="Times New Roman" w:cs="Times New Roman"/>
+        </w:rPr>
         <w:t>DAFTAR PUSTAKA</w:t>
         <w:tab/>
       </w:r>
       <w:r>
+        <w:rPr>
+          <w:rFonts w:ascii="Times New Roman" w:hAnsi="Times New Roman" w:cs="Times New Roman"/>
+        </w:rPr>
         <w:t>17</w:t>
       </w:r>
     </w:p>
@@ -1826,10 +2019,16 @@
         </w:sectPr>
       </w:pPr>
       <w:r>
+        <w:rPr>
+          <w:rFonts w:ascii="Times New Roman" w:hAnsi="Times New Roman" w:cs="Times New Roman"/>
+        </w:rPr>
         <w:t>LAMPIRAN</w:t>
         <w:tab/>
       </w:r>
       <w:r>
+        <w:rPr>
+          <w:rFonts w:ascii="Times New Roman" w:hAnsi="Times New Roman" w:cs="Times New Roman"/>
+        </w:rPr>
         <w:t>19</w:t>
       </w:r>
     </w:p>
@@ -1846,6 +2045,9 @@
         </w:rPr>
       </w:pPr>
       <w:r>
+        <w:rPr>
+          <w:rFonts w:ascii="Times New Roman" w:hAnsi="Times New Roman" w:cs="Times New Roman"/>
+        </w:rPr>
         <w:t>DAFTAR TABEL</w:t>
       </w:r>
     </w:p>
@@ -1859,10 +2061,16 @@
         </w:tabs>
       </w:pPr>
       <w:r>
+        <w:rPr>
+          <w:rFonts w:ascii="Times New Roman" w:hAnsi="Times New Roman" w:cs="Times New Roman"/>
+        </w:rPr>
         <w:t>Tabel 1.1  Perbandingan Dengan Produk Lain</w:t>
         <w:tab/>
       </w:r>
       <w:r>
+        <w:rPr>
+          <w:rFonts w:ascii="Times New Roman" w:hAnsi="Times New Roman" w:cs="Times New Roman"/>
+        </w:rPr>
         <w:t>6</w:t>
       </w:r>
     </w:p>
@@ -1876,10 +2084,16 @@
         </w:tabs>
       </w:pPr>
       <w:r>
+        <w:rPr>
+          <w:rFonts w:ascii="Times New Roman" w:hAnsi="Times New Roman" w:cs="Times New Roman"/>
+        </w:rPr>
         <w:t>Tabel 2.1  Perbandingan Penelitian Terdahulu</w:t>
         <w:tab/>
       </w:r>
       <w:r>
+        <w:rPr>
+          <w:rFonts w:ascii="Times New Roman" w:hAnsi="Times New Roman" w:cs="Times New Roman"/>
+        </w:rPr>
         <w:t>8</w:t>
       </w:r>
     </w:p>
@@ -1893,10 +2107,16 @@
         </w:tabs>
       </w:pPr>
       <w:r>
+        <w:rPr>
+          <w:rFonts w:ascii="Times New Roman" w:hAnsi="Times New Roman" w:cs="Times New Roman"/>
+        </w:rPr>
         <w:t>Tabel 3.1  Daftar Perangkat Keras</w:t>
         <w:tab/>
       </w:r>
       <w:r>
+        <w:rPr>
+          <w:rFonts w:ascii="Times New Roman" w:hAnsi="Times New Roman" w:cs="Times New Roman"/>
+        </w:rPr>
         <w:t>15</w:t>
       </w:r>
     </w:p>
@@ -1910,10 +2130,16 @@
         </w:tabs>
       </w:pPr>
       <w:r>
+        <w:rPr>
+          <w:rFonts w:ascii="Times New Roman" w:hAnsi="Times New Roman" w:cs="Times New Roman"/>
+        </w:rPr>
         <w:t>Tabel 3.2  Daftar Perangkat Lunak</w:t>
         <w:tab/>
       </w:r>
       <w:r>
+        <w:rPr>
+          <w:rFonts w:ascii="Times New Roman" w:hAnsi="Times New Roman" w:cs="Times New Roman"/>
+        </w:rPr>
         <w:t>15</w:t>
       </w:r>
     </w:p>
@@ -1936,10 +2162,16 @@
         </w:sectPr>
       </w:pPr>
       <w:r>
+        <w:rPr>
+          <w:rFonts w:ascii="Times New Roman" w:hAnsi="Times New Roman" w:cs="Times New Roman"/>
+        </w:rPr>
         <w:t>Tabel 3.3  Skenario Pengujian Kelayakan Prototipe</w:t>
         <w:tab/>
       </w:r>
       <w:r>
+        <w:rPr>
+          <w:rFonts w:ascii="Times New Roman" w:hAnsi="Times New Roman" w:cs="Times New Roman"/>
+        </w:rPr>
         <w:t>15</w:t>
       </w:r>
     </w:p>
@@ -1956,6 +2188,9 @@
         </w:rPr>
       </w:pPr>
       <w:r>
+        <w:rPr>
+          <w:rFonts w:ascii="Times New Roman" w:hAnsi="Times New Roman" w:cs="Times New Roman"/>
+        </w:rPr>
         <w:t>DAFTAR GAMBAR</w:t>
       </w:r>
     </w:p>
@@ -1969,10 +2204,16 @@
         </w:tabs>
       </w:pPr>
       <w:r>
+        <w:rPr>
+          <w:rFonts w:ascii="Times New Roman" w:hAnsi="Times New Roman" w:cs="Times New Roman"/>
+        </w:rPr>
         <w:t>Gambar 3.1  Blok Diagram Sistem</w:t>
         <w:tab/>
       </w:r>
       <w:r>
+        <w:rPr>
+          <w:rFonts w:ascii="Times New Roman" w:hAnsi="Times New Roman" w:cs="Times New Roman"/>
+        </w:rPr>
         <w:t>12</w:t>
       </w:r>
     </w:p>
@@ -1986,10 +2227,16 @@
         </w:tabs>
       </w:pPr>
       <w:r>
+        <w:rPr>
+          <w:rFonts w:ascii="Times New Roman" w:hAnsi="Times New Roman" w:cs="Times New Roman"/>
+        </w:rPr>
         <w:t>Gambar 3.2  Diagram Alir Pipeline</w:t>
         <w:tab/>
       </w:r>
       <w:r>
+        <w:rPr>
+          <w:rFonts w:ascii="Times New Roman" w:hAnsi="Times New Roman" w:cs="Times New Roman"/>
+        </w:rPr>
         <w:t>13</w:t>
       </w:r>
     </w:p>
@@ -2003,10 +2250,16 @@
         </w:tabs>
       </w:pPr>
       <w:r>
+        <w:rPr>
+          <w:rFonts w:ascii="Times New Roman" w:hAnsi="Times New Roman" w:cs="Times New Roman"/>
+        </w:rPr>
         <w:t>Gambar 3.3  Skema Pemasangan Kamera</w:t>
         <w:tab/>
       </w:r>
       <w:r>
+        <w:rPr>
+          <w:rFonts w:ascii="Times New Roman" w:hAnsi="Times New Roman" w:cs="Times New Roman"/>
+        </w:rPr>
         <w:t>14</w:t>
       </w:r>
     </w:p>
@@ -2020,10 +2273,16 @@
         </w:tabs>
       </w:pPr>
       <w:r>
+        <w:rPr>
+          <w:rFonts w:ascii="Times New Roman" w:hAnsi="Times New Roman" w:cs="Times New Roman"/>
+        </w:rPr>
         <w:t>Gambar 3.4  Bukti Asli Frame HP vs Pipeline</w:t>
         <w:tab/>
       </w:r>
       <w:r>
+        <w:rPr>
+          <w:rFonts w:ascii="Times New Roman" w:hAnsi="Times New Roman" w:cs="Times New Roman"/>
+        </w:rPr>
         <w:t>14</w:t>
       </w:r>
     </w:p>
@@ -2046,10 +2305,16 @@
         </w:sectPr>
       </w:pPr>
       <w:r>
+        <w:rPr>
+          <w:rFonts w:ascii="Times New Roman" w:hAnsi="Times New Roman" w:cs="Times New Roman"/>
+        </w:rPr>
         <w:t>Gambar 3.5  Bukti Asli Frame Video vs Segmentasi</w:t>
         <w:tab/>
       </w:r>
       <w:r>
+        <w:rPr>
+          <w:rFonts w:ascii="Times New Roman" w:hAnsi="Times New Roman" w:cs="Times New Roman"/>
+        </w:rPr>
         <w:t>14</w:t>
       </w:r>
     </w:p>
@@ -2094,6 +2359,9 @@
           </w:tcPr>
           <w:p>
             <w:r>
+              <w:rPr>
+                <w:rFonts w:ascii="Times New Roman" w:hAnsi="Times New Roman" w:cs="Times New Roman"/>
+              </w:rPr>
               <w:t>Singkatan</w:t>
             </w:r>
           </w:p>
@@ -2104,6 +2372,9 @@
           </w:tcPr>
           <w:p>
             <w:r>
+              <w:rPr>
+                <w:rFonts w:ascii="Times New Roman" w:hAnsi="Times New Roman" w:cs="Times New Roman"/>
+              </w:rPr>
               <w:t>Kepanjangan</w:t>
             </w:r>
           </w:p>
@@ -2114,6 +2385,9 @@
           </w:tcPr>
           <w:p>
             <w:r>
+              <w:rPr>
+                <w:rFonts w:ascii="Times New Roman" w:hAnsi="Times New Roman" w:cs="Times New Roman"/>
+              </w:rPr>
               <w:t>Keterangan</w:t>
             </w:r>
           </w:p>
@@ -2126,6 +2400,9 @@
           </w:tcPr>
           <w:p>
             <w:r>
+              <w:rPr>
+                <w:rFonts w:ascii="Times New Roman" w:hAnsi="Times New Roman" w:cs="Times New Roman"/>
+              </w:rPr>
               <w:t>HSV</w:t>
             </w:r>
           </w:p>
@@ -2136,6 +2413,9 @@
           </w:tcPr>
           <w:p>
             <w:r>
+              <w:rPr>
+                <w:rFonts w:ascii="Times New Roman" w:hAnsi="Times New Roman" w:cs="Times New Roman"/>
+              </w:rPr>
               <w:t>Hue Saturation Value</w:t>
             </w:r>
           </w:p>
@@ -2146,6 +2426,9 @@
           </w:tcPr>
           <w:p>
             <w:r>
+              <w:rPr>
+                <w:rFonts w:ascii="Times New Roman" w:hAnsi="Times New Roman" w:cs="Times New Roman"/>
+              </w:rPr>
               <w:t>ruang warna yang dipakai segmentasi</w:t>
             </w:r>
           </w:p>
@@ -2158,6 +2441,9 @@
           </w:tcPr>
           <w:p>
             <w:r>
+              <w:rPr>
+                <w:rFonts w:ascii="Times New Roman" w:hAnsi="Times New Roman" w:cs="Times New Roman"/>
+              </w:rPr>
               <w:t>EMA</w:t>
             </w:r>
           </w:p>
@@ -2168,6 +2454,9 @@
           </w:tcPr>
           <w:p>
             <w:r>
+              <w:rPr>
+                <w:rFonts w:ascii="Times New Roman" w:hAnsi="Times New Roman" w:cs="Times New Roman"/>
+              </w:rPr>
               <w:t>Exponential Moving Average</w:t>
             </w:r>
           </w:p>
@@ -2178,6 +2467,9 @@
           </w:tcPr>
           <w:p>
             <w:r>
+              <w:rPr>
+                <w:rFonts w:ascii="Times New Roman" w:hAnsi="Times New Roman" w:cs="Times New Roman"/>
+              </w:rPr>
               <w:t>perata temporal pada Persamaan 2.5</w:t>
             </w:r>
           </w:p>
@@ -2190,6 +2482,9 @@
           </w:tcPr>
           <w:p>
             <w:r>
+              <w:rPr>
+                <w:rFonts w:ascii="Times New Roman" w:hAnsi="Times New Roman" w:cs="Times New Roman"/>
+              </w:rPr>
               <w:t>PSI</w:t>
             </w:r>
           </w:p>
@@ -2200,6 +2495,9 @@
           </w:tcPr>
           <w:p>
             <w:r>
+              <w:rPr>
+                <w:rFonts w:ascii="Times New Roman" w:hAnsi="Times New Roman" w:cs="Times New Roman"/>
+              </w:rPr>
               <w:t>Plant Stress Index</w:t>
             </w:r>
           </w:p>
@@ -2210,6 +2508,9 @@
           </w:tcPr>
           <w:p>
             <w:r>
+              <w:rPr>
+                <w:rFonts w:ascii="Times New Roman" w:hAnsi="Times New Roman" w:cs="Times New Roman"/>
+              </w:rPr>
               <w:t>indeks stres 0-100 pada Persamaan 2.6</w:t>
             </w:r>
           </w:p>
@@ -2222,6 +2523,9 @@
           </w:tcPr>
           <w:p>
             <w:r>
+              <w:rPr>
+                <w:rFonts w:ascii="Times New Roman" w:hAnsi="Times New Roman" w:cs="Times New Roman"/>
+              </w:rPr>
               <w:t>F1</w:t>
             </w:r>
           </w:p>
@@ -2232,6 +2536,9 @@
           </w:tcPr>
           <w:p>
             <w:r>
+              <w:rPr>
+                <w:rFonts w:ascii="Times New Roman" w:hAnsi="Times New Roman" w:cs="Times New Roman"/>
+              </w:rPr>
               <w:t>harmonic mean presisi-recall</w:t>
             </w:r>
           </w:p>
@@ -2242,6 +2549,9 @@
           </w:tcPr>
           <w:p>
             <w:r>
+              <w:rPr>
+                <w:rFonts w:ascii="Times New Roman" w:hAnsi="Times New Roman" w:cs="Times New Roman"/>
+              </w:rPr>
               <w:t>metrik evaluasi pada Persamaan 2.8</w:t>
             </w:r>
           </w:p>
@@ -2254,6 +2564,9 @@
           </w:tcPr>
           <w:p>
             <w:r>
+              <w:rPr>
+                <w:rFonts w:ascii="Times New Roman" w:hAnsi="Times New Roman" w:cs="Times New Roman"/>
+              </w:rPr>
               <w:t>IoU</w:t>
             </w:r>
           </w:p>
@@ -2264,6 +2577,9 @@
           </w:tcPr>
           <w:p>
             <w:r>
+              <w:rPr>
+                <w:rFonts w:ascii="Times New Roman" w:hAnsi="Times New Roman" w:cs="Times New Roman"/>
+              </w:rPr>
               <w:t>Intersection over Union</w:t>
             </w:r>
           </w:p>
@@ -2274,6 +2590,9 @@
           </w:tcPr>
           <w:p>
             <w:r>
+              <w:rPr>
+                <w:rFonts w:ascii="Times New Roman" w:hAnsi="Times New Roman" w:cs="Times New Roman"/>
+              </w:rPr>
               <w:t>metrik evaluasi pada Persamaan 2.9</w:t>
             </w:r>
           </w:p>
@@ -2286,6 +2605,9 @@
           </w:tcPr>
           <w:p>
             <w:r>
+              <w:rPr>
+                <w:rFonts w:ascii="Times New Roman" w:hAnsi="Times New Roman" w:cs="Times New Roman"/>
+              </w:rPr>
               <w:t>RPi</w:t>
             </w:r>
           </w:p>
@@ -2296,6 +2618,9 @@
           </w:tcPr>
           <w:p>
             <w:r>
+              <w:rPr>
+                <w:rFonts w:ascii="Times New Roman" w:hAnsi="Times New Roman" w:cs="Times New Roman"/>
+              </w:rPr>
               <w:t>Raspberry Pi</w:t>
             </w:r>
           </w:p>
@@ -2306,6 +2631,9 @@
           </w:tcPr>
           <w:p>
             <w:r>
+              <w:rPr>
+                <w:rFonts w:ascii="Times New Roman" w:hAnsi="Times New Roman" w:cs="Times New Roman"/>
+              </w:rPr>
               <w:t>komputer papan tunggal 4B yang dipakai deploy</w:t>
             </w:r>
           </w:p>
@@ -2318,6 +2646,9 @@
           </w:tcPr>
           <w:p>
             <w:r>
+              <w:rPr>
+                <w:rFonts w:ascii="Times New Roman" w:hAnsi="Times New Roman" w:cs="Times New Roman"/>
+              </w:rPr>
               <w:t>CSI</w:t>
             </w:r>
           </w:p>
@@ -2328,6 +2659,9 @@
           </w:tcPr>
           <w:p>
             <w:r>
+              <w:rPr>
+                <w:rFonts w:ascii="Times New Roman" w:hAnsi="Times New Roman" w:cs="Times New Roman"/>
+              </w:rPr>
               <w:t>Camera Serial Interface</w:t>
             </w:r>
           </w:p>
@@ -2338,6 +2672,9 @@
           </w:tcPr>
           <w:p>
             <w:r>
+              <w:rPr>
+                <w:rFonts w:ascii="Times New Roman" w:hAnsi="Times New Roman" w:cs="Times New Roman"/>
+              </w:rPr>
               <w:t>antar muka kamera ov5647</w:t>
             </w:r>
           </w:p>
@@ -2350,6 +2687,9 @@
           </w:tcPr>
           <w:p>
             <w:r>
+              <w:rPr>
+                <w:rFonts w:ascii="Times New Roman" w:hAnsi="Times New Roman" w:cs="Times New Roman"/>
+              </w:rPr>
               <w:t>URL</w:t>
             </w:r>
           </w:p>
@@ -2360,6 +2700,9 @@
           </w:tcPr>
           <w:p>
             <w:r>
+              <w:rPr>
+                <w:rFonts w:ascii="Times New Roman" w:hAnsi="Times New Roman" w:cs="Times New Roman"/>
+              </w:rPr>
               <w:t>Uniform Resource Locator</w:t>
             </w:r>
           </w:p>
@@ -2370,6 +2713,9 @@
           </w:tcPr>
           <w:p>
             <w:r>
+              <w:rPr>
+                <w:rFonts w:ascii="Times New Roman" w:hAnsi="Times New Roman" w:cs="Times New Roman"/>
+              </w:rPr>
               <w:t>alamat dokumen Firestore dan Storage</w:t>
             </w:r>
           </w:p>
@@ -16717,6 +17063,9 @@
         </w:rPr>
       </w:pPr>
       <w:r>
+        <w:rPr>
+          <w:rFonts w:ascii="Times New Roman" w:hAnsi="Times New Roman" w:cs="Times New Roman"/>
+        </w:rPr>
         <w:t>Dari sisi komersial, prototipe ini memiliki potensi untuk dikembangkan menjadi perangkat pendukung monitoring akuaponik yang menilai kelayakan panen dan kesehatan tanaman dalam satu sistem. Arsitektur yang menggunakan komputer papan tunggal, kamera, rumah kamera cetak tiga dimensi, dan konektivitas Internet of Things memungkinkan sistem dikembangkan secara modular sesuai kebutuhan pengguna dan skala instalasi.</w:t>
       </w:r>
     </w:p>
@@ -16792,6 +17141,7 @@
       <w:proofErr w:type="spellEnd"/>
       <w:r>
         <w:rPr>
+          <w:rFonts w:ascii="Times New Roman" w:hAnsi="Times New Roman" w:cs="Times New Roman"/>
           <w:b w:val="0"/>
         </w:rPr>
         <w:t>Tabel 1.1  Perbandingan Dengan Produk Lain</w:t>
@@ -17012,6 +17362,9 @@
           </w:tcPr>
           <w:p>
             <w:r>
+              <w:rPr>
+                <w:rFonts w:ascii="Times New Roman" w:hAnsi="Times New Roman" w:cs="Times New Roman"/>
+              </w:rPr>
               <w:t>PlantEye (Phenospex)</w:t>
             </w:r>
           </w:p>
@@ -17109,6 +17462,9 @@
           </w:tcPr>
           <w:p>
             <w:r>
+              <w:rPr>
+                <w:rFonts w:ascii="Times New Roman" w:hAnsi="Times New Roman" w:cs="Times New Roman"/>
+              </w:rPr>
               <w:t>Rp 150.000.000</w:t>
             </w:r>
           </w:p>
@@ -17126,6 +17482,9 @@
           </w:tcPr>
           <w:p>
             <w:r>
+              <w:rPr>
+                <w:rFonts w:ascii="Times New Roman" w:hAnsi="Times New Roman" w:cs="Times New Roman"/>
+              </w:rPr>
               <w:t>Pemindai 3D multispektral dengan metrik kanopi terstandar untuk riset.</w:t>
             </w:r>
           </w:p>
@@ -17143,6 +17502,9 @@
           </w:tcPr>
           <w:p>
             <w:r>
+              <w:rPr>
+                <w:rFonts w:ascii="Times New Roman" w:hAnsi="Times New Roman" w:cs="Times New Roman"/>
+              </w:rPr>
               <w:t>Harga sangat mahal dan butuh operator terlatih, bukan untuk bed akuaponik kecil.</w:t>
             </w:r>
           </w:p>
@@ -17162,6 +17524,9 @@
           </w:tcPr>
           <w:p>
             <w:r>
+              <w:rPr>
+                <w:rFonts w:ascii="Times New Roman" w:hAnsi="Times New Roman" w:cs="Times New Roman"/>
+              </w:rPr>
               <w:t>CropSnap / sensor kanopi genggam</w:t>
             </w:r>
           </w:p>
@@ -17256,6 +17621,9 @@
           </w:tcPr>
           <w:p>
             <w:r>
+              <w:rPr>
+                <w:rFonts w:ascii="Times New Roman" w:hAnsi="Times New Roman" w:cs="Times New Roman"/>
+              </w:rPr>
               <w:t>Rp 3.000.000</w:t>
             </w:r>
           </w:p>
@@ -17273,6 +17641,9 @@
           </w:tcPr>
           <w:p>
             <w:r>
+              <w:rPr>
+                <w:rFonts w:ascii="Times New Roman" w:hAnsi="Times New Roman" w:cs="Times New Roman"/>
+              </w:rPr>
               <w:t>Ringkas untuk cek cepat satu titik tanam di lapangan.</w:t>
             </w:r>
           </w:p>
@@ -17290,6 +17661,9 @@
           </w:tcPr>
           <w:p>
             <w:r>
+              <w:rPr>
+                <w:rFonts w:ascii="Times New Roman" w:hAnsi="Times New Roman" w:cs="Times New Roman"/>
+              </w:rPr>
               <w:t>Hanya satu titik ukur tanpa peta zona dan tanpa arsip runtun waktu.</w:t>
             </w:r>
           </w:p>
@@ -17309,6 +17683,9 @@
           </w:tcPr>
           <w:p>
             <w:r>
+              <w:rPr>
+                <w:rFonts w:ascii="Times New Roman" w:hAnsi="Times New Roman" w:cs="Times New Roman"/>
+              </w:rPr>
               <w:t>Aplikasi cek daun via ponsel</w:t>
             </w:r>
           </w:p>
@@ -17403,6 +17780,9 @@
           </w:tcPr>
           <w:p>
             <w:r>
+              <w:rPr>
+                <w:rFonts w:ascii="Times New Roman" w:hAnsi="Times New Roman" w:cs="Times New Roman"/>
+              </w:rPr>
               <w:t>Gratis-Rp 500.000</w:t>
             </w:r>
           </w:p>
@@ -17420,6 +17800,9 @@
           </w:tcPr>
           <w:p>
             <w:r>
+              <w:rPr>
+                <w:rFonts w:ascii="Times New Roman" w:hAnsi="Times New Roman" w:cs="Times New Roman"/>
+              </w:rPr>
               <w:t>Mudah dipakai untuk foto satu daun dan klasifikasi cepat.</w:t>
             </w:r>
           </w:p>
@@ -17437,6 +17820,9 @@
           </w:tcPr>
           <w:p>
             <w:r>
+              <w:rPr>
+                <w:rFonts w:ascii="Times New Roman" w:hAnsi="Times New Roman" w:cs="Times New Roman"/>
+              </w:rPr>
               <w:t>Hasil per foto tidak konsisten antarbed dan tanpa grid zona serta dasbor.</w:t>
             </w:r>
           </w:p>
@@ -17470,6 +17856,9 @@
         <w:jc w:val="right"/>
       </w:pPr>
       <w:r>
+        <w:rPr>
+          <w:rFonts w:ascii="Times New Roman" w:hAnsi="Times New Roman" w:cs="Times New Roman"/>
+        </w:rPr>
         <w:drawing>
           <wp:inline xmlns:a="http://schemas.openxmlformats.org/drawingml/2006/main" xmlns:pic="http://schemas.openxmlformats.org/drawingml/2006/picture">
             <wp:extent cx="1097280" cy="1097280"/>
@@ -17511,6 +17900,7 @@
       </w:pPr>
       <w:r>
         <w:rPr>
+          <w:rFonts w:ascii="Times New Roman" w:hAnsi="Times New Roman" w:cs="Times New Roman"/>
           <w:b w:val="0"/>
         </w:rPr>
         <w:t>Gambar L.1  Kode QR repositori sumber terbuka</w:t>
@@ -17543,6 +17933,7 @@
       </w:r>
       <w:r>
         <w:rPr>
+          <w:rFonts w:ascii="Times New Roman" w:hAnsi="Times New Roman" w:cs="Times New Roman"/>
           <w:b/>
           <w:color w:val="000000"/>
           <w:sz w:val="28"/>
@@ -17551,6 +17942,7 @@
       </w:r>
       <w:r>
         <w:rPr>
+          <w:rFonts w:ascii="Times New Roman" w:hAnsi="Times New Roman" w:cs="Times New Roman"/>
           <w:b/>
           <w:color w:val="000000"/>
           <w:sz w:val="28"/>
@@ -18293,6 +18685,9 @@
           </w:tcPr>
           <w:p>
             <w:r>
+              <w:rPr>
+                <w:rFonts w:ascii="Times New Roman" w:hAnsi="Times New Roman" w:cs="Times New Roman"/>
+              </w:rPr>
               <w:t>Kajian</w:t>
             </w:r>
           </w:p>
@@ -18303,6 +18698,9 @@
           </w:tcPr>
           <w:p>
             <w:r>
+              <w:rPr>
+                <w:rFonts w:ascii="Times New Roman" w:hAnsi="Times New Roman" w:cs="Times New Roman"/>
+              </w:rPr>
               <w:t>Metode</w:t>
             </w:r>
           </w:p>
@@ -18313,6 +18711,9 @@
           </w:tcPr>
           <w:p>
             <w:r>
+              <w:rPr>
+                <w:rFonts w:ascii="Times New Roman" w:hAnsi="Times New Roman" w:cs="Times New Roman"/>
+              </w:rPr>
               <w:t>Keluaran</w:t>
             </w:r>
           </w:p>
@@ -18323,6 +18724,9 @@
           </w:tcPr>
           <w:p>
             <w:r>
+              <w:rPr>
+                <w:rFonts w:ascii="Times New Roman" w:hAnsi="Times New Roman" w:cs="Times New Roman"/>
+              </w:rPr>
               <w:t>Beda dengan usulan</w:t>
             </w:r>
           </w:p>
@@ -18335,6 +18739,9 @@
           </w:tcPr>
           <w:p>
             <w:r>
+              <w:rPr>
+                <w:rFonts w:ascii="Times New Roman" w:hAnsi="Times New Roman" w:cs="Times New Roman"/>
+              </w:rPr>
               <w:t>Wan dkk. [8]</w:t>
             </w:r>
           </w:p>
@@ -18345,6 +18752,9 @@
           </w:tcPr>
           <w:p>
             <w:r>
+              <w:rPr>
+                <w:rFonts w:ascii="Times New Roman" w:hAnsi="Times New Roman" w:cs="Times New Roman"/>
+              </w:rPr>
               <w:t>Tepi + citra akuaponik</w:t>
             </w:r>
           </w:p>
@@ -18355,6 +18765,9 @@
           </w:tcPr>
           <w:p>
             <w:r>
+              <w:rPr>
+                <w:rFonts w:ascii="Times New Roman" w:hAnsi="Times New Roman" w:cs="Times New Roman"/>
+              </w:rPr>
               <w:t>Status tumbuh</w:t>
             </w:r>
           </w:p>
@@ -18365,6 +18778,9 @@
           </w:tcPr>
           <w:p>
             <w:r>
+              <w:rPr>
+                <w:rFonts w:ascii="Times New Roman" w:hAnsi="Times New Roman" w:cs="Times New Roman"/>
+              </w:rPr>
               <w:t>Tanpa grid zona dan adaptasi cahaya</w:t>
             </w:r>
           </w:p>
@@ -18377,6 +18793,9 @@
           </w:tcPr>
           <w:p>
             <w:r>
+              <w:rPr>
+                <w:rFonts w:ascii="Times New Roman" w:hAnsi="Times New Roman" w:cs="Times New Roman"/>
+              </w:rPr>
               <w:t>Abbasi dkk. [3]</w:t>
             </w:r>
           </w:p>
@@ -18387,6 +18806,9 @@
           </w:tcPr>
           <w:p>
             <w:r>
+              <w:rPr>
+                <w:rFonts w:ascii="Times New Roman" w:hAnsi="Times New Roman" w:cs="Times New Roman"/>
+              </w:rPr>
               <w:t>Warna daun selada</w:t>
             </w:r>
           </w:p>
@@ -18397,6 +18819,9 @@
           </w:tcPr>
           <w:p>
             <w:r>
+              <w:rPr>
+                <w:rFonts w:ascii="Times New Roman" w:hAnsi="Times New Roman" w:cs="Times New Roman"/>
+              </w:rPr>
               <w:t>Klorosis</w:t>
             </w:r>
           </w:p>
@@ -18407,6 +18832,9 @@
           </w:tcPr>
           <w:p>
             <w:r>
+              <w:rPr>
+                <w:rFonts w:ascii="Times New Roman" w:hAnsi="Times New Roman" w:cs="Times New Roman"/>
+              </w:rPr>
               <w:t>Satu gejala, tanpa grid dan PSI</w:t>
             </w:r>
           </w:p>
@@ -18419,6 +18847,9 @@
           </w:tcPr>
           <w:p>
             <w:r>
+              <w:rPr>
+                <w:rFonts w:ascii="Times New Roman" w:hAnsi="Times New Roman" w:cs="Times New Roman"/>
+              </w:rPr>
               <w:t>Searson dkk. [2]</w:t>
             </w:r>
           </w:p>
@@ -18429,6 +18860,9 @@
           </w:tcPr>
           <w:p>
             <w:r>
+              <w:rPr>
+                <w:rFonts w:ascii="Times New Roman" w:hAnsi="Times New Roman" w:cs="Times New Roman"/>
+              </w:rPr>
               <w:t>HSV + morfologi</w:t>
             </w:r>
           </w:p>
@@ -18439,6 +18873,9 @@
           </w:tcPr>
           <w:p>
             <w:r>
+              <w:rPr>
+                <w:rFonts w:ascii="Times New Roman" w:hAnsi="Times New Roman" w:cs="Times New Roman"/>
+              </w:rPr>
               <w:t>Maska tanaman</w:t>
             </w:r>
           </w:p>
@@ -18449,6 +18886,9 @@
           </w:tcPr>
           <w:p>
             <w:r>
+              <w:rPr>
+                <w:rFonts w:ascii="Times New Roman" w:hAnsi="Times New Roman" w:cs="Times New Roman"/>
+              </w:rPr>
               <w:t>Ambang statis, tanpa adaptasi</w:t>
             </w:r>
           </w:p>
@@ -18461,6 +18901,9 @@
           </w:tcPr>
           <w:p>
             <w:r>
+              <w:rPr>
+                <w:rFonts w:ascii="Times New Roman" w:hAnsi="Times New Roman" w:cs="Times New Roman"/>
+              </w:rPr>
               <w:t>Hameed dkk. [5]</w:t>
             </w:r>
           </w:p>
@@ -18471,6 +18914,9 @@
           </w:tcPr>
           <w:p>
             <w:r>
+              <w:rPr>
+                <w:rFonts w:ascii="Times New Roman" w:hAnsi="Times New Roman" w:cs="Times New Roman"/>
+              </w:rPr>
               <w:t>Ambang histogram Hue</w:t>
             </w:r>
           </w:p>
@@ -18481,6 +18927,9 @@
           </w:tcPr>
           <w:p>
             <w:r>
+              <w:rPr>
+                <w:rFonts w:ascii="Times New Roman" w:hAnsi="Times New Roman" w:cs="Times New Roman"/>
+              </w:rPr>
               <w:t>Maska adaptif</w:t>
             </w:r>
           </w:p>
@@ -18491,6 +18940,9 @@
           </w:tcPr>
           <w:p>
             <w:r>
+              <w:rPr>
+                <w:rFonts w:ascii="Times New Roman" w:hAnsi="Times New Roman" w:cs="Times New Roman"/>
+              </w:rPr>
               <w:t>Tanpa grid panen dan skor kendali</w:t>
             </w:r>
           </w:p>
@@ -18503,6 +18955,9 @@
           </w:tcPr>
           <w:p>
             <w:r>
+              <w:rPr>
+                <w:rFonts w:ascii="Times New Roman" w:hAnsi="Times New Roman" w:cs="Times New Roman"/>
+              </w:rPr>
               <w:t>Yang dkk. [6]</w:t>
             </w:r>
           </w:p>
@@ -18513,6 +18968,9 @@
           </w:tcPr>
           <w:p>
             <w:r>
+              <w:rPr>
+                <w:rFonts w:ascii="Times New Roman" w:hAnsi="Times New Roman" w:cs="Times New Roman"/>
+              </w:rPr>
               <w:t>Pohon keputusan HSV</w:t>
             </w:r>
           </w:p>
@@ -18523,6 +18981,9 @@
           </w:tcPr>
           <w:p>
             <w:r>
+              <w:rPr>
+                <w:rFonts w:ascii="Times New Roman" w:hAnsi="Times New Roman" w:cs="Times New Roman"/>
+              </w:rPr>
               <w:t>Kehijauan</w:t>
             </w:r>
           </w:p>
@@ -18533,6 +18994,9 @@
           </w:tcPr>
           <w:p>
             <w:r>
+              <w:rPr>
+                <w:rFonts w:ascii="Times New Roman" w:hAnsi="Times New Roman" w:cs="Times New Roman"/>
+              </w:rPr>
               <w:t>Tanpa kuning/cokelat dan deploy</w:t>
             </w:r>
           </w:p>
@@ -18545,6 +19009,9 @@
           </w:tcPr>
           <w:p>
             <w:r>
+              <w:rPr>
+                <w:rFonts w:ascii="Times New Roman" w:hAnsi="Times New Roman" w:cs="Times New Roman"/>
+              </w:rPr>
               <w:t>Barbedo [7]</w:t>
             </w:r>
           </w:p>
@@ -18555,6 +19022,9 @@
           </w:tcPr>
           <w:p>
             <w:r>
+              <w:rPr>
+                <w:rFonts w:ascii="Times New Roman" w:hAnsi="Times New Roman" w:cs="Times New Roman"/>
+              </w:rPr>
               <w:t>Citra penyakit warna</w:t>
             </w:r>
           </w:p>
@@ -18565,6 +19035,9 @@
           </w:tcPr>
           <w:p>
             <w:r>
+              <w:rPr>
+                <w:rFonts w:ascii="Times New Roman" w:hAnsi="Times New Roman" w:cs="Times New Roman"/>
+              </w:rPr>
               <w:t>Area sakit</w:t>
             </w:r>
           </w:p>
@@ -18575,6 +19048,9 @@
           </w:tcPr>
           <w:p>
             <w:r>
+              <w:rPr>
+                <w:rFonts w:ascii="Times New Roman" w:hAnsi="Times New Roman" w:cs="Times New Roman"/>
+              </w:rPr>
               <w:t>Tanpa grid zona dan paket lapangan</w:t>
             </w:r>
           </w:p>
@@ -18587,6 +19063,9 @@
           </w:tcPr>
           <w:p>
             <w:r>
+              <w:rPr>
+                <w:rFonts w:ascii="Times New Roman" w:hAnsi="Times New Roman" w:cs="Times New Roman"/>
+              </w:rPr>
               <w:t>Usulan</w:t>
             </w:r>
           </w:p>
@@ -18597,6 +19076,9 @@
           </w:tcPr>
           <w:p>
             <w:r>
+              <w:rPr>
+                <w:rFonts w:ascii="Times New Roman" w:hAnsi="Times New Roman" w:cs="Times New Roman"/>
+              </w:rPr>
               <w:t>HSV adaptif + EMA + grid</w:t>
             </w:r>
           </w:p>
@@ -18607,6 +19089,9 @@
           </w:tcPr>
           <w:p>
             <w:r>
+              <w:rPr>
+                <w:rFonts w:ascii="Times New Roman" w:hAnsi="Times New Roman" w:cs="Times New Roman"/>
+              </w:rPr>
               <w:t>Peta 24 zona + PSI</w:t>
             </w:r>
           </w:p>
@@ -18617,6 +19102,9 @@
           </w:tcPr>
           <w:p>
             <w:r>
+              <w:rPr>
+                <w:rFonts w:ascii="Times New Roman" w:hAnsi="Times New Roman" w:cs="Times New Roman"/>
+              </w:rPr>
               <w:t>Gabungan ketujuh hal di atas</w:t>
             </w:r>
           </w:p>
@@ -18930,8 +19418,8 @@
       <w:pPr>
         <w:pStyle w:val="ListParagraph"/>
         <w:spacing w:line="360" w:lineRule="auto"/>
-        <w:ind w:left="360" w:firstLine="360"/>
-        <w:jc w:val="both"/>
+        <w:ind w:left="360"/>
+        <w:jc w:val="center"/>
         <w:rPr>
           <w:rFonts w:ascii="Times New Roman" w:hAnsi="Times New Roman" w:cs="Times New Roman"/>
         </w:rPr>
@@ -19188,6 +19676,256 @@
           <w:rFonts w:ascii="Times New Roman" w:hAnsi="Times New Roman" w:cs="Times New Roman"/>
         </w:rPr>
         <w:t xml:space="preserve">)   (2.1)</w:t>
+      </w:r>
+    </w:p>
+    <w:p>
+      <w:pPr>
+        <w:pStyle w:val="ListParagraph"/>
+        <w:spacing w:line="360" w:lineRule="auto"/>
+        <w:ind w:left="360"/>
+        <w:jc w:val="center"/>
+        <w:rPr>
+          <w:rFonts w:ascii="Times New Roman" w:hAnsi="Times New Roman" w:cs="Times New Roman"/>
+        </w:rPr>
+      </w:pPr>
+      <w:proofErr w:type="spellStart"/>
+      <w:proofErr w:type="spellEnd"/>
+      <w:proofErr w:type="spellStart"/>
+      <w:proofErr w:type="spellEnd"/>
+      <w:proofErr w:type="spellStart"/>
+      <w:proofErr w:type="spellEnd"/>
+      <w:proofErr w:type="spellStart"/>
+      <w:proofErr w:type="spellEnd"/>
+      <w:proofErr w:type="spellStart"/>
+      <w:proofErr w:type="spellEnd"/>
+      <w:proofErr w:type="spellStart"/>
+      <w:proofErr w:type="spellEnd"/>
+      <w:proofErr w:type="spellStart"/>
+      <w:proofErr w:type="spellEnd"/>
+      <w:proofErr w:type="spellStart"/>
+      <w:proofErr w:type="spellEnd"/>
+      <w:proofErr w:type="spellStart"/>
+      <w:proofErr w:type="spellEnd"/>
+      <w:proofErr w:type="spellStart"/>
+      <w:proofErr w:type="spellEnd"/>
+      <w:proofErr w:type="spellStart"/>
+      <w:proofErr w:type="spellEnd"/>
+      <w:proofErr w:type="spellStart"/>
+      <w:proofErr w:type="spellEnd"/>
+      <w:proofErr w:type="spellStart"/>
+      <w:proofErr w:type="spellEnd"/>
+      <w:proofErr w:type="spellStart"/>
+      <w:proofErr w:type="spellEnd"/>
+      <w:proofErr w:type="spellStart"/>
+      <w:proofErr w:type="spellEnd"/>
+      <w:proofErr w:type="spellStart"/>
+      <w:proofErr w:type="spellEnd"/>
+      <w:proofErr w:type="spellStart"/>
+      <w:proofErr w:type="spellEnd"/>
+      <w:proofErr w:type="spellStart"/>
+      <w:proofErr w:type="spellEnd"/>
+      <w:proofErr w:type="spellStart"/>
+      <w:proofErr w:type="spellEnd"/>
+      <w:proofErr w:type="spellStart"/>
+      <w:proofErr w:type="spellEnd"/>
+      <w:proofErr w:type="spellStart"/>
+      <w:proofErr w:type="spellEnd"/>
+      <w:proofErr w:type="spellStart"/>
+      <w:proofErr w:type="spellEnd"/>
+      <w:proofErr w:type="spellStart"/>
+      <w:proofErr w:type="spellEnd"/>
+      <w:proofErr w:type="spellStart"/>
+      <w:proofErr w:type="spellEnd"/>
+      <w:proofErr w:type="spellStart"/>
+      <w:proofErr w:type="spellEnd"/>
+      <w:proofErr w:type="spellStart"/>
+      <w:proofErr w:type="spellEnd"/>
+      <w:proofErr w:type="spellStart"/>
+      <w:proofErr w:type="spellEnd"/>
+      <w:proofErr w:type="spellStart"/>
+      <w:proofErr w:type="spellEnd"/>
+      <w:proofErr w:type="spellStart"/>
+      <w:proofErr w:type="spellEnd"/>
+      <w:proofErr w:type="spellStart"/>
+      <w:proofErr w:type="spellEnd"/>
+      <w:proofErr w:type="spellStart"/>
+      <w:proofErr w:type="spellEnd"/>
+      <w:proofErr w:type="spellStart"/>
+      <w:proofErr w:type="spellEnd"/>
+      <w:proofErr w:type="spellStart"/>
+      <w:proofErr w:type="spellEnd"/>
+      <w:proofErr w:type="spellStart"/>
+      <w:proofErr w:type="spellEnd"/>
+      <w:proofErr w:type="spellStart"/>
+      <w:proofErr w:type="spellEnd"/>
+      <w:proofErr w:type="spellStart"/>
+      <w:proofErr w:type="spellEnd"/>
+      <w:proofErr w:type="spellStart"/>
+      <w:proofErr w:type="spellEnd"/>
+      <w:proofErr w:type="spellStart"/>
+      <w:proofErr w:type="spellEnd"/>
+      <w:proofErr w:type="spellStart"/>
+      <w:proofErr w:type="spellEnd"/>
+      <w:proofErr w:type="spellStart"/>
+      <w:proofErr w:type="spellEnd"/>
+      <w:proofErr w:type="spellStart"/>
+      <w:proofErr w:type="spellEnd"/>
+      <w:proofErr w:type="spellStart"/>
+      <w:proofErr w:type="spellEnd"/>
+      <w:proofErr w:type="spellStart"/>
+      <w:proofErr w:type="spellEnd"/>
+      <w:proofErr w:type="spellStart"/>
+      <w:proofErr w:type="spellEnd"/>
+      <w:proofErr w:type="spellStart"/>
+      <w:proofErr w:type="spellEnd"/>
+      <w:proofErr w:type="spellStart"/>
+      <w:proofErr w:type="spellEnd"/>
+      <w:proofErr w:type="spellStart"/>
+      <w:proofErr w:type="spellEnd"/>
+      <w:proofErr w:type="spellStart"/>
+      <w:proofErr w:type="spellEnd"/>
+      <w:proofErr w:type="spellStart"/>
+      <w:proofErr w:type="spellEnd"/>
+      <w:proofErr w:type="spellStart"/>
+      <w:proofErr w:type="spellEnd"/>
+      <w:proofErr w:type="spellStart"/>
+      <w:proofErr w:type="spellEnd"/>
+      <w:proofErr w:type="spellStart"/>
+      <w:proofErr w:type="spellEnd"/>
+      <w:proofErr w:type="spellStart"/>
+      <w:proofErr w:type="spellEnd"/>
+      <w:proofErr w:type="spellStart"/>
+      <w:proofErr w:type="spellEnd"/>
+      <w:proofErr w:type="spellStart"/>
+      <w:proofErr w:type="spellEnd"/>
+      <w:proofErr w:type="spellStart"/>
+      <w:proofErr w:type="spellEnd"/>
+      <w:proofErr w:type="spellStart"/>
+      <w:proofErr w:type="spellEnd"/>
+      <w:proofErr w:type="spellStart"/>
+      <w:proofErr w:type="spellEnd"/>
+      <w:proofErr w:type="spellStart"/>
+      <w:proofErr w:type="spellEnd"/>
+      <w:proofErr w:type="spellStart"/>
+      <w:proofErr w:type="spellEnd"/>
+      <w:proofErr w:type="spellStart"/>
+      <w:proofErr w:type="spellEnd"/>
+      <w:proofErr w:type="spellStart"/>
+      <w:proofErr w:type="spellEnd"/>
+      <w:proofErr w:type="spellStart"/>
+      <w:proofErr w:type="spellEnd"/>
+      <w:proofErr w:type="spellStart"/>
+      <w:proofErr w:type="spellEnd"/>
+      <w:proofErr w:type="spellStart"/>
+      <w:proofErr w:type="spellEnd"/>
+      <w:proofErr w:type="spellStart"/>
+      <w:proofErr w:type="spellEnd"/>
+      <w:proofErr w:type="spellStart"/>
+      <w:proofErr w:type="spellEnd"/>
+      <w:proofErr w:type="spellStart"/>
+      <w:proofErr w:type="spellEnd"/>
+      <w:proofErr w:type="spellStart"/>
+      <w:proofErr w:type="spellEnd"/>
+      <w:proofErr w:type="spellStart"/>
+      <w:proofErr w:type="spellEnd"/>
+      <w:proofErr w:type="spellStart"/>
+      <w:proofErr w:type="spellEnd"/>
+      <w:proofErr w:type="spellStart"/>
+      <w:proofErr w:type="spellEnd"/>
+      <w:proofErr w:type="spellStart"/>
+      <w:proofErr w:type="spellEnd"/>
+      <w:proofErr w:type="spellStart"/>
+      <w:proofErr w:type="spellEnd"/>
+      <w:proofErr w:type="spellStart"/>
+      <w:proofErr w:type="spellEnd"/>
+      <w:proofErr w:type="spellStart"/>
+      <w:proofErr w:type="spellEnd"/>
+      <w:proofErr w:type="spellStart"/>
+      <w:proofErr w:type="spellEnd"/>
+      <w:proofErr w:type="spellStart"/>
+      <w:proofErr w:type="spellEnd"/>
+      <w:proofErr w:type="spellStart"/>
+      <w:proofErr w:type="spellEnd"/>
+      <w:proofErr w:type="spellStart"/>
+      <w:proofErr w:type="spellEnd"/>
+      <w:proofErr w:type="spellStart"/>
+      <w:proofErr w:type="spellEnd"/>
+      <w:proofErr w:type="spellStart"/>
+      <w:proofErr w:type="spellEnd"/>
+      <w:proofErr w:type="spellStart"/>
+      <w:proofErr w:type="spellEnd"/>
+      <w:proofErr w:type="spellStart"/>
+      <w:proofErr w:type="spellEnd"/>
+      <w:proofErr w:type="spellStart"/>
+      <w:proofErr w:type="spellEnd"/>
+      <w:proofErr w:type="spellStart"/>
+      <w:proofErr w:type="spellEnd"/>
+      <w:proofErr w:type="spellStart"/>
+      <w:proofErr w:type="spellEnd"/>
+      <w:proofErr w:type="spellStart"/>
+      <w:proofErr w:type="spellEnd"/>
+      <w:proofErr w:type="spellStart"/>
+      <w:proofErr w:type="spellEnd"/>
+      <w:proofErr w:type="spellStart"/>
+      <w:proofErr w:type="spellEnd"/>
+      <w:proofErr w:type="spellStart"/>
+      <w:proofErr w:type="spellEnd"/>
+      <w:proofErr w:type="spellStart"/>
+      <w:proofErr w:type="spellEnd"/>
+      <w:r>
+        <w:rPr>
+          <w:rFonts w:ascii="Times New Roman" w:hAnsi="Times New Roman" w:cs="Times New Roman"/>
+          <w:i/>
+        </w:rPr>
+        <w:t xml:space="preserve">θ</w:t>
+      </w:r>
+      <w:r>
+        <w:rPr>
+          <w:rFonts w:ascii="Times New Roman" w:hAnsi="Times New Roman" w:cs="Times New Roman"/>
+        </w:rPr>
+        <w:t xml:space="preserve"> = arctan(</w:t>
+      </w:r>
+      <w:r>
+        <w:rPr>
+          <w:rFonts w:ascii="Times New Roman" w:hAnsi="Times New Roman" w:cs="Times New Roman"/>
+          <w:i/>
+        </w:rPr>
+        <w:t xml:space="preserve">G</w:t>
+      </w:r>
+      <w:r>
+        <w:rPr>
+          <w:rFonts w:ascii="Times New Roman" w:hAnsi="Times New Roman" w:cs="Times New Roman"/>
+          <w:i/>
+          <w:vertAlign w:val="subscript"/>
+        </w:rPr>
+        <w:t xml:space="preserve">y</w:t>
+      </w:r>
+      <w:r>
+        <w:rPr>
+          <w:rFonts w:ascii="Times New Roman" w:hAnsi="Times New Roman" w:cs="Times New Roman"/>
+        </w:rPr>
+        <w:t xml:space="preserve"> / </w:t>
+      </w:r>
+      <w:r>
+        <w:rPr>
+          <w:rFonts w:ascii="Times New Roman" w:hAnsi="Times New Roman" w:cs="Times New Roman"/>
+          <w:i/>
+        </w:rPr>
+        <w:t xml:space="preserve">G</w:t>
+      </w:r>
+      <w:r>
+        <w:rPr>
+          <w:rFonts w:ascii="Times New Roman" w:hAnsi="Times New Roman" w:cs="Times New Roman"/>
+          <w:i/>
+          <w:vertAlign w:val="subscript"/>
+        </w:rPr>
+        <w:t xml:space="preserve">x</w:t>
+      </w:r>
+      <w:r>
+        <w:rPr>
+          <w:rFonts w:ascii="Times New Roman" w:hAnsi="Times New Roman" w:cs="Times New Roman"/>
+        </w:rPr>
+        <w:t xml:space="preserve">)   (2.2)</w:t>
       </w:r>
     </w:p>
     <w:p>
@@ -19387,318 +20125,68 @@
       <w:r>
         <w:rPr>
           <w:rFonts w:ascii="Times New Roman" w:hAnsi="Times New Roman" w:cs="Times New Roman"/>
+        </w:rPr>
+        <w:t xml:space="preserve">Empat sudut terurut dipetakan ke persegi 1200×660 dengan homografi planar. Homografi tiga kali tiga atau </w:t>
+      </w:r>
+      <w:r>
+        <w:rPr>
+          <w:rFonts w:ascii="Times New Roman" w:hAnsi="Times New Roman" w:cs="Times New Roman"/>
           <w:i/>
         </w:rPr>
-        <w:t xml:space="preserve">θ</w:t>
-      </w:r>
-      <w:r>
-        <w:rPr>
-          <w:rFonts w:ascii="Times New Roman" w:hAnsi="Times New Roman" w:cs="Times New Roman"/>
-        </w:rPr>
-        <w:t xml:space="preserve"> = arctan(</w:t>
+        <w:t xml:space="preserve">H</w:t>
+      </w:r>
+      <w:r>
+        <w:rPr>
+          <w:rFonts w:ascii="Times New Roman" w:hAnsi="Times New Roman" w:cs="Times New Roman"/>
+        </w:rPr>
+        <w:t xml:space="preserve"> memetakan titik sumber </w:t>
       </w:r>
       <w:r>
         <w:rPr>
           <w:rFonts w:ascii="Times New Roman" w:hAnsi="Times New Roman" w:cs="Times New Roman"/>
           <w:i/>
         </w:rPr>
-        <w:t xml:space="preserve">G</w:t>
+        <w:t xml:space="preserve">p</w:t>
+      </w:r>
+      <w:r>
+        <w:rPr>
+          <w:rFonts w:ascii="Times New Roman" w:hAnsi="Times New Roman" w:cs="Times New Roman"/>
+        </w:rPr>
+        <w:t xml:space="preserve"> ke titik tujuan </w:t>
       </w:r>
       <w:r>
         <w:rPr>
           <w:rFonts w:ascii="Times New Roman" w:hAnsi="Times New Roman" w:cs="Times New Roman"/>
           <w:i/>
-          <w:vertAlign w:val="subscript"/>
-        </w:rPr>
-        <w:t xml:space="preserve">y</w:t>
-      </w:r>
-      <w:r>
-        <w:rPr>
-          <w:rFonts w:ascii="Times New Roman" w:hAnsi="Times New Roman" w:cs="Times New Roman"/>
-        </w:rPr>
-        <w:t xml:space="preserve"> / </w:t>
+        </w:rPr>
+        <w:t xml:space="preserve">p</w:t>
+      </w:r>
+      <w:r>
+        <w:rPr>
+          <w:rFonts w:ascii="Times New Roman" w:hAnsi="Times New Roman" w:cs="Times New Roman"/>
+        </w:rPr>
+        <w:t xml:space="preserve"> dengan faktor skala </w:t>
       </w:r>
       <w:r>
         <w:rPr>
           <w:rFonts w:ascii="Times New Roman" w:hAnsi="Times New Roman" w:cs="Times New Roman"/>
           <w:i/>
         </w:rPr>
-        <w:t xml:space="preserve">G</w:t>
-      </w:r>
-      <w:r>
-        <w:rPr>
-          <w:rFonts w:ascii="Times New Roman" w:hAnsi="Times New Roman" w:cs="Times New Roman"/>
-          <w:i/>
-          <w:vertAlign w:val="subscript"/>
-        </w:rPr>
-        <w:t xml:space="preserve">x</w:t>
-      </w:r>
-      <w:r>
-        <w:rPr>
-          <w:rFonts w:ascii="Times New Roman" w:hAnsi="Times New Roman" w:cs="Times New Roman"/>
-        </w:rPr>
-        <w:t xml:space="preserve">)   (2.2)</w:t>
+        <w:t xml:space="preserve">s</w:t>
+      </w:r>
+      <w:r>
+        <w:rPr>
+          <w:rFonts w:ascii="Times New Roman" w:hAnsi="Times New Roman" w:cs="Times New Roman"/>
+        </w:rPr>
+        <w:t xml:space="preserve"> seperti Persamaan 2.3. Bed yang tegak dibagi menjadi grid 4 baris dan 6 kolom sehingga tiap zona R1C1 sampai R4C6 dianalisis terpisah dan liputan adil antarbed.</w:t>
       </w:r>
     </w:p>
     <w:p>
       <w:pPr>
         <w:pStyle w:val="ListParagraph"/>
         <w:spacing w:line="360" w:lineRule="auto"/>
-        <w:ind w:left="360" w:firstLine="360"/>
-        <w:jc w:val="both"/>
-        <w:rPr>
-          <w:rFonts w:ascii="Times New Roman" w:hAnsi="Times New Roman" w:cs="Times New Roman"/>
-        </w:rPr>
-      </w:pPr>
-      <w:proofErr w:type="spellStart"/>
-      <w:proofErr w:type="spellEnd"/>
-      <w:proofErr w:type="spellStart"/>
-      <w:proofErr w:type="spellEnd"/>
-      <w:proofErr w:type="spellStart"/>
-      <w:proofErr w:type="spellEnd"/>
-      <w:proofErr w:type="spellStart"/>
-      <w:proofErr w:type="spellEnd"/>
-      <w:proofErr w:type="spellStart"/>
-      <w:proofErr w:type="spellEnd"/>
-      <w:proofErr w:type="spellStart"/>
-      <w:proofErr w:type="spellEnd"/>
-      <w:proofErr w:type="spellStart"/>
-      <w:proofErr w:type="spellEnd"/>
-      <w:proofErr w:type="spellStart"/>
-      <w:proofErr w:type="spellEnd"/>
-      <w:proofErr w:type="spellStart"/>
-      <w:proofErr w:type="spellEnd"/>
-      <w:proofErr w:type="spellStart"/>
-      <w:proofErr w:type="spellEnd"/>
-      <w:proofErr w:type="spellStart"/>
-      <w:proofErr w:type="spellEnd"/>
-      <w:proofErr w:type="spellStart"/>
-      <w:proofErr w:type="spellEnd"/>
-      <w:proofErr w:type="spellStart"/>
-      <w:proofErr w:type="spellEnd"/>
-      <w:proofErr w:type="spellStart"/>
-      <w:proofErr w:type="spellEnd"/>
-      <w:proofErr w:type="spellStart"/>
-      <w:proofErr w:type="spellEnd"/>
-      <w:proofErr w:type="spellStart"/>
-      <w:proofErr w:type="spellEnd"/>
-      <w:proofErr w:type="spellStart"/>
-      <w:proofErr w:type="spellEnd"/>
-      <w:proofErr w:type="spellStart"/>
-      <w:proofErr w:type="spellEnd"/>
-      <w:proofErr w:type="spellStart"/>
-      <w:proofErr w:type="spellEnd"/>
-      <w:proofErr w:type="spellStart"/>
-      <w:proofErr w:type="spellEnd"/>
-      <w:proofErr w:type="spellStart"/>
-      <w:proofErr w:type="spellEnd"/>
-      <w:proofErr w:type="spellStart"/>
-      <w:proofErr w:type="spellEnd"/>
-      <w:proofErr w:type="spellStart"/>
-      <w:proofErr w:type="spellEnd"/>
-      <w:proofErr w:type="spellStart"/>
-      <w:proofErr w:type="spellEnd"/>
-      <w:proofErr w:type="spellStart"/>
-      <w:proofErr w:type="spellEnd"/>
-      <w:proofErr w:type="spellStart"/>
-      <w:proofErr w:type="spellEnd"/>
-      <w:proofErr w:type="spellStart"/>
-      <w:proofErr w:type="spellEnd"/>
-      <w:proofErr w:type="spellStart"/>
-      <w:proofErr w:type="spellEnd"/>
-      <w:proofErr w:type="spellStart"/>
-      <w:proofErr w:type="spellEnd"/>
-      <w:proofErr w:type="spellStart"/>
-      <w:proofErr w:type="spellEnd"/>
-      <w:proofErr w:type="spellStart"/>
-      <w:proofErr w:type="spellEnd"/>
-      <w:proofErr w:type="spellStart"/>
-      <w:proofErr w:type="spellEnd"/>
-      <w:proofErr w:type="spellStart"/>
-      <w:proofErr w:type="spellEnd"/>
-      <w:proofErr w:type="spellStart"/>
-      <w:proofErr w:type="spellEnd"/>
-      <w:proofErr w:type="spellStart"/>
-      <w:proofErr w:type="spellEnd"/>
-      <w:proofErr w:type="spellStart"/>
-      <w:proofErr w:type="spellEnd"/>
-      <w:proofErr w:type="spellStart"/>
-      <w:proofErr w:type="spellEnd"/>
-      <w:proofErr w:type="spellStart"/>
-      <w:proofErr w:type="spellEnd"/>
-      <w:proofErr w:type="spellStart"/>
-      <w:proofErr w:type="spellEnd"/>
-      <w:proofErr w:type="spellStart"/>
-      <w:proofErr w:type="spellEnd"/>
-      <w:proofErr w:type="spellStart"/>
-      <w:proofErr w:type="spellEnd"/>
-      <w:proofErr w:type="spellStart"/>
-      <w:proofErr w:type="spellEnd"/>
-      <w:proofErr w:type="spellStart"/>
-      <w:proofErr w:type="spellEnd"/>
-      <w:proofErr w:type="spellStart"/>
-      <w:proofErr w:type="spellEnd"/>
-      <w:proofErr w:type="spellStart"/>
-      <w:proofErr w:type="spellEnd"/>
-      <w:proofErr w:type="spellStart"/>
-      <w:proofErr w:type="spellEnd"/>
-      <w:proofErr w:type="spellStart"/>
-      <w:proofErr w:type="spellEnd"/>
-      <w:proofErr w:type="spellStart"/>
-      <w:proofErr w:type="spellEnd"/>
-      <w:proofErr w:type="spellStart"/>
-      <w:proofErr w:type="spellEnd"/>
-      <w:proofErr w:type="spellStart"/>
-      <w:proofErr w:type="spellEnd"/>
-      <w:proofErr w:type="spellStart"/>
-      <w:proofErr w:type="spellEnd"/>
-      <w:proofErr w:type="spellStart"/>
-      <w:proofErr w:type="spellEnd"/>
-      <w:proofErr w:type="spellStart"/>
-      <w:proofErr w:type="spellEnd"/>
-      <w:proofErr w:type="spellStart"/>
-      <w:proofErr w:type="spellEnd"/>
-      <w:proofErr w:type="spellStart"/>
-      <w:proofErr w:type="spellEnd"/>
-      <w:proofErr w:type="spellStart"/>
-      <w:proofErr w:type="spellEnd"/>
-      <w:proofErr w:type="spellStart"/>
-      <w:proofErr w:type="spellEnd"/>
-      <w:proofErr w:type="spellStart"/>
-      <w:proofErr w:type="spellEnd"/>
-      <w:proofErr w:type="spellStart"/>
-      <w:proofErr w:type="spellEnd"/>
-      <w:proofErr w:type="spellStart"/>
-      <w:proofErr w:type="spellEnd"/>
-      <w:proofErr w:type="spellStart"/>
-      <w:proofErr w:type="spellEnd"/>
-      <w:proofErr w:type="spellStart"/>
-      <w:proofErr w:type="spellEnd"/>
-      <w:proofErr w:type="spellStart"/>
-      <w:proofErr w:type="spellEnd"/>
-      <w:proofErr w:type="spellStart"/>
-      <w:proofErr w:type="spellEnd"/>
-      <w:proofErr w:type="spellStart"/>
-      <w:proofErr w:type="spellEnd"/>
-      <w:proofErr w:type="spellStart"/>
-      <w:proofErr w:type="spellEnd"/>
-      <w:proofErr w:type="spellStart"/>
-      <w:proofErr w:type="spellEnd"/>
-      <w:proofErr w:type="spellStart"/>
-      <w:proofErr w:type="spellEnd"/>
-      <w:proofErr w:type="spellStart"/>
-      <w:proofErr w:type="spellEnd"/>
-      <w:proofErr w:type="spellStart"/>
-      <w:proofErr w:type="spellEnd"/>
-      <w:proofErr w:type="spellStart"/>
-      <w:proofErr w:type="spellEnd"/>
-      <w:proofErr w:type="spellStart"/>
-      <w:proofErr w:type="spellEnd"/>
-      <w:proofErr w:type="spellStart"/>
-      <w:proofErr w:type="spellEnd"/>
-      <w:proofErr w:type="spellStart"/>
-      <w:proofErr w:type="spellEnd"/>
-      <w:proofErr w:type="spellStart"/>
-      <w:proofErr w:type="spellEnd"/>
-      <w:proofErr w:type="spellStart"/>
-      <w:proofErr w:type="spellEnd"/>
-      <w:proofErr w:type="spellStart"/>
-      <w:proofErr w:type="spellEnd"/>
-      <w:proofErr w:type="spellStart"/>
-      <w:proofErr w:type="spellEnd"/>
-      <w:proofErr w:type="spellStart"/>
-      <w:proofErr w:type="spellEnd"/>
-      <w:proofErr w:type="spellStart"/>
-      <w:proofErr w:type="spellEnd"/>
-      <w:proofErr w:type="spellStart"/>
-      <w:proofErr w:type="spellEnd"/>
-      <w:proofErr w:type="spellStart"/>
-      <w:proofErr w:type="spellEnd"/>
-      <w:proofErr w:type="spellStart"/>
-      <w:proofErr w:type="spellEnd"/>
-      <w:proofErr w:type="spellStart"/>
-      <w:proofErr w:type="spellEnd"/>
-      <w:proofErr w:type="spellStart"/>
-      <w:proofErr w:type="spellEnd"/>
-      <w:proofErr w:type="spellStart"/>
-      <w:proofErr w:type="spellEnd"/>
-      <w:proofErr w:type="spellStart"/>
-      <w:proofErr w:type="spellEnd"/>
-      <w:proofErr w:type="spellStart"/>
-      <w:proofErr w:type="spellEnd"/>
-      <w:proofErr w:type="spellStart"/>
-      <w:proofErr w:type="spellEnd"/>
-      <w:proofErr w:type="spellStart"/>
-      <w:proofErr w:type="spellEnd"/>
-      <w:proofErr w:type="spellStart"/>
-      <w:proofErr w:type="spellEnd"/>
-      <w:proofErr w:type="spellStart"/>
-      <w:proofErr w:type="spellEnd"/>
-      <w:r>
-        <w:rPr>
-          <w:rFonts w:ascii="Times New Roman" w:hAnsi="Times New Roman" w:cs="Times New Roman"/>
-        </w:rPr>
-        <w:t xml:space="preserve">Empat sudut terurut dipetakan ke persegi 1200×660 dengan homografi planar. Homografi tiga kali tiga atau </w:t>
-      </w:r>
-      <w:r>
-        <w:rPr>
-          <w:rFonts w:ascii="Times New Roman" w:hAnsi="Times New Roman" w:cs="Times New Roman"/>
-          <w:i/>
-        </w:rPr>
-        <w:t xml:space="preserve">H</w:t>
-      </w:r>
-      <w:r>
-        <w:rPr>
-          <w:rFonts w:ascii="Times New Roman" w:hAnsi="Times New Roman" w:cs="Times New Roman"/>
-        </w:rPr>
-        <w:t xml:space="preserve"> memetakan titik sumber </w:t>
-      </w:r>
-      <w:r>
-        <w:rPr>
-          <w:rFonts w:ascii="Times New Roman" w:hAnsi="Times New Roman" w:cs="Times New Roman"/>
-          <w:i/>
-        </w:rPr>
-        <w:t xml:space="preserve">p</w:t>
-      </w:r>
-      <w:r>
-        <w:rPr>
-          <w:rFonts w:ascii="Times New Roman" w:hAnsi="Times New Roman" w:cs="Times New Roman"/>
-        </w:rPr>
-        <w:t xml:space="preserve"> ke titik tujuan </w:t>
-      </w:r>
-      <w:r>
-        <w:rPr>
-          <w:rFonts w:ascii="Times New Roman" w:hAnsi="Times New Roman" w:cs="Times New Roman"/>
-          <w:i/>
-        </w:rPr>
-        <w:t xml:space="preserve">p</w:t>
-      </w:r>
-      <w:r>
-        <w:rPr>
-          <w:rFonts w:ascii="Times New Roman" w:hAnsi="Times New Roman" w:cs="Times New Roman"/>
-        </w:rPr>
-        <w:t xml:space="preserve"> dengan faktor skala </w:t>
-      </w:r>
-      <w:r>
-        <w:rPr>
-          <w:rFonts w:ascii="Times New Roman" w:hAnsi="Times New Roman" w:cs="Times New Roman"/>
-          <w:i/>
-        </w:rPr>
-        <w:t xml:space="preserve">s</w:t>
-      </w:r>
-      <w:r>
-        <w:rPr>
-          <w:rFonts w:ascii="Times New Roman" w:hAnsi="Times New Roman" w:cs="Times New Roman"/>
-        </w:rPr>
-        <w:t xml:space="preserve"> seperti Persamaan 2.3. Bed yang tegak dibagi menjadi grid 4 baris dan 6 kolom sehingga tiap zona R1C1 sampai R4C6 dianalisis terpisah dan liputan adil antarbed.</w:t>
-      </w:r>
-    </w:p>
-    <w:p>
-      <w:pPr>
-        <w:pStyle w:val="ListParagraph"/>
-        <w:spacing w:line="360" w:lineRule="auto"/>
-        <w:ind w:left="360" w:firstLine="360"/>
-        <w:jc w:val="both"/>
+        <w:ind w:left="360"/>
+        <w:jc w:val="center"/>
         <w:rPr>
           <w:rFonts w:ascii="Times New Roman" w:hAnsi="Times New Roman" w:cs="Times New Roman"/>
         </w:rPr>
@@ -20306,8 +20794,8 @@
       <w:pPr>
         <w:pStyle w:val="ListParagraph"/>
         <w:spacing w:line="360" w:lineRule="auto"/>
-        <w:ind w:left="360" w:firstLine="360"/>
-        <w:jc w:val="both"/>
+        <w:ind w:left="360"/>
+        <w:jc w:val="center"/>
         <w:rPr>
           <w:rFonts w:ascii="Times New Roman" w:hAnsi="Times New Roman" w:cs="Times New Roman"/>
         </w:rPr>
@@ -20829,8 +21317,8 @@
       <w:pPr>
         <w:pStyle w:val="ListParagraph"/>
         <w:spacing w:line="360" w:lineRule="auto"/>
-        <w:ind w:left="360" w:firstLine="360"/>
-        <w:jc w:val="both"/>
+        <w:ind w:left="360"/>
+        <w:jc w:val="center"/>
         <w:rPr>
           <w:rFonts w:ascii="Times New Roman" w:hAnsi="Times New Roman" w:cs="Times New Roman"/>
         </w:rPr>
@@ -21313,8 +21801,8 @@
       <w:pPr>
         <w:pStyle w:val="ListParagraph"/>
         <w:spacing w:line="360" w:lineRule="auto"/>
-        <w:ind w:left="360" w:firstLine="360"/>
-        <w:jc w:val="both"/>
+        <w:ind w:left="360"/>
+        <w:jc w:val="center"/>
         <w:rPr>
           <w:rFonts w:ascii="Times New Roman" w:hAnsi="Times New Roman" w:cs="Times New Roman"/>
         </w:rPr>
@@ -21560,8 +22048,8 @@
       <w:pPr>
         <w:pStyle w:val="ListParagraph"/>
         <w:spacing w:line="360" w:lineRule="auto"/>
-        <w:ind w:left="360" w:firstLine="360"/>
-        <w:jc w:val="both"/>
+        <w:ind w:left="360"/>
+        <w:jc w:val="center"/>
         <w:rPr>
           <w:rFonts w:ascii="Times New Roman" w:hAnsi="Times New Roman" w:cs="Times New Roman"/>
         </w:rPr>
@@ -21807,8 +22295,8 @@
       <w:pPr>
         <w:pStyle w:val="ListParagraph"/>
         <w:spacing w:line="360" w:lineRule="auto"/>
-        <w:ind w:left="360" w:firstLine="360"/>
-        <w:jc w:val="both"/>
+        <w:ind w:left="360"/>
+        <w:jc w:val="center"/>
         <w:rPr>
           <w:rFonts w:ascii="Times New Roman" w:hAnsi="Times New Roman" w:cs="Times New Roman"/>
         </w:rPr>
@@ -22348,8 +22836,8 @@
       <w:pPr>
         <w:pStyle w:val="ListParagraph"/>
         <w:spacing w:line="360" w:lineRule="auto"/>
-        <w:ind w:left="360" w:firstLine="360"/>
-        <w:jc w:val="both"/>
+        <w:ind w:left="360"/>
+        <w:jc w:val="center"/>
         <w:rPr>
           <w:rFonts w:ascii="Times New Roman" w:hAnsi="Times New Roman" w:cs="Times New Roman"/>
         </w:rPr>
@@ -22616,8 +23104,8 @@
       <w:pPr>
         <w:pStyle w:val="ListParagraph"/>
         <w:spacing w:line="360" w:lineRule="auto"/>
-        <w:ind w:left="360" w:firstLine="360"/>
-        <w:jc w:val="both"/>
+        <w:ind w:left="360"/>
+        <w:jc w:val="center"/>
         <w:rPr>
           <w:rFonts w:ascii="Times New Roman" w:hAnsi="Times New Roman" w:cs="Times New Roman"/>
         </w:rPr>
@@ -22899,6 +23387,7 @@
       </w:r>
       <w:r>
         <w:rPr>
+          <w:rFonts w:ascii="Times New Roman" w:hAnsi="Times New Roman" w:cs="Times New Roman"/>
           <w:b/>
           <w:color w:val="000000"/>
           <w:sz w:val="28"/>
@@ -22907,6 +23396,7 @@
       </w:r>
       <w:r>
         <w:rPr>
+          <w:rFonts w:ascii="Times New Roman" w:hAnsi="Times New Roman" w:cs="Times New Roman"/>
           <w:b/>
           <w:color w:val="000000"/>
           <w:sz w:val="28"/>
@@ -23901,6 +24391,9 @@
         <w:jc w:val="center"/>
       </w:pPr>
       <w:r>
+        <w:rPr>
+          <w:rFonts w:ascii="Times New Roman" w:hAnsi="Times New Roman" w:cs="Times New Roman"/>
+        </w:rPr>
         <w:drawing>
           <wp:inline xmlns:a="http://schemas.openxmlformats.org/drawingml/2006/main" xmlns:pic="http://schemas.openxmlformats.org/drawingml/2006/picture">
             <wp:extent cx="5029200" cy="1463040"/>
@@ -24455,6 +24948,9 @@
         <w:jc w:val="center"/>
       </w:pPr>
       <w:r>
+        <w:rPr>
+          <w:rFonts w:ascii="Times New Roman" w:hAnsi="Times New Roman" w:cs="Times New Roman"/>
+        </w:rPr>
         <w:drawing>
           <wp:inline xmlns:a="http://schemas.openxmlformats.org/drawingml/2006/main" xmlns:pic="http://schemas.openxmlformats.org/drawingml/2006/picture">
             <wp:extent cx="2926080" cy="3762103"/>
@@ -24756,6 +25252,9 @@
         <w:jc w:val="center"/>
       </w:pPr>
       <w:r>
+        <w:rPr>
+          <w:rFonts w:ascii="Times New Roman" w:hAnsi="Times New Roman" w:cs="Times New Roman"/>
+        </w:rPr>
         <w:drawing>
           <wp:inline xmlns:a="http://schemas.openxmlformats.org/drawingml/2006/main" xmlns:pic="http://schemas.openxmlformats.org/drawingml/2006/picture">
             <wp:extent cx="5029200" cy="2235200"/>
@@ -25245,6 +25744,9 @@
         <w:jc w:val="center"/>
       </w:pPr>
       <w:r>
+        <w:rPr>
+          <w:rFonts w:ascii="Times New Roman" w:hAnsi="Times New Roman" w:cs="Times New Roman"/>
+        </w:rPr>
         <w:drawing>
           <wp:inline xmlns:a="http://schemas.openxmlformats.org/drawingml/2006/main" xmlns:pic="http://schemas.openxmlformats.org/drawingml/2006/picture">
             <wp:extent cx="5303520" cy="1491615"/>
@@ -25307,6 +25809,9 @@
         <w:jc w:val="center"/>
       </w:pPr>
       <w:r>
+        <w:rPr>
+          <w:rFonts w:ascii="Times New Roman" w:hAnsi="Times New Roman" w:cs="Times New Roman"/>
+        </w:rPr>
         <w:drawing>
           <wp:inline xmlns:a="http://schemas.openxmlformats.org/drawingml/2006/main" xmlns:pic="http://schemas.openxmlformats.org/drawingml/2006/picture">
             <wp:extent cx="4754880" cy="1337310"/>
@@ -25670,6 +26175,9 @@
           </w:tcPr>
           <w:p>
             <w:r>
+              <w:rPr>
+                <w:rFonts w:ascii="Times New Roman" w:hAnsi="Times New Roman" w:cs="Times New Roman"/>
+              </w:rPr>
               <w:t>Perangkat</w:t>
             </w:r>
           </w:p>
@@ -25680,6 +26188,9 @@
           </w:tcPr>
           <w:p>
             <w:r>
+              <w:rPr>
+                <w:rFonts w:ascii="Times New Roman" w:hAnsi="Times New Roman" w:cs="Times New Roman"/>
+              </w:rPr>
               <w:t>Spesifikasi</w:t>
             </w:r>
           </w:p>
@@ -25690,6 +26201,9 @@
           </w:tcPr>
           <w:p>
             <w:r>
+              <w:rPr>
+                <w:rFonts w:ascii="Times New Roman" w:hAnsi="Times New Roman" w:cs="Times New Roman"/>
+              </w:rPr>
               <w:t>Fungsi</w:t>
             </w:r>
           </w:p>
@@ -25702,6 +26216,9 @@
           </w:tcPr>
           <w:p>
             <w:r>
+              <w:rPr>
+                <w:rFonts w:ascii="Times New Roman" w:hAnsi="Times New Roman" w:cs="Times New Roman"/>
+              </w:rPr>
               <w:t>Raspberry Pi 4B</w:t>
             </w:r>
           </w:p>
@@ -25712,6 +26229,9 @@
           </w:tcPr>
           <w:p>
             <w:r>
+              <w:rPr>
+                <w:rFonts w:ascii="Times New Roman" w:hAnsi="Times New Roman" w:cs="Times New Roman"/>
+              </w:rPr>
               <w:t>RAM 2 GB, Debian 13, Python 3.13</w:t>
             </w:r>
           </w:p>
@@ -25722,6 +26242,9 @@
           </w:tcPr>
           <w:p>
             <w:r>
+              <w:rPr>
+                <w:rFonts w:ascii="Times New Roman" w:hAnsi="Times New Roman" w:cs="Times New Roman"/>
+              </w:rPr>
               <w:t>Komputasi pipeline tiap 10 menit</w:t>
             </w:r>
           </w:p>
@@ -25734,6 +26257,9 @@
           </w:tcPr>
           <w:p>
             <w:r>
+              <w:rPr>
+                <w:rFonts w:ascii="Times New Roman" w:hAnsi="Times New Roman" w:cs="Times New Roman"/>
+              </w:rPr>
               <w:t>Kamera CSI IR 5MP</w:t>
             </w:r>
           </w:p>
@@ -25744,6 +26270,9 @@
           </w:tcPr>
           <w:p>
             <w:r>
+              <w:rPr>
+                <w:rFonts w:ascii="Times New Roman" w:hAnsi="Times New Roman" w:cs="Times New Roman"/>
+              </w:rPr>
               <w:t>Sensor ov5647, 1296×972 via libcamera</w:t>
             </w:r>
           </w:p>
@@ -25754,6 +26283,9 @@
           </w:tcPr>
           <w:p>
             <w:r>
+              <w:rPr>
+                <w:rFonts w:ascii="Times New Roman" w:hAnsi="Times New Roman" w:cs="Times New Roman"/>
+              </w:rPr>
               <w:t>Akuisisi top-down</w:t>
             </w:r>
           </w:p>
@@ -25766,6 +26298,9 @@
           </w:tcPr>
           <w:p>
             <w:r>
+              <w:rPr>
+                <w:rFonts w:ascii="Times New Roman" w:hAnsi="Times New Roman" w:cs="Times New Roman"/>
+              </w:rPr>
               <w:t>Adaptor 5V/3A</w:t>
             </w:r>
           </w:p>
@@ -25776,6 +26311,9 @@
           </w:tcPr>
           <w:p>
             <w:r>
+              <w:rPr>
+                <w:rFonts w:ascii="Times New Roman" w:hAnsi="Times New Roman" w:cs="Times New Roman"/>
+              </w:rPr>
               <w:t>USB-C 5 V polos</w:t>
             </w:r>
           </w:p>
@@ -25786,6 +26324,9 @@
           </w:tcPr>
           <w:p>
             <w:r>
+              <w:rPr>
+                <w:rFonts w:ascii="Times New Roman" w:hAnsi="Times New Roman" w:cs="Times New Roman"/>
+              </w:rPr>
               <w:t>Catu daya stabil</w:t>
             </w:r>
           </w:p>
@@ -25798,6 +26339,9 @@
           </w:tcPr>
           <w:p>
             <w:r>
+              <w:rPr>
+                <w:rFonts w:ascii="Times New Roman" w:hAnsi="Times New Roman" w:cs="Times New Roman"/>
+              </w:rPr>
               <w:t>microSD high-endurance</w:t>
             </w:r>
           </w:p>
@@ -25808,6 +26352,9 @@
           </w:tcPr>
           <w:p>
             <w:r>
+              <w:rPr>
+                <w:rFonts w:ascii="Times New Roman" w:hAnsi="Times New Roman" w:cs="Times New Roman"/>
+              </w:rPr>
               <w:t>Minimal 16 GB</w:t>
             </w:r>
           </w:p>
@@ -25818,6 +26365,9 @@
           </w:tcPr>
           <w:p>
             <w:r>
+              <w:rPr>
+                <w:rFonts w:ascii="Times New Roman" w:hAnsi="Times New Roman" w:cs="Times New Roman"/>
+              </w:rPr>
               <w:t>Media sistem 24/7</w:t>
             </w:r>
           </w:p>
@@ -25830,6 +26380,9 @@
           </w:tcPr>
           <w:p>
             <w:r>
+              <w:rPr>
+                <w:rFonts w:ascii="Times New Roman" w:hAnsi="Times New Roman" w:cs="Times New Roman"/>
+              </w:rPr>
               <w:t>Rumah kamera 3DP</w:t>
             </w:r>
           </w:p>
@@ -25840,6 +26393,9 @@
           </w:tcPr>
           <w:p>
             <w:r>
+              <w:rPr>
+                <w:rFonts w:ascii="Times New Roman" w:hAnsi="Times New Roman" w:cs="Times New Roman"/>
+              </w:rPr>
               <w:t>PETG, IP65, sun shield, silica</w:t>
             </w:r>
           </w:p>
@@ -25850,6 +26406,9 @@
           </w:tcPr>
           <w:p>
             <w:r>
+              <w:rPr>
+                <w:rFonts w:ascii="Times New Roman" w:hAnsi="Times New Roman" w:cs="Times New Roman"/>
+              </w:rPr>
               <w:t>Pelindung outdoor</w:t>
             </w:r>
           </w:p>
@@ -25862,6 +26421,9 @@
           </w:tcPr>
           <w:p>
             <w:r>
+              <w:rPr>
+                <w:rFonts w:ascii="Times New Roman" w:hAnsi="Times New Roman" w:cs="Times New Roman"/>
+              </w:rPr>
               <w:t>Laptop</w:t>
             </w:r>
           </w:p>
@@ -25872,6 +26434,9 @@
           </w:tcPr>
           <w:p>
             <w:r>
+              <w:rPr>
+                <w:rFonts w:ascii="Times New Roman" w:hAnsi="Times New Roman" w:cs="Times New Roman"/>
+              </w:rPr>
               <w:t>Windows, Python 3.12</w:t>
             </w:r>
           </w:p>
@@ -25882,6 +26447,9 @@
           </w:tcPr>
           <w:p>
             <w:r>
+              <w:rPr>
+                <w:rFonts w:ascii="Times New Roman" w:hAnsi="Times New Roman" w:cs="Times New Roman"/>
+              </w:rPr>
               <w:t>Analisis video dan GT</w:t>
             </w:r>
           </w:p>
@@ -25929,6 +26497,9 @@
           </w:tcPr>
           <w:p>
             <w:r>
+              <w:rPr>
+                <w:rFonts w:ascii="Times New Roman" w:hAnsi="Times New Roman" w:cs="Times New Roman"/>
+              </w:rPr>
               <w:t>Perangkat lunak</w:t>
             </w:r>
           </w:p>
@@ -25939,6 +26510,9 @@
           </w:tcPr>
           <w:p>
             <w:r>
+              <w:rPr>
+                <w:rFonts w:ascii="Times New Roman" w:hAnsi="Times New Roman" w:cs="Times New Roman"/>
+              </w:rPr>
               <w:t>Versi/Sumber</w:t>
             </w:r>
           </w:p>
@@ -25949,6 +26523,9 @@
           </w:tcPr>
           <w:p>
             <w:r>
+              <w:rPr>
+                <w:rFonts w:ascii="Times New Roman" w:hAnsi="Times New Roman" w:cs="Times New Roman"/>
+              </w:rPr>
               <w:t>Fungsi</w:t>
             </w:r>
           </w:p>
@@ -25961,6 +26538,9 @@
           </w:tcPr>
           <w:p>
             <w:r>
+              <w:rPr>
+                <w:rFonts w:ascii="Times New Roman" w:hAnsi="Times New Roman" w:cs="Times New Roman"/>
+              </w:rPr>
               <w:t>OpenCV headless</w:t>
             </w:r>
           </w:p>
@@ -25971,6 +26551,9 @@
           </w:tcPr>
           <w:p>
             <w:r>
+              <w:rPr>
+                <w:rFonts w:ascii="Times New Roman" w:hAnsi="Times New Roman" w:cs="Times New Roman"/>
+              </w:rPr>
               <w:t>4.10.0</w:t>
             </w:r>
           </w:p>
@@ -25981,6 +26564,9 @@
           </w:tcPr>
           <w:p>
             <w:r>
+              <w:rPr>
+                <w:rFonts w:ascii="Times New Roman" w:hAnsi="Times New Roman" w:cs="Times New Roman"/>
+              </w:rPr>
               <w:t>Canny, kontur, warp, HSV</w:t>
             </w:r>
           </w:p>
@@ -25993,6 +26579,9 @@
           </w:tcPr>
           <w:p>
             <w:r>
+              <w:rPr>
+                <w:rFonts w:ascii="Times New Roman" w:hAnsi="Times New Roman" w:cs="Times New Roman"/>
+              </w:rPr>
               <w:t>NumPy</w:t>
             </w:r>
           </w:p>
@@ -26003,6 +26592,9 @@
           </w:tcPr>
           <w:p>
             <w:r>
+              <w:rPr>
+                <w:rFonts w:ascii="Times New Roman" w:hAnsi="Times New Roman" w:cs="Times New Roman"/>
+              </w:rPr>
               <w:t>1.26.4</w:t>
             </w:r>
           </w:p>
@@ -26013,6 +26605,9 @@
           </w:tcPr>
           <w:p>
             <w:r>
+              <w:rPr>
+                <w:rFonts w:ascii="Times New Roman" w:hAnsi="Times New Roman" w:cs="Times New Roman"/>
+              </w:rPr>
               <w:t>Operasi matriks dan maska</w:t>
             </w:r>
           </w:p>
@@ -26025,6 +26620,9 @@
           </w:tcPr>
           <w:p>
             <w:r>
+              <w:rPr>
+                <w:rFonts w:ascii="Times New Roman" w:hAnsi="Times New Roman" w:cs="Times New Roman"/>
+              </w:rPr>
               <w:t>firebase-admin</w:t>
             </w:r>
           </w:p>
@@ -26035,6 +26633,9 @@
           </w:tcPr>
           <w:p>
             <w:r>
+              <w:rPr>
+                <w:rFonts w:ascii="Times New Roman" w:hAnsi="Times New Roman" w:cs="Times New Roman"/>
+              </w:rPr>
               <w:t>6.5.0</w:t>
             </w:r>
           </w:p>
@@ -26045,6 +26646,9 @@
           </w:tcPr>
           <w:p>
             <w:r>
+              <w:rPr>
+                <w:rFonts w:ascii="Times New Roman" w:hAnsi="Times New Roman" w:cs="Times New Roman"/>
+              </w:rPr>
               <w:t>Uplink Firestore/Storage</w:t>
             </w:r>
           </w:p>
@@ -26057,6 +26661,9 @@
           </w:tcPr>
           <w:p>
             <w:r>
+              <w:rPr>
+                <w:rFonts w:ascii="Times New Roman" w:hAnsi="Times New Roman" w:cs="Times New Roman"/>
+              </w:rPr>
               <w:t>Picamera2/libcamera</w:t>
             </w:r>
           </w:p>
@@ -26067,6 +26674,9 @@
           </w:tcPr>
           <w:p>
             <w:r>
+              <w:rPr>
+                <w:rFonts w:ascii="Times New Roman" w:hAnsi="Times New Roman" w:cs="Times New Roman"/>
+              </w:rPr>
               <w:t>Sistem Pi</w:t>
             </w:r>
           </w:p>
@@ -26077,6 +26687,9 @@
           </w:tcPr>
           <w:p>
             <w:r>
+              <w:rPr>
+                <w:rFonts w:ascii="Times New Roman" w:hAnsi="Times New Roman" w:cs="Times New Roman"/>
+              </w:rPr>
               <w:t>Akuisisi CSI</w:t>
             </w:r>
           </w:p>
@@ -26089,6 +26702,9 @@
           </w:tcPr>
           <w:p>
             <w:r>
+              <w:rPr>
+                <w:rFonts w:ascii="Times New Roman" w:hAnsi="Times New Roman" w:cs="Times New Roman"/>
+              </w:rPr>
               <w:t>Tailscale + SSH</w:t>
             </w:r>
           </w:p>
@@ -26099,6 +26715,9 @@
           </w:tcPr>
           <w:p>
             <w:r>
+              <w:rPr>
+                <w:rFonts w:ascii="Times New Roman" w:hAnsi="Times New Roman" w:cs="Times New Roman"/>
+              </w:rPr>
               <w:t>Layanan jarak jauh</w:t>
             </w:r>
           </w:p>
@@ -26109,6 +26728,9 @@
           </w:tcPr>
           <w:p>
             <w:r>
+              <w:rPr>
+                <w:rFonts w:ascii="Times New Roman" w:hAnsi="Times New Roman" w:cs="Times New Roman"/>
+              </w:rPr>
               <w:t>Administrasi tanpa buka port</w:t>
             </w:r>
           </w:p>
@@ -26121,6 +26743,9 @@
           </w:tcPr>
           <w:p>
             <w:r>
+              <w:rPr>
+                <w:rFonts w:ascii="Times New Roman" w:hAnsi="Times New Roman" w:cs="Times New Roman"/>
+              </w:rPr>
               <w:t>Dasbor web statis</w:t>
             </w:r>
           </w:p>
@@ -26131,6 +26756,9 @@
           </w:tcPr>
           <w:p>
             <w:r>
+              <w:rPr>
+                <w:rFonts w:ascii="Times New Roman" w:hAnsi="Times New Roman" w:cs="Times New Roman"/>
+              </w:rPr>
               <w:t>web/ tanpa build</w:t>
             </w:r>
           </w:p>
@@ -26141,6 +26769,9 @@
           </w:tcPr>
           <w:p>
             <w:r>
+              <w:rPr>
+                <w:rFonts w:ascii="Times New Roman" w:hAnsi="Times New Roman" w:cs="Times New Roman"/>
+              </w:rPr>
               <w:t>Heatmap 4×6 dan grafik 24 jam</w:t>
             </w:r>
           </w:p>
@@ -26480,6 +27111,9 @@
           </w:tcPr>
           <w:p>
             <w:r>
+              <w:rPr>
+                <w:rFonts w:ascii="Times New Roman" w:hAnsi="Times New Roman" w:cs="Times New Roman"/>
+              </w:rPr>
               <w:t>Skenario</w:t>
             </w:r>
           </w:p>
@@ -26490,6 +27124,9 @@
           </w:tcPr>
           <w:p>
             <w:r>
+              <w:rPr>
+                <w:rFonts w:ascii="Times New Roman" w:hAnsi="Times New Roman" w:cs="Times New Roman"/>
+              </w:rPr>
               <w:t>Data</w:t>
             </w:r>
           </w:p>
@@ -26500,6 +27137,9 @@
           </w:tcPr>
           <w:p>
             <w:r>
+              <w:rPr>
+                <w:rFonts w:ascii="Times New Roman" w:hAnsi="Times New Roman" w:cs="Times New Roman"/>
+              </w:rPr>
               <w:t>Metrik dan target</w:t>
             </w:r>
           </w:p>
@@ -26510,6 +27150,9 @@
           </w:tcPr>
           <w:p>
             <w:r>
+              <w:rPr>
+                <w:rFonts w:ascii="Times New Roman" w:hAnsi="Times New Roman" w:cs="Times New Roman"/>
+              </w:rPr>
               <w:t>Acuan</w:t>
             </w:r>
           </w:p>
@@ -26522,6 +27165,9 @@
           </w:tcPr>
           <w:p>
             <w:r>
+              <w:rPr>
+                <w:rFonts w:ascii="Times New Roman" w:hAnsi="Times New Roman" w:cs="Times New Roman"/>
+              </w:rPr>
               <w:t>Stabilitas iluminasi</w:t>
             </w:r>
           </w:p>
@@ -26532,6 +27178,9 @@
           </w:tcPr>
           <w:p>
             <w:r>
+              <w:rPr>
+                <w:rFonts w:ascii="Times New Roman" w:hAnsi="Times New Roman" w:cs="Times New Roman"/>
+              </w:rPr>
               <w:t>18 video pagi/siang/sore</w:t>
             </w:r>
           </w:p>
@@ -26542,6 +27191,9 @@
           </w:tcPr>
           <w:p>
             <w:r>
+              <w:rPr>
+                <w:rFonts w:ascii="Times New Roman" w:hAnsi="Times New Roman" w:cs="Times New Roman"/>
+              </w:rPr>
               <w:t>Jitter turun &gt;=40 persen, liputan stabil</w:t>
             </w:r>
           </w:p>
@@ -26552,6 +27204,9 @@
           </w:tcPr>
           <w:p>
             <w:r>
+              <w:rPr>
+                <w:rFonts w:ascii="Times New Roman" w:hAnsi="Times New Roman" w:cs="Times New Roman"/>
+              </w:rPr>
               <w:t>Persamaan 2.5</w:t>
             </w:r>
           </w:p>
@@ -26564,6 +27219,9 @@
           </w:tcPr>
           <w:p>
             <w:r>
+              <w:rPr>
+                <w:rFonts w:ascii="Times New Roman" w:hAnsi="Times New Roman" w:cs="Times New Roman"/>
+              </w:rPr>
               <w:t>Akurasi segmentasi</w:t>
             </w:r>
           </w:p>
@@ -26574,6 +27232,9 @@
           </w:tcPr>
           <w:p>
             <w:r>
+              <w:rPr>
+                <w:rFonts w:ascii="Times New Roman" w:hAnsi="Times New Roman" w:cs="Times New Roman"/>
+              </w:rPr>
               <w:t>5 mask ground truth</w:t>
             </w:r>
           </w:p>
@@ -26584,6 +27245,9 @@
           </w:tcPr>
           <w:p>
             <w:r>
+              <w:rPr>
+                <w:rFonts w:ascii="Times New Roman" w:hAnsi="Times New Roman" w:cs="Times New Roman"/>
+              </w:rPr>
               <w:t>F1 0,85-0,95, IoU per kelas</w:t>
             </w:r>
           </w:p>
@@ -26594,6 +27258,9 @@
           </w:tcPr>
           <w:p>
             <w:r>
+              <w:rPr>
+                <w:rFonts w:ascii="Times New Roman" w:hAnsi="Times New Roman" w:cs="Times New Roman"/>
+              </w:rPr>
               <w:t>Persamaan 2.8-2.9</w:t>
             </w:r>
           </w:p>
@@ -26606,6 +27273,9 @@
           </w:tcPr>
           <w:p>
             <w:r>
+              <w:rPr>
+                <w:rFonts w:ascii="Times New Roman" w:hAnsi="Times New Roman" w:cs="Times New Roman"/>
+              </w:rPr>
               <w:t>Kesehatan dan PSI</w:t>
             </w:r>
           </w:p>
@@ -26616,6 +27286,9 @@
           </w:tcPr>
           <w:p>
             <w:r>
+              <w:rPr>
+                <w:rFonts w:ascii="Times New Roman" w:hAnsi="Times New Roman" w:cs="Times New Roman"/>
+              </w:rPr>
               <w:t>5 foto lapangan + foto sakit</w:t>
             </w:r>
           </w:p>
@@ -26626,6 +27299,9 @@
           </w:tcPr>
           <w:p>
             <w:r>
+              <w:rPr>
+                <w:rFonts w:ascii="Times New Roman" w:hAnsi="Times New Roman" w:cs="Times New Roman"/>
+              </w:rPr>
               <w:t>0 zona sakit palsu, PSI 0-0,1 saat sehat</w:t>
             </w:r>
           </w:p>
@@ -26636,6 +27312,9 @@
           </w:tcPr>
           <w:p>
             <w:r>
+              <w:rPr>
+                <w:rFonts w:ascii="Times New Roman" w:hAnsi="Times New Roman" w:cs="Times New Roman"/>
+              </w:rPr>
               <w:t>Persamaan 2.6-2.7</w:t>
             </w:r>
           </w:p>
@@ -26648,6 +27327,9 @@
           </w:tcPr>
           <w:p>
             <w:r>
+              <w:rPr>
+                <w:rFonts w:ascii="Times New Roman" w:hAnsi="Times New Roman" w:cs="Times New Roman"/>
+              </w:rPr>
               <w:t>Banding metode</w:t>
             </w:r>
           </w:p>
@@ -26658,6 +27340,9 @@
           </w:tcPr>
           <w:p>
             <w:r>
+              <w:rPr>
+                <w:rFonts w:ascii="Times New Roman" w:hAnsi="Times New Roman" w:cs="Times New Roman"/>
+              </w:rPr>
               <w:t>5 gambar GT</w:t>
             </w:r>
           </w:p>
@@ -26668,6 +27353,9 @@
           </w:tcPr>
           <w:p>
             <w:r>
+              <w:rPr>
+                <w:rFonts w:ascii="Times New Roman" w:hAnsi="Times New Roman" w:cs="Times New Roman"/>
+              </w:rPr>
               <w:t>HSV vs ExG vs Otsu-Hue</w:t>
             </w:r>
           </w:p>
@@ -26678,6 +27366,9 @@
           </w:tcPr>
           <w:p>
             <w:r>
+              <w:rPr>
+                <w:rFonts w:ascii="Times New Roman" w:hAnsi="Times New Roman" w:cs="Times New Roman"/>
+              </w:rPr>
               <w:t>Tabel 2.1</w:t>
             </w:r>
           </w:p>
@@ -26690,6 +27381,9 @@
           </w:tcPr>
           <w:p>
             <w:r>
+              <w:rPr>
+                <w:rFonts w:ascii="Times New Roman" w:hAnsi="Times New Roman" w:cs="Times New Roman"/>
+              </w:rPr>
               <w:t>Burn-in lapangan</w:t>
             </w:r>
           </w:p>
@@ -26700,6 +27394,9 @@
           </w:tcPr>
           <w:p>
             <w:r>
+              <w:rPr>
+                <w:rFonts w:ascii="Times New Roman" w:hAnsi="Times New Roman" w:cs="Times New Roman"/>
+              </w:rPr>
               <w:t>24 jam, 144 siklus</w:t>
             </w:r>
           </w:p>
@@ -26710,6 +27407,9 @@
           </w:tcPr>
           <w:p>
             <w:r>
+              <w:rPr>
+                <w:rFonts w:ascii="Times New Roman" w:hAnsi="Times New Roman" w:cs="Times New Roman"/>
+              </w:rPr>
               <w:t>&gt;=140 OK, suhu &lt;70 °C</w:t>
             </w:r>
           </w:p>
@@ -26720,6 +27420,9 @@
           </w:tcPr>
           <w:p>
             <w:r>
+              <w:rPr>
+                <w:rFonts w:ascii="Times New Roman" w:hAnsi="Times New Roman" w:cs="Times New Roman"/>
+              </w:rPr>
               <w:t>Tabel 3.1</w:t>
             </w:r>
           </w:p>

</xml_diff>

<commit_message>
chore: renumber sitasi dari 1, set author doc, perbaiki hal ii
</commit_message>
<xml_diff>
--- a/docs/PROPOSAL_PROTOTIPE_FELIX_ENRIQUE_2305110019.docx
+++ b/docs/PROPOSAL_PROTOTIPE_FELIX_ENRIQUE_2305110019.docx
@@ -2838,7 +2838,7 @@
           <w:rFonts w:ascii="Times New Roman" w:hAnsi="Times New Roman" w:cs="Times New Roman"/>
           <w:i w:val="0"/>
         </w:rPr>
-        <w:t>Sistem akuaponik mengintegrasikan budidaya ikan dan tanaman melalui sirkulasi air yang sama sehingga kondisi air dan kondisi tanaman saling memengaruhi [11]. Monitoring kualitas air dan kondisi lingkungan menjadi bagian penting sistem akuaponik karena perubahan parameter air memengaruhi penyerapan nutrisi tanaman, seperti dipantau pada sistem aquaponik skala kecil [12]. Pada sistem akuaponik di Aquaponik Eco Farm Universitas Negeri Semarang (UNNES), kolam ikan nila digunakan sebagai sumber air dan nutrisi bagi tanaman kangkung pada bak tanam berukuran 2 m × 1,1 m. Berdasarkan observasi dan wawancara awal dengan pengelola, salah satu persoalan yang ditemukan adalah penilaian kesiapan panen yang masih dilakukan secara visual. Penilaian visual tersebut bersifat subjektif sehingga keputusan panen antarpetani dan antarbed tidak konsisten, sedangkan bed tidak tumbuh seragam antara bagian tepi dan bagian tengah. Akibatnya panen terlalu dini menurunkan biomassa, sedangkan panen yang terlambat menurunkan mutu daun. Permasalahan tersebut menuntut peta kelayakan panen per zona yang objektif dan berulang. Prototipe ini membagi bak tanam menjadi grid 4×6 atau 24 zona dan menilai tiap zona secara terpisah sehingga panen selektif per zona dapat direncanakan.</w:t>
+        <w:t>Sistem akuaponik mengintegrasikan budidaya ikan dan tanaman melalui sirkulasi air yang sama sehingga kondisi air dan kondisi tanaman saling memengaruhi [1]. Monitoring kualitas air dan kondisi lingkungan menjadi bagian penting sistem akuaponik karena perubahan parameter air memengaruhi penyerapan nutrisi tanaman, seperti dipantau pada sistem aquaponik skala kecil [2]. Pada sistem akuaponik di Aquaponik Eco Farm Universitas Negeri Semarang (UNNES), kolam ikan nila digunakan sebagai sumber air dan nutrisi bagi tanaman kangkung pada bak tanam berukuran 2 m × 1,1 m. Berdasarkan observasi dan wawancara awal dengan pengelola, salah satu persoalan yang ditemukan adalah penilaian kesiapan panen yang masih dilakukan secara visual. Penilaian visual tersebut bersifat subjektif sehingga keputusan panen antarpetani dan antarbed tidak konsisten, sedangkan bed tidak tumbuh seragam antara bagian tepi dan bagian tengah. Akibatnya panen terlalu dini menurunkan biomassa, sedangkan panen yang terlambat menurunkan mutu daun. Permasalahan tersebut menuntut peta kelayakan panen per zona yang objektif dan berulang. Prototipe ini membagi bak tanam menjadi grid 4×6 atau 24 zona dan menilai tiap zona secara terpisah sehingga panen selektif per zona dapat direncanakan.</w:t>
       </w:r>
       <w:proofErr w:type="spellStart"/>
       <w:r>
@@ -5002,7 +5002,7 @@
           <w:rFonts w:ascii="Times New Roman" w:hAnsi="Times New Roman" w:cs="Times New Roman"/>
           <w:i w:val="0"/>
         </w:rPr>
-        <w:t xml:space="preserve">). Tutupan kanopi berkorelasi dengan biomassa dan fase tumbuh sehingga ambang tutupan dipakai sebagai kriteria panen pada berbagai komoditas daun. Tantangan utama pengukuran tutupan di lapangan adalah perubahan iluminasi. Cahaya pagi, siang, dan sore mengubah komponen terang citra sehingga segmentasi warna statis menghasilkan liputan yang melompat walaupun tanamannya sama [13]. Penelitian ini merumuskan faktor adaptasi iluminasi </w:t>
+        <w:t xml:space="preserve">). Tutupan kanopi berkorelasi dengan biomassa dan fase tumbuh sehingga ambang tutupan dipakai sebagai kriteria panen pada berbagai komoditas daun. Tantangan utama pengukuran tutupan di lapangan adalah perubahan iluminasi. Cahaya pagi, siang, dan sore mengubah komponen terang citra sehingga segmentasi warna statis menghasilkan liputan yang melompat walaupun tanamannya sama [3]. Penelitian ini merumuskan faktor adaptasi iluminasi </w:t>
       </w:r>
       <w:r>
         <w:rPr>
@@ -5090,7 +5090,7 @@
           <w:rFonts w:ascii="Times New Roman" w:hAnsi="Times New Roman" w:cs="Times New Roman"/>
           <w:i w:val="0"/>
         </w:rPr>
-        <w:t xml:space="preserve">Gejala daun menguning atau klorosis dan jaringan mati atau nekrosis sering disadari setelah menyebar [14]. Klorosis ditandai pergeseran warna ke rentang kuning, sedangkan nekrosis ditandai bercak cokelat yang menempel pada kanopi [15], [16]. Woebbecke dkk. [4] merumuskan rentang </w:t>
+        <w:t xml:space="preserve">Gejala daun menguning atau klorosis dan jaringan mati atau nekrosis sering disadari setelah menyebar [4]. Klorosis ditandai pergeseran warna ke rentang kuning, sedangkan nekrosis ditandai bercak cokelat yang menempel pada kanopi [5], [6]. Woebbecke dkk. [7] merumuskan rentang </w:t>
       </w:r>
       <w:r>
         <w:rPr>
@@ -6287,7 +6287,7 @@
           <w:rFonts w:ascii="Times New Roman" w:hAnsi="Times New Roman" w:cs="Times New Roman"/>
           <w:i w:val="0"/>
         </w:rPr>
-        <w:t>Wan dkk. [8] membangun sistem monitoring akuaponik berbasis komputasi tepi dengan Raspberry Pi dan pengolahan citra untuk pertumbuhan tanaman, tetapi sistem tersebut tidak menilai kelayakan panen per zona dan tidak menangani adaptasi iluminasi. Abbasi dkk. [3] mendeteksi klorosis daun selada akuaponik dari citra warna secara otomatis, tetapi kajian tersebut hanya satu gejala tanpa grid zona. Searson dkk. [2] memakai ruang warna HSV (</w:t>
+        <w:t>Wan dkk. [8] membangun sistem monitoring akuaponik berbasis komputasi tepi dengan Raspberry Pi dan pengolahan citra untuk pertumbuhan tanaman, tetapi sistem tersebut tidak menilai kelayakan panen per zona dan tidak menangani adaptasi iluminasi. Abbasi dkk. [9] mendeteksi klorosis daun selada akuaponik dari citra warna secara otomatis, tetapi kajian tersebut hanya satu gejala tanpa grid zona. Searson dkk. [10] memakai ruang warna HSV (</w:t>
       </w:r>
       <w:proofErr w:type="spellStart"/>
       <w:r>
@@ -7405,7 +7405,7 @@
           <w:rFonts w:ascii="Times New Roman" w:hAnsi="Times New Roman" w:cs="Times New Roman"/>
           <w:i w:val="0"/>
         </w:rPr>
-        <w:t xml:space="preserve">) dan operasi morfologi untuk deteksi tanaman di lapangan, tetapi ambangnya statis. Hameed dkk. [5] menentukan ambang vegetasi dari histogram </w:t>
+        <w:t xml:space="preserve">) dan operasi morfologi untuk deteksi tanaman di lapangan, tetapi ambangnya statis. Hameed dkk. [11] menentukan ambang vegetasi dari histogram </w:t>
       </w:r>
       <w:r>
         <w:rPr>
@@ -7419,7 +7419,7 @@
           <w:rFonts w:ascii="Times New Roman" w:hAnsi="Times New Roman" w:cs="Times New Roman"/>
           <w:i w:val="0"/>
         </w:rPr>
-        <w:t xml:space="preserve"> sehingga adaptif terhadap cahaya, tetapi tanpa grid panen dan skor siap kendali. Variyar dkk. [17] memantau kualitas air dan pertumbuhan tanaman akuaponik dengan komputasi tepi dan dasbor waktu nyata, sedangkan Prajapati dkk. [18] merancang sistem monitoring akuaponik berbasis mikrokontroler dengan tampilan web. Bayas dkk. [19] merangkum tren penerapan visi komputer pada sistem akuaponik, tetapi seluruh kajian tersebut belum menilai kelayakan panen per zona. Perbedaan dengan penelitian terdahulu terletak pada gabungan empat hal dalam satu prototipe ringan tanpa pembelajaran mendalam atau </w:t>
+        <w:t xml:space="preserve"> sehingga adaptif terhadap cahaya, tetapi tanpa grid panen dan skor siap kendali. Variyar dkk. [12] memantau kualitas air dan pertumbuhan tanaman akuaponik dengan komputasi tepi dan dasbor waktu nyata, sedangkan Prajapati dkk. [13] merancang sistem monitoring akuaponik berbasis mikrokontroler dengan tampilan web. Bayas dkk. [14] merangkum tren penerapan visi komputer pada sistem akuaponik, tetapi seluruh kajian tersebut belum menilai kelayakan panen per zona. Perbedaan dengan penelitian terdahulu terletak pada gabungan empat hal dalam satu prototipe ringan tanpa pembelajaran mendalam atau </w:t>
       </w:r>
       <w:r>
         <w:rPr>
@@ -18186,7 +18186,7 @@
         <w:rPr>
           <w:rFonts w:ascii="Times New Roman" w:hAnsi="Times New Roman" w:cs="Times New Roman"/>
         </w:rPr>
-        <w:t xml:space="preserve"> dengan Raspberry Pi dan pengolahan citra untuk pertumbuhan tanaman. Sistem tersebut membuktikan arsitektur sensor-kamera-komputasi tepi layak untuk akuaponik, tetapi tidak menilai kelayakan panen per zona dan tidak menangani adaptasi iluminasi. Abbasi dkk. [3] mendeteksi klorosis daun selada akuaponik dari citra warna secara otomatis. Kajian tersebut menjadi rujukan terdekat untuk deteksi menguning, tetapi hanya satu gejala dan satu bed tanpa grid zona. Searson dkk. [2] memakai ruang warna HSV dan operasi morfologi untuk deteksi tanaman di lapangan dengan iluminasi alami. Kajian tersebut menjadi dasar segmentasi hijau prototipe ini, tetapi ambangnya statis sehingga liputan melompat ketika cahaya berubah.</w:t>
+        <w:t xml:space="preserve"> dengan Raspberry Pi dan pengolahan citra untuk pertumbuhan tanaman. Sistem tersebut membuktikan arsitektur sensor-kamera-komputasi tepi layak untuk akuaponik, tetapi tidak menilai kelayakan panen per zona dan tidak menangani adaptasi iluminasi. Abbasi dkk. [9] mendeteksi klorosis daun selada akuaponik dari citra warna secara otomatis. Kajian tersebut menjadi rujukan terdekat untuk deteksi menguning, tetapi hanya satu gejala dan satu bed tanpa grid zona. Searson dkk. [10] memakai ruang warna HSV dan operasi morfologi untuk deteksi tanaman di lapangan dengan iluminasi alami. Kajian tersebut menjadi dasar segmentasi hijau prototipe ini, tetapi ambangnya statis sehingga liputan melompat ketika cahaya berubah.</w:t>
       </w:r>
     </w:p>
     <w:p>
@@ -18387,7 +18387,7 @@
         <w:rPr>
           <w:rFonts w:ascii="Times New Roman" w:hAnsi="Times New Roman" w:cs="Times New Roman"/>
         </w:rPr>
-        <w:t xml:space="preserve">Hameed dkk. [5] menentukan ambang vegetasi dari histogram </w:t>
+        <w:t xml:space="preserve">Hameed dkk. [11] menentukan ambang vegetasi dari histogram </w:t>
       </w:r>
       <w:r>
         <w:rPr>
@@ -18400,7 +18400,7 @@
         <w:rPr>
           <w:rFonts w:ascii="Times New Roman" w:hAnsi="Times New Roman" w:cs="Times New Roman"/>
         </w:rPr>
-        <w:t xml:space="preserve"> sehingga adaptif terhadap cahaya. Gagasan tersebut dipakai sebagai kerabat faktor adaptasi f pada prototipe ini. Yang dkk. [6] memakai pohon keputusan HSV untuk identifikasi kehijauan dan Barbedo [7] memetakan teknik citra digital untuk deteksi dan kuantifikasi penyakit daun berbasis warna. Kedua kajian tersebut mendukung pemisahan kuning dan cokelat sebagai gejala berbeda. Tovar dkk. [9] memakai Raspberry Pi untuk fenotipe tanaman sehingga mendukung pilihan deploy ringan. Perbandingan posisi penelitian ini terhadap tujuh kajian tersebut diringkas pada Tabel 2.1. Celah yang diisi prototipe ini adalah gabungan grid panen 4×6, adaptasi iluminasi tanpa pembelajaran mendalam, dan skor stres siap kendali dalam satu paket lapangan.</w:t>
+        <w:t xml:space="preserve"> sehingga adaptif terhadap cahaya. Gagasan tersebut dipakai sebagai kerabat faktor adaptasi f pada prototipe ini. Yang dkk. [15] memakai pohon keputusan HSV untuk identifikasi kehijauan dan Barbedo [16] memetakan teknik citra digital untuk deteksi dan kuantifikasi penyakit daun berbasis warna. Kedua kajian tersebut mendukung pemisahan kuning dan cokelat sebagai gejala berbeda. Tovar dkk. [17] memakai Raspberry Pi untuk fenotipe tanaman sehingga mendukung pilihan deploy ringan. Perbandingan posisi penelitian ini terhadap tujuh kajian tersebut diringkas pada Tabel 2.1. Celah yang diisi prototipe ini adalah gabungan grid panen 4×6, adaptasi iluminasi tanpa pembelajaran mendalam, dan skor stres siap kendali dalam satu paket lapangan.</w:t>
       </w:r>
     </w:p>
     <w:p>
@@ -18601,7 +18601,7 @@
         <w:rPr>
           <w:rFonts w:ascii="Times New Roman" w:hAnsi="Times New Roman" w:cs="Times New Roman"/>
         </w:rPr>
-        <w:t xml:space="preserve">Kajian pendukung lain diperiksa untuk memperkuat posisi prototipe ini. Zhang dkk. [20] mendeteksi baris tanaman dari citra tampak atas dengan pengelompokan posisi dan lintasan terpendek, yang sejalan dengan deteksi bed pada Bagian 2.2.1. Liakos dkk. [22] merangkum penerapan pembelajaran mesin pada pertanian dan Kamilaris dan Prenafeta-Boldú [21] merangkum penerapan pembelajaran mendalam; kedua tinjauan tersebut menegaskan bahwa pendekatan berbasis data membutuhkan pelatihan berlabel dalam jumlah besar. Perez-Marin dkk. [24] memprediksi pertumbuhan dan hasil panen tanaman hortikultura dengan jaringan saraf temporal, Mane dkk. [25] memperkirakan tinggi tanaman dan luas tajuk dari titik </w:t>
+        <w:t xml:space="preserve">Kajian pendukung lain diperiksa untuk memperkuat posisi prototipe ini. Zhang dkk. [18] mendeteksi baris tanaman dari citra tampak atas dengan pengelompokan posisi dan lintasan terpendek, yang sejalan dengan deteksi bed pada Bagian 2.2.1. Liakos dkk. [19] merangkum penerapan pembelajaran mesin pada pertanian dan Kamilaris dan Prenafeta-Boldú [20] merangkum penerapan pembelajaran mendalam; kedua tinjauan tersebut menegaskan bahwa pendekatan berbasis data membutuhkan pelatihan berlabel dalam jumlah besar. Perez-Marin dkk. [21] memprediksi pertumbuhan dan hasil panen tanaman hortikultura dengan jaringan saraf temporal, Mane dkk. [22] memperkirakan tinggi tanaman dan luas tajuk dari titik </w:t>
       </w:r>
       <w:r>
         <w:rPr>
@@ -18614,7 +18614,7 @@
         <w:rPr>
           <w:rFonts w:ascii="Times New Roman" w:hAnsi="Times New Roman" w:cs="Times New Roman"/>
         </w:rPr>
-        <w:t xml:space="preserve">, serta Athanasiadis dkk. [26] meramalkan pertumbuhan tanaman dengan </w:t>
+        <w:t xml:space="preserve">, serta Athanasiadis dkk. [23] meramalkan pertumbuhan tanaman dengan </w:t>
       </w:r>
       <w:r>
         <w:rPr>
@@ -18796,7 +18796,7 @@
               <w:rPr>
                 <w:rFonts w:ascii="Times New Roman" w:hAnsi="Times New Roman" w:cs="Times New Roman"/>
               </w:rPr>
-              <w:t>Abbasi dkk. [3]</w:t>
+              <w:t>Abbasi dkk. [9]</w:t>
             </w:r>
           </w:p>
         </w:tc>
@@ -18850,7 +18850,7 @@
               <w:rPr>
                 <w:rFonts w:ascii="Times New Roman" w:hAnsi="Times New Roman" w:cs="Times New Roman"/>
               </w:rPr>
-              <w:t>Searson dkk. [2]</w:t>
+              <w:t>Searson dkk. [10]</w:t>
             </w:r>
           </w:p>
         </w:tc>
@@ -18904,7 +18904,7 @@
               <w:rPr>
                 <w:rFonts w:ascii="Times New Roman" w:hAnsi="Times New Roman" w:cs="Times New Roman"/>
               </w:rPr>
-              <w:t>Hameed dkk. [5]</w:t>
+              <w:t>Hameed dkk. [11]</w:t>
             </w:r>
           </w:p>
         </w:tc>
@@ -18958,7 +18958,7 @@
               <w:rPr>
                 <w:rFonts w:ascii="Times New Roman" w:hAnsi="Times New Roman" w:cs="Times New Roman"/>
               </w:rPr>
-              <w:t>Yang dkk. [6]</w:t>
+              <w:t>Yang dkk. [15]</w:t>
             </w:r>
           </w:p>
         </w:tc>
@@ -19012,7 +19012,7 @@
               <w:rPr>
                 <w:rFonts w:ascii="Times New Roman" w:hAnsi="Times New Roman" w:cs="Times New Roman"/>
               </w:rPr>
-              <w:t>Barbedo [7]</w:t>
+              <w:t>Barbedo [16]</w:t>
             </w:r>
           </w:p>
         </w:tc>
@@ -19359,7 +19359,7 @@
         <w:rPr>
           <w:rFonts w:ascii="Times New Roman" w:hAnsi="Times New Roman" w:cs="Times New Roman"/>
         </w:rPr>
-        <w:t xml:space="preserve">Detektor Canny [1] mencari tepi melalui gradien multiskala, penekanan nonmaksimum atau </w:t>
+        <w:t xml:space="preserve">Detektor Canny [24] mencari tepi melalui gradien multiskala, penekanan nonmaksimum atau </w:t>
       </w:r>
       <w:r>
         <w:rPr>
@@ -20735,7 +20735,7 @@
         <w:rPr>
           <w:rFonts w:ascii="Times New Roman" w:hAnsi="Times New Roman" w:cs="Times New Roman"/>
         </w:rPr>
-        <w:t xml:space="preserve"> menyimpan identitas warna daun [4], [6]. Maska tanaman dibentuk dari gabungan dua rentang hijau muda </w:t>
+        <w:t xml:space="preserve"> menyimpan identitas warna daun [7], [15]. Maska tanaman dibentuk dari gabungan dua rentang hijau muda </w:t>
       </w:r>
       <w:r>
         <w:rPr>
@@ -23627,7 +23627,7 @@
         <w:rPr>
           <w:rFonts w:ascii="Times New Roman" w:hAnsi="Times New Roman" w:cs="Times New Roman"/>
         </w:rPr>
-        <w:t xml:space="preserve">Perancangan prototipe ini memakai pendekatan rekayasa sistem berbasis aturan visi komputer konvensional, yaitu deteksi tepi Canny, aproksimasi quad, homografi planar, dan segmentasi warna HSV adaptif iluminasi, tanpa pembelajaran mendalam atau deep learning [21], [22]. Pendekatan tersebut dipilih karena data lapangan yang tersedia terbatas pada 18 video dan lima foto, ambang warna tetap transparan dan mudah dikalibrasi ulang mengikuti karakteristik bed, serta beban komputasi ringan sehingga pipeline dapat berjalan tiap 10 menit pada Raspberry Pi 4B. Alur perancangan mengikuti observasi dan wawancara kebutuhan, perumusan arsitektur berlima tahap, implementasi pipeline beserta kontrak data, lalu pengujian iluminasi, akurasi segmentasi, dan burn-in lapangan.</w:t>
+        <w:t xml:space="preserve">Perancangan prototipe ini memakai pendekatan rekayasa sistem berbasis aturan visi komputer konvensional, yaitu deteksi tepi Canny, aproksimasi quad, homografi planar, dan segmentasi warna HSV adaptif iluminasi, tanpa pembelajaran mendalam atau deep learning [20], [19]. Pendekatan tersebut dipilih karena data lapangan yang tersedia terbatas pada 18 video dan lima foto, ambang warna tetap transparan dan mudah dikalibrasi ulang mengikuti karakteristik bed, serta beban komputasi ringan sehingga pipeline dapat berjalan tiap 10 menit pada Raspberry Pi 4B. Alur perancangan mengikuti observasi dan wawancara kebutuhan, perumusan arsitektur berlima tahap, implementasi pipeline beserta kontrak data, lalu pengujian iluminasi, akurasi segmentasi, dan burn-in lapangan.</w:t>
       </w:r>
     </w:p>
     <w:p>
@@ -24383,7 +24383,7 @@
         <w:rPr>
           <w:rFonts w:ascii="Times New Roman" w:hAnsi="Times New Roman" w:cs="Times New Roman"/>
         </w:rPr>
-        <w:t xml:space="preserve"> skema v1.1 dengan payload 2-3 KB tiap 10 menit. Tahap dasbor menampilkan heatmap 4×6, grafik 24 jam, distribusi status, dan kartu PSI secara baca saja. Tahap kendali membaca PSI, PSI maksimum, dan jumlah zona sakit menjadi keputusan pompa dengan persetujuan manusia. Perancangan sensor, komputer papan tunggal, dan aktuator dalam satu skema terkendali sejalan dengan tren otomasi greenhouse yang dirangkum Shamshiri dkk. [23]. Blok diagram pada Gambar 3.1 meringkas aliran tersebut. Kode sumber pipeline, skema Firebase, dan dasbor tersedia pada Lampiran 1.</w:t>
+        <w:t xml:space="preserve"> skema v1.1 dengan payload 2-3 KB tiap 10 menit. Tahap dasbor menampilkan heatmap 4×6, grafik 24 jam, distribusi status, dan kartu PSI secara baca saja. Tahap kendali membaca PSI, PSI maksimum, dan jumlah zona sakit menjadi keputusan pompa dengan persetujuan manusia. Perancangan sensor, komputer papan tunggal, dan aktuator dalam satu skema terkendali sejalan dengan tren otomasi greenhouse yang dirangkum Shamshiri dkk. [25]. Blok diagram pada Gambar 3.1 meringkas aliran tersebut. Kode sumber pipeline, skema Firebase, dan dasbor tersedia pada Lampiran 1.</w:t>
       </w:r>
     </w:p>
     <w:p>
@@ -27066,7 +27066,7 @@
         <w:rPr>
           <w:rFonts w:ascii="Times New Roman" w:hAnsi="Times New Roman" w:cs="Times New Roman"/>
         </w:rPr>
-        <w:t xml:space="preserve"> dan ambang Otsu-Hue mengikuti prosedur Netto dkk. [10] sehingga keunggulan metode dapat diuji pada data lapangan yang sama. Metrik sistem terdiri atas keberhasilan siklus burn-in, suhu System on Chip (SoC) dalam °C, dan keterbacaan snapshot. Skenario pada Tabel 3.3 menguji tiap rumusan masalah secara kuantitatif dan divisualkan dengan plot pengujian agar pembaca tidak menelusuri angka mentah satu per satu.</w:t>
+        <w:t xml:space="preserve"> dan ambang Otsu-Hue mengikuti prosedur Netto dkk. [26] sehingga keunggulan metode dapat diuji pada data lapangan yang sama. Metrik sistem terdiri atas keberhasilan siklus burn-in, suhu System on Chip (SoC) dalam °C, dan keterbacaan snapshot. Skenario pada Tabel 3.3 menguji tiap rumusan masalah secara kuantitatif dan divisualkan dengan plot pengujian agar pembaca tidak menelusuri angka mentah satu per satu.</w:t>
       </w:r>
     </w:p>
     <w:p>
@@ -27472,7 +27472,7 @@
           <w:b w:val="0"/>
           <w:bCs/>
         </w:rPr>
-        <w:t xml:space="preserve">[1] J. Canny, A computational approach to edge detection, IEEE Trans. Pattern Anal. Mach. Intell., vol. 8, no. 6, pp. 679-698, 1986. doi: 10.1109/TPAMI.1986.4767851.</w:t>
+        <w:t xml:space="preserve">[1] P. Lindholm-Lehto, Water quality monitoring in recirculating aquaculture systems, Aquaculture and Fisheries, 2023. doi: 10.1002/aff2.102.</w:t>
       </w:r>
     </w:p>
     <w:p>
@@ -27495,7 +27495,7 @@
           <w:b w:val="0"/>
           <w:bCs/>
         </w:rPr>
-        <w:t xml:space="preserve">[2] D. Searson dkk., Automatic crop detection under field conditions using the HSV colour space and morphological operations, Comput. Electron. Agric., vol. 134, pp. 80-89, 2017. doi: 10.1016/j.compag.2016.12.013.</w:t>
+        <w:t xml:space="preserve">[2] Y. Rahmanto, A. Rifaini, S. Samsugi, dan S. D. Riskiono, Sistem monitoring pH air pada aquaponik menggunakan mikrokontroler Arduino Uno, Jurnal Teknologi dan Sistem Tertanam, vol. 1, no. 1, 2020. doi: 10.33365/jtst.v1i1.711.</w:t>
       </w:r>
     </w:p>
     <w:p>
@@ -27518,7 +27518,7 @@
           <w:b w:val="0"/>
           <w:bCs/>
         </w:rPr>
-        <w:t xml:space="preserve">[3] R. Abbasi, P. Martinez, dan R. Ahmad, Automated visual identification of foliage chlorosis in lettuce grown in aquaponic systems, Agriculture, vol. 13, no. 3, p. 615, 2023. doi: 10.3390/agriculture13030615.</w:t>
+        <w:t xml:space="preserve">[3] S. Mardanisamani, M. Eramian dkk., Segmentation of vegetation and microplots in aerial agriculture images: A survey, Plant Phenome J., vol. 5, no. 1, 2022. doi: 10.1002/ppj2.20042.</w:t>
       </w:r>
     </w:p>
     <w:p>
@@ -27541,7 +27541,7 @@
           <w:b w:val="0"/>
           <w:bCs/>
         </w:rPr>
-        <w:t xml:space="preserve">[4] D. M. Woebbecke, G. E. Meyer, K. Von Bargen, dan D. A. Mortensen, Color indices for weed identification under various soil, residue, and lighting conditions, Trans. ASAE, vol. 38, no. 1, pp. 259-269, 1995. doi: 10.13031/2013.27838.</w:t>
+        <w:t xml:space="preserve">[4] N. Zhang dkk., A review of advanced technologies and development for hyperspectral-based plant disease detection in the past three decades, Remote Sens., vol. 12, no. 19, p. 3188, 2020. doi: 10.3390/rs12193188.</w:t>
       </w:r>
     </w:p>
     <w:p>
@@ -27564,7 +27564,7 @@
           <w:b w:val="0"/>
           <w:bCs/>
         </w:rPr>
-        <w:t xml:space="preserve">[5] I. A. Hameed, M. Usama dkk., A new vegetation segmentation approach for cropped fields based on threshold detection from hue histograms, Sensors, vol. 18, no. 4, p. 1258, 2018. doi: 10.3390/s18041258.</w:t>
+        <w:t xml:space="preserve">[5] W. Huang, Z. Yu dkk., K-mean and HSV model based segmentation of unhealthy plant leaves and classification using machine learning approach, IEEE Access, 2021.</w:t>
       </w:r>
     </w:p>
     <w:p>
@@ -27587,7 +27587,7 @@
           <w:b w:val="0"/>
           <w:bCs/>
         </w:rPr>
-        <w:t xml:space="preserve">[6] W. Yang, S. Wang, X. Zhao, J. Zhang, dan J. Feng, Greenness identification based on HSV decision tree, Inf. Process. Agric., vol. 2, no. 3-4, pp. 277-284, 2015. doi: 10.1016/j.inpa.2015.07.003.</w:t>
+        <w:t xml:space="preserve">[6] A. Raza, M. A. Khan dkk., Robust leaf disease detection using complex fuzzy sets and HSV-based color segmentation techniques, Adv. Trends Artif. Intell. Mach. Learn., vol. 3, no. 3, 2024.</w:t>
       </w:r>
     </w:p>
     <w:p>
@@ -27610,7 +27610,7 @@
           <w:b w:val="0"/>
           <w:bCs/>
         </w:rPr>
-        <w:t xml:space="preserve">[7] J. G. A. Barbedo, Digital image processing techniques for detecting, quantifying and classifying plant diseases, SpringerPlus, vol. 2, p. 660, 2013. doi: 10.1186/2193-1801-2-660.</w:t>
+        <w:t xml:space="preserve">[7] D. M. Woebbecke, G. E. Meyer, K. Von Bargen, dan D. A. Mortensen, Color indices for weed identification under various soil, residue, and lighting conditions, Trans. ASAE, vol. 38, no. 1, pp. 259-269, 1995. doi: 10.13031/2013.27838.</w:t>
       </w:r>
     </w:p>
     <w:p>
@@ -27656,7 +27656,7 @@
           <w:b w:val="0"/>
           <w:bCs/>
         </w:rPr>
-        <w:t xml:space="preserve">[9] J. C. Tovar dkk., Raspberry Pi-powered imaging for plant phenotyping, Appl. Plant Sci., vol. 6, no. 4, 2018. doi: 10.1002/aps3.1031.</w:t>
+        <w:t xml:space="preserve">[9] R. Abbasi, P. Martinez, dan R. Ahmad, Automated visual identification of foliage chlorosis in lettuce grown in aquaponic systems, Agriculture, vol. 13, no. 3, p. 615, 2023. doi: 10.3390/agriculture13030615.</w:t>
       </w:r>
     </w:p>
     <w:p>
@@ -27679,7 +27679,7 @@
           <w:b w:val="0"/>
           <w:bCs/>
         </w:rPr>
-        <w:t xml:space="preserve">[10] A. F. A. Netto dkk., Segmentation of RGB images using different vegetation indices and thresholding methods, Nativa, vol. 6, no. 4, 2018. doi: 10.31413/nativa.v6i4.5405.</w:t>
+        <w:t xml:space="preserve">[10] D. Searson dkk., Automatic crop detection under field conditions using the HSV colour space and morphological operations, Comput. Electron. Agric., vol. 134, pp. 80-89, 2017. doi: 10.1016/j.compag.2016.12.013.</w:t>
       </w:r>
     </w:p>
     <w:p>
@@ -27702,7 +27702,7 @@
           <w:b w:val="0"/>
           <w:bCs/>
         </w:rPr>
-        <w:t xml:space="preserve">[11] P. Lindholm-Lehto, Water quality monitoring in recirculating aquaculture systems, Aquaculture and Fisheries, 2023. doi: 10.1002/aff2.102.</w:t>
+        <w:t xml:space="preserve">[11] I. A. Hameed, M. Usama dkk., A new vegetation segmentation approach for cropped fields based on threshold detection from hue histograms, Sensors, vol. 18, no. 4, p. 1258, 2018. doi: 10.3390/s18041258.</w:t>
       </w:r>
     </w:p>
     <w:p>
@@ -27725,7 +27725,7 @@
           <w:b w:val="0"/>
           <w:bCs/>
         </w:rPr>
-        <w:t xml:space="preserve">[12] Y. Rahmanto, A. Rifaini, S. Samsugi, dan S. D. Riskiono, Sistem monitoring pH air pada aquaponik menggunakan mikrokontroler Arduino Uno, Jurnal Teknologi dan Sistem Tertanam, vol. 1, no. 1, 2020. doi: 10.33365/jtst.v1i1.711.</w:t>
+        <w:t xml:space="preserve">[12] V. Variyar, N. Haridas dkk., Water IoT monitoring system for aquaponics health and fishery applications, Sensors, vol. 22, no. 19, p. 7679, 2022. doi: 10.3390/s22197679.</w:t>
       </w:r>
     </w:p>
     <w:p>
@@ -27748,7 +27748,7 @@
           <w:b w:val="0"/>
           <w:bCs/>
         </w:rPr>
-        <w:t xml:space="preserve">[13] S. Mardanisamani, M. Eramian dkk., Segmentation of vegetation and microplots in aerial agriculture images: A survey, Plant Phenome J., vol. 5, no. 1, 2022. doi: 10.1002/ppj2.20042.</w:t>
+        <w:t xml:space="preserve">[13] R. Prajapati, P. Tamang, dan E. Kumar, IoT based aquaponics monitoring system, KEC Conference, Lalitpur, Nepal, 2018.</w:t>
       </w:r>
     </w:p>
     <w:p>
@@ -27771,7 +27771,7 @@
           <w:b w:val="0"/>
           <w:bCs/>
         </w:rPr>
-        <w:t xml:space="preserve">[14] N. Zhang dkk., A review of advanced technologies and development for hyperspectral-based plant disease detection in the past three decades, Remote Sens., vol. 12, no. 19, p. 3188, 2020. doi: 10.3390/rs12193188.</w:t>
+        <w:t xml:space="preserve">[14] M. C. Bayas, M. T. R. Ponce dkk., Trend forecasting of computer vision application in aquaponic cropping systems industry, IEEE Access, 2021.</w:t>
       </w:r>
     </w:p>
     <w:p>
@@ -27794,7 +27794,7 @@
           <w:b w:val="0"/>
           <w:bCs/>
         </w:rPr>
-        <w:t xml:space="preserve">[15] W. Huang, Z. Yu dkk., K-mean and HSV model based segmentation of unhealthy plant leaves and classification using machine learning approach, IEEE Access, 2021.</w:t>
+        <w:t xml:space="preserve">[15] W. Yang, S. Wang, X. Zhao, J. Zhang, dan J. Feng, Greenness identification based on HSV decision tree, Inf. Process. Agric., vol. 2, no. 3-4, pp. 277-284, 2015. doi: 10.1016/j.inpa.2015.07.003.</w:t>
       </w:r>
     </w:p>
     <w:p>
@@ -27817,7 +27817,7 @@
           <w:b w:val="0"/>
           <w:bCs/>
         </w:rPr>
-        <w:t xml:space="preserve">[16] A. Raza, M. A. Khan dkk., Robust leaf disease detection using complex fuzzy sets and HSV-based color segmentation techniques, Adv. Trends Artif. Intell. Mach. Learn., vol. 3, no. 3, 2024.</w:t>
+        <w:t xml:space="preserve">[16] J. G. A. Barbedo, Digital image processing techniques for detecting, quantifying and classifying plant diseases, SpringerPlus, vol. 2, p. 660, 2013. doi: 10.1186/2193-1801-2-660.</w:t>
       </w:r>
     </w:p>
     <w:p>
@@ -27840,7 +27840,7 @@
           <w:b w:val="0"/>
           <w:bCs/>
         </w:rPr>
-        <w:t xml:space="preserve">[17] V. Variyar, N. Haridas dkk., Water IoT monitoring system for aquaponics health and fishery applications, Sensors, vol. 22, no. 19, p. 7679, 2022. doi: 10.3390/s22197679.</w:t>
+        <w:t xml:space="preserve">[17] J. C. Tovar dkk., Raspberry Pi-powered imaging for plant phenotyping, Appl. Plant Sci., vol. 6, no. 4, 2018. doi: 10.1002/aps3.1031.</w:t>
       </w:r>
     </w:p>
     <w:p>
@@ -27863,7 +27863,7 @@
           <w:b w:val="0"/>
           <w:bCs/>
         </w:rPr>
-        <w:t xml:space="preserve">[18] R. Prajapati, P. Tamang, dan E. Kumar, IoT based aquaponics monitoring system, KEC Conference, Lalitpur, Nepal, 2018.</w:t>
+        <w:t xml:space="preserve">[18] X. Zhang, X. Li, B. Zhang, J. Zhou, G. Tian, Y. Xiong, dan B. Gu, Automated robust crop-row detection in maize fields based on position clustering algorithm and shortest path method, Comput. Electron. Agric., 2018. doi: 10.1016/j.compag.2018.09.014.</w:t>
       </w:r>
     </w:p>
     <w:p>
@@ -27886,7 +27886,7 @@
           <w:b w:val="0"/>
           <w:bCs/>
         </w:rPr>
-        <w:t xml:space="preserve">[19] M. C. Bayas, M. T. R. Ponce dkk., Trend forecasting of computer vision application in aquaponic cropping systems industry, IEEE Access, 2021.</w:t>
+        <w:t xml:space="preserve">[19] K. G. Liakos dkk., Machine learning in agriculture: A review, Sensors, vol. 18, no. 8, p. 2674, 2018. doi: 10.3390/s18082674.</w:t>
       </w:r>
     </w:p>
     <w:p>
@@ -27909,7 +27909,7 @@
           <w:b w:val="0"/>
           <w:bCs/>
         </w:rPr>
-        <w:t xml:space="preserve">[20] X. Zhang, X. Li, B. Zhang, J. Zhou, G. Tian, Y. Xiong, dan B. Gu, Automated robust crop-row detection in maize fields based on position clustering algorithm and shortest path method, Comput. Electron. Agric., 2018. doi: 10.1016/j.compag.2018.09.014.</w:t>
+        <w:t xml:space="preserve">[20] A. Kamilaris dan F. X. Prenafeta-Boldú, Deep learning in agriculture: A survey, Comput. Electron. Agric., 2018. doi: 10.1016/j.compag.2018.02.016.</w:t>
       </w:r>
     </w:p>
     <w:p>
@@ -27932,7 +27932,7 @@
           <w:b w:val="0"/>
           <w:bCs/>
         </w:rPr>
-        <w:t xml:space="preserve">[21] A. Kamilaris dan F. X. Prenafeta-Boldú, Deep learning in agriculture: A survey, Comput. Electron. Agric., 2018. doi: 10.1016/j.compag.2018.02.016.</w:t>
+        <w:t xml:space="preserve">[21] A. Perez-Marin, A. J. Slater dkk., Using deep learning to predict plant growth and yield in greenhouse environments, arXiv:1907.00624, 2019.</w:t>
       </w:r>
     </w:p>
     <w:p>
@@ -27955,7 +27955,7 @@
           <w:b w:val="0"/>
           <w:bCs/>
         </w:rPr>
-        <w:t xml:space="preserve">[22] K. G. Liakos dkk., Machine learning in agriculture: A review, Sensors, vol. 18, no. 8, p. 2674, 2018. doi: 10.3390/s18082674.</w:t>
+        <w:t xml:space="preserve">[22] P. Mane, V. Agrawal dkk., Deep learning-based prediction of plant height and crown area of vegetable crops using LiDAR point cloud, Sci. Rep., vol. 14, 2024. doi: 10.1038/s41598-024-59643-8.</w:t>
       </w:r>
     </w:p>
     <w:p>
@@ -27978,7 +27978,7 @@
           <w:b w:val="0"/>
           <w:bCs/>
         </w:rPr>
-        <w:t xml:space="preserve">[23] R. R. Shamshiri dkk., Advances in greenhouse automation and controlled environment agriculture: A transition to plant factories and urban agriculture, Int. J. Agric. Biol. Eng., vol. 11, no. 1, 2018. doi: 10.25165/j.ijabe.20181101.3210.</w:t>
+        <w:t xml:space="preserve">[23] I. Athanasiadis dkk., An autoencoder wavelet based deep neural network with attention mechanism for multistep prediction of plant growth, arXiv:2012.04041, 2020.</w:t>
       </w:r>
     </w:p>
     <w:p>
@@ -28001,7 +28001,7 @@
           <w:b w:val="0"/>
           <w:bCs/>
         </w:rPr>
-        <w:t xml:space="preserve">[24] A. Perez-Marin, A. J. Slater dkk., Using deep learning to predict plant growth and yield in greenhouse environments, arXiv:1907.00624, 2019.</w:t>
+        <w:t xml:space="preserve">[24] J. Canny, A computational approach to edge detection, IEEE Trans. Pattern Anal. Mach. Intell., vol. 8, no. 6, pp. 679-698, 1986. doi: 10.1109/TPAMI.1986.4767851.</w:t>
       </w:r>
     </w:p>
     <w:p>
@@ -28024,7 +28024,7 @@
           <w:b w:val="0"/>
           <w:bCs/>
         </w:rPr>
-        <w:t xml:space="preserve">[25] P. Mane, V. Agrawal dkk., Deep learning-based prediction of plant height and crown area of vegetable crops using LiDAR point cloud, Sci. Rep., vol. 14, 2024. doi: 10.1038/s41598-024-59643-8.</w:t>
+        <w:t xml:space="preserve">[25] R. R. Shamshiri dkk., Advances in greenhouse automation and controlled environment agriculture: A transition to plant factories and urban agriculture, Int. J. Agric. Biol. Eng., vol. 11, no. 1, 2018. doi: 10.25165/j.ijabe.20181101.3210.</w:t>
       </w:r>
     </w:p>
     <w:p>
@@ -28047,7 +28047,7 @@
           <w:b w:val="0"/>
           <w:bCs/>
         </w:rPr>
-        <w:t xml:space="preserve">[26] I. Athanasiadis dkk., An autoencoder wavelet based deep neural network with attention mechanism for multistep prediction of plant growth, arXiv:2012.04041, 2020.</w:t>
+        <w:t xml:space="preserve">[26] A. F. A. Netto dkk., Segmentation of RGB images using different vegetation indices and thresholding methods, Nativa, vol. 6, no. 4, 2018. doi: 10.31413/nativa.v6i4.5405.</w:t>
       </w:r>
     </w:p>
     <w:p>

</xml_diff>

<commit_message>
perbaiki judul 1.5.2, tambahkan maksud judul ke isi, non-bold/non-center pengembangan lebih lanjut
</commit_message>
<xml_diff>
--- a/docs/PROPOSAL_PROTOTIPE_FELIX_ENRIQUE_2305110019.docx
+++ b/docs/PROPOSAL_PROTOTIPE_FELIX_ENRIQUE_2305110019.docx
@@ -14977,7 +14977,7 @@
         <w:rPr>
           <w:rFonts w:ascii="Times New Roman" w:hAnsi="Times New Roman" w:cs="Times New Roman"/>
         </w:rPr>
-        <w:t>Prototipe yang dirancang memiliki potensi memberikan dampak fungsional pada proses pengelolaan budidaya akuaponik, khususnya dalam menentukan kesiapan panen secara lebih terukur. Keputusan tidak hanya didasarkan pada pengamatan visual, tetapi menggunakan liputan kanopi per zona, status kesehatan daun, dan Indeks Stres Tanaman atau Plant Stress Index (PSI) sebagai keluaran sistem. Peta 24 zona memungkinkan panen selektif pada zona yang siap sedangkan zona yang belum siap dibiarkan tumbuh, sedangkan status sehat, waspada, dan sakit menjadi dasar pemeriksaan lanjutan.</w:t>
+        <w:t>Judul 1.5.2 menggambarkan dampak fungsional dan komersial prototipe: dampak fungsional berkaitan dengan manfaat operasional sistem dalam mendukung keputusan panen secara lebih objektif dan terukur, sedangkan dampak komersial berkaitan dengan potensi sistem dikembangkan menjadi produk siap pakai bagi pelaku budidaya akuaponik. Prototipe yang dirancang memiliki potensi memberikan dampak fungsional pada proses pengelolaan budidaya akuaponik, khususnya dalam menentukan kesiapan panen secara lebih terukur. Keputusan tidak hanya didasarkan pada pengamatan visual, tetapi menggunakan liputan kanopi per zona, status kesehatan daun, dan Indeks Stres Tanaman atau Plant Stress Index (PSI) sebagai keluaran sistem. Peta 24 zona memungkinkan panen selektif pada zona yang siap sedangkan zona yang belum siap dibiarkan tumbuh, sedangkan status sehat, waspada, dan sakit menjadi dasar pemeriksaan lanjutan.</w:t>
       </w:r>
       <w:proofErr w:type="spellStart"/>
       <w:r>
@@ -16166,6 +16166,7 @@
       <w:r>
         <w:rPr>
           <w:rFonts w:ascii="Times New Roman" w:hAnsi="Times New Roman" w:cs="Times New Roman"/>
+          <w:b w:val="0"/>
         </w:rPr>
         <w:tab/>
       </w:r>
@@ -16173,6 +16174,7 @@
       <w:r>
         <w:rPr>
           <w:rFonts w:ascii="Times New Roman" w:hAnsi="Times New Roman" w:cs="Times New Roman"/>
+          <w:b w:val="0"/>
         </w:rPr>
         <w:t>Pengembangan</w:t>
       </w:r>
@@ -16180,6 +16182,7 @@
       <w:r>
         <w:rPr>
           <w:rFonts w:ascii="Times New Roman" w:hAnsi="Times New Roman" w:cs="Times New Roman"/>
+          <w:b w:val="0"/>
         </w:rPr>
         <w:t xml:space="preserve"> </w:t>
       </w:r>
@@ -16187,6 +16190,7 @@
       <w:r>
         <w:rPr>
           <w:rFonts w:ascii="Times New Roman" w:hAnsi="Times New Roman" w:cs="Times New Roman"/>
+          <w:b w:val="0"/>
         </w:rPr>
         <w:t>lebih</w:t>
       </w:r>
@@ -16194,6 +16198,7 @@
       <w:r>
         <w:rPr>
           <w:rFonts w:ascii="Times New Roman" w:hAnsi="Times New Roman" w:cs="Times New Roman"/>
+          <w:b w:val="0"/>
         </w:rPr>
         <w:t xml:space="preserve"> </w:t>
       </w:r>
@@ -16201,6 +16206,7 @@
       <w:r>
         <w:rPr>
           <w:rFonts w:ascii="Times New Roman" w:hAnsi="Times New Roman" w:cs="Times New Roman"/>
+          <w:b w:val="0"/>
         </w:rPr>
         <w:t>lanjut</w:t>
       </w:r>
@@ -16208,6 +16214,7 @@
       <w:r>
         <w:rPr>
           <w:rFonts w:ascii="Times New Roman" w:hAnsi="Times New Roman" w:cs="Times New Roman"/>
+          <w:b w:val="0"/>
         </w:rPr>
         <w:t xml:space="preserve"> </w:t>
       </w:r>
@@ -16215,6 +16222,7 @@
       <w:r>
         <w:rPr>
           <w:rFonts w:ascii="Times New Roman" w:hAnsi="Times New Roman" w:cs="Times New Roman"/>
+          <w:b w:val="0"/>
         </w:rPr>
         <w:t>dapat</w:t>
       </w:r>
@@ -16222,6 +16230,7 @@
       <w:r>
         <w:rPr>
           <w:rFonts w:ascii="Times New Roman" w:hAnsi="Times New Roman" w:cs="Times New Roman"/>
+          <w:b w:val="0"/>
         </w:rPr>
         <w:t xml:space="preserve"> </w:t>
       </w:r>
@@ -16229,6 +16238,7 @@
       <w:r>
         <w:rPr>
           <w:rFonts w:ascii="Times New Roman" w:hAnsi="Times New Roman" w:cs="Times New Roman"/>
+          <w:b w:val="0"/>
         </w:rPr>
         <w:t>diarahkan</w:t>
       </w:r>
@@ -16236,6 +16246,7 @@
       <w:r>
         <w:rPr>
           <w:rFonts w:ascii="Times New Roman" w:hAnsi="Times New Roman" w:cs="Times New Roman"/>
+          <w:b w:val="0"/>
         </w:rPr>
         <w:t xml:space="preserve"> pada </w:t>
       </w:r>
@@ -16243,6 +16254,7 @@
       <w:r>
         <w:rPr>
           <w:rFonts w:ascii="Times New Roman" w:hAnsi="Times New Roman" w:cs="Times New Roman"/>
+          <w:b w:val="0"/>
         </w:rPr>
         <w:t>penyederhanaan</w:t>
       </w:r>
@@ -16250,6 +16262,7 @@
       <w:r>
         <w:rPr>
           <w:rFonts w:ascii="Times New Roman" w:hAnsi="Times New Roman" w:cs="Times New Roman"/>
+          <w:b w:val="0"/>
         </w:rPr>
         <w:t xml:space="preserve"> </w:t>
       </w:r>
@@ -16257,6 +16270,7 @@
       <w:r>
         <w:rPr>
           <w:rFonts w:ascii="Times New Roman" w:hAnsi="Times New Roman" w:cs="Times New Roman"/>
+          <w:b w:val="0"/>
         </w:rPr>
         <w:t>instalasi</w:t>
       </w:r>
@@ -16264,6 +16278,7 @@
       <w:r>
         <w:rPr>
           <w:rFonts w:ascii="Times New Roman" w:hAnsi="Times New Roman" w:cs="Times New Roman"/>
+          <w:b w:val="0"/>
         </w:rPr>
         <w:t xml:space="preserve">, </w:t>
       </w:r>
@@ -16271,6 +16286,7 @@
       <w:r>
         <w:rPr>
           <w:rFonts w:ascii="Times New Roman" w:hAnsi="Times New Roman" w:cs="Times New Roman"/>
+          <w:b w:val="0"/>
         </w:rPr>
         <w:t>peningkatan</w:t>
       </w:r>
@@ -16278,6 +16294,7 @@
       <w:r>
         <w:rPr>
           <w:rFonts w:ascii="Times New Roman" w:hAnsi="Times New Roman" w:cs="Times New Roman"/>
+          <w:b w:val="0"/>
         </w:rPr>
         <w:t xml:space="preserve"> </w:t>
       </w:r>
@@ -16285,6 +16302,7 @@
       <w:r>
         <w:rPr>
           <w:rFonts w:ascii="Times New Roman" w:hAnsi="Times New Roman" w:cs="Times New Roman"/>
+          <w:b w:val="0"/>
         </w:rPr>
         <w:t>keandalan</w:t>
       </w:r>
@@ -16292,6 +16310,7 @@
       <w:r>
         <w:rPr>
           <w:rFonts w:ascii="Times New Roman" w:hAnsi="Times New Roman" w:cs="Times New Roman"/>
+          <w:b w:val="0"/>
         </w:rPr>
         <w:t xml:space="preserve"> </w:t>
       </w:r>
@@ -16299,6 +16318,7 @@
       <w:r>
         <w:rPr>
           <w:rFonts w:ascii="Times New Roman" w:hAnsi="Times New Roman" w:cs="Times New Roman"/>
+          <w:b w:val="0"/>
         </w:rPr>
         <w:t>perangkat</w:t>
       </w:r>
@@ -16306,6 +16326,7 @@
       <w:r>
         <w:rPr>
           <w:rFonts w:ascii="Times New Roman" w:hAnsi="Times New Roman" w:cs="Times New Roman"/>
+          <w:b w:val="0"/>
         </w:rPr>
         <w:t xml:space="preserve"> </w:t>
       </w:r>
@@ -16313,6 +16334,7 @@
       <w:r>
         <w:rPr>
           <w:rFonts w:ascii="Times New Roman" w:hAnsi="Times New Roman" w:cs="Times New Roman"/>
+          <w:b w:val="0"/>
         </w:rPr>
         <w:t>keras</w:t>
       </w:r>
@@ -16320,6 +16342,7 @@
       <w:r>
         <w:rPr>
           <w:rFonts w:ascii="Times New Roman" w:hAnsi="Times New Roman" w:cs="Times New Roman"/>
+          <w:b w:val="0"/>
         </w:rPr>
         <w:t xml:space="preserve">, </w:t>
       </w:r>
@@ -16327,6 +16350,7 @@
       <w:r>
         <w:rPr>
           <w:rFonts w:ascii="Times New Roman" w:hAnsi="Times New Roman" w:cs="Times New Roman"/>
+          <w:b w:val="0"/>
         </w:rPr>
         <w:t>pengembangan</w:t>
       </w:r>
@@ -16334,6 +16358,7 @@
       <w:r>
         <w:rPr>
           <w:rFonts w:ascii="Times New Roman" w:hAnsi="Times New Roman" w:cs="Times New Roman"/>
+          <w:b w:val="0"/>
         </w:rPr>
         <w:t xml:space="preserve"> </w:t>
       </w:r>
@@ -16341,6 +16366,7 @@
       <w:r>
         <w:rPr>
           <w:rFonts w:ascii="Times New Roman" w:hAnsi="Times New Roman" w:cs="Times New Roman"/>
+          <w:b w:val="0"/>
         </w:rPr>
         <w:t>antarmuka</w:t>
       </w:r>
@@ -16348,6 +16374,7 @@
       <w:r>
         <w:rPr>
           <w:rFonts w:ascii="Times New Roman" w:hAnsi="Times New Roman" w:cs="Times New Roman"/>
+          <w:b w:val="0"/>
         </w:rPr>
         <w:t xml:space="preserve"> </w:t>
       </w:r>
@@ -16355,6 +16382,7 @@
       <w:r>
         <w:rPr>
           <w:rFonts w:ascii="Times New Roman" w:hAnsi="Times New Roman" w:cs="Times New Roman"/>
+          <w:b w:val="0"/>
         </w:rPr>
         <w:t>pengguna</w:t>
       </w:r>
@@ -16362,6 +16390,7 @@
       <w:r>
         <w:rPr>
           <w:rFonts w:ascii="Times New Roman" w:hAnsi="Times New Roman" w:cs="Times New Roman"/>
+          <w:b w:val="0"/>
         </w:rPr>
         <w:t xml:space="preserve">, </w:t>
       </w:r>
@@ -16369,6 +16398,7 @@
       <w:r>
         <w:rPr>
           <w:rFonts w:ascii="Times New Roman" w:hAnsi="Times New Roman" w:cs="Times New Roman"/>
+          <w:b w:val="0"/>
         </w:rPr>
         <w:t>serta</w:t>
       </w:r>
@@ -16376,6 +16406,7 @@
       <w:r>
         <w:rPr>
           <w:rFonts w:ascii="Times New Roman" w:hAnsi="Times New Roman" w:cs="Times New Roman"/>
+          <w:b w:val="0"/>
         </w:rPr>
         <w:t xml:space="preserve"> </w:t>
       </w:r>
@@ -16383,6 +16414,7 @@
       <w:r>
         <w:rPr>
           <w:rFonts w:ascii="Times New Roman" w:hAnsi="Times New Roman" w:cs="Times New Roman"/>
+          <w:b w:val="0"/>
         </w:rPr>
         <w:t>pengujian</w:t>
       </w:r>
@@ -16390,6 +16422,7 @@
       <w:r>
         <w:rPr>
           <w:rFonts w:ascii="Times New Roman" w:hAnsi="Times New Roman" w:cs="Times New Roman"/>
+          <w:b w:val="0"/>
         </w:rPr>
         <w:t xml:space="preserve"> pada </w:t>
       </w:r>
@@ -16397,6 +16430,7 @@
       <w:r>
         <w:rPr>
           <w:rFonts w:ascii="Times New Roman" w:hAnsi="Times New Roman" w:cs="Times New Roman"/>
+          <w:b w:val="0"/>
         </w:rPr>
         <w:t>lebih</w:t>
       </w:r>
@@ -16404,6 +16438,7 @@
       <w:r>
         <w:rPr>
           <w:rFonts w:ascii="Times New Roman" w:hAnsi="Times New Roman" w:cs="Times New Roman"/>
+          <w:b w:val="0"/>
         </w:rPr>
         <w:t xml:space="preserve"> </w:t>
       </w:r>
@@ -16411,6 +16446,7 @@
       <w:r>
         <w:rPr>
           <w:rFonts w:ascii="Times New Roman" w:hAnsi="Times New Roman" w:cs="Times New Roman"/>
+          <w:b w:val="0"/>
         </w:rPr>
         <w:t>banyak</w:t>
       </w:r>
@@ -16418,6 +16454,7 @@
       <w:r>
         <w:rPr>
           <w:rFonts w:ascii="Times New Roman" w:hAnsi="Times New Roman" w:cs="Times New Roman"/>
+          <w:b w:val="0"/>
         </w:rPr>
         <w:t xml:space="preserve"> </w:t>
       </w:r>
@@ -16425,6 +16462,7 @@
       <w:r>
         <w:rPr>
           <w:rFonts w:ascii="Times New Roman" w:hAnsi="Times New Roman" w:cs="Times New Roman"/>
+          <w:b w:val="0"/>
         </w:rPr>
         <w:t>konfigurasi</w:t>
       </w:r>
@@ -16432,6 +16470,7 @@
       <w:r>
         <w:rPr>
           <w:rFonts w:ascii="Times New Roman" w:hAnsi="Times New Roman" w:cs="Times New Roman"/>
+          <w:b w:val="0"/>
         </w:rPr>
         <w:t xml:space="preserve"> </w:t>
       </w:r>
@@ -16439,6 +16478,7 @@
       <w:r>
         <w:rPr>
           <w:rFonts w:ascii="Times New Roman" w:hAnsi="Times New Roman" w:cs="Times New Roman"/>
+          <w:b w:val="0"/>
         </w:rPr>
         <w:t>akuaponik</w:t>
       </w:r>
@@ -16446,6 +16486,7 @@
       <w:r>
         <w:rPr>
           <w:rFonts w:ascii="Times New Roman" w:hAnsi="Times New Roman" w:cs="Times New Roman"/>
+          <w:b w:val="0"/>
         </w:rPr>
         <w:t xml:space="preserve">. Dengan </w:t>
       </w:r>
@@ -16453,6 +16494,7 @@
       <w:r>
         <w:rPr>
           <w:rFonts w:ascii="Times New Roman" w:hAnsi="Times New Roman" w:cs="Times New Roman"/>
+          <w:b w:val="0"/>
         </w:rPr>
         <w:t>tahapan</w:t>
       </w:r>
@@ -16460,6 +16502,7 @@
       <w:r>
         <w:rPr>
           <w:rFonts w:ascii="Times New Roman" w:hAnsi="Times New Roman" w:cs="Times New Roman"/>
+          <w:b w:val="0"/>
         </w:rPr>
         <w:t xml:space="preserve"> </w:t>
       </w:r>
@@ -16467,6 +16510,7 @@
       <w:r>
         <w:rPr>
           <w:rFonts w:ascii="Times New Roman" w:hAnsi="Times New Roman" w:cs="Times New Roman"/>
+          <w:b w:val="0"/>
         </w:rPr>
         <w:t>tersebut</w:t>
       </w:r>
@@ -16474,6 +16518,7 @@
       <w:r>
         <w:rPr>
           <w:rFonts w:ascii="Times New Roman" w:hAnsi="Times New Roman" w:cs="Times New Roman"/>
+          <w:b w:val="0"/>
         </w:rPr>
         <w:t xml:space="preserve">, </w:t>
       </w:r>
@@ -16481,6 +16526,7 @@
       <w:r>
         <w:rPr>
           <w:rFonts w:ascii="Times New Roman" w:hAnsi="Times New Roman" w:cs="Times New Roman"/>
+          <w:b w:val="0"/>
         </w:rPr>
         <w:t>prototipe</w:t>
       </w:r>
@@ -16488,6 +16534,7 @@
       <w:r>
         <w:rPr>
           <w:rFonts w:ascii="Times New Roman" w:hAnsi="Times New Roman" w:cs="Times New Roman"/>
+          <w:b w:val="0"/>
         </w:rPr>
         <w:t xml:space="preserve"> </w:t>
       </w:r>
@@ -16495,6 +16542,7 @@
       <w:r>
         <w:rPr>
           <w:rFonts w:ascii="Times New Roman" w:hAnsi="Times New Roman" w:cs="Times New Roman"/>
+          <w:b w:val="0"/>
         </w:rPr>
         <w:t>dapat</w:t>
       </w:r>
@@ -16502,6 +16550,7 @@
       <w:r>
         <w:rPr>
           <w:rFonts w:ascii="Times New Roman" w:hAnsi="Times New Roman" w:cs="Times New Roman"/>
+          <w:b w:val="0"/>
         </w:rPr>
         <w:t xml:space="preserve"> </w:t>
       </w:r>
@@ -16509,6 +16558,7 @@
       <w:r>
         <w:rPr>
           <w:rFonts w:ascii="Times New Roman" w:hAnsi="Times New Roman" w:cs="Times New Roman"/>
+          <w:b w:val="0"/>
         </w:rPr>
         <w:t>menjadi</w:t>
       </w:r>
@@ -16516,6 +16566,7 @@
       <w:r>
         <w:rPr>
           <w:rFonts w:ascii="Times New Roman" w:hAnsi="Times New Roman" w:cs="Times New Roman"/>
+          <w:b w:val="0"/>
         </w:rPr>
         <w:t xml:space="preserve"> </w:t>
       </w:r>
@@ -16523,6 +16574,7 @@
       <w:r>
         <w:rPr>
           <w:rFonts w:ascii="Times New Roman" w:hAnsi="Times New Roman" w:cs="Times New Roman"/>
+          <w:b w:val="0"/>
         </w:rPr>
         <w:t>dasar</w:t>
       </w:r>
@@ -16530,6 +16582,7 @@
       <w:r>
         <w:rPr>
           <w:rFonts w:ascii="Times New Roman" w:hAnsi="Times New Roman" w:cs="Times New Roman"/>
+          <w:b w:val="0"/>
         </w:rPr>
         <w:t xml:space="preserve"> </w:t>
       </w:r>
@@ -16537,6 +16590,7 @@
       <w:r>
         <w:rPr>
           <w:rFonts w:ascii="Times New Roman" w:hAnsi="Times New Roman" w:cs="Times New Roman"/>
+          <w:b w:val="0"/>
         </w:rPr>
         <w:t>pengembangan</w:t>
       </w:r>
@@ -16544,6 +16598,7 @@
       <w:r>
         <w:rPr>
           <w:rFonts w:ascii="Times New Roman" w:hAnsi="Times New Roman" w:cs="Times New Roman"/>
+          <w:b w:val="0"/>
         </w:rPr>
         <w:t xml:space="preserve"> </w:t>
       </w:r>
@@ -16551,6 +16606,7 @@
       <w:r>
         <w:rPr>
           <w:rFonts w:ascii="Times New Roman" w:hAnsi="Times New Roman" w:cs="Times New Roman"/>
+          <w:b w:val="0"/>
         </w:rPr>
         <w:t>produk</w:t>
       </w:r>
@@ -16558,6 +16614,7 @@
       <w:r>
         <w:rPr>
           <w:rFonts w:ascii="Times New Roman" w:hAnsi="Times New Roman" w:cs="Times New Roman"/>
+          <w:b w:val="0"/>
         </w:rPr>
         <w:t xml:space="preserve"> </w:t>
       </w:r>
@@ -16565,6 +16622,7 @@
       <w:r>
         <w:rPr>
           <w:rFonts w:ascii="Times New Roman" w:hAnsi="Times New Roman" w:cs="Times New Roman"/>
+          <w:b w:val="0"/>
         </w:rPr>
         <w:t>teknologi</w:t>
       </w:r>
@@ -16572,6 +16630,7 @@
       <w:r>
         <w:rPr>
           <w:rFonts w:ascii="Times New Roman" w:hAnsi="Times New Roman" w:cs="Times New Roman"/>
+          <w:b w:val="0"/>
         </w:rPr>
         <w:t xml:space="preserve"> </w:t>
       </w:r>
@@ -16579,6 +16638,7 @@
       <w:r>
         <w:rPr>
           <w:rFonts w:ascii="Times New Roman" w:hAnsi="Times New Roman" w:cs="Times New Roman"/>
+          <w:b w:val="0"/>
         </w:rPr>
         <w:t>akuaponik</w:t>
       </w:r>
@@ -16586,6 +16646,7 @@
       <w:r>
         <w:rPr>
           <w:rFonts w:ascii="Times New Roman" w:hAnsi="Times New Roman" w:cs="Times New Roman"/>
+          <w:b w:val="0"/>
         </w:rPr>
         <w:t xml:space="preserve"> </w:t>
       </w:r>
@@ -16593,6 +16654,7 @@
       <w:r>
         <w:rPr>
           <w:rFonts w:ascii="Times New Roman" w:hAnsi="Times New Roman" w:cs="Times New Roman"/>
+          <w:b w:val="0"/>
         </w:rPr>
         <w:t>cerdas</w:t>
       </w:r>
@@ -16600,6 +16662,7 @@
       <w:r>
         <w:rPr>
           <w:rFonts w:ascii="Times New Roman" w:hAnsi="Times New Roman" w:cs="Times New Roman"/>
+          <w:b w:val="0"/>
         </w:rPr>
         <w:t xml:space="preserve"> </w:t>
       </w:r>
@@ -16607,6 +16670,7 @@
       <w:r>
         <w:rPr>
           <w:rFonts w:ascii="Times New Roman" w:hAnsi="Times New Roman" w:cs="Times New Roman"/>
+          <w:b w:val="0"/>
         </w:rPr>
         <w:t>untuk</w:t>
       </w:r>
@@ -16614,6 +16678,7 @@
       <w:r>
         <w:rPr>
           <w:rFonts w:ascii="Times New Roman" w:hAnsi="Times New Roman" w:cs="Times New Roman"/>
+          <w:b w:val="0"/>
         </w:rPr>
         <w:t xml:space="preserve"> </w:t>
       </w:r>
@@ -16621,6 +16686,7 @@
       <w:r>
         <w:rPr>
           <w:rFonts w:ascii="Times New Roman" w:hAnsi="Times New Roman" w:cs="Times New Roman"/>
+          <w:b w:val="0"/>
         </w:rPr>
         <w:t>kebutuhan</w:t>
       </w:r>
@@ -16628,6 +16694,7 @@
       <w:r>
         <w:rPr>
           <w:rFonts w:ascii="Times New Roman" w:hAnsi="Times New Roman" w:cs="Times New Roman"/>
+          <w:b w:val="0"/>
         </w:rPr>
         <w:t xml:space="preserve"> </w:t>
       </w:r>
@@ -16635,6 +16702,7 @@
       <w:r>
         <w:rPr>
           <w:rFonts w:ascii="Times New Roman" w:hAnsi="Times New Roman" w:cs="Times New Roman"/>
+          <w:b w:val="0"/>
         </w:rPr>
         <w:t>pendidikan</w:t>
       </w:r>
@@ -16642,6 +16710,7 @@
       <w:r>
         <w:rPr>
           <w:rFonts w:ascii="Times New Roman" w:hAnsi="Times New Roman" w:cs="Times New Roman"/>
+          <w:b w:val="0"/>
         </w:rPr>
         <w:t xml:space="preserve">, </w:t>
       </w:r>
@@ -16649,6 +16718,7 @@
       <w:r>
         <w:rPr>
           <w:rFonts w:ascii="Times New Roman" w:hAnsi="Times New Roman" w:cs="Times New Roman"/>
+          <w:b w:val="0"/>
         </w:rPr>
         <w:t>penelitian</w:t>
       </w:r>
@@ -16656,6 +16726,7 @@
       <w:r>
         <w:rPr>
           <w:rFonts w:ascii="Times New Roman" w:hAnsi="Times New Roman" w:cs="Times New Roman"/>
+          <w:b w:val="0"/>
         </w:rPr>
         <w:t xml:space="preserve">, </w:t>
       </w:r>
@@ -16663,6 +16734,7 @@
       <w:r>
         <w:rPr>
           <w:rFonts w:ascii="Times New Roman" w:hAnsi="Times New Roman" w:cs="Times New Roman"/>
+          <w:b w:val="0"/>
         </w:rPr>
         <w:t>komunitas</w:t>
       </w:r>
@@ -16670,6 +16742,7 @@
       <w:r>
         <w:rPr>
           <w:rFonts w:ascii="Times New Roman" w:hAnsi="Times New Roman" w:cs="Times New Roman"/>
+          <w:b w:val="0"/>
         </w:rPr>
         <w:t xml:space="preserve">, </w:t>
       </w:r>
@@ -16677,6 +16750,7 @@
       <w:r>
         <w:rPr>
           <w:rFonts w:ascii="Times New Roman" w:hAnsi="Times New Roman" w:cs="Times New Roman"/>
+          <w:b w:val="0"/>
         </w:rPr>
         <w:t>maupun</w:t>
       </w:r>
@@ -16684,6 +16758,7 @@
       <w:r>
         <w:rPr>
           <w:rFonts w:ascii="Times New Roman" w:hAnsi="Times New Roman" w:cs="Times New Roman"/>
+          <w:b w:val="0"/>
         </w:rPr>
         <w:t xml:space="preserve"> </w:t>
       </w:r>
@@ -16691,6 +16766,7 @@
       <w:r>
         <w:rPr>
           <w:rFonts w:ascii="Times New Roman" w:hAnsi="Times New Roman" w:cs="Times New Roman"/>
+          <w:b w:val="0"/>
         </w:rPr>
         <w:t>pelaku</w:t>
       </w:r>
@@ -16698,6 +16774,7 @@
       <w:r>
         <w:rPr>
           <w:rFonts w:ascii="Times New Roman" w:hAnsi="Times New Roman" w:cs="Times New Roman"/>
+          <w:b w:val="0"/>
         </w:rPr>
         <w:t xml:space="preserve"> </w:t>
       </w:r>
@@ -16705,6 +16782,7 @@
       <w:r>
         <w:rPr>
           <w:rFonts w:ascii="Times New Roman" w:hAnsi="Times New Roman" w:cs="Times New Roman"/>
+          <w:b w:val="0"/>
         </w:rPr>
         <w:t>budidaya</w:t>
       </w:r>
@@ -16712,6 +16790,7 @@
       <w:r>
         <w:rPr>
           <w:rFonts w:ascii="Times New Roman" w:hAnsi="Times New Roman" w:cs="Times New Roman"/>
+          <w:b w:val="0"/>
         </w:rPr>
         <w:t xml:space="preserve"> </w:t>
       </w:r>
@@ -16719,6 +16798,7 @@
       <w:r>
         <w:rPr>
           <w:rFonts w:ascii="Times New Roman" w:hAnsi="Times New Roman" w:cs="Times New Roman"/>
+          <w:b w:val="0"/>
         </w:rPr>
         <w:t>skala</w:t>
       </w:r>
@@ -16726,6 +16806,7 @@
       <w:r>
         <w:rPr>
           <w:rFonts w:ascii="Times New Roman" w:hAnsi="Times New Roman" w:cs="Times New Roman"/>
+          <w:b w:val="0"/>
         </w:rPr>
         <w:t xml:space="preserve"> </w:t>
       </w:r>
@@ -16733,6 +16814,7 @@
       <w:r>
         <w:rPr>
           <w:rFonts w:ascii="Times New Roman" w:hAnsi="Times New Roman" w:cs="Times New Roman"/>
+          <w:b w:val="0"/>
         </w:rPr>
         <w:t>kecil</w:t>
       </w:r>
@@ -16740,6 +16822,7 @@
       <w:r>
         <w:rPr>
           <w:rFonts w:ascii="Times New Roman" w:hAnsi="Times New Roman" w:cs="Times New Roman"/>
+          <w:b w:val="0"/>
         </w:rPr>
         <w:t xml:space="preserve"> dan </w:t>
       </w:r>
@@ -16747,6 +16830,7 @@
       <w:r>
         <w:rPr>
           <w:rFonts w:ascii="Times New Roman" w:hAnsi="Times New Roman" w:cs="Times New Roman"/>
+          <w:b w:val="0"/>
         </w:rPr>
         <w:t>menengah</w:t>
       </w:r>
@@ -16754,6 +16838,7 @@
       <w:r>
         <w:rPr>
           <w:rFonts w:ascii="Times New Roman" w:hAnsi="Times New Roman" w:cs="Times New Roman"/>
+          <w:b w:val="0"/>
         </w:rPr>
         <w:t xml:space="preserve">. </w:t>
       </w:r>
@@ -16761,6 +16846,7 @@
       <w:r>
         <w:rPr>
           <w:rFonts w:ascii="Times New Roman" w:hAnsi="Times New Roman" w:cs="Times New Roman"/>
+          <w:b w:val="0"/>
         </w:rPr>
         <w:t>Namun</w:t>
       </w:r>
@@ -16768,6 +16854,7 @@
       <w:r>
         <w:rPr>
           <w:rFonts w:ascii="Times New Roman" w:hAnsi="Times New Roman" w:cs="Times New Roman"/>
+          <w:b w:val="0"/>
         </w:rPr>
         <w:t xml:space="preserve">, </w:t>
       </w:r>
@@ -16775,6 +16862,7 @@
       <w:r>
         <w:rPr>
           <w:rFonts w:ascii="Times New Roman" w:hAnsi="Times New Roman" w:cs="Times New Roman"/>
+          <w:b w:val="0"/>
         </w:rPr>
         <w:t>penerapan</w:t>
       </w:r>
@@ -16782,6 +16870,7 @@
       <w:r>
         <w:rPr>
           <w:rFonts w:ascii="Times New Roman" w:hAnsi="Times New Roman" w:cs="Times New Roman"/>
+          <w:b w:val="0"/>
         </w:rPr>
         <w:t xml:space="preserve"> </w:t>
       </w:r>
@@ -16789,6 +16878,7 @@
       <w:r>
         <w:rPr>
           <w:rFonts w:ascii="Times New Roman" w:hAnsi="Times New Roman" w:cs="Times New Roman"/>
+          <w:b w:val="0"/>
         </w:rPr>
         <w:t>secara</w:t>
       </w:r>
@@ -16796,6 +16886,7 @@
       <w:r>
         <w:rPr>
           <w:rFonts w:ascii="Times New Roman" w:hAnsi="Times New Roman" w:cs="Times New Roman"/>
+          <w:b w:val="0"/>
         </w:rPr>
         <w:t xml:space="preserve"> </w:t>
       </w:r>
@@ -16803,6 +16894,7 @@
       <w:r>
         <w:rPr>
           <w:rFonts w:ascii="Times New Roman" w:hAnsi="Times New Roman" w:cs="Times New Roman"/>
+          <w:b w:val="0"/>
         </w:rPr>
         <w:t>komersial</w:t>
       </w:r>
@@ -16810,6 +16902,7 @@
       <w:r>
         <w:rPr>
           <w:rFonts w:ascii="Times New Roman" w:hAnsi="Times New Roman" w:cs="Times New Roman"/>
+          <w:b w:val="0"/>
         </w:rPr>
         <w:t xml:space="preserve"> </w:t>
       </w:r>
@@ -16817,6 +16910,7 @@
       <w:r>
         <w:rPr>
           <w:rFonts w:ascii="Times New Roman" w:hAnsi="Times New Roman" w:cs="Times New Roman"/>
+          <w:b w:val="0"/>
         </w:rPr>
         <w:t>tetap</w:t>
       </w:r>
@@ -16824,6 +16918,7 @@
       <w:r>
         <w:rPr>
           <w:rFonts w:ascii="Times New Roman" w:hAnsi="Times New Roman" w:cs="Times New Roman"/>
+          <w:b w:val="0"/>
         </w:rPr>
         <w:t xml:space="preserve"> </w:t>
       </w:r>
@@ -16831,6 +16926,7 @@
       <w:r>
         <w:rPr>
           <w:rFonts w:ascii="Times New Roman" w:hAnsi="Times New Roman" w:cs="Times New Roman"/>
+          <w:b w:val="0"/>
         </w:rPr>
         <w:t>memerlukan</w:t>
       </w:r>
@@ -16838,6 +16934,7 @@
       <w:r>
         <w:rPr>
           <w:rFonts w:ascii="Times New Roman" w:hAnsi="Times New Roman" w:cs="Times New Roman"/>
+          <w:b w:val="0"/>
         </w:rPr>
         <w:t xml:space="preserve"> </w:t>
       </w:r>
@@ -16845,6 +16942,7 @@
       <w:r>
         <w:rPr>
           <w:rFonts w:ascii="Times New Roman" w:hAnsi="Times New Roman" w:cs="Times New Roman"/>
+          <w:b w:val="0"/>
         </w:rPr>
         <w:t>validasi</w:t>
       </w:r>
@@ -16852,6 +16950,7 @@
       <w:r>
         <w:rPr>
           <w:rFonts w:ascii="Times New Roman" w:hAnsi="Times New Roman" w:cs="Times New Roman"/>
+          <w:b w:val="0"/>
         </w:rPr>
         <w:t xml:space="preserve"> </w:t>
       </w:r>
@@ -16859,6 +16958,7 @@
       <w:r>
         <w:rPr>
           <w:rFonts w:ascii="Times New Roman" w:hAnsi="Times New Roman" w:cs="Times New Roman"/>
+          <w:b w:val="0"/>
         </w:rPr>
         <w:t>tambahan</w:t>
       </w:r>
@@ -16866,6 +16966,7 @@
       <w:r>
         <w:rPr>
           <w:rFonts w:ascii="Times New Roman" w:hAnsi="Times New Roman" w:cs="Times New Roman"/>
+          <w:b w:val="0"/>
         </w:rPr>
         <w:t xml:space="preserve"> </w:t>
       </w:r>
@@ -16873,6 +16974,7 @@
       <w:r>
         <w:rPr>
           <w:rFonts w:ascii="Times New Roman" w:hAnsi="Times New Roman" w:cs="Times New Roman"/>
+          <w:b w:val="0"/>
         </w:rPr>
         <w:t>untuk</w:t>
       </w:r>
@@ -16880,6 +16982,7 @@
       <w:r>
         <w:rPr>
           <w:rFonts w:ascii="Times New Roman" w:hAnsi="Times New Roman" w:cs="Times New Roman"/>
+          <w:b w:val="0"/>
         </w:rPr>
         <w:t xml:space="preserve"> </w:t>
       </w:r>
@@ -16887,6 +16990,7 @@
       <w:r>
         <w:rPr>
           <w:rFonts w:ascii="Times New Roman" w:hAnsi="Times New Roman" w:cs="Times New Roman"/>
+          <w:b w:val="0"/>
         </w:rPr>
         <w:t>memastikan</w:t>
       </w:r>
@@ -16894,6 +16998,7 @@
       <w:r>
         <w:rPr>
           <w:rFonts w:ascii="Times New Roman" w:hAnsi="Times New Roman" w:cs="Times New Roman"/>
+          <w:b w:val="0"/>
         </w:rPr>
         <w:t xml:space="preserve"> </w:t>
       </w:r>
@@ -16901,6 +17006,7 @@
       <w:r>
         <w:rPr>
           <w:rFonts w:ascii="Times New Roman" w:hAnsi="Times New Roman" w:cs="Times New Roman"/>
+          <w:b w:val="0"/>
         </w:rPr>
         <w:t>keandalan</w:t>
       </w:r>
@@ -16908,6 +17014,7 @@
       <w:r>
         <w:rPr>
           <w:rFonts w:ascii="Times New Roman" w:hAnsi="Times New Roman" w:cs="Times New Roman"/>
+          <w:b w:val="0"/>
         </w:rPr>
         <w:t xml:space="preserve">, </w:t>
       </w:r>
@@ -16915,6 +17022,7 @@
       <w:r>
         <w:rPr>
           <w:rFonts w:ascii="Times New Roman" w:hAnsi="Times New Roman" w:cs="Times New Roman"/>
+          <w:b w:val="0"/>
         </w:rPr>
         <w:t>konsistensi</w:t>
       </w:r>
@@ -16922,6 +17030,7 @@
       <w:r>
         <w:rPr>
           <w:rFonts w:ascii="Times New Roman" w:hAnsi="Times New Roman" w:cs="Times New Roman"/>
+          <w:b w:val="0"/>
         </w:rPr>
         <w:t xml:space="preserve"> </w:t>
       </w:r>
@@ -16929,6 +17038,7 @@
       <w:r>
         <w:rPr>
           <w:rFonts w:ascii="Times New Roman" w:hAnsi="Times New Roman" w:cs="Times New Roman"/>
+          <w:b w:val="0"/>
         </w:rPr>
         <w:t>kinerja</w:t>
       </w:r>
@@ -16936,6 +17046,7 @@
       <w:r>
         <w:rPr>
           <w:rFonts w:ascii="Times New Roman" w:hAnsi="Times New Roman" w:cs="Times New Roman"/>
+          <w:b w:val="0"/>
         </w:rPr>
         <w:t xml:space="preserve">, </w:t>
       </w:r>
@@ -16943,6 +17054,7 @@
       <w:r>
         <w:rPr>
           <w:rFonts w:ascii="Times New Roman" w:hAnsi="Times New Roman" w:cs="Times New Roman"/>
+          <w:b w:val="0"/>
         </w:rPr>
         <w:t>kemudahan</w:t>
       </w:r>
@@ -16950,6 +17062,7 @@
       <w:r>
         <w:rPr>
           <w:rFonts w:ascii="Times New Roman" w:hAnsi="Times New Roman" w:cs="Times New Roman"/>
+          <w:b w:val="0"/>
         </w:rPr>
         <w:t xml:space="preserve"> </w:t>
       </w:r>
@@ -16957,6 +17070,7 @@
       <w:r>
         <w:rPr>
           <w:rFonts w:ascii="Times New Roman" w:hAnsi="Times New Roman" w:cs="Times New Roman"/>
+          <w:b w:val="0"/>
         </w:rPr>
         <w:t>pemeliharaan</w:t>
       </w:r>
@@ -16964,6 +17078,7 @@
       <w:r>
         <w:rPr>
           <w:rFonts w:ascii="Times New Roman" w:hAnsi="Times New Roman" w:cs="Times New Roman"/>
+          <w:b w:val="0"/>
         </w:rPr>
         <w:t xml:space="preserve">, dan </w:t>
       </w:r>
@@ -16971,6 +17086,7 @@
       <w:r>
         <w:rPr>
           <w:rFonts w:ascii="Times New Roman" w:hAnsi="Times New Roman" w:cs="Times New Roman"/>
+          <w:b w:val="0"/>
         </w:rPr>
         <w:t>kesesuaian</w:t>
       </w:r>
@@ -16978,6 +17094,7 @@
       <w:r>
         <w:rPr>
           <w:rFonts w:ascii="Times New Roman" w:hAnsi="Times New Roman" w:cs="Times New Roman"/>
+          <w:b w:val="0"/>
         </w:rPr>
         <w:t xml:space="preserve"> </w:t>
       </w:r>
@@ -16985,6 +17102,7 @@
       <w:r>
         <w:rPr>
           <w:rFonts w:ascii="Times New Roman" w:hAnsi="Times New Roman" w:cs="Times New Roman"/>
+          <w:b w:val="0"/>
         </w:rPr>
         <w:t>sistem</w:t>
       </w:r>
@@ -16992,6 +17110,7 @@
       <w:r>
         <w:rPr>
           <w:rFonts w:ascii="Times New Roman" w:hAnsi="Times New Roman" w:cs="Times New Roman"/>
+          <w:b w:val="0"/>
         </w:rPr>
         <w:t xml:space="preserve"> </w:t>
       </w:r>
@@ -16999,6 +17118,7 @@
       <w:r>
         <w:rPr>
           <w:rFonts w:ascii="Times New Roman" w:hAnsi="Times New Roman" w:cs="Times New Roman"/>
+          <w:b w:val="0"/>
         </w:rPr>
         <w:t>terhadap</w:t>
       </w:r>
@@ -17006,6 +17126,7 @@
       <w:r>
         <w:rPr>
           <w:rFonts w:ascii="Times New Roman" w:hAnsi="Times New Roman" w:cs="Times New Roman"/>
+          <w:b w:val="0"/>
         </w:rPr>
         <w:t xml:space="preserve"> </w:t>
       </w:r>
@@ -17013,6 +17134,7 @@
       <w:r>
         <w:rPr>
           <w:rFonts w:ascii="Times New Roman" w:hAnsi="Times New Roman" w:cs="Times New Roman"/>
+          <w:b w:val="0"/>
         </w:rPr>
         <w:t>kondisi</w:t>
       </w:r>
@@ -17020,6 +17142,7 @@
       <w:r>
         <w:rPr>
           <w:rFonts w:ascii="Times New Roman" w:hAnsi="Times New Roman" w:cs="Times New Roman"/>
+          <w:b w:val="0"/>
         </w:rPr>
         <w:t xml:space="preserve"> </w:t>
       </w:r>
@@ -17027,6 +17150,7 @@
       <w:r>
         <w:rPr>
           <w:rFonts w:ascii="Times New Roman" w:hAnsi="Times New Roman" w:cs="Times New Roman"/>
+          <w:b w:val="0"/>
         </w:rPr>
         <w:t>operasional</w:t>
       </w:r>
@@ -17034,6 +17158,7 @@
       <w:r>
         <w:rPr>
           <w:rFonts w:ascii="Times New Roman" w:hAnsi="Times New Roman" w:cs="Times New Roman"/>
+          <w:b w:val="0"/>
         </w:rPr>
         <w:t xml:space="preserve"> yang </w:t>
       </w:r>
@@ -17041,6 +17166,7 @@
       <w:r>
         <w:rPr>
           <w:rFonts w:ascii="Times New Roman" w:hAnsi="Times New Roman" w:cs="Times New Roman"/>
+          <w:b w:val="0"/>
         </w:rPr>
         <w:t>berbeda</w:t>
       </w:r>
@@ -17048,6 +17174,7 @@
       <w:r>
         <w:rPr>
           <w:rFonts w:ascii="Times New Roman" w:hAnsi="Times New Roman" w:cs="Times New Roman"/>
+          <w:b w:val="0"/>
         </w:rPr>
         <w:t>.</w:t>
       </w:r>
@@ -17072,7 +17199,8 @@
     <w:p>
       <w:pPr>
         <w:spacing w:after="0" w:line="360" w:lineRule="auto"/>
-        <w:jc w:val="center"/>
+        <w:ind w:firstLine="360"/>
+        <w:jc w:val="both"/>
         <w:rPr>
           <w:rFonts w:ascii="Times New Roman" w:hAnsi="Times New Roman" w:cs="Times New Roman"/>
           <w:b/>
@@ -17082,7 +17210,7 @@
       <w:r>
         <w:rPr>
           <w:rFonts w:ascii="Times New Roman" w:hAnsi="Times New Roman" w:cs="Times New Roman"/>
-          <w:b/>
+          <w:b w:val="0"/>
           <w:bCs/>
         </w:rPr>
         <w:t>Pengembangan lebih lanjut dapat diarahkan pada penyederhanaan instalasi, peningkatan keandalan perangkat keras, pengembangan antarmuka pengguna, serta pengujian pada lebih banyak konfigurasi akuaponik. Dengan tahapan tersebut, prototipe dapat menjadi dasar pengembangan produk teknologi monitoring cerdas untuk kebutuhan pendidikan, penelitian, komunitas, maupun pelaku budidaya skala kecil dan menengah. Namun, penerapan secara komersial tetap memerlukan validasi tambahan untuk memastikan keandalan, konsistensi kinerja, kemudahan pemeliharaan, dan kesesuaian sistem terhadap kondisi operasional yang berbeda.</w:t>
@@ -17091,7 +17219,7 @@
       <w:r>
         <w:rPr>
           <w:rFonts w:ascii="Times New Roman" w:hAnsi="Times New Roman" w:cs="Times New Roman"/>
-          <w:b/>
+          <w:b w:val="0"/>
           <w:bCs/>
         </w:rPr>
       </w:r>
@@ -17099,7 +17227,7 @@
       <w:r>
         <w:rPr>
           <w:rFonts w:ascii="Times New Roman" w:hAnsi="Times New Roman" w:cs="Times New Roman"/>
-          <w:b/>
+          <w:b w:val="0"/>
           <w:bCs/>
         </w:rPr>
       </w:r>
@@ -17107,7 +17235,7 @@
       <w:r>
         <w:rPr>
           <w:rFonts w:ascii="Times New Roman" w:hAnsi="Times New Roman" w:cs="Times New Roman"/>
-          <w:b/>
+          <w:b w:val="0"/>
           <w:bCs/>
         </w:rPr>
       </w:r>
@@ -17115,14 +17243,14 @@
       <w:r>
         <w:rPr>
           <w:rFonts w:ascii="Times New Roman" w:hAnsi="Times New Roman" w:cs="Times New Roman"/>
-          <w:b/>
+          <w:b w:val="0"/>
           <w:bCs/>
         </w:rPr>
       </w:r>
       <w:r>
         <w:rPr>
           <w:rFonts w:ascii="Times New Roman" w:hAnsi="Times New Roman" w:cs="Times New Roman"/>
-          <w:b/>
+          <w:b w:val="0"/>
           <w:bCs/>
         </w:rPr>
       </w:r>

</xml_diff>

<commit_message>
ubah pengembangan lebih lanjut jadi sub-bab 1.5.3 (Heading 3), hapus duplikasi teks lama
</commit_message>
<xml_diff>
--- a/docs/PROPOSAL_PROTOTIPE_FELIX_ENRIQUE_2305110019.docx
+++ b/docs/PROPOSAL_PROTOTIPE_FELIX_ENRIQUE_2305110019.docx
@@ -16166,1040 +16166,14 @@
       <w:r>
         <w:rPr>
           <w:rFonts w:ascii="Times New Roman" w:hAnsi="Times New Roman" w:cs="Times New Roman"/>
-          <w:b w:val="0"/>
-        </w:rPr>
-        <w:tab/>
-      </w:r>
-      <w:proofErr w:type="spellStart"/>
-      <w:r>
-        <w:rPr>
-          <w:rFonts w:ascii="Times New Roman" w:hAnsi="Times New Roman" w:cs="Times New Roman"/>
-          <w:b w:val="0"/>
-        </w:rPr>
-        <w:t>Pengembangan</w:t>
-      </w:r>
-      <w:proofErr w:type="spellEnd"/>
-      <w:r>
-        <w:rPr>
-          <w:rFonts w:ascii="Times New Roman" w:hAnsi="Times New Roman" w:cs="Times New Roman"/>
-          <w:b w:val="0"/>
-        </w:rPr>
-        <w:t xml:space="preserve"> </w:t>
-      </w:r>
-      <w:proofErr w:type="spellStart"/>
-      <w:r>
-        <w:rPr>
-          <w:rFonts w:ascii="Times New Roman" w:hAnsi="Times New Roman" w:cs="Times New Roman"/>
-          <w:b w:val="0"/>
-        </w:rPr>
-        <w:t>lebih</w:t>
-      </w:r>
-      <w:proofErr w:type="spellEnd"/>
-      <w:r>
-        <w:rPr>
-          <w:rFonts w:ascii="Times New Roman" w:hAnsi="Times New Roman" w:cs="Times New Roman"/>
-          <w:b w:val="0"/>
-        </w:rPr>
-        <w:t xml:space="preserve"> </w:t>
-      </w:r>
-      <w:proofErr w:type="spellStart"/>
-      <w:r>
-        <w:rPr>
-          <w:rFonts w:ascii="Times New Roman" w:hAnsi="Times New Roman" w:cs="Times New Roman"/>
-          <w:b w:val="0"/>
-        </w:rPr>
-        <w:t>lanjut</w:t>
-      </w:r>
-      <w:proofErr w:type="spellEnd"/>
-      <w:r>
-        <w:rPr>
-          <w:rFonts w:ascii="Times New Roman" w:hAnsi="Times New Roman" w:cs="Times New Roman"/>
-          <w:b w:val="0"/>
-        </w:rPr>
-        <w:t xml:space="preserve"> </w:t>
-      </w:r>
-      <w:proofErr w:type="spellStart"/>
-      <w:r>
-        <w:rPr>
-          <w:rFonts w:ascii="Times New Roman" w:hAnsi="Times New Roman" w:cs="Times New Roman"/>
-          <w:b w:val="0"/>
-        </w:rPr>
-        <w:t>dapat</w:t>
-      </w:r>
-      <w:proofErr w:type="spellEnd"/>
-      <w:r>
-        <w:rPr>
-          <w:rFonts w:ascii="Times New Roman" w:hAnsi="Times New Roman" w:cs="Times New Roman"/>
-          <w:b w:val="0"/>
-        </w:rPr>
-        <w:t xml:space="preserve"> </w:t>
-      </w:r>
-      <w:proofErr w:type="spellStart"/>
-      <w:r>
-        <w:rPr>
-          <w:rFonts w:ascii="Times New Roman" w:hAnsi="Times New Roman" w:cs="Times New Roman"/>
-          <w:b w:val="0"/>
-        </w:rPr>
-        <w:t>diarahkan</w:t>
-      </w:r>
-      <w:proofErr w:type="spellEnd"/>
-      <w:r>
-        <w:rPr>
-          <w:rFonts w:ascii="Times New Roman" w:hAnsi="Times New Roman" w:cs="Times New Roman"/>
-          <w:b w:val="0"/>
-        </w:rPr>
-        <w:t xml:space="preserve"> pada </w:t>
-      </w:r>
-      <w:proofErr w:type="spellStart"/>
-      <w:r>
-        <w:rPr>
-          <w:rFonts w:ascii="Times New Roman" w:hAnsi="Times New Roman" w:cs="Times New Roman"/>
-          <w:b w:val="0"/>
-        </w:rPr>
-        <w:t>penyederhanaan</w:t>
-      </w:r>
-      <w:proofErr w:type="spellEnd"/>
-      <w:r>
-        <w:rPr>
-          <w:rFonts w:ascii="Times New Roman" w:hAnsi="Times New Roman" w:cs="Times New Roman"/>
-          <w:b w:val="0"/>
-        </w:rPr>
-        <w:t xml:space="preserve"> </w:t>
-      </w:r>
-      <w:proofErr w:type="spellStart"/>
-      <w:r>
-        <w:rPr>
-          <w:rFonts w:ascii="Times New Roman" w:hAnsi="Times New Roman" w:cs="Times New Roman"/>
-          <w:b w:val="0"/>
-        </w:rPr>
-        <w:t>instalasi</w:t>
-      </w:r>
-      <w:proofErr w:type="spellEnd"/>
-      <w:r>
-        <w:rPr>
-          <w:rFonts w:ascii="Times New Roman" w:hAnsi="Times New Roman" w:cs="Times New Roman"/>
-          <w:b w:val="0"/>
-        </w:rPr>
-        <w:t xml:space="preserve">, </w:t>
-      </w:r>
-      <w:proofErr w:type="spellStart"/>
-      <w:r>
-        <w:rPr>
-          <w:rFonts w:ascii="Times New Roman" w:hAnsi="Times New Roman" w:cs="Times New Roman"/>
-          <w:b w:val="0"/>
-        </w:rPr>
-        <w:t>peningkatan</w:t>
-      </w:r>
-      <w:proofErr w:type="spellEnd"/>
-      <w:r>
-        <w:rPr>
-          <w:rFonts w:ascii="Times New Roman" w:hAnsi="Times New Roman" w:cs="Times New Roman"/>
-          <w:b w:val="0"/>
-        </w:rPr>
-        <w:t xml:space="preserve"> </w:t>
-      </w:r>
-      <w:proofErr w:type="spellStart"/>
-      <w:r>
-        <w:rPr>
-          <w:rFonts w:ascii="Times New Roman" w:hAnsi="Times New Roman" w:cs="Times New Roman"/>
-          <w:b w:val="0"/>
-        </w:rPr>
-        <w:t>keandalan</w:t>
-      </w:r>
-      <w:proofErr w:type="spellEnd"/>
-      <w:r>
-        <w:rPr>
-          <w:rFonts w:ascii="Times New Roman" w:hAnsi="Times New Roman" w:cs="Times New Roman"/>
-          <w:b w:val="0"/>
-        </w:rPr>
-        <w:t xml:space="preserve"> </w:t>
-      </w:r>
-      <w:proofErr w:type="spellStart"/>
-      <w:r>
-        <w:rPr>
-          <w:rFonts w:ascii="Times New Roman" w:hAnsi="Times New Roman" w:cs="Times New Roman"/>
-          <w:b w:val="0"/>
-        </w:rPr>
-        <w:t>perangkat</w:t>
-      </w:r>
-      <w:proofErr w:type="spellEnd"/>
-      <w:r>
-        <w:rPr>
-          <w:rFonts w:ascii="Times New Roman" w:hAnsi="Times New Roman" w:cs="Times New Roman"/>
-          <w:b w:val="0"/>
-        </w:rPr>
-        <w:t xml:space="preserve"> </w:t>
-      </w:r>
-      <w:proofErr w:type="spellStart"/>
-      <w:r>
-        <w:rPr>
-          <w:rFonts w:ascii="Times New Roman" w:hAnsi="Times New Roman" w:cs="Times New Roman"/>
-          <w:b w:val="0"/>
-        </w:rPr>
-        <w:t>keras</w:t>
-      </w:r>
-      <w:proofErr w:type="spellEnd"/>
-      <w:r>
-        <w:rPr>
-          <w:rFonts w:ascii="Times New Roman" w:hAnsi="Times New Roman" w:cs="Times New Roman"/>
-          <w:b w:val="0"/>
-        </w:rPr>
-        <w:t xml:space="preserve">, </w:t>
-      </w:r>
-      <w:proofErr w:type="spellStart"/>
-      <w:r>
-        <w:rPr>
-          <w:rFonts w:ascii="Times New Roman" w:hAnsi="Times New Roman" w:cs="Times New Roman"/>
-          <w:b w:val="0"/>
-        </w:rPr>
-        <w:t>pengembangan</w:t>
-      </w:r>
-      <w:proofErr w:type="spellEnd"/>
-      <w:r>
-        <w:rPr>
-          <w:rFonts w:ascii="Times New Roman" w:hAnsi="Times New Roman" w:cs="Times New Roman"/>
-          <w:b w:val="0"/>
-        </w:rPr>
-        <w:t xml:space="preserve"> </w:t>
-      </w:r>
-      <w:proofErr w:type="spellStart"/>
-      <w:r>
-        <w:rPr>
-          <w:rFonts w:ascii="Times New Roman" w:hAnsi="Times New Roman" w:cs="Times New Roman"/>
-          <w:b w:val="0"/>
-        </w:rPr>
-        <w:t>antarmuka</w:t>
-      </w:r>
-      <w:proofErr w:type="spellEnd"/>
-      <w:r>
-        <w:rPr>
-          <w:rFonts w:ascii="Times New Roman" w:hAnsi="Times New Roman" w:cs="Times New Roman"/>
-          <w:b w:val="0"/>
-        </w:rPr>
-        <w:t xml:space="preserve"> </w:t>
-      </w:r>
-      <w:proofErr w:type="spellStart"/>
-      <w:r>
-        <w:rPr>
-          <w:rFonts w:ascii="Times New Roman" w:hAnsi="Times New Roman" w:cs="Times New Roman"/>
-          <w:b w:val="0"/>
-        </w:rPr>
-        <w:t>pengguna</w:t>
-      </w:r>
-      <w:proofErr w:type="spellEnd"/>
-      <w:r>
-        <w:rPr>
-          <w:rFonts w:ascii="Times New Roman" w:hAnsi="Times New Roman" w:cs="Times New Roman"/>
-          <w:b w:val="0"/>
-        </w:rPr>
-        <w:t xml:space="preserve">, </w:t>
-      </w:r>
-      <w:proofErr w:type="spellStart"/>
-      <w:r>
-        <w:rPr>
-          <w:rFonts w:ascii="Times New Roman" w:hAnsi="Times New Roman" w:cs="Times New Roman"/>
-          <w:b w:val="0"/>
-        </w:rPr>
-        <w:t>serta</w:t>
-      </w:r>
-      <w:proofErr w:type="spellEnd"/>
-      <w:r>
-        <w:rPr>
-          <w:rFonts w:ascii="Times New Roman" w:hAnsi="Times New Roman" w:cs="Times New Roman"/>
-          <w:b w:val="0"/>
-        </w:rPr>
-        <w:t xml:space="preserve"> </w:t>
-      </w:r>
-      <w:proofErr w:type="spellStart"/>
-      <w:r>
-        <w:rPr>
-          <w:rFonts w:ascii="Times New Roman" w:hAnsi="Times New Roman" w:cs="Times New Roman"/>
-          <w:b w:val="0"/>
-        </w:rPr>
-        <w:t>pengujian</w:t>
-      </w:r>
-      <w:proofErr w:type="spellEnd"/>
-      <w:r>
-        <w:rPr>
-          <w:rFonts w:ascii="Times New Roman" w:hAnsi="Times New Roman" w:cs="Times New Roman"/>
-          <w:b w:val="0"/>
-        </w:rPr>
-        <w:t xml:space="preserve"> pada </w:t>
-      </w:r>
-      <w:proofErr w:type="spellStart"/>
-      <w:r>
-        <w:rPr>
-          <w:rFonts w:ascii="Times New Roman" w:hAnsi="Times New Roman" w:cs="Times New Roman"/>
-          <w:b w:val="0"/>
-        </w:rPr>
-        <w:t>lebih</w:t>
-      </w:r>
-      <w:proofErr w:type="spellEnd"/>
-      <w:r>
-        <w:rPr>
-          <w:rFonts w:ascii="Times New Roman" w:hAnsi="Times New Roman" w:cs="Times New Roman"/>
-          <w:b w:val="0"/>
-        </w:rPr>
-        <w:t xml:space="preserve"> </w:t>
-      </w:r>
-      <w:proofErr w:type="spellStart"/>
-      <w:r>
-        <w:rPr>
-          <w:rFonts w:ascii="Times New Roman" w:hAnsi="Times New Roman" w:cs="Times New Roman"/>
-          <w:b w:val="0"/>
-        </w:rPr>
-        <w:t>banyak</w:t>
-      </w:r>
-      <w:proofErr w:type="spellEnd"/>
-      <w:r>
-        <w:rPr>
-          <w:rFonts w:ascii="Times New Roman" w:hAnsi="Times New Roman" w:cs="Times New Roman"/>
-          <w:b w:val="0"/>
-        </w:rPr>
-        <w:t xml:space="preserve"> </w:t>
-      </w:r>
-      <w:proofErr w:type="spellStart"/>
-      <w:r>
-        <w:rPr>
-          <w:rFonts w:ascii="Times New Roman" w:hAnsi="Times New Roman" w:cs="Times New Roman"/>
-          <w:b w:val="0"/>
-        </w:rPr>
-        <w:t>konfigurasi</w:t>
-      </w:r>
-      <w:proofErr w:type="spellEnd"/>
-      <w:r>
-        <w:rPr>
-          <w:rFonts w:ascii="Times New Roman" w:hAnsi="Times New Roman" w:cs="Times New Roman"/>
-          <w:b w:val="0"/>
-        </w:rPr>
-        <w:t xml:space="preserve"> </w:t>
-      </w:r>
-      <w:proofErr w:type="spellStart"/>
-      <w:r>
-        <w:rPr>
-          <w:rFonts w:ascii="Times New Roman" w:hAnsi="Times New Roman" w:cs="Times New Roman"/>
-          <w:b w:val="0"/>
-        </w:rPr>
-        <w:t>akuaponik</w:t>
-      </w:r>
-      <w:proofErr w:type="spellEnd"/>
-      <w:r>
-        <w:rPr>
-          <w:rFonts w:ascii="Times New Roman" w:hAnsi="Times New Roman" w:cs="Times New Roman"/>
-          <w:b w:val="0"/>
-        </w:rPr>
-        <w:t xml:space="preserve">. Dengan </w:t>
-      </w:r>
-      <w:proofErr w:type="spellStart"/>
-      <w:r>
-        <w:rPr>
-          <w:rFonts w:ascii="Times New Roman" w:hAnsi="Times New Roman" w:cs="Times New Roman"/>
-          <w:b w:val="0"/>
-        </w:rPr>
-        <w:t>tahapan</w:t>
-      </w:r>
-      <w:proofErr w:type="spellEnd"/>
-      <w:r>
-        <w:rPr>
-          <w:rFonts w:ascii="Times New Roman" w:hAnsi="Times New Roman" w:cs="Times New Roman"/>
-          <w:b w:val="0"/>
-        </w:rPr>
-        <w:t xml:space="preserve"> </w:t>
-      </w:r>
-      <w:proofErr w:type="spellStart"/>
-      <w:r>
-        <w:rPr>
-          <w:rFonts w:ascii="Times New Roman" w:hAnsi="Times New Roman" w:cs="Times New Roman"/>
-          <w:b w:val="0"/>
-        </w:rPr>
-        <w:t>tersebut</w:t>
-      </w:r>
-      <w:proofErr w:type="spellEnd"/>
-      <w:r>
-        <w:rPr>
-          <w:rFonts w:ascii="Times New Roman" w:hAnsi="Times New Roman" w:cs="Times New Roman"/>
-          <w:b w:val="0"/>
-        </w:rPr>
-        <w:t xml:space="preserve">, </w:t>
-      </w:r>
-      <w:proofErr w:type="spellStart"/>
-      <w:r>
-        <w:rPr>
-          <w:rFonts w:ascii="Times New Roman" w:hAnsi="Times New Roman" w:cs="Times New Roman"/>
-          <w:b w:val="0"/>
-        </w:rPr>
-        <w:t>prototipe</w:t>
-      </w:r>
-      <w:proofErr w:type="spellEnd"/>
-      <w:r>
-        <w:rPr>
-          <w:rFonts w:ascii="Times New Roman" w:hAnsi="Times New Roman" w:cs="Times New Roman"/>
-          <w:b w:val="0"/>
-        </w:rPr>
-        <w:t xml:space="preserve"> </w:t>
-      </w:r>
-      <w:proofErr w:type="spellStart"/>
-      <w:r>
-        <w:rPr>
-          <w:rFonts w:ascii="Times New Roman" w:hAnsi="Times New Roman" w:cs="Times New Roman"/>
-          <w:b w:val="0"/>
-        </w:rPr>
-        <w:t>dapat</w:t>
-      </w:r>
-      <w:proofErr w:type="spellEnd"/>
-      <w:r>
-        <w:rPr>
-          <w:rFonts w:ascii="Times New Roman" w:hAnsi="Times New Roman" w:cs="Times New Roman"/>
-          <w:b w:val="0"/>
-        </w:rPr>
-        <w:t xml:space="preserve"> </w:t>
-      </w:r>
-      <w:proofErr w:type="spellStart"/>
-      <w:r>
-        <w:rPr>
-          <w:rFonts w:ascii="Times New Roman" w:hAnsi="Times New Roman" w:cs="Times New Roman"/>
-          <w:b w:val="0"/>
-        </w:rPr>
-        <w:t>menjadi</w:t>
-      </w:r>
-      <w:proofErr w:type="spellEnd"/>
-      <w:r>
-        <w:rPr>
-          <w:rFonts w:ascii="Times New Roman" w:hAnsi="Times New Roman" w:cs="Times New Roman"/>
-          <w:b w:val="0"/>
-        </w:rPr>
-        <w:t xml:space="preserve"> </w:t>
-      </w:r>
-      <w:proofErr w:type="spellStart"/>
-      <w:r>
-        <w:rPr>
-          <w:rFonts w:ascii="Times New Roman" w:hAnsi="Times New Roman" w:cs="Times New Roman"/>
-          <w:b w:val="0"/>
-        </w:rPr>
-        <w:t>dasar</w:t>
-      </w:r>
-      <w:proofErr w:type="spellEnd"/>
-      <w:r>
-        <w:rPr>
-          <w:rFonts w:ascii="Times New Roman" w:hAnsi="Times New Roman" w:cs="Times New Roman"/>
-          <w:b w:val="0"/>
-        </w:rPr>
-        <w:t xml:space="preserve"> </w:t>
-      </w:r>
-      <w:proofErr w:type="spellStart"/>
-      <w:r>
-        <w:rPr>
-          <w:rFonts w:ascii="Times New Roman" w:hAnsi="Times New Roman" w:cs="Times New Roman"/>
-          <w:b w:val="0"/>
-        </w:rPr>
-        <w:t>pengembangan</w:t>
-      </w:r>
-      <w:proofErr w:type="spellEnd"/>
-      <w:r>
-        <w:rPr>
-          <w:rFonts w:ascii="Times New Roman" w:hAnsi="Times New Roman" w:cs="Times New Roman"/>
-          <w:b w:val="0"/>
-        </w:rPr>
-        <w:t xml:space="preserve"> </w:t>
-      </w:r>
-      <w:proofErr w:type="spellStart"/>
-      <w:r>
-        <w:rPr>
-          <w:rFonts w:ascii="Times New Roman" w:hAnsi="Times New Roman" w:cs="Times New Roman"/>
-          <w:b w:val="0"/>
-        </w:rPr>
-        <w:t>produk</w:t>
-      </w:r>
-      <w:proofErr w:type="spellEnd"/>
-      <w:r>
-        <w:rPr>
-          <w:rFonts w:ascii="Times New Roman" w:hAnsi="Times New Roman" w:cs="Times New Roman"/>
-          <w:b w:val="0"/>
-        </w:rPr>
-        <w:t xml:space="preserve"> </w:t>
-      </w:r>
-      <w:proofErr w:type="spellStart"/>
-      <w:r>
-        <w:rPr>
-          <w:rFonts w:ascii="Times New Roman" w:hAnsi="Times New Roman" w:cs="Times New Roman"/>
-          <w:b w:val="0"/>
-        </w:rPr>
-        <w:t>teknologi</w:t>
-      </w:r>
-      <w:proofErr w:type="spellEnd"/>
-      <w:r>
-        <w:rPr>
-          <w:rFonts w:ascii="Times New Roman" w:hAnsi="Times New Roman" w:cs="Times New Roman"/>
-          <w:b w:val="0"/>
-        </w:rPr>
-        <w:t xml:space="preserve"> </w:t>
-      </w:r>
-      <w:proofErr w:type="spellStart"/>
-      <w:r>
-        <w:rPr>
-          <w:rFonts w:ascii="Times New Roman" w:hAnsi="Times New Roman" w:cs="Times New Roman"/>
-          <w:b w:val="0"/>
-        </w:rPr>
-        <w:t>akuaponik</w:t>
-      </w:r>
-      <w:proofErr w:type="spellEnd"/>
-      <w:r>
-        <w:rPr>
-          <w:rFonts w:ascii="Times New Roman" w:hAnsi="Times New Roman" w:cs="Times New Roman"/>
-          <w:b w:val="0"/>
-        </w:rPr>
-        <w:t xml:space="preserve"> </w:t>
-      </w:r>
-      <w:proofErr w:type="spellStart"/>
-      <w:r>
-        <w:rPr>
-          <w:rFonts w:ascii="Times New Roman" w:hAnsi="Times New Roman" w:cs="Times New Roman"/>
-          <w:b w:val="0"/>
-        </w:rPr>
-        <w:t>cerdas</w:t>
-      </w:r>
-      <w:proofErr w:type="spellEnd"/>
-      <w:r>
-        <w:rPr>
-          <w:rFonts w:ascii="Times New Roman" w:hAnsi="Times New Roman" w:cs="Times New Roman"/>
-          <w:b w:val="0"/>
-        </w:rPr>
-        <w:t xml:space="preserve"> </w:t>
-      </w:r>
-      <w:proofErr w:type="spellStart"/>
-      <w:r>
-        <w:rPr>
-          <w:rFonts w:ascii="Times New Roman" w:hAnsi="Times New Roman" w:cs="Times New Roman"/>
-          <w:b w:val="0"/>
-        </w:rPr>
-        <w:t>untuk</w:t>
-      </w:r>
-      <w:proofErr w:type="spellEnd"/>
-      <w:r>
-        <w:rPr>
-          <w:rFonts w:ascii="Times New Roman" w:hAnsi="Times New Roman" w:cs="Times New Roman"/>
-          <w:b w:val="0"/>
-        </w:rPr>
-        <w:t xml:space="preserve"> </w:t>
-      </w:r>
-      <w:proofErr w:type="spellStart"/>
-      <w:r>
-        <w:rPr>
-          <w:rFonts w:ascii="Times New Roman" w:hAnsi="Times New Roman" w:cs="Times New Roman"/>
-          <w:b w:val="0"/>
-        </w:rPr>
-        <w:t>kebutuhan</w:t>
-      </w:r>
-      <w:proofErr w:type="spellEnd"/>
-      <w:r>
-        <w:rPr>
-          <w:rFonts w:ascii="Times New Roman" w:hAnsi="Times New Roman" w:cs="Times New Roman"/>
-          <w:b w:val="0"/>
-        </w:rPr>
-        <w:t xml:space="preserve"> </w:t>
-      </w:r>
-      <w:proofErr w:type="spellStart"/>
-      <w:r>
-        <w:rPr>
-          <w:rFonts w:ascii="Times New Roman" w:hAnsi="Times New Roman" w:cs="Times New Roman"/>
-          <w:b w:val="0"/>
-        </w:rPr>
-        <w:t>pendidikan</w:t>
-      </w:r>
-      <w:proofErr w:type="spellEnd"/>
-      <w:r>
-        <w:rPr>
-          <w:rFonts w:ascii="Times New Roman" w:hAnsi="Times New Roman" w:cs="Times New Roman"/>
-          <w:b w:val="0"/>
-        </w:rPr>
-        <w:t xml:space="preserve">, </w:t>
-      </w:r>
-      <w:proofErr w:type="spellStart"/>
-      <w:r>
-        <w:rPr>
-          <w:rFonts w:ascii="Times New Roman" w:hAnsi="Times New Roman" w:cs="Times New Roman"/>
-          <w:b w:val="0"/>
-        </w:rPr>
-        <w:t>penelitian</w:t>
-      </w:r>
-      <w:proofErr w:type="spellEnd"/>
-      <w:r>
-        <w:rPr>
-          <w:rFonts w:ascii="Times New Roman" w:hAnsi="Times New Roman" w:cs="Times New Roman"/>
-          <w:b w:val="0"/>
-        </w:rPr>
-        <w:t xml:space="preserve">, </w:t>
-      </w:r>
-      <w:proofErr w:type="spellStart"/>
-      <w:r>
-        <w:rPr>
-          <w:rFonts w:ascii="Times New Roman" w:hAnsi="Times New Roman" w:cs="Times New Roman"/>
-          <w:b w:val="0"/>
-        </w:rPr>
-        <w:t>komunitas</w:t>
-      </w:r>
-      <w:proofErr w:type="spellEnd"/>
-      <w:r>
-        <w:rPr>
-          <w:rFonts w:ascii="Times New Roman" w:hAnsi="Times New Roman" w:cs="Times New Roman"/>
-          <w:b w:val="0"/>
-        </w:rPr>
-        <w:t xml:space="preserve">, </w:t>
-      </w:r>
-      <w:proofErr w:type="spellStart"/>
-      <w:r>
-        <w:rPr>
-          <w:rFonts w:ascii="Times New Roman" w:hAnsi="Times New Roman" w:cs="Times New Roman"/>
-          <w:b w:val="0"/>
-        </w:rPr>
-        <w:t>maupun</w:t>
-      </w:r>
-      <w:proofErr w:type="spellEnd"/>
-      <w:r>
-        <w:rPr>
-          <w:rFonts w:ascii="Times New Roman" w:hAnsi="Times New Roman" w:cs="Times New Roman"/>
-          <w:b w:val="0"/>
-        </w:rPr>
-        <w:t xml:space="preserve"> </w:t>
-      </w:r>
-      <w:proofErr w:type="spellStart"/>
-      <w:r>
-        <w:rPr>
-          <w:rFonts w:ascii="Times New Roman" w:hAnsi="Times New Roman" w:cs="Times New Roman"/>
-          <w:b w:val="0"/>
-        </w:rPr>
-        <w:t>pelaku</w:t>
-      </w:r>
-      <w:proofErr w:type="spellEnd"/>
-      <w:r>
-        <w:rPr>
-          <w:rFonts w:ascii="Times New Roman" w:hAnsi="Times New Roman" w:cs="Times New Roman"/>
-          <w:b w:val="0"/>
-        </w:rPr>
-        <w:t xml:space="preserve"> </w:t>
-      </w:r>
-      <w:proofErr w:type="spellStart"/>
-      <w:r>
-        <w:rPr>
-          <w:rFonts w:ascii="Times New Roman" w:hAnsi="Times New Roman" w:cs="Times New Roman"/>
-          <w:b w:val="0"/>
-        </w:rPr>
-        <w:t>budidaya</w:t>
-      </w:r>
-      <w:proofErr w:type="spellEnd"/>
-      <w:r>
-        <w:rPr>
-          <w:rFonts w:ascii="Times New Roman" w:hAnsi="Times New Roman" w:cs="Times New Roman"/>
-          <w:b w:val="0"/>
-        </w:rPr>
-        <w:t xml:space="preserve"> </w:t>
-      </w:r>
-      <w:proofErr w:type="spellStart"/>
-      <w:r>
-        <w:rPr>
-          <w:rFonts w:ascii="Times New Roman" w:hAnsi="Times New Roman" w:cs="Times New Roman"/>
-          <w:b w:val="0"/>
-        </w:rPr>
-        <w:t>skala</w:t>
-      </w:r>
-      <w:proofErr w:type="spellEnd"/>
-      <w:r>
-        <w:rPr>
-          <w:rFonts w:ascii="Times New Roman" w:hAnsi="Times New Roman" w:cs="Times New Roman"/>
-          <w:b w:val="0"/>
-        </w:rPr>
-        <w:t xml:space="preserve"> </w:t>
-      </w:r>
-      <w:proofErr w:type="spellStart"/>
-      <w:r>
-        <w:rPr>
-          <w:rFonts w:ascii="Times New Roman" w:hAnsi="Times New Roman" w:cs="Times New Roman"/>
-          <w:b w:val="0"/>
-        </w:rPr>
-        <w:t>kecil</w:t>
-      </w:r>
-      <w:proofErr w:type="spellEnd"/>
-      <w:r>
-        <w:rPr>
-          <w:rFonts w:ascii="Times New Roman" w:hAnsi="Times New Roman" w:cs="Times New Roman"/>
-          <w:b w:val="0"/>
-        </w:rPr>
-        <w:t xml:space="preserve"> dan </w:t>
-      </w:r>
-      <w:proofErr w:type="spellStart"/>
-      <w:r>
-        <w:rPr>
-          <w:rFonts w:ascii="Times New Roman" w:hAnsi="Times New Roman" w:cs="Times New Roman"/>
-          <w:b w:val="0"/>
-        </w:rPr>
-        <w:t>menengah</w:t>
-      </w:r>
-      <w:proofErr w:type="spellEnd"/>
-      <w:r>
-        <w:rPr>
-          <w:rFonts w:ascii="Times New Roman" w:hAnsi="Times New Roman" w:cs="Times New Roman"/>
-          <w:b w:val="0"/>
-        </w:rPr>
-        <w:t xml:space="preserve">. </w:t>
-      </w:r>
-      <w:proofErr w:type="spellStart"/>
-      <w:r>
-        <w:rPr>
-          <w:rFonts w:ascii="Times New Roman" w:hAnsi="Times New Roman" w:cs="Times New Roman"/>
-          <w:b w:val="0"/>
-        </w:rPr>
-        <w:t>Namun</w:t>
-      </w:r>
-      <w:proofErr w:type="spellEnd"/>
-      <w:r>
-        <w:rPr>
-          <w:rFonts w:ascii="Times New Roman" w:hAnsi="Times New Roman" w:cs="Times New Roman"/>
-          <w:b w:val="0"/>
-        </w:rPr>
-        <w:t xml:space="preserve">, </w:t>
-      </w:r>
-      <w:proofErr w:type="spellStart"/>
-      <w:r>
-        <w:rPr>
-          <w:rFonts w:ascii="Times New Roman" w:hAnsi="Times New Roman" w:cs="Times New Roman"/>
-          <w:b w:val="0"/>
-        </w:rPr>
-        <w:t>penerapan</w:t>
-      </w:r>
-      <w:proofErr w:type="spellEnd"/>
-      <w:r>
-        <w:rPr>
-          <w:rFonts w:ascii="Times New Roman" w:hAnsi="Times New Roman" w:cs="Times New Roman"/>
-          <w:b w:val="0"/>
-        </w:rPr>
-        <w:t xml:space="preserve"> </w:t>
-      </w:r>
-      <w:proofErr w:type="spellStart"/>
-      <w:r>
-        <w:rPr>
-          <w:rFonts w:ascii="Times New Roman" w:hAnsi="Times New Roman" w:cs="Times New Roman"/>
-          <w:b w:val="0"/>
-        </w:rPr>
-        <w:t>secara</w:t>
-      </w:r>
-      <w:proofErr w:type="spellEnd"/>
-      <w:r>
-        <w:rPr>
-          <w:rFonts w:ascii="Times New Roman" w:hAnsi="Times New Roman" w:cs="Times New Roman"/>
-          <w:b w:val="0"/>
-        </w:rPr>
-        <w:t xml:space="preserve"> </w:t>
-      </w:r>
-      <w:proofErr w:type="spellStart"/>
-      <w:r>
-        <w:rPr>
-          <w:rFonts w:ascii="Times New Roman" w:hAnsi="Times New Roman" w:cs="Times New Roman"/>
-          <w:b w:val="0"/>
-        </w:rPr>
-        <w:t>komersial</w:t>
-      </w:r>
-      <w:proofErr w:type="spellEnd"/>
-      <w:r>
-        <w:rPr>
-          <w:rFonts w:ascii="Times New Roman" w:hAnsi="Times New Roman" w:cs="Times New Roman"/>
-          <w:b w:val="0"/>
-        </w:rPr>
-        <w:t xml:space="preserve"> </w:t>
-      </w:r>
-      <w:proofErr w:type="spellStart"/>
-      <w:r>
-        <w:rPr>
-          <w:rFonts w:ascii="Times New Roman" w:hAnsi="Times New Roman" w:cs="Times New Roman"/>
-          <w:b w:val="0"/>
-        </w:rPr>
-        <w:t>tetap</w:t>
-      </w:r>
-      <w:proofErr w:type="spellEnd"/>
-      <w:r>
-        <w:rPr>
-          <w:rFonts w:ascii="Times New Roman" w:hAnsi="Times New Roman" w:cs="Times New Roman"/>
-          <w:b w:val="0"/>
-        </w:rPr>
-        <w:t xml:space="preserve"> </w:t>
-      </w:r>
-      <w:proofErr w:type="spellStart"/>
-      <w:r>
-        <w:rPr>
-          <w:rFonts w:ascii="Times New Roman" w:hAnsi="Times New Roman" w:cs="Times New Roman"/>
-          <w:b w:val="0"/>
-        </w:rPr>
-        <w:t>memerlukan</w:t>
-      </w:r>
-      <w:proofErr w:type="spellEnd"/>
-      <w:r>
-        <w:rPr>
-          <w:rFonts w:ascii="Times New Roman" w:hAnsi="Times New Roman" w:cs="Times New Roman"/>
-          <w:b w:val="0"/>
-        </w:rPr>
-        <w:t xml:space="preserve"> </w:t>
-      </w:r>
-      <w:proofErr w:type="spellStart"/>
-      <w:r>
-        <w:rPr>
-          <w:rFonts w:ascii="Times New Roman" w:hAnsi="Times New Roman" w:cs="Times New Roman"/>
-          <w:b w:val="0"/>
-        </w:rPr>
-        <w:t>validasi</w:t>
-      </w:r>
-      <w:proofErr w:type="spellEnd"/>
-      <w:r>
-        <w:rPr>
-          <w:rFonts w:ascii="Times New Roman" w:hAnsi="Times New Roman" w:cs="Times New Roman"/>
-          <w:b w:val="0"/>
-        </w:rPr>
-        <w:t xml:space="preserve"> </w:t>
-      </w:r>
-      <w:proofErr w:type="spellStart"/>
-      <w:r>
-        <w:rPr>
-          <w:rFonts w:ascii="Times New Roman" w:hAnsi="Times New Roman" w:cs="Times New Roman"/>
-          <w:b w:val="0"/>
-        </w:rPr>
-        <w:t>tambahan</w:t>
-      </w:r>
-      <w:proofErr w:type="spellEnd"/>
-      <w:r>
-        <w:rPr>
-          <w:rFonts w:ascii="Times New Roman" w:hAnsi="Times New Roman" w:cs="Times New Roman"/>
-          <w:b w:val="0"/>
-        </w:rPr>
-        <w:t xml:space="preserve"> </w:t>
-      </w:r>
-      <w:proofErr w:type="spellStart"/>
-      <w:r>
-        <w:rPr>
-          <w:rFonts w:ascii="Times New Roman" w:hAnsi="Times New Roman" w:cs="Times New Roman"/>
-          <w:b w:val="0"/>
-        </w:rPr>
-        <w:t>untuk</w:t>
-      </w:r>
-      <w:proofErr w:type="spellEnd"/>
-      <w:r>
-        <w:rPr>
-          <w:rFonts w:ascii="Times New Roman" w:hAnsi="Times New Roman" w:cs="Times New Roman"/>
-          <w:b w:val="0"/>
-        </w:rPr>
-        <w:t xml:space="preserve"> </w:t>
-      </w:r>
-      <w:proofErr w:type="spellStart"/>
-      <w:r>
-        <w:rPr>
-          <w:rFonts w:ascii="Times New Roman" w:hAnsi="Times New Roman" w:cs="Times New Roman"/>
-          <w:b w:val="0"/>
-        </w:rPr>
-        <w:t>memastikan</w:t>
-      </w:r>
-      <w:proofErr w:type="spellEnd"/>
-      <w:r>
-        <w:rPr>
-          <w:rFonts w:ascii="Times New Roman" w:hAnsi="Times New Roman" w:cs="Times New Roman"/>
-          <w:b w:val="0"/>
-        </w:rPr>
-        <w:t xml:space="preserve"> </w:t>
-      </w:r>
-      <w:proofErr w:type="spellStart"/>
-      <w:r>
-        <w:rPr>
-          <w:rFonts w:ascii="Times New Roman" w:hAnsi="Times New Roman" w:cs="Times New Roman"/>
-          <w:b w:val="0"/>
-        </w:rPr>
-        <w:t>keandalan</w:t>
-      </w:r>
-      <w:proofErr w:type="spellEnd"/>
-      <w:r>
-        <w:rPr>
-          <w:rFonts w:ascii="Times New Roman" w:hAnsi="Times New Roman" w:cs="Times New Roman"/>
-          <w:b w:val="0"/>
-        </w:rPr>
-        <w:t xml:space="preserve">, </w:t>
-      </w:r>
-      <w:proofErr w:type="spellStart"/>
-      <w:r>
-        <w:rPr>
-          <w:rFonts w:ascii="Times New Roman" w:hAnsi="Times New Roman" w:cs="Times New Roman"/>
-          <w:b w:val="0"/>
-        </w:rPr>
-        <w:t>konsistensi</w:t>
-      </w:r>
-      <w:proofErr w:type="spellEnd"/>
-      <w:r>
-        <w:rPr>
-          <w:rFonts w:ascii="Times New Roman" w:hAnsi="Times New Roman" w:cs="Times New Roman"/>
-          <w:b w:val="0"/>
-        </w:rPr>
-        <w:t xml:space="preserve"> </w:t>
-      </w:r>
-      <w:proofErr w:type="spellStart"/>
-      <w:r>
-        <w:rPr>
-          <w:rFonts w:ascii="Times New Roman" w:hAnsi="Times New Roman" w:cs="Times New Roman"/>
-          <w:b w:val="0"/>
-        </w:rPr>
-        <w:t>kinerja</w:t>
-      </w:r>
-      <w:proofErr w:type="spellEnd"/>
-      <w:r>
-        <w:rPr>
-          <w:rFonts w:ascii="Times New Roman" w:hAnsi="Times New Roman" w:cs="Times New Roman"/>
-          <w:b w:val="0"/>
-        </w:rPr>
-        <w:t xml:space="preserve">, </w:t>
-      </w:r>
-      <w:proofErr w:type="spellStart"/>
-      <w:r>
-        <w:rPr>
-          <w:rFonts w:ascii="Times New Roman" w:hAnsi="Times New Roman" w:cs="Times New Roman"/>
-          <w:b w:val="0"/>
-        </w:rPr>
-        <w:t>kemudahan</w:t>
-      </w:r>
-      <w:proofErr w:type="spellEnd"/>
-      <w:r>
-        <w:rPr>
-          <w:rFonts w:ascii="Times New Roman" w:hAnsi="Times New Roman" w:cs="Times New Roman"/>
-          <w:b w:val="0"/>
-        </w:rPr>
-        <w:t xml:space="preserve"> </w:t>
-      </w:r>
-      <w:proofErr w:type="spellStart"/>
-      <w:r>
-        <w:rPr>
-          <w:rFonts w:ascii="Times New Roman" w:hAnsi="Times New Roman" w:cs="Times New Roman"/>
-          <w:b w:val="0"/>
-        </w:rPr>
-        <w:t>pemeliharaan</w:t>
-      </w:r>
-      <w:proofErr w:type="spellEnd"/>
-      <w:r>
-        <w:rPr>
-          <w:rFonts w:ascii="Times New Roman" w:hAnsi="Times New Roman" w:cs="Times New Roman"/>
-          <w:b w:val="0"/>
-        </w:rPr>
-        <w:t xml:space="preserve">, dan </w:t>
-      </w:r>
-      <w:proofErr w:type="spellStart"/>
-      <w:r>
-        <w:rPr>
-          <w:rFonts w:ascii="Times New Roman" w:hAnsi="Times New Roman" w:cs="Times New Roman"/>
-          <w:b w:val="0"/>
-        </w:rPr>
-        <w:t>kesesuaian</w:t>
-      </w:r>
-      <w:proofErr w:type="spellEnd"/>
-      <w:r>
-        <w:rPr>
-          <w:rFonts w:ascii="Times New Roman" w:hAnsi="Times New Roman" w:cs="Times New Roman"/>
-          <w:b w:val="0"/>
-        </w:rPr>
-        <w:t xml:space="preserve"> </w:t>
-      </w:r>
-      <w:proofErr w:type="spellStart"/>
-      <w:r>
-        <w:rPr>
-          <w:rFonts w:ascii="Times New Roman" w:hAnsi="Times New Roman" w:cs="Times New Roman"/>
-          <w:b w:val="0"/>
-        </w:rPr>
-        <w:t>sistem</w:t>
-      </w:r>
-      <w:proofErr w:type="spellEnd"/>
-      <w:r>
-        <w:rPr>
-          <w:rFonts w:ascii="Times New Roman" w:hAnsi="Times New Roman" w:cs="Times New Roman"/>
-          <w:b w:val="0"/>
-        </w:rPr>
-        <w:t xml:space="preserve"> </w:t>
-      </w:r>
-      <w:proofErr w:type="spellStart"/>
-      <w:r>
-        <w:rPr>
-          <w:rFonts w:ascii="Times New Roman" w:hAnsi="Times New Roman" w:cs="Times New Roman"/>
-          <w:b w:val="0"/>
-        </w:rPr>
-        <w:t>terhadap</w:t>
-      </w:r>
-      <w:proofErr w:type="spellEnd"/>
-      <w:r>
-        <w:rPr>
-          <w:rFonts w:ascii="Times New Roman" w:hAnsi="Times New Roman" w:cs="Times New Roman"/>
-          <w:b w:val="0"/>
-        </w:rPr>
-        <w:t xml:space="preserve"> </w:t>
-      </w:r>
-      <w:proofErr w:type="spellStart"/>
-      <w:r>
-        <w:rPr>
-          <w:rFonts w:ascii="Times New Roman" w:hAnsi="Times New Roman" w:cs="Times New Roman"/>
-          <w:b w:val="0"/>
-        </w:rPr>
-        <w:t>kondisi</w:t>
-      </w:r>
-      <w:proofErr w:type="spellEnd"/>
-      <w:r>
-        <w:rPr>
-          <w:rFonts w:ascii="Times New Roman" w:hAnsi="Times New Roman" w:cs="Times New Roman"/>
-          <w:b w:val="0"/>
-        </w:rPr>
-        <w:t xml:space="preserve"> </w:t>
-      </w:r>
-      <w:proofErr w:type="spellStart"/>
-      <w:r>
-        <w:rPr>
-          <w:rFonts w:ascii="Times New Roman" w:hAnsi="Times New Roman" w:cs="Times New Roman"/>
-          <w:b w:val="0"/>
-        </w:rPr>
-        <w:t>operasional</w:t>
-      </w:r>
-      <w:proofErr w:type="spellEnd"/>
-      <w:r>
-        <w:rPr>
-          <w:rFonts w:ascii="Times New Roman" w:hAnsi="Times New Roman" w:cs="Times New Roman"/>
-          <w:b w:val="0"/>
-        </w:rPr>
-        <w:t xml:space="preserve"> yang </w:t>
-      </w:r>
-      <w:proofErr w:type="spellStart"/>
-      <w:r>
-        <w:rPr>
-          <w:rFonts w:ascii="Times New Roman" w:hAnsi="Times New Roman" w:cs="Times New Roman"/>
-          <w:b w:val="0"/>
-        </w:rPr>
-        <w:t>berbeda</w:t>
-      </w:r>
-      <w:proofErr w:type="spellEnd"/>
-      <w:r>
-        <w:rPr>
-          <w:rFonts w:ascii="Times New Roman" w:hAnsi="Times New Roman" w:cs="Times New Roman"/>
-          <w:b w:val="0"/>
-        </w:rPr>
-        <w:t>.</w:t>
+        </w:rPr>
+        <w:t>Dari sisi komersial, prototipe ini memiliki potensi untuk dikembangkan menjadi perangkat pendukung monitoring akuaponik yang menilai kelayakan panen dan kesehatan tanaman dalam satu sistem. Arsitektur yang menggunakan komputer papan tunggal, kamera, rumah kamera cetak tiga dimensi, dan konektivitas Internet of Things memungkinkan sistem dikembangkan secara modular sesuai kebutuhan pengguna dan skala instalasi.</w:t>
       </w:r>
     </w:p>
     <w:p>
       <w:pPr>
-        <w:pStyle w:val="ListParagraph"/>
-        <w:spacing w:line="360" w:lineRule="auto"/>
-        <w:ind w:left="851" w:firstLine="360"/>
-        <w:jc w:val="both"/>
-        <w:rPr>
-          <w:rFonts w:ascii="Times New Roman" w:hAnsi="Times New Roman" w:cs="Times New Roman"/>
-        </w:rPr>
-      </w:pPr>
-      <w:r>
-        <w:rPr>
-          <w:rFonts w:ascii="Times New Roman" w:hAnsi="Times New Roman" w:cs="Times New Roman"/>
-        </w:rPr>
-        <w:t>Dari sisi komersial, prototipe ini memiliki potensi untuk dikembangkan menjadi perangkat pendukung monitoring akuaponik yang menilai kelayakan panen dan kesehatan tanaman dalam satu sistem. Arsitektur yang menggunakan komputer papan tunggal, kamera, rumah kamera cetak tiga dimensi, dan konektivitas Internet of Things memungkinkan sistem dikembangkan secara modular sesuai kebutuhan pengguna dan skala instalasi.</w:t>
-      </w:r>
-    </w:p>
-    <w:p>
-      <w:pPr>
+        <w:pStyle w:val="Heading3"/>
         <w:spacing w:after="0" w:line="360" w:lineRule="auto"/>
-        <w:ind w:firstLine="360"/>
         <w:jc w:val="both"/>
         <w:rPr>
           <w:rFonts w:ascii="Times New Roman" w:hAnsi="Times New Roman" w:cs="Times New Roman"/>
@@ -17210,48 +16184,60 @@
       <w:r>
         <w:rPr>
           <w:rFonts w:ascii="Times New Roman" w:hAnsi="Times New Roman" w:cs="Times New Roman"/>
-          <w:b w:val="0"/>
+          <w:b/>
           <w:bCs/>
-        </w:rPr>
-        <w:t>Pengembangan lebih lanjut dapat diarahkan pada penyederhanaan instalasi, peningkatan keandalan perangkat keras, pengembangan antarmuka pengguna, serta pengujian pada lebih banyak konfigurasi akuaponik. Dengan tahapan tersebut, prototipe dapat menjadi dasar pengembangan produk teknologi monitoring cerdas untuk kebutuhan pendidikan, penelitian, komunitas, maupun pelaku budidaya skala kecil dan menengah. Namun, penerapan secara komersial tetap memerlukan validasi tambahan untuk memastikan keandalan, konsistensi kinerja, kemudahan pemeliharaan, dan kesesuaian sistem terhadap kondisi operasional yang berbeda.</w:t>
-      </w:r>
-      <w:proofErr w:type="spellStart"/>
-      <w:r>
-        <w:rPr>
-          <w:rFonts w:ascii="Times New Roman" w:hAnsi="Times New Roman" w:cs="Times New Roman"/>
-          <w:b w:val="0"/>
+          <w:color w:val="000000"/>
+          <w:sz w:val="24"/>
+        </w:rPr>
+        <w:t>1.5.3 Pengembangan lebih lanjut</w:t>
+      </w:r>
+      <w:proofErr w:type="spellStart"/>
+      <w:r>
+        <w:rPr>
+          <w:rFonts w:ascii="Times New Roman" w:hAnsi="Times New Roman" w:cs="Times New Roman"/>
+          <w:b/>
           <w:bCs/>
-        </w:rPr>
-      </w:r>
-      <w:proofErr w:type="spellEnd"/>
-      <w:r>
-        <w:rPr>
-          <w:rFonts w:ascii="Times New Roman" w:hAnsi="Times New Roman" w:cs="Times New Roman"/>
-          <w:b w:val="0"/>
+          <w:color w:val="000000"/>
+          <w:sz w:val="24"/>
+        </w:rPr>
+      </w:r>
+      <w:proofErr w:type="spellEnd"/>
+      <w:r>
+        <w:rPr>
+          <w:rFonts w:ascii="Times New Roman" w:hAnsi="Times New Roman" w:cs="Times New Roman"/>
+          <w:b/>
           <w:bCs/>
-        </w:rPr>
-      </w:r>
-      <w:proofErr w:type="spellStart"/>
-      <w:r>
-        <w:rPr>
-          <w:rFonts w:ascii="Times New Roman" w:hAnsi="Times New Roman" w:cs="Times New Roman"/>
-          <w:b w:val="0"/>
+          <w:color w:val="000000"/>
+          <w:sz w:val="24"/>
+        </w:rPr>
+      </w:r>
+      <w:proofErr w:type="spellStart"/>
+      <w:r>
+        <w:rPr>
+          <w:rFonts w:ascii="Times New Roman" w:hAnsi="Times New Roman" w:cs="Times New Roman"/>
+          <w:b/>
           <w:bCs/>
-        </w:rPr>
-      </w:r>
-      <w:proofErr w:type="spellEnd"/>
-      <w:r>
-        <w:rPr>
-          <w:rFonts w:ascii="Times New Roman" w:hAnsi="Times New Roman" w:cs="Times New Roman"/>
-          <w:b w:val="0"/>
+          <w:color w:val="000000"/>
+          <w:sz w:val="24"/>
+        </w:rPr>
+      </w:r>
+      <w:proofErr w:type="spellEnd"/>
+      <w:r>
+        <w:rPr>
+          <w:rFonts w:ascii="Times New Roman" w:hAnsi="Times New Roman" w:cs="Times New Roman"/>
+          <w:b/>
           <w:bCs/>
-        </w:rPr>
-      </w:r>
-      <w:r>
-        <w:rPr>
-          <w:rFonts w:ascii="Times New Roman" w:hAnsi="Times New Roman" w:cs="Times New Roman"/>
-          <w:b w:val="0"/>
+          <w:color w:val="000000"/>
+          <w:sz w:val="24"/>
+        </w:rPr>
+      </w:r>
+      <w:r>
+        <w:rPr>
+          <w:rFonts w:ascii="Times New Roman" w:hAnsi="Times New Roman" w:cs="Times New Roman"/>
+          <w:b/>
           <w:bCs/>
+          <w:color w:val="000000"/>
+          <w:sz w:val="24"/>
         </w:rPr>
       </w:r>
     </w:p>
@@ -17960,13 +16946,19 @@
     <w:p>
       <w:pPr>
         <w:pStyle w:val="ListParagraph"/>
-        <w:spacing w:line="276" w:lineRule="auto"/>
+        <w:spacing w:line="360" w:lineRule="auto"/>
         <w:ind w:left="851" w:firstLine="360"/>
         <w:jc w:val="both"/>
         <w:rPr>
           <w:rFonts w:ascii="Times New Roman" w:hAnsi="Times New Roman" w:cs="Times New Roman"/>
         </w:rPr>
       </w:pPr>
+      <w:r>
+        <w:rPr>
+          <w:rFonts w:ascii="Times New Roman" w:hAnsi="Times New Roman" w:cs="Times New Roman"/>
+        </w:rPr>
+        <w:t>Dapat diarahkan pada penyederhanaan instalasi, peningkatan keandalan perangkat keras, pengembangan antarmuka pengguna, serta pengujian pada lebih banyak konfigurasi akuaponik. Dengan tahapan tersebut, prototipe dapat menjadi dasar pengembangan produk teknologi monitoring cerdas untuk kebutuhan pendidikan, penelitian, komunitas, maupun pelaku budidaya skala kecil dan menengah. Namun, penerapan secara komersial tetap memerlukan validasi tambahan untuk memastikan keandalan, konsistensi kinerja, kemudahan pemeliharaan, dan kesesuaian sistem terhadap kondisi operasional yang berbeda.</w:t>
+      </w:r>
     </w:p>
     <w:p>
       <w:pPr>

</xml_diff>

<commit_message>
perbaiki kriteria dosen: sebut Tabel 1.1 & Lampiran 2, kepanjangan LiDAR/ExG, flowchart simbol baku + cabang fallback terhubung
</commit_message>
<xml_diff>
--- a/docs/PROPOSAL_PROTOTIPE_FELIX_ENRIQUE_2305110019.docx
+++ b/docs/PROPOSAL_PROTOTIPE_FELIX_ENRIQUE_2305110019.docx
@@ -603,25 +603,6 @@
     </w:p>
     <w:p>
       <w:pPr>
-        <w:spacing w:before="280" w:after="400"/>
-        <w:jc w:val="center"/>
-        <w:rPr>
-          <w:rFonts w:ascii="Times New Roman" w:hAnsi="Times New Roman"/>
-        </w:rPr>
-      </w:pPr>
-    </w:p>
-    <w:p>
-      <w:pPr>
-        <w:spacing w:before="280" w:after="400"/>
-        <w:jc w:val="center"/>
-        <w:rPr>
-          <w:rFonts w:ascii="Times New Roman" w:hAnsi="Times New Roman"/>
-          <w:color w:val="000000"/>
-        </w:rPr>
-      </w:pPr>
-    </w:p>
-    <w:p>
-      <w:pPr>
         <w:spacing w:before="400" w:after="0" w:line="360" w:lineRule="auto"/>
         <w:jc w:val="center"/>
       </w:pPr>
@@ -632,33 +613,31 @@
           <w:sz w:val="24"/>
         </w:rPr>
         <w:t>PROGRAM STUDI TEKNIK KOMPUTER</w:t>
-      </w:r>
-      <w:r>
-        <w:rPr>
-          <w:rFonts w:ascii="Times New Roman" w:hAnsi="Times New Roman" w:cs="Times New Roman"/>
-          <w:b/>
-          <w:sz w:val="24"/>
-        </w:rPr>
         <w:br/>
-        <w:t>FAKULTAS TEKNIK</w:t>
-      </w:r>
-      <w:r>
-        <w:rPr>
-          <w:rFonts w:ascii="Times New Roman" w:hAnsi="Times New Roman" w:cs="Times New Roman"/>
-          <w:b/>
-          <w:sz w:val="24"/>
-        </w:rPr>
-        <w:br/>
-        <w:t>UNIVERSITAS NEGERI SEMARANG</w:t>
-      </w:r>
-      <w:r>
-        <w:rPr>
-          <w:rFonts w:ascii="Times New Roman" w:hAnsi="Times New Roman" w:cs="Times New Roman"/>
-          <w:b/>
-          <w:sz w:val="24"/>
-        </w:rPr>
+        <w:t>FAKULTAS TEKNIK UNIVERSITAS NEGERI SEMARANG</w:t>
         <w:br/>
         <w:t>2026</w:t>
+      </w:r>
+      <w:r>
+        <w:rPr>
+          <w:rFonts w:ascii="Times New Roman" w:hAnsi="Times New Roman" w:cs="Times New Roman"/>
+          <w:b/>
+          <w:sz w:val="24"/>
+        </w:rPr>
+      </w:r>
+      <w:r>
+        <w:rPr>
+          <w:rFonts w:ascii="Times New Roman" w:hAnsi="Times New Roman" w:cs="Times New Roman"/>
+          <w:b/>
+          <w:sz w:val="24"/>
+        </w:rPr>
+      </w:r>
+      <w:r>
+        <w:rPr>
+          <w:rFonts w:ascii="Times New Roman" w:hAnsi="Times New Roman" w:cs="Times New Roman"/>
+          <w:b/>
+          <w:sz w:val="24"/>
+        </w:rPr>
       </w:r>
     </w:p>
     <w:p>
@@ -1472,7 +1451,7 @@
         <w:rPr>
           <w:rFonts w:ascii="Times New Roman" w:hAnsi="Times New Roman" w:cs="Times New Roman"/>
         </w:rPr>
-        <w:t>2</w:t>
+        <w:t>3</w:t>
       </w:r>
     </w:p>
     <w:p>
@@ -1520,7 +1499,7 @@
         <w:rPr>
           <w:rFonts w:ascii="Times New Roman" w:hAnsi="Times New Roman" w:cs="Times New Roman"/>
         </w:rPr>
-        <w:t>3</w:t>
+        <w:t>4</w:t>
       </w:r>
     </w:p>
     <w:p>
@@ -1544,30 +1523,7 @@
         <w:rPr>
           <w:rFonts w:ascii="Times New Roman" w:hAnsi="Times New Roman" w:cs="Times New Roman"/>
         </w:rPr>
-        <w:t>5</w:t>
-      </w:r>
-    </w:p>
-    <w:p>
-      <w:pPr>
-        <w:rPr>
-          <w:rFonts w:ascii="Times New Roman" w:hAnsi="Times New Roman" w:cs="Times New Roman"/>
-        </w:rPr>
-        <w:tabs>
-          <w:tab w:val="right" w:leader="dot" w:pos="7900"/>
-        </w:tabs>
-      </w:pPr>
-      <w:r>
-        <w:rPr>
-          <w:rFonts w:ascii="Times New Roman" w:hAnsi="Times New Roman" w:cs="Times New Roman"/>
-        </w:rPr>
-        <w:t>BAB II  KAJIAN PUSTAKA</w:t>
-        <w:tab/>
-      </w:r>
-      <w:r>
-        <w:rPr>
-          <w:rFonts w:ascii="Times New Roman" w:hAnsi="Times New Roman" w:cs="Times New Roman"/>
-        </w:rPr>
-        <w:t>7</w:t>
+        <w:t>6</w:t>
       </w:r>
     </w:p>
     <w:p>
@@ -1584,14 +1540,14 @@
         <w:rPr>
           <w:rFonts w:ascii="Times New Roman" w:hAnsi="Times New Roman" w:cs="Times New Roman"/>
         </w:rPr>
-        <w:t>2.1  Tinjauan Pustaka</w:t>
+        <w:t>1.5.1  Potensi Dampak Fungsional</w:t>
         <w:tab/>
       </w:r>
       <w:r>
         <w:rPr>
           <w:rFonts w:ascii="Times New Roman" w:hAnsi="Times New Roman" w:cs="Times New Roman"/>
         </w:rPr>
-        <w:t>7</w:t>
+        <w:t>6</w:t>
       </w:r>
     </w:p>
     <w:p>
@@ -1608,6 +1564,104 @@
         <w:rPr>
           <w:rFonts w:ascii="Times New Roman" w:hAnsi="Times New Roman" w:cs="Times New Roman"/>
         </w:rPr>
+        <w:t>1.5.2  Potensi Dampak Komersial</w:t>
+        <w:tab/>
+      </w:r>
+      <w:r>
+        <w:rPr>
+          <w:rFonts w:ascii="Times New Roman" w:hAnsi="Times New Roman" w:cs="Times New Roman"/>
+        </w:rPr>
+        <w:t>7</w:t>
+      </w:r>
+    </w:p>
+    <w:p>
+      <w:pPr>
+        <w:jc w:val="both"/>
+        <w:rPr>
+          <w:rFonts w:ascii="Times New Roman" w:hAnsi="Times New Roman" w:cs="Times New Roman"/>
+        </w:rPr>
+        <w:ind w:left="360"/>
+        <w:tabs>
+          <w:tab w:val="right" w:leader="dot" w:pos="7900"/>
+        </w:tabs>
+      </w:pPr>
+      <w:r>
+        <w:rPr>
+          <w:rFonts w:ascii="Times New Roman" w:hAnsi="Times New Roman" w:cs="Times New Roman"/>
+          <w:b w:val="0"/>
+        </w:rPr>
+        <w:t>1.5.3  Pengembangan lebih lanjut</w:t>
+        <w:tab/>
+      </w:r>
+      <w:r>
+        <w:rPr>
+          <w:rFonts w:ascii="Times New Roman" w:hAnsi="Times New Roman" w:cs="Times New Roman"/>
+          <w:b w:val="0"/>
+        </w:rPr>
+        <w:t>7</w:t>
+      </w:r>
+    </w:p>
+    <w:p>
+      <w:pPr>
+        <w:rPr>
+          <w:rFonts w:ascii="Times New Roman" w:hAnsi="Times New Roman" w:cs="Times New Roman"/>
+        </w:rPr>
+        <w:tabs>
+          <w:tab w:val="right" w:leader="dot" w:pos="7900"/>
+        </w:tabs>
+      </w:pPr>
+      <w:r>
+        <w:rPr>
+          <w:rFonts w:ascii="Times New Roman" w:hAnsi="Times New Roman" w:cs="Times New Roman"/>
+        </w:rPr>
+        <w:t>BAB II  KAJIAN PUSTAKA</w:t>
+        <w:tab/>
+      </w:r>
+      <w:r>
+        <w:rPr>
+          <w:rFonts w:ascii="Times New Roman" w:hAnsi="Times New Roman" w:cs="Times New Roman"/>
+        </w:rPr>
+        <w:t>9</w:t>
+      </w:r>
+    </w:p>
+    <w:p>
+      <w:pPr>
+        <w:rPr>
+          <w:rFonts w:ascii="Times New Roman" w:hAnsi="Times New Roman" w:cs="Times New Roman"/>
+        </w:rPr>
+        <w:ind w:left="360"/>
+        <w:tabs>
+          <w:tab w:val="right" w:leader="dot" w:pos="7900"/>
+        </w:tabs>
+      </w:pPr>
+      <w:r>
+        <w:rPr>
+          <w:rFonts w:ascii="Times New Roman" w:hAnsi="Times New Roman" w:cs="Times New Roman"/>
+        </w:rPr>
+        <w:t>2.1  Tinjauan Pustaka</w:t>
+        <w:tab/>
+      </w:r>
+      <w:r>
+        <w:rPr>
+          <w:rFonts w:ascii="Times New Roman" w:hAnsi="Times New Roman" w:cs="Times New Roman"/>
+        </w:rPr>
+        <w:t>9</w:t>
+      </w:r>
+    </w:p>
+    <w:p>
+      <w:pPr>
+        <w:rPr>
+          <w:rFonts w:ascii="Times New Roman" w:hAnsi="Times New Roman" w:cs="Times New Roman"/>
+        </w:rPr>
+        <w:ind w:left="360"/>
+        <w:tabs>
+          <w:tab w:val="right" w:leader="dot" w:pos="7900"/>
+        </w:tabs>
+      </w:pPr>
+      <w:r>
+        <w:rPr>
+          <w:rFonts w:ascii="Times New Roman" w:hAnsi="Times New Roman" w:cs="Times New Roman"/>
+        </w:rPr>
         <w:t>2.2  Landasan Teoretik</w:t>
         <w:tab/>
       </w:r>
@@ -1615,7 +1669,7 @@
         <w:rPr>
           <w:rFonts w:ascii="Times New Roman" w:hAnsi="Times New Roman" w:cs="Times New Roman"/>
         </w:rPr>
-        <w:t>8</w:t>
+        <w:t>10</w:t>
       </w:r>
     </w:p>
     <w:p>
@@ -1639,7 +1693,7 @@
         <w:rPr>
           <w:rFonts w:ascii="Times New Roman" w:hAnsi="Times New Roman" w:cs="Times New Roman"/>
         </w:rPr>
-        <w:t>8</w:t>
+        <w:t>10</w:t>
       </w:r>
     </w:p>
     <w:p>
@@ -1663,7 +1717,7 @@
         <w:rPr>
           <w:rFonts w:ascii="Times New Roman" w:hAnsi="Times New Roman" w:cs="Times New Roman"/>
         </w:rPr>
-        <w:t>8</w:t>
+        <w:t>11</w:t>
       </w:r>
     </w:p>
     <w:p>
@@ -1687,7 +1741,7 @@
         <w:rPr>
           <w:rFonts w:ascii="Times New Roman" w:hAnsi="Times New Roman" w:cs="Times New Roman"/>
         </w:rPr>
-        <w:t>9</w:t>
+        <w:t>11</w:t>
       </w:r>
     </w:p>
     <w:p>
@@ -1711,7 +1765,7 @@
         <w:rPr>
           <w:rFonts w:ascii="Times New Roman" w:hAnsi="Times New Roman" w:cs="Times New Roman"/>
         </w:rPr>
-        <w:t>9</w:t>
+        <w:t>11</w:t>
       </w:r>
     </w:p>
     <w:p>
@@ -1735,7 +1789,7 @@
         <w:rPr>
           <w:rFonts w:ascii="Times New Roman" w:hAnsi="Times New Roman" w:cs="Times New Roman"/>
         </w:rPr>
-        <w:t>9</w:t>
+        <w:t>12</w:t>
       </w:r>
     </w:p>
     <w:p>
@@ -1758,7 +1812,7 @@
         <w:rPr>
           <w:rFonts w:ascii="Times New Roman" w:hAnsi="Times New Roman" w:cs="Times New Roman"/>
         </w:rPr>
-        <w:t>11</w:t>
+        <w:t>13</w:t>
       </w:r>
     </w:p>
     <w:p>
@@ -1782,7 +1836,7 @@
         <w:rPr>
           <w:rFonts w:ascii="Times New Roman" w:hAnsi="Times New Roman" w:cs="Times New Roman"/>
         </w:rPr>
-        <w:t>11</w:t>
+        <w:t>13</w:t>
       </w:r>
     </w:p>
     <w:p>
@@ -1806,7 +1860,7 @@
         <w:rPr>
           <w:rFonts w:ascii="Times New Roman" w:hAnsi="Times New Roman" w:cs="Times New Roman"/>
         </w:rPr>
-        <w:t>11</w:t>
+        <w:t>13</w:t>
       </w:r>
     </w:p>
     <w:p>
@@ -1830,7 +1884,7 @@
         <w:rPr>
           <w:rFonts w:ascii="Times New Roman" w:hAnsi="Times New Roman" w:cs="Times New Roman"/>
         </w:rPr>
-        <w:t>11</w:t>
+        <w:t>13</w:t>
       </w:r>
     </w:p>
     <w:p>
@@ -1854,7 +1908,7 @@
         <w:rPr>
           <w:rFonts w:ascii="Times New Roman" w:hAnsi="Times New Roman" w:cs="Times New Roman"/>
         </w:rPr>
-        <w:t>12</w:t>
+        <w:t>14</w:t>
       </w:r>
     </w:p>
     <w:p>
@@ -1878,7 +1932,7 @@
         <w:rPr>
           <w:rFonts w:ascii="Times New Roman" w:hAnsi="Times New Roman" w:cs="Times New Roman"/>
         </w:rPr>
-        <w:t>12</w:t>
+        <w:t>15</w:t>
       </w:r>
     </w:p>
     <w:p>
@@ -1902,7 +1956,7 @@
         <w:rPr>
           <w:rFonts w:ascii="Times New Roman" w:hAnsi="Times New Roman" w:cs="Times New Roman"/>
         </w:rPr>
-        <w:t>13</w:t>
+        <w:t>16</w:t>
       </w:r>
     </w:p>
     <w:p>
@@ -1926,7 +1980,7 @@
         <w:rPr>
           <w:rFonts w:ascii="Times New Roman" w:hAnsi="Times New Roman" w:cs="Times New Roman"/>
         </w:rPr>
-        <w:t>14</w:t>
+        <w:t>16</w:t>
       </w:r>
     </w:p>
     <w:p>
@@ -1950,7 +2004,7 @@
         <w:rPr>
           <w:rFonts w:ascii="Times New Roman" w:hAnsi="Times New Roman" w:cs="Times New Roman"/>
         </w:rPr>
-        <w:t>14</w:t>
+        <w:t>17</w:t>
       </w:r>
     </w:p>
     <w:p>
@@ -1974,7 +2028,7 @@
         <w:rPr>
           <w:rFonts w:ascii="Times New Roman" w:hAnsi="Times New Roman" w:cs="Times New Roman"/>
         </w:rPr>
-        <w:t>15</w:t>
+        <w:t>18</w:t>
       </w:r>
     </w:p>
     <w:p>
@@ -1997,7 +2051,7 @@
         <w:rPr>
           <w:rFonts w:ascii="Times New Roman" w:hAnsi="Times New Roman" w:cs="Times New Roman"/>
         </w:rPr>
-        <w:t>17</w:t>
+        <w:t>19</w:t>
       </w:r>
     </w:p>
     <w:p>
@@ -2029,7 +2083,7 @@
         <w:rPr>
           <w:rFonts w:ascii="Times New Roman" w:hAnsi="Times New Roman" w:cs="Times New Roman"/>
         </w:rPr>
-        <w:t>19</w:t>
+        <w:t>21</w:t>
       </w:r>
     </w:p>
     <w:p>
@@ -2071,7 +2125,7 @@
         <w:rPr>
           <w:rFonts w:ascii="Times New Roman" w:hAnsi="Times New Roman" w:cs="Times New Roman"/>
         </w:rPr>
-        <w:t>6</w:t>
+        <w:t>7</w:t>
       </w:r>
     </w:p>
     <w:p>
@@ -2094,7 +2148,7 @@
         <w:rPr>
           <w:rFonts w:ascii="Times New Roman" w:hAnsi="Times New Roman" w:cs="Times New Roman"/>
         </w:rPr>
-        <w:t>8</w:t>
+        <w:t>9</w:t>
       </w:r>
     </w:p>
     <w:p>
@@ -2117,7 +2171,7 @@
         <w:rPr>
           <w:rFonts w:ascii="Times New Roman" w:hAnsi="Times New Roman" w:cs="Times New Roman"/>
         </w:rPr>
-        <w:t>15</w:t>
+        <w:t>17</w:t>
       </w:r>
     </w:p>
     <w:p>
@@ -2140,7 +2194,7 @@
         <w:rPr>
           <w:rFonts w:ascii="Times New Roman" w:hAnsi="Times New Roman" w:cs="Times New Roman"/>
         </w:rPr>
-        <w:t>15</w:t>
+        <w:t>17</w:t>
       </w:r>
     </w:p>
     <w:p>
@@ -2172,7 +2226,7 @@
         <w:rPr>
           <w:rFonts w:ascii="Times New Roman" w:hAnsi="Times New Roman" w:cs="Times New Roman"/>
         </w:rPr>
-        <w:t>15</w:t>
+        <w:t>18</w:t>
       </w:r>
     </w:p>
     <w:p>
@@ -2214,7 +2268,7 @@
         <w:rPr>
           <w:rFonts w:ascii="Times New Roman" w:hAnsi="Times New Roman" w:cs="Times New Roman"/>
         </w:rPr>
-        <w:t>12</w:t>
+        <w:t>14</w:t>
       </w:r>
     </w:p>
     <w:p>
@@ -2237,7 +2291,7 @@
         <w:rPr>
           <w:rFonts w:ascii="Times New Roman" w:hAnsi="Times New Roman" w:cs="Times New Roman"/>
         </w:rPr>
-        <w:t>13</w:t>
+        <w:t>15</w:t>
       </w:r>
     </w:p>
     <w:p>
@@ -2260,7 +2314,7 @@
         <w:rPr>
           <w:rFonts w:ascii="Times New Roman" w:hAnsi="Times New Roman" w:cs="Times New Roman"/>
         </w:rPr>
-        <w:t>14</w:t>
+        <w:t>16</w:t>
       </w:r>
     </w:p>
     <w:p>
@@ -2283,7 +2337,7 @@
         <w:rPr>
           <w:rFonts w:ascii="Times New Roman" w:hAnsi="Times New Roman" w:cs="Times New Roman"/>
         </w:rPr>
-        <w:t>14</w:t>
+        <w:t>16</w:t>
       </w:r>
     </w:p>
     <w:p>
@@ -2315,7 +2369,7 @@
         <w:rPr>
           <w:rFonts w:ascii="Times New Roman" w:hAnsi="Times New Roman" w:cs="Times New Roman"/>
         </w:rPr>
-        <w:t>14</w:t>
+        <w:t>17</w:t>
       </w:r>
     </w:p>
     <w:p>
@@ -14902,13 +14956,9 @@
     </w:p>
     <w:p>
       <w:pPr>
-        <w:pStyle w:val="ListParagraph"/>
-        <w:numPr>
-          <w:ilvl w:val="0"/>
-          <w:numId w:val="13"/>
-        </w:numPr>
+        <w:pStyle w:val="Heading3"/>
         <w:spacing w:line="360" w:lineRule="auto"/>
-        <w:ind w:left="851" w:hanging="567"/>
+        <w:ind w:left="851"/>
         <w:jc w:val="both"/>
         <w:rPr>
           <w:rFonts w:ascii="Times New Roman" w:hAnsi="Times New Roman" w:cs="Times New Roman"/>
@@ -14922,8 +14972,10 @@
           <w:rFonts w:ascii="Times New Roman" w:hAnsi="Times New Roman" w:cs="Times New Roman"/>
           <w:b/>
           <w:bCs/>
-        </w:rPr>
-        <w:t>Potensi</w:t>
+          <w:color w:val="000000"/>
+          <w:sz w:val="24"/>
+        </w:rPr>
+        <w:t>1.5.1  Potensi Dampak Fungsional</w:t>
       </w:r>
       <w:proofErr w:type="spellEnd"/>
       <w:r>
@@ -14931,8 +14983,9 @@
           <w:rFonts w:ascii="Times New Roman" w:hAnsi="Times New Roman" w:cs="Times New Roman"/>
           <w:b/>
           <w:bCs/>
-        </w:rPr>
-        <w:t xml:space="preserve"> </w:t>
+          <w:color w:val="000000"/>
+          <w:sz w:val="24"/>
+        </w:rPr>
       </w:r>
       <w:proofErr w:type="spellStart"/>
       <w:r>
@@ -14940,8 +14993,9 @@
           <w:rFonts w:ascii="Times New Roman" w:hAnsi="Times New Roman" w:cs="Times New Roman"/>
           <w:b/>
           <w:bCs/>
-        </w:rPr>
-        <w:t>Dampak</w:t>
+          <w:color w:val="000000"/>
+          <w:sz w:val="24"/>
+        </w:rPr>
       </w:r>
       <w:proofErr w:type="spellEnd"/>
       <w:r>
@@ -14949,8 +15003,9 @@
           <w:rFonts w:ascii="Times New Roman" w:hAnsi="Times New Roman" w:cs="Times New Roman"/>
           <w:b/>
           <w:bCs/>
-        </w:rPr>
-        <w:t xml:space="preserve"> </w:t>
+          <w:color w:val="000000"/>
+          <w:sz w:val="24"/>
+        </w:rPr>
       </w:r>
       <w:proofErr w:type="spellStart"/>
       <w:r>
@@ -14958,8 +15013,9 @@
           <w:rFonts w:ascii="Times New Roman" w:hAnsi="Times New Roman" w:cs="Times New Roman"/>
           <w:b/>
           <w:bCs/>
-        </w:rPr>
-        <w:t>Fungsional</w:t>
+          <w:color w:val="000000"/>
+          <w:sz w:val="24"/>
+        </w:rPr>
       </w:r>
       <w:proofErr w:type="spellEnd"/>
     </w:p>
@@ -14977,607 +15033,548 @@
         <w:rPr>
           <w:rFonts w:ascii="Times New Roman" w:hAnsi="Times New Roman" w:cs="Times New Roman"/>
         </w:rPr>
-        <w:t>Judul 1.5.2 menggambarkan dampak fungsional dan komersial prototipe: dampak fungsional berkaitan dengan manfaat operasional sistem dalam mendukung keputusan panen secara lebih objektif dan terukur, sedangkan dampak komersial berkaitan dengan potensi sistem dikembangkan menjadi produk siap pakai bagi pelaku budidaya akuaponik. Prototipe yang dirancang memiliki potensi memberikan dampak fungsional pada proses pengelolaan budidaya akuaponik, khususnya dalam menentukan kesiapan panen secara lebih terukur. Keputusan tidak hanya didasarkan pada pengamatan visual, tetapi menggunakan liputan kanopi per zona, status kesehatan daun, dan Indeks Stres Tanaman atau Plant Stress Index (PSI) sebagai keluaran sistem. Peta 24 zona memungkinkan panen selektif pada zona yang siap sedangkan zona yang belum siap dibiarkan tumbuh, sedangkan status sehat, waspada, dan sakit menjadi dasar pemeriksaan lanjutan.</w:t>
-      </w:r>
-      <w:proofErr w:type="spellStart"/>
-      <w:r>
-        <w:rPr>
-          <w:rFonts w:ascii="Times New Roman" w:hAnsi="Times New Roman" w:cs="Times New Roman"/>
-        </w:rPr>
-      </w:r>
-      <w:proofErr w:type="spellEnd"/>
-      <w:r>
-        <w:rPr>
-          <w:rFonts w:ascii="Times New Roman" w:hAnsi="Times New Roman" w:cs="Times New Roman"/>
-        </w:rPr>
-      </w:r>
-      <w:proofErr w:type="spellStart"/>
-      <w:r>
-        <w:rPr>
-          <w:rFonts w:ascii="Times New Roman" w:hAnsi="Times New Roman" w:cs="Times New Roman"/>
-        </w:rPr>
-      </w:r>
-      <w:proofErr w:type="spellEnd"/>
-      <w:r>
-        <w:rPr>
-          <w:rFonts w:ascii="Times New Roman" w:hAnsi="Times New Roman" w:cs="Times New Roman"/>
-        </w:rPr>
-      </w:r>
-      <w:proofErr w:type="spellStart"/>
-      <w:r>
-        <w:rPr>
-          <w:rFonts w:ascii="Times New Roman" w:hAnsi="Times New Roman" w:cs="Times New Roman"/>
-        </w:rPr>
-      </w:r>
-      <w:proofErr w:type="spellEnd"/>
-      <w:r>
-        <w:rPr>
-          <w:rFonts w:ascii="Times New Roman" w:hAnsi="Times New Roman" w:cs="Times New Roman"/>
-        </w:rPr>
-      </w:r>
-      <w:proofErr w:type="spellStart"/>
-      <w:r>
-        <w:rPr>
-          <w:rFonts w:ascii="Times New Roman" w:hAnsi="Times New Roman" w:cs="Times New Roman"/>
-        </w:rPr>
-      </w:r>
-      <w:proofErr w:type="spellEnd"/>
-      <w:r>
-        <w:rPr>
-          <w:rFonts w:ascii="Times New Roman" w:hAnsi="Times New Roman" w:cs="Times New Roman"/>
-        </w:rPr>
-      </w:r>
-      <w:proofErr w:type="spellStart"/>
-      <w:r>
-        <w:rPr>
-          <w:rFonts w:ascii="Times New Roman" w:hAnsi="Times New Roman" w:cs="Times New Roman"/>
-        </w:rPr>
-      </w:r>
-      <w:proofErr w:type="spellEnd"/>
-      <w:r>
-        <w:rPr>
-          <w:rFonts w:ascii="Times New Roman" w:hAnsi="Times New Roman" w:cs="Times New Roman"/>
-        </w:rPr>
-      </w:r>
-      <w:proofErr w:type="spellStart"/>
-      <w:r>
-        <w:rPr>
-          <w:rFonts w:ascii="Times New Roman" w:hAnsi="Times New Roman" w:cs="Times New Roman"/>
-        </w:rPr>
-      </w:r>
-      <w:proofErr w:type="spellEnd"/>
-      <w:r>
-        <w:rPr>
-          <w:rFonts w:ascii="Times New Roman" w:hAnsi="Times New Roman" w:cs="Times New Roman"/>
-        </w:rPr>
-      </w:r>
-      <w:proofErr w:type="spellStart"/>
-      <w:r>
-        <w:rPr>
-          <w:rFonts w:ascii="Times New Roman" w:hAnsi="Times New Roman" w:cs="Times New Roman"/>
-        </w:rPr>
-      </w:r>
-      <w:proofErr w:type="spellEnd"/>
-      <w:r>
-        <w:rPr>
-          <w:rFonts w:ascii="Times New Roman" w:hAnsi="Times New Roman" w:cs="Times New Roman"/>
-        </w:rPr>
-      </w:r>
-      <w:proofErr w:type="spellStart"/>
-      <w:r>
-        <w:rPr>
-          <w:rFonts w:ascii="Times New Roman" w:hAnsi="Times New Roman" w:cs="Times New Roman"/>
-        </w:rPr>
-      </w:r>
-      <w:proofErr w:type="spellEnd"/>
-      <w:r>
-        <w:rPr>
-          <w:rFonts w:ascii="Times New Roman" w:hAnsi="Times New Roman" w:cs="Times New Roman"/>
-        </w:rPr>
-      </w:r>
-      <w:proofErr w:type="spellStart"/>
-      <w:r>
-        <w:rPr>
-          <w:rFonts w:ascii="Times New Roman" w:hAnsi="Times New Roman" w:cs="Times New Roman"/>
-        </w:rPr>
-      </w:r>
-      <w:proofErr w:type="spellEnd"/>
-      <w:r>
-        <w:rPr>
-          <w:rFonts w:ascii="Times New Roman" w:hAnsi="Times New Roman" w:cs="Times New Roman"/>
-        </w:rPr>
-      </w:r>
-      <w:proofErr w:type="spellStart"/>
-      <w:r>
-        <w:rPr>
-          <w:rFonts w:ascii="Times New Roman" w:hAnsi="Times New Roman" w:cs="Times New Roman"/>
-        </w:rPr>
-      </w:r>
-      <w:proofErr w:type="spellEnd"/>
-      <w:r>
-        <w:rPr>
-          <w:rFonts w:ascii="Times New Roman" w:hAnsi="Times New Roman" w:cs="Times New Roman"/>
-        </w:rPr>
-      </w:r>
-      <w:proofErr w:type="spellStart"/>
-      <w:r>
-        <w:rPr>
-          <w:rFonts w:ascii="Times New Roman" w:hAnsi="Times New Roman" w:cs="Times New Roman"/>
-        </w:rPr>
-      </w:r>
-      <w:proofErr w:type="spellEnd"/>
-      <w:r>
-        <w:rPr>
-          <w:rFonts w:ascii="Times New Roman" w:hAnsi="Times New Roman" w:cs="Times New Roman"/>
-        </w:rPr>
-      </w:r>
-      <w:proofErr w:type="spellStart"/>
-      <w:r>
-        <w:rPr>
-          <w:rFonts w:ascii="Times New Roman" w:hAnsi="Times New Roman" w:cs="Times New Roman"/>
-        </w:rPr>
-      </w:r>
-      <w:proofErr w:type="spellEnd"/>
-      <w:r>
-        <w:rPr>
-          <w:rFonts w:ascii="Times New Roman" w:hAnsi="Times New Roman" w:cs="Times New Roman"/>
-        </w:rPr>
-      </w:r>
-      <w:proofErr w:type="spellStart"/>
-      <w:r>
-        <w:rPr>
-          <w:rFonts w:ascii="Times New Roman" w:hAnsi="Times New Roman" w:cs="Times New Roman"/>
-        </w:rPr>
-      </w:r>
-      <w:proofErr w:type="spellEnd"/>
-      <w:r>
-        <w:rPr>
-          <w:rFonts w:ascii="Times New Roman" w:hAnsi="Times New Roman" w:cs="Times New Roman"/>
-        </w:rPr>
-      </w:r>
-      <w:proofErr w:type="spellStart"/>
-      <w:r>
-        <w:rPr>
-          <w:rFonts w:ascii="Times New Roman" w:hAnsi="Times New Roman" w:cs="Times New Roman"/>
-        </w:rPr>
-      </w:r>
-      <w:proofErr w:type="spellEnd"/>
-      <w:r>
-        <w:rPr>
-          <w:rFonts w:ascii="Times New Roman" w:hAnsi="Times New Roman" w:cs="Times New Roman"/>
-        </w:rPr>
-      </w:r>
-      <w:proofErr w:type="spellStart"/>
-      <w:r>
-        <w:rPr>
-          <w:rFonts w:ascii="Times New Roman" w:hAnsi="Times New Roman" w:cs="Times New Roman"/>
-        </w:rPr>
-      </w:r>
-      <w:proofErr w:type="spellEnd"/>
-      <w:r>
-        <w:rPr>
-          <w:rFonts w:ascii="Times New Roman" w:hAnsi="Times New Roman" w:cs="Times New Roman"/>
-        </w:rPr>
-      </w:r>
-      <w:proofErr w:type="spellStart"/>
-      <w:r>
-        <w:rPr>
-          <w:rFonts w:ascii="Times New Roman" w:hAnsi="Times New Roman" w:cs="Times New Roman"/>
-        </w:rPr>
-      </w:r>
-      <w:proofErr w:type="spellEnd"/>
-      <w:r>
-        <w:rPr>
-          <w:rFonts w:ascii="Times New Roman" w:hAnsi="Times New Roman" w:cs="Times New Roman"/>
-        </w:rPr>
-      </w:r>
-      <w:proofErr w:type="spellStart"/>
-      <w:r>
-        <w:rPr>
-          <w:rFonts w:ascii="Times New Roman" w:hAnsi="Times New Roman" w:cs="Times New Roman"/>
-        </w:rPr>
-      </w:r>
-      <w:proofErr w:type="spellEnd"/>
-      <w:r>
-        <w:rPr>
-          <w:rFonts w:ascii="Times New Roman" w:hAnsi="Times New Roman" w:cs="Times New Roman"/>
-        </w:rPr>
-      </w:r>
-      <w:proofErr w:type="spellStart"/>
-      <w:r>
-        <w:rPr>
-          <w:rFonts w:ascii="Times New Roman" w:hAnsi="Times New Roman" w:cs="Times New Roman"/>
-        </w:rPr>
-      </w:r>
-      <w:proofErr w:type="spellEnd"/>
-      <w:r>
-        <w:rPr>
-          <w:rFonts w:ascii="Times New Roman" w:hAnsi="Times New Roman" w:cs="Times New Roman"/>
-        </w:rPr>
-      </w:r>
-      <w:proofErr w:type="spellStart"/>
-      <w:r>
-        <w:rPr>
-          <w:rFonts w:ascii="Times New Roman" w:hAnsi="Times New Roman" w:cs="Times New Roman"/>
-        </w:rPr>
-      </w:r>
-      <w:proofErr w:type="spellEnd"/>
-      <w:r>
-        <w:rPr>
-          <w:rFonts w:ascii="Times New Roman" w:hAnsi="Times New Roman" w:cs="Times New Roman"/>
-        </w:rPr>
-      </w:r>
-      <w:proofErr w:type="spellStart"/>
-      <w:r>
-        <w:rPr>
-          <w:rFonts w:ascii="Times New Roman" w:hAnsi="Times New Roman" w:cs="Times New Roman"/>
-        </w:rPr>
-      </w:r>
-      <w:proofErr w:type="spellEnd"/>
-      <w:r>
-        <w:rPr>
-          <w:rFonts w:ascii="Times New Roman" w:hAnsi="Times New Roman" w:cs="Times New Roman"/>
-        </w:rPr>
-      </w:r>
-      <w:proofErr w:type="spellStart"/>
-      <w:r>
-        <w:rPr>
-          <w:rFonts w:ascii="Times New Roman" w:hAnsi="Times New Roman" w:cs="Times New Roman"/>
-        </w:rPr>
-      </w:r>
-      <w:proofErr w:type="spellEnd"/>
-      <w:r>
-        <w:rPr>
-          <w:rFonts w:ascii="Times New Roman" w:hAnsi="Times New Roman" w:cs="Times New Roman"/>
-        </w:rPr>
-      </w:r>
-      <w:proofErr w:type="spellStart"/>
-      <w:r>
-        <w:rPr>
-          <w:rFonts w:ascii="Times New Roman" w:hAnsi="Times New Roman" w:cs="Times New Roman"/>
-        </w:rPr>
-      </w:r>
-      <w:proofErr w:type="spellEnd"/>
-      <w:r>
-        <w:rPr>
-          <w:rFonts w:ascii="Times New Roman" w:hAnsi="Times New Roman" w:cs="Times New Roman"/>
-        </w:rPr>
-      </w:r>
-      <w:proofErr w:type="spellStart"/>
-      <w:r>
-        <w:rPr>
-          <w:rFonts w:ascii="Times New Roman" w:hAnsi="Times New Roman" w:cs="Times New Roman"/>
-        </w:rPr>
-      </w:r>
-      <w:proofErr w:type="spellEnd"/>
-      <w:r>
-        <w:rPr>
-          <w:rFonts w:ascii="Times New Roman" w:hAnsi="Times New Roman" w:cs="Times New Roman"/>
-        </w:rPr>
-      </w:r>
-      <w:proofErr w:type="spellStart"/>
-      <w:r>
-        <w:rPr>
-          <w:rFonts w:ascii="Times New Roman" w:hAnsi="Times New Roman" w:cs="Times New Roman"/>
-        </w:rPr>
-      </w:r>
-      <w:proofErr w:type="spellEnd"/>
-      <w:r>
-        <w:rPr>
-          <w:rFonts w:ascii="Times New Roman" w:hAnsi="Times New Roman" w:cs="Times New Roman"/>
-        </w:rPr>
-      </w:r>
-      <w:proofErr w:type="spellStart"/>
-      <w:r>
-        <w:rPr>
-          <w:rFonts w:ascii="Times New Roman" w:hAnsi="Times New Roman" w:cs="Times New Roman"/>
-        </w:rPr>
-      </w:r>
-      <w:proofErr w:type="spellEnd"/>
-      <w:r>
-        <w:rPr>
-          <w:rFonts w:ascii="Times New Roman" w:hAnsi="Times New Roman" w:cs="Times New Roman"/>
-        </w:rPr>
-      </w:r>
-      <w:proofErr w:type="spellStart"/>
-      <w:r>
-        <w:rPr>
-          <w:rFonts w:ascii="Times New Roman" w:hAnsi="Times New Roman" w:cs="Times New Roman"/>
-        </w:rPr>
-      </w:r>
-      <w:proofErr w:type="spellEnd"/>
-      <w:r>
-        <w:rPr>
-          <w:rFonts w:ascii="Times New Roman" w:hAnsi="Times New Roman" w:cs="Times New Roman"/>
-        </w:rPr>
-      </w:r>
-      <w:proofErr w:type="spellStart"/>
-      <w:r>
-        <w:rPr>
-          <w:rFonts w:ascii="Times New Roman" w:hAnsi="Times New Roman" w:cs="Times New Roman"/>
-        </w:rPr>
-      </w:r>
-      <w:proofErr w:type="spellEnd"/>
-      <w:r>
-        <w:rPr>
-          <w:rFonts w:ascii="Times New Roman" w:hAnsi="Times New Roman" w:cs="Times New Roman"/>
-        </w:rPr>
-      </w:r>
-      <w:proofErr w:type="spellStart"/>
-      <w:r>
-        <w:rPr>
-          <w:rFonts w:ascii="Times New Roman" w:hAnsi="Times New Roman" w:cs="Times New Roman"/>
-        </w:rPr>
-      </w:r>
-      <w:proofErr w:type="spellEnd"/>
-      <w:r>
-        <w:rPr>
-          <w:rFonts w:ascii="Times New Roman" w:hAnsi="Times New Roman" w:cs="Times New Roman"/>
-        </w:rPr>
-      </w:r>
-      <w:proofErr w:type="spellStart"/>
-      <w:r>
-        <w:rPr>
-          <w:rFonts w:ascii="Times New Roman" w:hAnsi="Times New Roman" w:cs="Times New Roman"/>
-        </w:rPr>
-      </w:r>
-      <w:proofErr w:type="spellEnd"/>
-      <w:r>
-        <w:rPr>
-          <w:rFonts w:ascii="Times New Roman" w:hAnsi="Times New Roman" w:cs="Times New Roman"/>
-        </w:rPr>
-      </w:r>
-      <w:proofErr w:type="spellStart"/>
-      <w:r>
-        <w:rPr>
-          <w:rFonts w:ascii="Times New Roman" w:hAnsi="Times New Roman" w:cs="Times New Roman"/>
-        </w:rPr>
-      </w:r>
-      <w:proofErr w:type="spellEnd"/>
-      <w:r>
-        <w:rPr>
-          <w:rFonts w:ascii="Times New Roman" w:hAnsi="Times New Roman" w:cs="Times New Roman"/>
-        </w:rPr>
-      </w:r>
-      <w:proofErr w:type="spellStart"/>
-      <w:r>
-        <w:rPr>
-          <w:rFonts w:ascii="Times New Roman" w:hAnsi="Times New Roman" w:cs="Times New Roman"/>
-        </w:rPr>
-      </w:r>
-      <w:proofErr w:type="spellEnd"/>
-      <w:r>
-        <w:rPr>
-          <w:rFonts w:ascii="Times New Roman" w:hAnsi="Times New Roman" w:cs="Times New Roman"/>
-        </w:rPr>
-      </w:r>
-      <w:proofErr w:type="spellStart"/>
-      <w:r>
-        <w:rPr>
-          <w:rFonts w:ascii="Times New Roman" w:hAnsi="Times New Roman" w:cs="Times New Roman"/>
-        </w:rPr>
-      </w:r>
-      <w:proofErr w:type="spellEnd"/>
-      <w:r>
-        <w:rPr>
-          <w:rFonts w:ascii="Times New Roman" w:hAnsi="Times New Roman" w:cs="Times New Roman"/>
-        </w:rPr>
-      </w:r>
-      <w:proofErr w:type="spellStart"/>
-      <w:r>
-        <w:rPr>
-          <w:rFonts w:ascii="Times New Roman" w:hAnsi="Times New Roman" w:cs="Times New Roman"/>
-        </w:rPr>
-      </w:r>
-      <w:proofErr w:type="spellEnd"/>
-      <w:r>
-        <w:rPr>
-          <w:rFonts w:ascii="Times New Roman" w:hAnsi="Times New Roman" w:cs="Times New Roman"/>
-        </w:rPr>
-      </w:r>
-      <w:proofErr w:type="spellStart"/>
-      <w:r>
-        <w:rPr>
-          <w:rFonts w:ascii="Times New Roman" w:hAnsi="Times New Roman" w:cs="Times New Roman"/>
-        </w:rPr>
-      </w:r>
-      <w:proofErr w:type="spellEnd"/>
-      <w:r>
-        <w:rPr>
-          <w:rFonts w:ascii="Times New Roman" w:hAnsi="Times New Roman" w:cs="Times New Roman"/>
-        </w:rPr>
-      </w:r>
-      <w:proofErr w:type="spellStart"/>
-      <w:r>
-        <w:rPr>
-          <w:rFonts w:ascii="Times New Roman" w:hAnsi="Times New Roman" w:cs="Times New Roman"/>
-        </w:rPr>
-      </w:r>
-      <w:proofErr w:type="spellEnd"/>
-      <w:r>
-        <w:rPr>
-          <w:rFonts w:ascii="Times New Roman" w:hAnsi="Times New Roman" w:cs="Times New Roman"/>
-        </w:rPr>
-      </w:r>
-      <w:proofErr w:type="spellStart"/>
-      <w:r>
-        <w:rPr>
-          <w:rFonts w:ascii="Times New Roman" w:hAnsi="Times New Roman" w:cs="Times New Roman"/>
-        </w:rPr>
-      </w:r>
-      <w:proofErr w:type="spellEnd"/>
-      <w:r>
-        <w:rPr>
-          <w:rFonts w:ascii="Times New Roman" w:hAnsi="Times New Roman" w:cs="Times New Roman"/>
-        </w:rPr>
-      </w:r>
-      <w:proofErr w:type="spellStart"/>
-      <w:r>
-        <w:rPr>
-          <w:rFonts w:ascii="Times New Roman" w:hAnsi="Times New Roman" w:cs="Times New Roman"/>
-        </w:rPr>
-      </w:r>
-      <w:proofErr w:type="spellEnd"/>
-      <w:r>
-        <w:rPr>
-          <w:rFonts w:ascii="Times New Roman" w:hAnsi="Times New Roman" w:cs="Times New Roman"/>
-        </w:rPr>
-      </w:r>
-      <w:proofErr w:type="spellStart"/>
-      <w:r>
-        <w:rPr>
-          <w:rFonts w:ascii="Times New Roman" w:hAnsi="Times New Roman" w:cs="Times New Roman"/>
-        </w:rPr>
-      </w:r>
-      <w:proofErr w:type="spellEnd"/>
-      <w:r>
-        <w:rPr>
-          <w:rFonts w:ascii="Times New Roman" w:hAnsi="Times New Roman" w:cs="Times New Roman"/>
-        </w:rPr>
-      </w:r>
-      <w:proofErr w:type="spellStart"/>
-      <w:r>
-        <w:rPr>
-          <w:rFonts w:ascii="Times New Roman" w:hAnsi="Times New Roman" w:cs="Times New Roman"/>
-        </w:rPr>
-      </w:r>
-      <w:proofErr w:type="spellEnd"/>
-      <w:r>
-        <w:rPr>
-          <w:rFonts w:ascii="Times New Roman" w:hAnsi="Times New Roman" w:cs="Times New Roman"/>
-        </w:rPr>
-      </w:r>
-      <w:proofErr w:type="spellStart"/>
-      <w:r>
-        <w:rPr>
-          <w:rFonts w:ascii="Times New Roman" w:hAnsi="Times New Roman" w:cs="Times New Roman"/>
-        </w:rPr>
-      </w:r>
-      <w:proofErr w:type="spellEnd"/>
-      <w:r>
-        <w:rPr>
-          <w:rFonts w:ascii="Times New Roman" w:hAnsi="Times New Roman" w:cs="Times New Roman"/>
-        </w:rPr>
-      </w:r>
-      <w:proofErr w:type="spellStart"/>
-      <w:r>
-        <w:rPr>
-          <w:rFonts w:ascii="Times New Roman" w:hAnsi="Times New Roman" w:cs="Times New Roman"/>
-        </w:rPr>
-      </w:r>
-      <w:proofErr w:type="spellEnd"/>
-      <w:r>
-        <w:rPr>
-          <w:rFonts w:ascii="Times New Roman" w:hAnsi="Times New Roman" w:cs="Times New Roman"/>
-        </w:rPr>
-      </w:r>
-      <w:proofErr w:type="spellStart"/>
-      <w:r>
-        <w:rPr>
-          <w:rFonts w:ascii="Times New Roman" w:hAnsi="Times New Roman" w:cs="Times New Roman"/>
-        </w:rPr>
-      </w:r>
-      <w:proofErr w:type="spellEnd"/>
-      <w:r>
-        <w:rPr>
-          <w:rFonts w:ascii="Times New Roman" w:hAnsi="Times New Roman" w:cs="Times New Roman"/>
-        </w:rPr>
-      </w:r>
-      <w:proofErr w:type="spellStart"/>
-      <w:r>
-        <w:rPr>
-          <w:rFonts w:ascii="Times New Roman" w:hAnsi="Times New Roman" w:cs="Times New Roman"/>
-        </w:rPr>
-      </w:r>
-      <w:proofErr w:type="spellEnd"/>
-      <w:r>
-        <w:rPr>
-          <w:rFonts w:ascii="Times New Roman" w:hAnsi="Times New Roman" w:cs="Times New Roman"/>
-        </w:rPr>
-      </w:r>
-      <w:proofErr w:type="spellStart"/>
-      <w:r>
-        <w:rPr>
-          <w:rFonts w:ascii="Times New Roman" w:hAnsi="Times New Roman" w:cs="Times New Roman"/>
-        </w:rPr>
-      </w:r>
-      <w:proofErr w:type="spellEnd"/>
-      <w:r>
-        <w:rPr>
-          <w:rFonts w:ascii="Times New Roman" w:hAnsi="Times New Roman" w:cs="Times New Roman"/>
-        </w:rPr>
-      </w:r>
-      <w:proofErr w:type="spellStart"/>
-      <w:r>
-        <w:rPr>
-          <w:rFonts w:ascii="Times New Roman" w:hAnsi="Times New Roman" w:cs="Times New Roman"/>
-        </w:rPr>
-      </w:r>
-      <w:proofErr w:type="spellEnd"/>
-      <w:r>
-        <w:rPr>
-          <w:rFonts w:ascii="Times New Roman" w:hAnsi="Times New Roman" w:cs="Times New Roman"/>
-        </w:rPr>
-      </w:r>
-    </w:p>
-    <w:p>
-      <w:pPr>
-        <w:pStyle w:val="ListParagraph"/>
-        <w:numPr>
-          <w:ilvl w:val="0"/>
-          <w:numId w:val="13"/>
-        </w:numPr>
-        <w:spacing w:line="360" w:lineRule="auto"/>
-        <w:ind w:left="851" w:hanging="567"/>
-        <w:jc w:val="both"/>
-        <w:rPr>
-          <w:rFonts w:ascii="Times New Roman" w:hAnsi="Times New Roman" w:cs="Times New Roman"/>
-          <w:b/>
-          <w:bCs/>
-        </w:rPr>
-      </w:pPr>
-      <w:proofErr w:type="spellStart"/>
-      <w:r>
-        <w:rPr>
-          <w:rFonts w:ascii="Times New Roman" w:hAnsi="Times New Roman" w:cs="Times New Roman"/>
-          <w:b/>
-          <w:bCs/>
-        </w:rPr>
-        <w:t>Penerapan peta zona dalam bentuk status per zona juga memberikan keluaran yang lebih operasional bagi pengelola. Selain itu, sistem dilengkapi arsip runtun waktu per zona dan dasbor dengan grafik 24 jam sehingga tren pertumbuhan tiap zona terpantau. Sementara itu, ambang status 25, 55, dan 80 persen beserta ambang kesehatan kuning 10 dan 25 persen serta cokelat 3 dan 8 persen dapat dikonfigurasi kembali mengikuti hasil validasi ahli.</w:t>
-      </w:r>
-      <w:proofErr w:type="spellEnd"/>
-      <w:r>
-        <w:rPr>
-          <w:rFonts w:ascii="Times New Roman" w:hAnsi="Times New Roman" w:cs="Times New Roman"/>
-          <w:b/>
-          <w:bCs/>
-        </w:rPr>
-      </w:r>
-      <w:proofErr w:type="spellStart"/>
-      <w:r>
-        <w:rPr>
-          <w:rFonts w:ascii="Times New Roman" w:hAnsi="Times New Roman" w:cs="Times New Roman"/>
-          <w:b/>
-          <w:bCs/>
-        </w:rPr>
-      </w:r>
-      <w:proofErr w:type="spellEnd"/>
-      <w:r>
-        <w:rPr>
-          <w:rFonts w:ascii="Times New Roman" w:hAnsi="Times New Roman" w:cs="Times New Roman"/>
-          <w:b/>
-          <w:bCs/>
-        </w:rPr>
-      </w:r>
-      <w:proofErr w:type="spellStart"/>
-      <w:r>
-        <w:rPr>
-          <w:rFonts w:ascii="Times New Roman" w:hAnsi="Times New Roman" w:cs="Times New Roman"/>
-          <w:b/>
-          <w:bCs/>
-        </w:rPr>
-      </w:r>
-      <w:proofErr w:type="spellEnd"/>
+        <w:t>Bagian ini menggambarkan dampak fungsional dan komersial prototipe: dampak fungsional berkaitan dengan manfaat operasional sistem dalam mendukung keputusan panen secara lebih objektif dan terukur, sedangkan dampak komersial berkaitan dengan potensi sistem dikembangkan menjadi produk siap pakai bagi pelaku budidaya akuaponik. Prototipe yang dirancang memiliki potensi memberikan dampak fungsional pada proses pengelolaan budidaya akuaponik, khususnya dalam menentukan kesiapan panen secara lebih terukur. Keputusan tidak hanya didasarkan pada pengamatan visual, tetapi menggunakan liputan kanopi per zona, status kesehatan daun, dan Indeks Stres Tanaman atau Plant Stress Index (PSI) sebagai keluaran sistem. Peta 24 zona memungkinkan panen selektif pada zona yang siap sedangkan zona yang belum siap dibiarkan tumbuh, sedangkan status sehat, waspada, dan sakit menjadi dasar pemeriksaan lanjutan.</w:t>
+      </w:r>
+      <w:proofErr w:type="spellStart"/>
+      <w:r>
+        <w:rPr>
+          <w:rFonts w:ascii="Times New Roman" w:hAnsi="Times New Roman" w:cs="Times New Roman"/>
+        </w:rPr>
+      </w:r>
+      <w:proofErr w:type="spellEnd"/>
+      <w:r>
+        <w:rPr>
+          <w:rFonts w:ascii="Times New Roman" w:hAnsi="Times New Roman" w:cs="Times New Roman"/>
+        </w:rPr>
+      </w:r>
+      <w:proofErr w:type="spellStart"/>
+      <w:r>
+        <w:rPr>
+          <w:rFonts w:ascii="Times New Roman" w:hAnsi="Times New Roman" w:cs="Times New Roman"/>
+        </w:rPr>
+      </w:r>
+      <w:proofErr w:type="spellEnd"/>
+      <w:r>
+        <w:rPr>
+          <w:rFonts w:ascii="Times New Roman" w:hAnsi="Times New Roman" w:cs="Times New Roman"/>
+        </w:rPr>
+      </w:r>
+      <w:proofErr w:type="spellStart"/>
+      <w:r>
+        <w:rPr>
+          <w:rFonts w:ascii="Times New Roman" w:hAnsi="Times New Roman" w:cs="Times New Roman"/>
+        </w:rPr>
+      </w:r>
+      <w:proofErr w:type="spellEnd"/>
+      <w:r>
+        <w:rPr>
+          <w:rFonts w:ascii="Times New Roman" w:hAnsi="Times New Roman" w:cs="Times New Roman"/>
+        </w:rPr>
+      </w:r>
+      <w:proofErr w:type="spellStart"/>
+      <w:r>
+        <w:rPr>
+          <w:rFonts w:ascii="Times New Roman" w:hAnsi="Times New Roman" w:cs="Times New Roman"/>
+        </w:rPr>
+      </w:r>
+      <w:proofErr w:type="spellEnd"/>
+      <w:r>
+        <w:rPr>
+          <w:rFonts w:ascii="Times New Roman" w:hAnsi="Times New Roman" w:cs="Times New Roman"/>
+        </w:rPr>
+      </w:r>
+      <w:proofErr w:type="spellStart"/>
+      <w:r>
+        <w:rPr>
+          <w:rFonts w:ascii="Times New Roman" w:hAnsi="Times New Roman" w:cs="Times New Roman"/>
+        </w:rPr>
+      </w:r>
+      <w:proofErr w:type="spellEnd"/>
+      <w:r>
+        <w:rPr>
+          <w:rFonts w:ascii="Times New Roman" w:hAnsi="Times New Roman" w:cs="Times New Roman"/>
+        </w:rPr>
+      </w:r>
+      <w:proofErr w:type="spellStart"/>
+      <w:r>
+        <w:rPr>
+          <w:rFonts w:ascii="Times New Roman" w:hAnsi="Times New Roman" w:cs="Times New Roman"/>
+        </w:rPr>
+      </w:r>
+      <w:proofErr w:type="spellEnd"/>
+      <w:r>
+        <w:rPr>
+          <w:rFonts w:ascii="Times New Roman" w:hAnsi="Times New Roman" w:cs="Times New Roman"/>
+        </w:rPr>
+      </w:r>
+      <w:proofErr w:type="spellStart"/>
+      <w:r>
+        <w:rPr>
+          <w:rFonts w:ascii="Times New Roman" w:hAnsi="Times New Roman" w:cs="Times New Roman"/>
+        </w:rPr>
+      </w:r>
+      <w:proofErr w:type="spellEnd"/>
+      <w:r>
+        <w:rPr>
+          <w:rFonts w:ascii="Times New Roman" w:hAnsi="Times New Roman" w:cs="Times New Roman"/>
+        </w:rPr>
+      </w:r>
+      <w:proofErr w:type="spellStart"/>
+      <w:r>
+        <w:rPr>
+          <w:rFonts w:ascii="Times New Roman" w:hAnsi="Times New Roman" w:cs="Times New Roman"/>
+        </w:rPr>
+      </w:r>
+      <w:proofErr w:type="spellEnd"/>
+      <w:r>
+        <w:rPr>
+          <w:rFonts w:ascii="Times New Roman" w:hAnsi="Times New Roman" w:cs="Times New Roman"/>
+        </w:rPr>
+      </w:r>
+      <w:proofErr w:type="spellStart"/>
+      <w:r>
+        <w:rPr>
+          <w:rFonts w:ascii="Times New Roman" w:hAnsi="Times New Roman" w:cs="Times New Roman"/>
+        </w:rPr>
+      </w:r>
+      <w:proofErr w:type="spellEnd"/>
+      <w:r>
+        <w:rPr>
+          <w:rFonts w:ascii="Times New Roman" w:hAnsi="Times New Roman" w:cs="Times New Roman"/>
+        </w:rPr>
+      </w:r>
+      <w:proofErr w:type="spellStart"/>
+      <w:r>
+        <w:rPr>
+          <w:rFonts w:ascii="Times New Roman" w:hAnsi="Times New Roman" w:cs="Times New Roman"/>
+        </w:rPr>
+      </w:r>
+      <w:proofErr w:type="spellEnd"/>
+      <w:r>
+        <w:rPr>
+          <w:rFonts w:ascii="Times New Roman" w:hAnsi="Times New Roman" w:cs="Times New Roman"/>
+        </w:rPr>
+      </w:r>
+      <w:proofErr w:type="spellStart"/>
+      <w:r>
+        <w:rPr>
+          <w:rFonts w:ascii="Times New Roman" w:hAnsi="Times New Roman" w:cs="Times New Roman"/>
+        </w:rPr>
+      </w:r>
+      <w:proofErr w:type="spellEnd"/>
+      <w:r>
+        <w:rPr>
+          <w:rFonts w:ascii="Times New Roman" w:hAnsi="Times New Roman" w:cs="Times New Roman"/>
+        </w:rPr>
+      </w:r>
+      <w:proofErr w:type="spellStart"/>
+      <w:r>
+        <w:rPr>
+          <w:rFonts w:ascii="Times New Roman" w:hAnsi="Times New Roman" w:cs="Times New Roman"/>
+        </w:rPr>
+      </w:r>
+      <w:proofErr w:type="spellEnd"/>
+      <w:r>
+        <w:rPr>
+          <w:rFonts w:ascii="Times New Roman" w:hAnsi="Times New Roman" w:cs="Times New Roman"/>
+        </w:rPr>
+      </w:r>
+      <w:proofErr w:type="spellStart"/>
+      <w:r>
+        <w:rPr>
+          <w:rFonts w:ascii="Times New Roman" w:hAnsi="Times New Roman" w:cs="Times New Roman"/>
+        </w:rPr>
+      </w:r>
+      <w:proofErr w:type="spellEnd"/>
+      <w:r>
+        <w:rPr>
+          <w:rFonts w:ascii="Times New Roman" w:hAnsi="Times New Roman" w:cs="Times New Roman"/>
+        </w:rPr>
+      </w:r>
+      <w:proofErr w:type="spellStart"/>
+      <w:r>
+        <w:rPr>
+          <w:rFonts w:ascii="Times New Roman" w:hAnsi="Times New Roman" w:cs="Times New Roman"/>
+        </w:rPr>
+      </w:r>
+      <w:proofErr w:type="spellEnd"/>
+      <w:r>
+        <w:rPr>
+          <w:rFonts w:ascii="Times New Roman" w:hAnsi="Times New Roman" w:cs="Times New Roman"/>
+        </w:rPr>
+      </w:r>
+      <w:proofErr w:type="spellStart"/>
+      <w:r>
+        <w:rPr>
+          <w:rFonts w:ascii="Times New Roman" w:hAnsi="Times New Roman" w:cs="Times New Roman"/>
+        </w:rPr>
+      </w:r>
+      <w:proofErr w:type="spellEnd"/>
+      <w:r>
+        <w:rPr>
+          <w:rFonts w:ascii="Times New Roman" w:hAnsi="Times New Roman" w:cs="Times New Roman"/>
+        </w:rPr>
+      </w:r>
+      <w:proofErr w:type="spellStart"/>
+      <w:r>
+        <w:rPr>
+          <w:rFonts w:ascii="Times New Roman" w:hAnsi="Times New Roman" w:cs="Times New Roman"/>
+        </w:rPr>
+      </w:r>
+      <w:proofErr w:type="spellEnd"/>
+      <w:r>
+        <w:rPr>
+          <w:rFonts w:ascii="Times New Roman" w:hAnsi="Times New Roman" w:cs="Times New Roman"/>
+        </w:rPr>
+      </w:r>
+      <w:proofErr w:type="spellStart"/>
+      <w:r>
+        <w:rPr>
+          <w:rFonts w:ascii="Times New Roman" w:hAnsi="Times New Roman" w:cs="Times New Roman"/>
+        </w:rPr>
+      </w:r>
+      <w:proofErr w:type="spellEnd"/>
+      <w:r>
+        <w:rPr>
+          <w:rFonts w:ascii="Times New Roman" w:hAnsi="Times New Roman" w:cs="Times New Roman"/>
+        </w:rPr>
+      </w:r>
+      <w:proofErr w:type="spellStart"/>
+      <w:r>
+        <w:rPr>
+          <w:rFonts w:ascii="Times New Roman" w:hAnsi="Times New Roman" w:cs="Times New Roman"/>
+        </w:rPr>
+      </w:r>
+      <w:proofErr w:type="spellEnd"/>
+      <w:r>
+        <w:rPr>
+          <w:rFonts w:ascii="Times New Roman" w:hAnsi="Times New Roman" w:cs="Times New Roman"/>
+        </w:rPr>
+      </w:r>
+      <w:proofErr w:type="spellStart"/>
+      <w:r>
+        <w:rPr>
+          <w:rFonts w:ascii="Times New Roman" w:hAnsi="Times New Roman" w:cs="Times New Roman"/>
+        </w:rPr>
+      </w:r>
+      <w:proofErr w:type="spellEnd"/>
+      <w:r>
+        <w:rPr>
+          <w:rFonts w:ascii="Times New Roman" w:hAnsi="Times New Roman" w:cs="Times New Roman"/>
+        </w:rPr>
+      </w:r>
+      <w:proofErr w:type="spellStart"/>
+      <w:r>
+        <w:rPr>
+          <w:rFonts w:ascii="Times New Roman" w:hAnsi="Times New Roman" w:cs="Times New Roman"/>
+        </w:rPr>
+      </w:r>
+      <w:proofErr w:type="spellEnd"/>
+      <w:r>
+        <w:rPr>
+          <w:rFonts w:ascii="Times New Roman" w:hAnsi="Times New Roman" w:cs="Times New Roman"/>
+        </w:rPr>
+      </w:r>
+      <w:proofErr w:type="spellStart"/>
+      <w:r>
+        <w:rPr>
+          <w:rFonts w:ascii="Times New Roman" w:hAnsi="Times New Roman" w:cs="Times New Roman"/>
+        </w:rPr>
+      </w:r>
+      <w:proofErr w:type="spellEnd"/>
+      <w:r>
+        <w:rPr>
+          <w:rFonts w:ascii="Times New Roman" w:hAnsi="Times New Roman" w:cs="Times New Roman"/>
+        </w:rPr>
+      </w:r>
+      <w:proofErr w:type="spellStart"/>
+      <w:r>
+        <w:rPr>
+          <w:rFonts w:ascii="Times New Roman" w:hAnsi="Times New Roman" w:cs="Times New Roman"/>
+        </w:rPr>
+      </w:r>
+      <w:proofErr w:type="spellEnd"/>
+      <w:r>
+        <w:rPr>
+          <w:rFonts w:ascii="Times New Roman" w:hAnsi="Times New Roman" w:cs="Times New Roman"/>
+        </w:rPr>
+      </w:r>
+      <w:proofErr w:type="spellStart"/>
+      <w:r>
+        <w:rPr>
+          <w:rFonts w:ascii="Times New Roman" w:hAnsi="Times New Roman" w:cs="Times New Roman"/>
+        </w:rPr>
+      </w:r>
+      <w:proofErr w:type="spellEnd"/>
+      <w:r>
+        <w:rPr>
+          <w:rFonts w:ascii="Times New Roman" w:hAnsi="Times New Roman" w:cs="Times New Roman"/>
+        </w:rPr>
+      </w:r>
+      <w:proofErr w:type="spellStart"/>
+      <w:r>
+        <w:rPr>
+          <w:rFonts w:ascii="Times New Roman" w:hAnsi="Times New Roman" w:cs="Times New Roman"/>
+        </w:rPr>
+      </w:r>
+      <w:proofErr w:type="spellEnd"/>
+      <w:r>
+        <w:rPr>
+          <w:rFonts w:ascii="Times New Roman" w:hAnsi="Times New Roman" w:cs="Times New Roman"/>
+        </w:rPr>
+      </w:r>
+      <w:proofErr w:type="spellStart"/>
+      <w:r>
+        <w:rPr>
+          <w:rFonts w:ascii="Times New Roman" w:hAnsi="Times New Roman" w:cs="Times New Roman"/>
+        </w:rPr>
+      </w:r>
+      <w:proofErr w:type="spellEnd"/>
+      <w:r>
+        <w:rPr>
+          <w:rFonts w:ascii="Times New Roman" w:hAnsi="Times New Roman" w:cs="Times New Roman"/>
+        </w:rPr>
+      </w:r>
+      <w:proofErr w:type="spellStart"/>
+      <w:r>
+        <w:rPr>
+          <w:rFonts w:ascii="Times New Roman" w:hAnsi="Times New Roman" w:cs="Times New Roman"/>
+        </w:rPr>
+      </w:r>
+      <w:proofErr w:type="spellEnd"/>
+      <w:r>
+        <w:rPr>
+          <w:rFonts w:ascii="Times New Roman" w:hAnsi="Times New Roman" w:cs="Times New Roman"/>
+        </w:rPr>
+      </w:r>
+      <w:proofErr w:type="spellStart"/>
+      <w:r>
+        <w:rPr>
+          <w:rFonts w:ascii="Times New Roman" w:hAnsi="Times New Roman" w:cs="Times New Roman"/>
+        </w:rPr>
+      </w:r>
+      <w:proofErr w:type="spellEnd"/>
+      <w:r>
+        <w:rPr>
+          <w:rFonts w:ascii="Times New Roman" w:hAnsi="Times New Roman" w:cs="Times New Roman"/>
+        </w:rPr>
+      </w:r>
+      <w:proofErr w:type="spellStart"/>
+      <w:r>
+        <w:rPr>
+          <w:rFonts w:ascii="Times New Roman" w:hAnsi="Times New Roman" w:cs="Times New Roman"/>
+        </w:rPr>
+      </w:r>
+      <w:proofErr w:type="spellEnd"/>
+      <w:r>
+        <w:rPr>
+          <w:rFonts w:ascii="Times New Roman" w:hAnsi="Times New Roman" w:cs="Times New Roman"/>
+        </w:rPr>
+      </w:r>
+      <w:proofErr w:type="spellStart"/>
+      <w:r>
+        <w:rPr>
+          <w:rFonts w:ascii="Times New Roman" w:hAnsi="Times New Roman" w:cs="Times New Roman"/>
+        </w:rPr>
+      </w:r>
+      <w:proofErr w:type="spellEnd"/>
+      <w:r>
+        <w:rPr>
+          <w:rFonts w:ascii="Times New Roman" w:hAnsi="Times New Roman" w:cs="Times New Roman"/>
+        </w:rPr>
+      </w:r>
+      <w:proofErr w:type="spellStart"/>
+      <w:r>
+        <w:rPr>
+          <w:rFonts w:ascii="Times New Roman" w:hAnsi="Times New Roman" w:cs="Times New Roman"/>
+        </w:rPr>
+      </w:r>
+      <w:proofErr w:type="spellEnd"/>
+      <w:r>
+        <w:rPr>
+          <w:rFonts w:ascii="Times New Roman" w:hAnsi="Times New Roman" w:cs="Times New Roman"/>
+        </w:rPr>
+      </w:r>
+      <w:proofErr w:type="spellStart"/>
+      <w:r>
+        <w:rPr>
+          <w:rFonts w:ascii="Times New Roman" w:hAnsi="Times New Roman" w:cs="Times New Roman"/>
+        </w:rPr>
+      </w:r>
+      <w:proofErr w:type="spellEnd"/>
+      <w:r>
+        <w:rPr>
+          <w:rFonts w:ascii="Times New Roman" w:hAnsi="Times New Roman" w:cs="Times New Roman"/>
+        </w:rPr>
+      </w:r>
+      <w:proofErr w:type="spellStart"/>
+      <w:r>
+        <w:rPr>
+          <w:rFonts w:ascii="Times New Roman" w:hAnsi="Times New Roman" w:cs="Times New Roman"/>
+        </w:rPr>
+      </w:r>
+      <w:proofErr w:type="spellEnd"/>
+      <w:r>
+        <w:rPr>
+          <w:rFonts w:ascii="Times New Roman" w:hAnsi="Times New Roman" w:cs="Times New Roman"/>
+        </w:rPr>
+      </w:r>
+      <w:proofErr w:type="spellStart"/>
+      <w:r>
+        <w:rPr>
+          <w:rFonts w:ascii="Times New Roman" w:hAnsi="Times New Roman" w:cs="Times New Roman"/>
+        </w:rPr>
+      </w:r>
+      <w:proofErr w:type="spellEnd"/>
+      <w:r>
+        <w:rPr>
+          <w:rFonts w:ascii="Times New Roman" w:hAnsi="Times New Roman" w:cs="Times New Roman"/>
+        </w:rPr>
+      </w:r>
+      <w:proofErr w:type="spellStart"/>
+      <w:r>
+        <w:rPr>
+          <w:rFonts w:ascii="Times New Roman" w:hAnsi="Times New Roman" w:cs="Times New Roman"/>
+        </w:rPr>
+      </w:r>
+      <w:proofErr w:type="spellEnd"/>
+      <w:r>
+        <w:rPr>
+          <w:rFonts w:ascii="Times New Roman" w:hAnsi="Times New Roman" w:cs="Times New Roman"/>
+        </w:rPr>
+      </w:r>
+      <w:proofErr w:type="spellStart"/>
+      <w:r>
+        <w:rPr>
+          <w:rFonts w:ascii="Times New Roman" w:hAnsi="Times New Roman" w:cs="Times New Roman"/>
+        </w:rPr>
+      </w:r>
+      <w:proofErr w:type="spellEnd"/>
+      <w:r>
+        <w:rPr>
+          <w:rFonts w:ascii="Times New Roman" w:hAnsi="Times New Roman" w:cs="Times New Roman"/>
+        </w:rPr>
+      </w:r>
+      <w:proofErr w:type="spellStart"/>
+      <w:r>
+        <w:rPr>
+          <w:rFonts w:ascii="Times New Roman" w:hAnsi="Times New Roman" w:cs="Times New Roman"/>
+        </w:rPr>
+      </w:r>
+      <w:proofErr w:type="spellEnd"/>
+      <w:r>
+        <w:rPr>
+          <w:rFonts w:ascii="Times New Roman" w:hAnsi="Times New Roman" w:cs="Times New Roman"/>
+        </w:rPr>
+      </w:r>
+      <w:proofErr w:type="spellStart"/>
+      <w:r>
+        <w:rPr>
+          <w:rFonts w:ascii="Times New Roman" w:hAnsi="Times New Roman" w:cs="Times New Roman"/>
+        </w:rPr>
+      </w:r>
+      <w:proofErr w:type="spellEnd"/>
+      <w:r>
+        <w:rPr>
+          <w:rFonts w:ascii="Times New Roman" w:hAnsi="Times New Roman" w:cs="Times New Roman"/>
+        </w:rPr>
+      </w:r>
+      <w:proofErr w:type="spellStart"/>
+      <w:r>
+        <w:rPr>
+          <w:rFonts w:ascii="Times New Roman" w:hAnsi="Times New Roman" w:cs="Times New Roman"/>
+        </w:rPr>
+      </w:r>
+      <w:proofErr w:type="spellEnd"/>
+      <w:r>
+        <w:rPr>
+          <w:rFonts w:ascii="Times New Roman" w:hAnsi="Times New Roman" w:cs="Times New Roman"/>
+        </w:rPr>
+      </w:r>
+      <w:proofErr w:type="spellStart"/>
+      <w:r>
+        <w:rPr>
+          <w:rFonts w:ascii="Times New Roman" w:hAnsi="Times New Roman" w:cs="Times New Roman"/>
+        </w:rPr>
+      </w:r>
+      <w:proofErr w:type="spellEnd"/>
+      <w:r>
+        <w:rPr>
+          <w:rFonts w:ascii="Times New Roman" w:hAnsi="Times New Roman" w:cs="Times New Roman"/>
+        </w:rPr>
+      </w:r>
+      <w:proofErr w:type="spellStart"/>
+      <w:r>
+        <w:rPr>
+          <w:rFonts w:ascii="Times New Roman" w:hAnsi="Times New Roman" w:cs="Times New Roman"/>
+        </w:rPr>
+      </w:r>
+      <w:proofErr w:type="spellEnd"/>
+      <w:r>
+        <w:rPr>
+          <w:rFonts w:ascii="Times New Roman" w:hAnsi="Times New Roman" w:cs="Times New Roman"/>
+        </w:rPr>
+      </w:r>
+      <w:proofErr w:type="spellStart"/>
+      <w:r>
+        <w:rPr>
+          <w:rFonts w:ascii="Times New Roman" w:hAnsi="Times New Roman" w:cs="Times New Roman"/>
+        </w:rPr>
+      </w:r>
+      <w:proofErr w:type="spellEnd"/>
+      <w:r>
+        <w:rPr>
+          <w:rFonts w:ascii="Times New Roman" w:hAnsi="Times New Roman" w:cs="Times New Roman"/>
+        </w:rPr>
+      </w:r>
+      <w:proofErr w:type="spellStart"/>
+      <w:r>
+        <w:rPr>
+          <w:rFonts w:ascii="Times New Roman" w:hAnsi="Times New Roman" w:cs="Times New Roman"/>
+        </w:rPr>
+      </w:r>
+      <w:proofErr w:type="spellEnd"/>
+      <w:r>
+        <w:rPr>
+          <w:rFonts w:ascii="Times New Roman" w:hAnsi="Times New Roman" w:cs="Times New Roman"/>
+        </w:rPr>
+      </w:r>
+      <w:proofErr w:type="spellStart"/>
+      <w:r>
+        <w:rPr>
+          <w:rFonts w:ascii="Times New Roman" w:hAnsi="Times New Roman" w:cs="Times New Roman"/>
+        </w:rPr>
+      </w:r>
+      <w:proofErr w:type="spellEnd"/>
+      <w:r>
+        <w:rPr>
+          <w:rFonts w:ascii="Times New Roman" w:hAnsi="Times New Roman" w:cs="Times New Roman"/>
+        </w:rPr>
+      </w:r>
+      <w:proofErr w:type="spellStart"/>
+      <w:r>
+        <w:rPr>
+          <w:rFonts w:ascii="Times New Roman" w:hAnsi="Times New Roman" w:cs="Times New Roman"/>
+        </w:rPr>
+      </w:r>
+      <w:proofErr w:type="spellEnd"/>
+      <w:r>
+        <w:rPr>
+          <w:rFonts w:ascii="Times New Roman" w:hAnsi="Times New Roman" w:cs="Times New Roman"/>
+        </w:rPr>
+      </w:r>
+      <w:proofErr w:type="spellStart"/>
+      <w:r>
+        <w:rPr>
+          <w:rFonts w:ascii="Times New Roman" w:hAnsi="Times New Roman" w:cs="Times New Roman"/>
+        </w:rPr>
+      </w:r>
+      <w:proofErr w:type="spellEnd"/>
+      <w:r>
+        <w:rPr>
+          <w:rFonts w:ascii="Times New Roman" w:hAnsi="Times New Roman" w:cs="Times New Roman"/>
+        </w:rPr>
+      </w:r>
     </w:p>
     <w:p>
       <w:pPr>
@@ -15587,569 +15584,906 @@
         <w:jc w:val="both"/>
         <w:rPr>
           <w:rFonts w:ascii="Times New Roman" w:hAnsi="Times New Roman" w:cs="Times New Roman"/>
-        </w:rPr>
-      </w:pPr>
-      <w:r>
-        <w:rPr>
-          <w:rFonts w:ascii="Times New Roman" w:hAnsi="Times New Roman" w:cs="Times New Roman"/>
+          <w:b/>
+          <w:bCs/>
+        </w:rPr>
+      </w:pPr>
+      <w:proofErr w:type="spellStart"/>
+      <w:r>
+        <w:rPr>
+          <w:rFonts w:ascii="Times New Roman" w:hAnsi="Times New Roman" w:cs="Times New Roman"/>
+          <w:b w:val="0"/>
+          <w:bCs/>
         </w:rPr>
         <w:t>Secara fungsional, prototipe juga memiliki potensi untuk diterapkan pada konfigurasi akuaponik yang berbeda melalui proses penyesuaian parameter. Rentang HSV, ambang status, ambang kesehatan, serta parameter ketinggian kamera dapat dikonfigurasi kembali sesuai kebutuhan. Dengan demikian, arsitektur sistem tidak dibatasi hanya pada satu kondisi instalasi, meskipun penerapan pada sistem lain tetap memerlukan proses kalibrasi dan pengujian ulang.</w:t>
       </w:r>
-      <w:r>
-        <w:rPr>
-          <w:rFonts w:ascii="Times New Roman" w:hAnsi="Times New Roman" w:cs="Times New Roman"/>
-        </w:rPr>
-      </w:r>
-      <w:proofErr w:type="spellStart"/>
-      <w:r>
-        <w:rPr>
-          <w:rFonts w:ascii="Times New Roman" w:hAnsi="Times New Roman" w:cs="Times New Roman"/>
-        </w:rPr>
-      </w:r>
-      <w:proofErr w:type="spellEnd"/>
-      <w:r>
-        <w:rPr>
-          <w:rFonts w:ascii="Times New Roman" w:hAnsi="Times New Roman" w:cs="Times New Roman"/>
-        </w:rPr>
-      </w:r>
-      <w:proofErr w:type="spellStart"/>
-      <w:r>
-        <w:rPr>
-          <w:rFonts w:ascii="Times New Roman" w:hAnsi="Times New Roman" w:cs="Times New Roman"/>
-        </w:rPr>
-      </w:r>
-      <w:proofErr w:type="spellEnd"/>
-      <w:r>
-        <w:rPr>
-          <w:rFonts w:ascii="Times New Roman" w:hAnsi="Times New Roman" w:cs="Times New Roman"/>
-        </w:rPr>
-      </w:r>
-      <w:proofErr w:type="spellStart"/>
-      <w:r>
-        <w:rPr>
-          <w:rFonts w:ascii="Times New Roman" w:hAnsi="Times New Roman" w:cs="Times New Roman"/>
-        </w:rPr>
-      </w:r>
-      <w:proofErr w:type="spellEnd"/>
-      <w:r>
-        <w:rPr>
-          <w:rFonts w:ascii="Times New Roman" w:hAnsi="Times New Roman" w:cs="Times New Roman"/>
-        </w:rPr>
-      </w:r>
-      <w:proofErr w:type="spellStart"/>
-      <w:r>
-        <w:rPr>
-          <w:rFonts w:ascii="Times New Roman" w:hAnsi="Times New Roman" w:cs="Times New Roman"/>
-        </w:rPr>
-      </w:r>
-      <w:proofErr w:type="spellEnd"/>
-      <w:r>
-        <w:rPr>
-          <w:rFonts w:ascii="Times New Roman" w:hAnsi="Times New Roman" w:cs="Times New Roman"/>
-        </w:rPr>
-      </w:r>
-      <w:proofErr w:type="spellStart"/>
-      <w:r>
-        <w:rPr>
-          <w:rFonts w:ascii="Times New Roman" w:hAnsi="Times New Roman" w:cs="Times New Roman"/>
-        </w:rPr>
-      </w:r>
-      <w:proofErr w:type="spellEnd"/>
-      <w:r>
-        <w:rPr>
-          <w:rFonts w:ascii="Times New Roman" w:hAnsi="Times New Roman" w:cs="Times New Roman"/>
-        </w:rPr>
-      </w:r>
-      <w:proofErr w:type="spellStart"/>
-      <w:r>
-        <w:rPr>
-          <w:rFonts w:ascii="Times New Roman" w:hAnsi="Times New Roman" w:cs="Times New Roman"/>
-        </w:rPr>
-      </w:r>
-      <w:proofErr w:type="spellEnd"/>
-      <w:r>
-        <w:rPr>
-          <w:rFonts w:ascii="Times New Roman" w:hAnsi="Times New Roman" w:cs="Times New Roman"/>
-        </w:rPr>
-      </w:r>
-      <w:proofErr w:type="spellStart"/>
-      <w:r>
-        <w:rPr>
-          <w:rFonts w:ascii="Times New Roman" w:hAnsi="Times New Roman" w:cs="Times New Roman"/>
-        </w:rPr>
-      </w:r>
-      <w:proofErr w:type="spellEnd"/>
-      <w:r>
-        <w:rPr>
-          <w:rFonts w:ascii="Times New Roman" w:hAnsi="Times New Roman" w:cs="Times New Roman"/>
-        </w:rPr>
-      </w:r>
-      <w:proofErr w:type="spellStart"/>
-      <w:r>
-        <w:rPr>
-          <w:rFonts w:ascii="Times New Roman" w:hAnsi="Times New Roman" w:cs="Times New Roman"/>
-        </w:rPr>
-      </w:r>
-      <w:proofErr w:type="spellEnd"/>
-      <w:r>
-        <w:rPr>
-          <w:rFonts w:ascii="Times New Roman" w:hAnsi="Times New Roman" w:cs="Times New Roman"/>
-        </w:rPr>
-      </w:r>
-      <w:proofErr w:type="spellStart"/>
-      <w:r>
-        <w:rPr>
-          <w:rFonts w:ascii="Times New Roman" w:hAnsi="Times New Roman" w:cs="Times New Roman"/>
-        </w:rPr>
-      </w:r>
-      <w:proofErr w:type="spellEnd"/>
-      <w:r>
-        <w:rPr>
-          <w:rFonts w:ascii="Times New Roman" w:hAnsi="Times New Roman" w:cs="Times New Roman"/>
-        </w:rPr>
-      </w:r>
-      <w:proofErr w:type="spellStart"/>
-      <w:r>
-        <w:rPr>
-          <w:rFonts w:ascii="Times New Roman" w:hAnsi="Times New Roman" w:cs="Times New Roman"/>
-        </w:rPr>
-      </w:r>
-      <w:proofErr w:type="spellEnd"/>
-      <w:r>
-        <w:rPr>
-          <w:rFonts w:ascii="Times New Roman" w:hAnsi="Times New Roman" w:cs="Times New Roman"/>
-        </w:rPr>
-      </w:r>
-      <w:proofErr w:type="spellStart"/>
-      <w:r>
-        <w:rPr>
-          <w:rFonts w:ascii="Times New Roman" w:hAnsi="Times New Roman" w:cs="Times New Roman"/>
-        </w:rPr>
-      </w:r>
-      <w:proofErr w:type="spellEnd"/>
-      <w:r>
-        <w:rPr>
-          <w:rFonts w:ascii="Times New Roman" w:hAnsi="Times New Roman" w:cs="Times New Roman"/>
-        </w:rPr>
-      </w:r>
-      <w:proofErr w:type="spellStart"/>
-      <w:r>
-        <w:rPr>
-          <w:rFonts w:ascii="Times New Roman" w:hAnsi="Times New Roman" w:cs="Times New Roman"/>
-        </w:rPr>
-      </w:r>
-      <w:proofErr w:type="spellEnd"/>
-      <w:r>
-        <w:rPr>
-          <w:rFonts w:ascii="Times New Roman" w:hAnsi="Times New Roman" w:cs="Times New Roman"/>
-        </w:rPr>
-      </w:r>
-      <w:proofErr w:type="spellStart"/>
-      <w:r>
-        <w:rPr>
-          <w:rFonts w:ascii="Times New Roman" w:hAnsi="Times New Roman" w:cs="Times New Roman"/>
-        </w:rPr>
-      </w:r>
-      <w:proofErr w:type="spellEnd"/>
-      <w:r>
-        <w:rPr>
-          <w:rFonts w:ascii="Times New Roman" w:hAnsi="Times New Roman" w:cs="Times New Roman"/>
-        </w:rPr>
-      </w:r>
-      <w:proofErr w:type="spellStart"/>
-      <w:r>
-        <w:rPr>
-          <w:rFonts w:ascii="Times New Roman" w:hAnsi="Times New Roman" w:cs="Times New Roman"/>
-        </w:rPr>
-      </w:r>
-      <w:proofErr w:type="spellEnd"/>
-      <w:r>
-        <w:rPr>
-          <w:rFonts w:ascii="Times New Roman" w:hAnsi="Times New Roman" w:cs="Times New Roman"/>
-        </w:rPr>
-      </w:r>
-      <w:proofErr w:type="spellStart"/>
-      <w:r>
-        <w:rPr>
-          <w:rFonts w:ascii="Times New Roman" w:hAnsi="Times New Roman" w:cs="Times New Roman"/>
-        </w:rPr>
-      </w:r>
-      <w:proofErr w:type="spellEnd"/>
-      <w:r>
-        <w:rPr>
-          <w:rFonts w:ascii="Times New Roman" w:hAnsi="Times New Roman" w:cs="Times New Roman"/>
-        </w:rPr>
-      </w:r>
-      <w:proofErr w:type="spellStart"/>
-      <w:r>
-        <w:rPr>
-          <w:rFonts w:ascii="Times New Roman" w:hAnsi="Times New Roman" w:cs="Times New Roman"/>
-        </w:rPr>
-      </w:r>
-      <w:proofErr w:type="spellEnd"/>
-      <w:r>
-        <w:rPr>
-          <w:rFonts w:ascii="Times New Roman" w:hAnsi="Times New Roman" w:cs="Times New Roman"/>
-        </w:rPr>
-      </w:r>
-      <w:proofErr w:type="spellStart"/>
-      <w:r>
-        <w:rPr>
-          <w:rFonts w:ascii="Times New Roman" w:hAnsi="Times New Roman" w:cs="Times New Roman"/>
-        </w:rPr>
-      </w:r>
-      <w:proofErr w:type="spellEnd"/>
-      <w:r>
-        <w:rPr>
-          <w:rFonts w:ascii="Times New Roman" w:hAnsi="Times New Roman" w:cs="Times New Roman"/>
-        </w:rPr>
-      </w:r>
-      <w:proofErr w:type="spellStart"/>
-      <w:r>
-        <w:rPr>
-          <w:rFonts w:ascii="Times New Roman" w:hAnsi="Times New Roman" w:cs="Times New Roman"/>
-        </w:rPr>
-      </w:r>
-      <w:proofErr w:type="spellEnd"/>
-      <w:r>
-        <w:rPr>
-          <w:rFonts w:ascii="Times New Roman" w:hAnsi="Times New Roman" w:cs="Times New Roman"/>
-        </w:rPr>
-      </w:r>
-      <w:proofErr w:type="spellStart"/>
-      <w:r>
-        <w:rPr>
-          <w:rFonts w:ascii="Times New Roman" w:hAnsi="Times New Roman" w:cs="Times New Roman"/>
-        </w:rPr>
-      </w:r>
-      <w:proofErr w:type="spellEnd"/>
-      <w:r>
-        <w:rPr>
-          <w:rFonts w:ascii="Times New Roman" w:hAnsi="Times New Roman" w:cs="Times New Roman"/>
-        </w:rPr>
-      </w:r>
-      <w:proofErr w:type="spellStart"/>
-      <w:r>
-        <w:rPr>
-          <w:rFonts w:ascii="Times New Roman" w:hAnsi="Times New Roman" w:cs="Times New Roman"/>
-        </w:rPr>
-      </w:r>
-      <w:proofErr w:type="spellEnd"/>
-      <w:r>
-        <w:rPr>
-          <w:rFonts w:ascii="Times New Roman" w:hAnsi="Times New Roman" w:cs="Times New Roman"/>
-        </w:rPr>
-      </w:r>
-      <w:proofErr w:type="spellStart"/>
-      <w:r>
-        <w:rPr>
-          <w:rFonts w:ascii="Times New Roman" w:hAnsi="Times New Roman" w:cs="Times New Roman"/>
-        </w:rPr>
-      </w:r>
-      <w:proofErr w:type="spellEnd"/>
-      <w:r>
-        <w:rPr>
-          <w:rFonts w:ascii="Times New Roman" w:hAnsi="Times New Roman" w:cs="Times New Roman"/>
-        </w:rPr>
-      </w:r>
-      <w:proofErr w:type="spellStart"/>
-      <w:r>
-        <w:rPr>
-          <w:rFonts w:ascii="Times New Roman" w:hAnsi="Times New Roman" w:cs="Times New Roman"/>
-        </w:rPr>
-      </w:r>
-      <w:proofErr w:type="spellEnd"/>
-      <w:r>
-        <w:rPr>
-          <w:rFonts w:ascii="Times New Roman" w:hAnsi="Times New Roman" w:cs="Times New Roman"/>
-        </w:rPr>
-      </w:r>
-      <w:proofErr w:type="spellStart"/>
-      <w:r>
-        <w:rPr>
-          <w:rFonts w:ascii="Times New Roman" w:hAnsi="Times New Roman" w:cs="Times New Roman"/>
-        </w:rPr>
-      </w:r>
-      <w:proofErr w:type="spellEnd"/>
-      <w:r>
-        <w:rPr>
-          <w:rFonts w:ascii="Times New Roman" w:hAnsi="Times New Roman" w:cs="Times New Roman"/>
-        </w:rPr>
-      </w:r>
-      <w:proofErr w:type="spellStart"/>
-      <w:r>
-        <w:rPr>
-          <w:rFonts w:ascii="Times New Roman" w:hAnsi="Times New Roman" w:cs="Times New Roman"/>
-        </w:rPr>
-      </w:r>
-      <w:proofErr w:type="spellEnd"/>
-      <w:r>
-        <w:rPr>
-          <w:rFonts w:ascii="Times New Roman" w:hAnsi="Times New Roman" w:cs="Times New Roman"/>
-        </w:rPr>
-      </w:r>
-      <w:proofErr w:type="spellStart"/>
-      <w:r>
-        <w:rPr>
-          <w:rFonts w:ascii="Times New Roman" w:hAnsi="Times New Roman" w:cs="Times New Roman"/>
-        </w:rPr>
-      </w:r>
-      <w:proofErr w:type="spellEnd"/>
-      <w:r>
-        <w:rPr>
-          <w:rFonts w:ascii="Times New Roman" w:hAnsi="Times New Roman" w:cs="Times New Roman"/>
-        </w:rPr>
-      </w:r>
-      <w:proofErr w:type="spellStart"/>
-      <w:r>
-        <w:rPr>
-          <w:rFonts w:ascii="Times New Roman" w:hAnsi="Times New Roman" w:cs="Times New Roman"/>
-        </w:rPr>
-      </w:r>
-      <w:proofErr w:type="spellEnd"/>
-      <w:r>
-        <w:rPr>
-          <w:rFonts w:ascii="Times New Roman" w:hAnsi="Times New Roman" w:cs="Times New Roman"/>
-        </w:rPr>
-      </w:r>
-      <w:proofErr w:type="spellStart"/>
-      <w:r>
-        <w:rPr>
-          <w:rFonts w:ascii="Times New Roman" w:hAnsi="Times New Roman" w:cs="Times New Roman"/>
-        </w:rPr>
-      </w:r>
-      <w:proofErr w:type="spellEnd"/>
-      <w:r>
-        <w:rPr>
-          <w:rFonts w:ascii="Times New Roman" w:hAnsi="Times New Roman" w:cs="Times New Roman"/>
-        </w:rPr>
-      </w:r>
-      <w:proofErr w:type="spellStart"/>
-      <w:r>
-        <w:rPr>
-          <w:rFonts w:ascii="Times New Roman" w:hAnsi="Times New Roman" w:cs="Times New Roman"/>
-        </w:rPr>
-      </w:r>
-      <w:proofErr w:type="spellEnd"/>
-      <w:r>
-        <w:rPr>
-          <w:rFonts w:ascii="Times New Roman" w:hAnsi="Times New Roman" w:cs="Times New Roman"/>
-        </w:rPr>
-      </w:r>
-      <w:proofErr w:type="spellStart"/>
-      <w:r>
-        <w:rPr>
-          <w:rFonts w:ascii="Times New Roman" w:hAnsi="Times New Roman" w:cs="Times New Roman"/>
-        </w:rPr>
-      </w:r>
-      <w:proofErr w:type="spellEnd"/>
-      <w:r>
-        <w:rPr>
-          <w:rFonts w:ascii="Times New Roman" w:hAnsi="Times New Roman" w:cs="Times New Roman"/>
-        </w:rPr>
-      </w:r>
-      <w:proofErr w:type="spellStart"/>
-      <w:r>
-        <w:rPr>
-          <w:rFonts w:ascii="Times New Roman" w:hAnsi="Times New Roman" w:cs="Times New Roman"/>
-        </w:rPr>
-      </w:r>
-      <w:proofErr w:type="spellEnd"/>
-      <w:r>
-        <w:rPr>
-          <w:rFonts w:ascii="Times New Roman" w:hAnsi="Times New Roman" w:cs="Times New Roman"/>
-        </w:rPr>
-      </w:r>
-      <w:proofErr w:type="spellStart"/>
-      <w:r>
-        <w:rPr>
-          <w:rFonts w:ascii="Times New Roman" w:hAnsi="Times New Roman" w:cs="Times New Roman"/>
-        </w:rPr>
-      </w:r>
-      <w:proofErr w:type="spellEnd"/>
-      <w:r>
-        <w:rPr>
-          <w:rFonts w:ascii="Times New Roman" w:hAnsi="Times New Roman" w:cs="Times New Roman"/>
-        </w:rPr>
-      </w:r>
-      <w:proofErr w:type="spellStart"/>
-      <w:r>
-        <w:rPr>
-          <w:rFonts w:ascii="Times New Roman" w:hAnsi="Times New Roman" w:cs="Times New Roman"/>
-        </w:rPr>
-      </w:r>
-      <w:proofErr w:type="spellEnd"/>
-      <w:r>
-        <w:rPr>
-          <w:rFonts w:ascii="Times New Roman" w:hAnsi="Times New Roman" w:cs="Times New Roman"/>
-        </w:rPr>
-      </w:r>
-      <w:proofErr w:type="spellStart"/>
-      <w:r>
-        <w:rPr>
-          <w:rFonts w:ascii="Times New Roman" w:hAnsi="Times New Roman" w:cs="Times New Roman"/>
-        </w:rPr>
-      </w:r>
-      <w:proofErr w:type="spellEnd"/>
-      <w:r>
-        <w:rPr>
-          <w:rFonts w:ascii="Times New Roman" w:hAnsi="Times New Roman" w:cs="Times New Roman"/>
-        </w:rPr>
-      </w:r>
-      <w:proofErr w:type="spellStart"/>
-      <w:r>
-        <w:rPr>
-          <w:rFonts w:ascii="Times New Roman" w:hAnsi="Times New Roman" w:cs="Times New Roman"/>
-        </w:rPr>
-      </w:r>
-      <w:proofErr w:type="spellEnd"/>
-      <w:r>
-        <w:rPr>
-          <w:rFonts w:ascii="Times New Roman" w:hAnsi="Times New Roman" w:cs="Times New Roman"/>
-        </w:rPr>
-      </w:r>
-      <w:proofErr w:type="spellStart"/>
-      <w:r>
-        <w:rPr>
-          <w:rFonts w:ascii="Times New Roman" w:hAnsi="Times New Roman" w:cs="Times New Roman"/>
-        </w:rPr>
-      </w:r>
-      <w:proofErr w:type="spellEnd"/>
-      <w:r>
-        <w:rPr>
-          <w:rFonts w:ascii="Times New Roman" w:hAnsi="Times New Roman" w:cs="Times New Roman"/>
-        </w:rPr>
-      </w:r>
-      <w:proofErr w:type="spellStart"/>
-      <w:r>
-        <w:rPr>
-          <w:rFonts w:ascii="Times New Roman" w:hAnsi="Times New Roman" w:cs="Times New Roman"/>
-        </w:rPr>
-      </w:r>
-      <w:proofErr w:type="spellEnd"/>
-      <w:r>
-        <w:rPr>
-          <w:rFonts w:ascii="Times New Roman" w:hAnsi="Times New Roman" w:cs="Times New Roman"/>
-        </w:rPr>
-      </w:r>
-      <w:r>
-        <w:rPr>
-          <w:rFonts w:ascii="Times New Roman" w:hAnsi="Times New Roman" w:cs="Times New Roman"/>
+      <w:proofErr w:type="spellEnd"/>
+      <w:r>
+        <w:rPr>
+          <w:rFonts w:ascii="Times New Roman" w:hAnsi="Times New Roman" w:cs="Times New Roman"/>
+          <w:b w:val="0"/>
+          <w:bCs/>
+        </w:rPr>
+      </w:r>
+      <w:proofErr w:type="spellStart"/>
+      <w:r>
+        <w:rPr>
+          <w:rFonts w:ascii="Times New Roman" w:hAnsi="Times New Roman" w:cs="Times New Roman"/>
+          <w:b w:val="0"/>
+          <w:bCs/>
+        </w:rPr>
+      </w:r>
+      <w:proofErr w:type="spellEnd"/>
+      <w:r>
+        <w:rPr>
+          <w:rFonts w:ascii="Times New Roman" w:hAnsi="Times New Roman" w:cs="Times New Roman"/>
+          <w:b w:val="0"/>
+          <w:bCs/>
+        </w:rPr>
+      </w:r>
+      <w:proofErr w:type="spellStart"/>
+      <w:r>
+        <w:rPr>
+          <w:rFonts w:ascii="Times New Roman" w:hAnsi="Times New Roman" w:cs="Times New Roman"/>
+          <w:b w:val="0"/>
+          <w:bCs/>
+        </w:rPr>
+      </w:r>
+      <w:proofErr w:type="spellEnd"/>
+    </w:p>
+    <w:p>
+      <w:pPr>
+        <w:pStyle w:val="Heading3"/>
+        <w:spacing w:line="360" w:lineRule="auto"/>
+        <w:ind w:left="851"/>
+        <w:jc w:val="both"/>
+        <w:rPr>
+          <w:rFonts w:ascii="Times New Roman" w:hAnsi="Times New Roman" w:cs="Times New Roman"/>
+        </w:rPr>
+      </w:pPr>
+      <w:r>
+        <w:rPr>
+          <w:rFonts w:ascii="Times New Roman" w:hAnsi="Times New Roman" w:cs="Times New Roman"/>
+          <w:b/>
+          <w:color w:val="000000"/>
+          <w:sz w:val="24"/>
+        </w:rPr>
+        <w:t>1.5.2  Potensi Dampak Komersial</w:t>
+      </w:r>
+      <w:r>
+        <w:rPr>
+          <w:rFonts w:ascii="Times New Roman" w:hAnsi="Times New Roman" w:cs="Times New Roman"/>
+          <w:b/>
+          <w:color w:val="000000"/>
+          <w:sz w:val="24"/>
+        </w:rPr>
+      </w:r>
+      <w:proofErr w:type="spellStart"/>
+      <w:r>
+        <w:rPr>
+          <w:rFonts w:ascii="Times New Roman" w:hAnsi="Times New Roman" w:cs="Times New Roman"/>
+          <w:b/>
+          <w:color w:val="000000"/>
+          <w:sz w:val="24"/>
+        </w:rPr>
+      </w:r>
+      <w:proofErr w:type="spellEnd"/>
+      <w:r>
+        <w:rPr>
+          <w:rFonts w:ascii="Times New Roman" w:hAnsi="Times New Roman" w:cs="Times New Roman"/>
+          <w:b/>
+          <w:color w:val="000000"/>
+          <w:sz w:val="24"/>
+        </w:rPr>
+      </w:r>
+      <w:proofErr w:type="spellStart"/>
+      <w:r>
+        <w:rPr>
+          <w:rFonts w:ascii="Times New Roman" w:hAnsi="Times New Roman" w:cs="Times New Roman"/>
+          <w:b/>
+          <w:color w:val="000000"/>
+          <w:sz w:val="24"/>
+        </w:rPr>
+      </w:r>
+      <w:proofErr w:type="spellEnd"/>
+      <w:r>
+        <w:rPr>
+          <w:rFonts w:ascii="Times New Roman" w:hAnsi="Times New Roman" w:cs="Times New Roman"/>
+          <w:b/>
+          <w:color w:val="000000"/>
+          <w:sz w:val="24"/>
+        </w:rPr>
+      </w:r>
+      <w:proofErr w:type="spellStart"/>
+      <w:r>
+        <w:rPr>
+          <w:rFonts w:ascii="Times New Roman" w:hAnsi="Times New Roman" w:cs="Times New Roman"/>
+          <w:b/>
+          <w:color w:val="000000"/>
+          <w:sz w:val="24"/>
+        </w:rPr>
+      </w:r>
+      <w:proofErr w:type="spellEnd"/>
+      <w:r>
+        <w:rPr>
+          <w:rFonts w:ascii="Times New Roman" w:hAnsi="Times New Roman" w:cs="Times New Roman"/>
+          <w:b/>
+          <w:color w:val="000000"/>
+          <w:sz w:val="24"/>
+        </w:rPr>
+      </w:r>
+      <w:proofErr w:type="spellStart"/>
+      <w:r>
+        <w:rPr>
+          <w:rFonts w:ascii="Times New Roman" w:hAnsi="Times New Roman" w:cs="Times New Roman"/>
+          <w:b/>
+          <w:color w:val="000000"/>
+          <w:sz w:val="24"/>
+        </w:rPr>
+      </w:r>
+      <w:proofErr w:type="spellEnd"/>
+      <w:r>
+        <w:rPr>
+          <w:rFonts w:ascii="Times New Roman" w:hAnsi="Times New Roman" w:cs="Times New Roman"/>
+          <w:b/>
+          <w:color w:val="000000"/>
+          <w:sz w:val="24"/>
+        </w:rPr>
+      </w:r>
+      <w:proofErr w:type="spellStart"/>
+      <w:r>
+        <w:rPr>
+          <w:rFonts w:ascii="Times New Roman" w:hAnsi="Times New Roman" w:cs="Times New Roman"/>
+          <w:b/>
+          <w:color w:val="000000"/>
+          <w:sz w:val="24"/>
+        </w:rPr>
+      </w:r>
+      <w:proofErr w:type="spellEnd"/>
+      <w:r>
+        <w:rPr>
+          <w:rFonts w:ascii="Times New Roman" w:hAnsi="Times New Roman" w:cs="Times New Roman"/>
+          <w:b/>
+          <w:color w:val="000000"/>
+          <w:sz w:val="24"/>
+        </w:rPr>
+      </w:r>
+      <w:proofErr w:type="spellStart"/>
+      <w:r>
+        <w:rPr>
+          <w:rFonts w:ascii="Times New Roman" w:hAnsi="Times New Roman" w:cs="Times New Roman"/>
+          <w:b/>
+          <w:color w:val="000000"/>
+          <w:sz w:val="24"/>
+        </w:rPr>
+      </w:r>
+      <w:proofErr w:type="spellEnd"/>
+      <w:r>
+        <w:rPr>
+          <w:rFonts w:ascii="Times New Roman" w:hAnsi="Times New Roman" w:cs="Times New Roman"/>
+          <w:b/>
+          <w:color w:val="000000"/>
+          <w:sz w:val="24"/>
+        </w:rPr>
+      </w:r>
+      <w:proofErr w:type="spellStart"/>
+      <w:r>
+        <w:rPr>
+          <w:rFonts w:ascii="Times New Roman" w:hAnsi="Times New Roman" w:cs="Times New Roman"/>
+          <w:b/>
+          <w:color w:val="000000"/>
+          <w:sz w:val="24"/>
+        </w:rPr>
+      </w:r>
+      <w:proofErr w:type="spellEnd"/>
+      <w:r>
+        <w:rPr>
+          <w:rFonts w:ascii="Times New Roman" w:hAnsi="Times New Roman" w:cs="Times New Roman"/>
+          <w:b/>
+          <w:color w:val="000000"/>
+          <w:sz w:val="24"/>
+        </w:rPr>
+      </w:r>
+      <w:proofErr w:type="spellStart"/>
+      <w:r>
+        <w:rPr>
+          <w:rFonts w:ascii="Times New Roman" w:hAnsi="Times New Roman" w:cs="Times New Roman"/>
+          <w:b/>
+          <w:color w:val="000000"/>
+          <w:sz w:val="24"/>
+        </w:rPr>
+      </w:r>
+      <w:proofErr w:type="spellEnd"/>
+      <w:r>
+        <w:rPr>
+          <w:rFonts w:ascii="Times New Roman" w:hAnsi="Times New Roman" w:cs="Times New Roman"/>
+          <w:b/>
+          <w:color w:val="000000"/>
+          <w:sz w:val="24"/>
+        </w:rPr>
+      </w:r>
+      <w:proofErr w:type="spellStart"/>
+      <w:r>
+        <w:rPr>
+          <w:rFonts w:ascii="Times New Roman" w:hAnsi="Times New Roman" w:cs="Times New Roman"/>
+          <w:b/>
+          <w:color w:val="000000"/>
+          <w:sz w:val="24"/>
+        </w:rPr>
+      </w:r>
+      <w:proofErr w:type="spellEnd"/>
+      <w:r>
+        <w:rPr>
+          <w:rFonts w:ascii="Times New Roman" w:hAnsi="Times New Roman" w:cs="Times New Roman"/>
+          <w:b/>
+          <w:color w:val="000000"/>
+          <w:sz w:val="24"/>
+        </w:rPr>
+      </w:r>
+      <w:proofErr w:type="spellStart"/>
+      <w:r>
+        <w:rPr>
+          <w:rFonts w:ascii="Times New Roman" w:hAnsi="Times New Roman" w:cs="Times New Roman"/>
+          <w:b/>
+          <w:color w:val="000000"/>
+          <w:sz w:val="24"/>
+        </w:rPr>
+      </w:r>
+      <w:proofErr w:type="spellEnd"/>
+      <w:r>
+        <w:rPr>
+          <w:rFonts w:ascii="Times New Roman" w:hAnsi="Times New Roman" w:cs="Times New Roman"/>
+          <w:b/>
+          <w:color w:val="000000"/>
+          <w:sz w:val="24"/>
+        </w:rPr>
+      </w:r>
+      <w:proofErr w:type="spellStart"/>
+      <w:r>
+        <w:rPr>
+          <w:rFonts w:ascii="Times New Roman" w:hAnsi="Times New Roman" w:cs="Times New Roman"/>
+          <w:b/>
+          <w:color w:val="000000"/>
+          <w:sz w:val="24"/>
+        </w:rPr>
+      </w:r>
+      <w:proofErr w:type="spellEnd"/>
+      <w:r>
+        <w:rPr>
+          <w:rFonts w:ascii="Times New Roman" w:hAnsi="Times New Roman" w:cs="Times New Roman"/>
+          <w:b/>
+          <w:color w:val="000000"/>
+          <w:sz w:val="24"/>
+        </w:rPr>
+      </w:r>
+      <w:proofErr w:type="spellStart"/>
+      <w:r>
+        <w:rPr>
+          <w:rFonts w:ascii="Times New Roman" w:hAnsi="Times New Roman" w:cs="Times New Roman"/>
+          <w:b/>
+          <w:color w:val="000000"/>
+          <w:sz w:val="24"/>
+        </w:rPr>
+      </w:r>
+      <w:proofErr w:type="spellEnd"/>
+      <w:r>
+        <w:rPr>
+          <w:rFonts w:ascii="Times New Roman" w:hAnsi="Times New Roman" w:cs="Times New Roman"/>
+          <w:b/>
+          <w:color w:val="000000"/>
+          <w:sz w:val="24"/>
+        </w:rPr>
+      </w:r>
+      <w:proofErr w:type="spellStart"/>
+      <w:r>
+        <w:rPr>
+          <w:rFonts w:ascii="Times New Roman" w:hAnsi="Times New Roman" w:cs="Times New Roman"/>
+          <w:b/>
+          <w:color w:val="000000"/>
+          <w:sz w:val="24"/>
+        </w:rPr>
+      </w:r>
+      <w:proofErr w:type="spellEnd"/>
+      <w:r>
+        <w:rPr>
+          <w:rFonts w:ascii="Times New Roman" w:hAnsi="Times New Roman" w:cs="Times New Roman"/>
+          <w:b/>
+          <w:color w:val="000000"/>
+          <w:sz w:val="24"/>
+        </w:rPr>
+      </w:r>
+      <w:proofErr w:type="spellStart"/>
+      <w:r>
+        <w:rPr>
+          <w:rFonts w:ascii="Times New Roman" w:hAnsi="Times New Roman" w:cs="Times New Roman"/>
+          <w:b/>
+          <w:color w:val="000000"/>
+          <w:sz w:val="24"/>
+        </w:rPr>
+      </w:r>
+      <w:proofErr w:type="spellEnd"/>
+      <w:r>
+        <w:rPr>
+          <w:rFonts w:ascii="Times New Roman" w:hAnsi="Times New Roman" w:cs="Times New Roman"/>
+          <w:b/>
+          <w:color w:val="000000"/>
+          <w:sz w:val="24"/>
+        </w:rPr>
+      </w:r>
+      <w:proofErr w:type="spellStart"/>
+      <w:r>
+        <w:rPr>
+          <w:rFonts w:ascii="Times New Roman" w:hAnsi="Times New Roman" w:cs="Times New Roman"/>
+          <w:b/>
+          <w:color w:val="000000"/>
+          <w:sz w:val="24"/>
+        </w:rPr>
+      </w:r>
+      <w:proofErr w:type="spellEnd"/>
+      <w:r>
+        <w:rPr>
+          <w:rFonts w:ascii="Times New Roman" w:hAnsi="Times New Roman" w:cs="Times New Roman"/>
+          <w:b/>
+          <w:color w:val="000000"/>
+          <w:sz w:val="24"/>
+        </w:rPr>
+      </w:r>
+      <w:proofErr w:type="spellStart"/>
+      <w:r>
+        <w:rPr>
+          <w:rFonts w:ascii="Times New Roman" w:hAnsi="Times New Roman" w:cs="Times New Roman"/>
+          <w:b/>
+          <w:color w:val="000000"/>
+          <w:sz w:val="24"/>
+        </w:rPr>
+      </w:r>
+      <w:proofErr w:type="spellEnd"/>
+      <w:r>
+        <w:rPr>
+          <w:rFonts w:ascii="Times New Roman" w:hAnsi="Times New Roman" w:cs="Times New Roman"/>
+          <w:b/>
+          <w:color w:val="000000"/>
+          <w:sz w:val="24"/>
+        </w:rPr>
+      </w:r>
+      <w:proofErr w:type="spellStart"/>
+      <w:r>
+        <w:rPr>
+          <w:rFonts w:ascii="Times New Roman" w:hAnsi="Times New Roman" w:cs="Times New Roman"/>
+          <w:b/>
+          <w:color w:val="000000"/>
+          <w:sz w:val="24"/>
+        </w:rPr>
+      </w:r>
+      <w:proofErr w:type="spellEnd"/>
+      <w:r>
+        <w:rPr>
+          <w:rFonts w:ascii="Times New Roman" w:hAnsi="Times New Roman" w:cs="Times New Roman"/>
+          <w:b/>
+          <w:color w:val="000000"/>
+          <w:sz w:val="24"/>
+        </w:rPr>
+      </w:r>
+      <w:proofErr w:type="spellStart"/>
+      <w:r>
+        <w:rPr>
+          <w:rFonts w:ascii="Times New Roman" w:hAnsi="Times New Roman" w:cs="Times New Roman"/>
+          <w:b/>
+          <w:color w:val="000000"/>
+          <w:sz w:val="24"/>
+        </w:rPr>
+      </w:r>
+      <w:proofErr w:type="spellEnd"/>
+      <w:r>
+        <w:rPr>
+          <w:rFonts w:ascii="Times New Roman" w:hAnsi="Times New Roman" w:cs="Times New Roman"/>
+          <w:b/>
+          <w:color w:val="000000"/>
+          <w:sz w:val="24"/>
+        </w:rPr>
+      </w:r>
+      <w:proofErr w:type="spellStart"/>
+      <w:r>
+        <w:rPr>
+          <w:rFonts w:ascii="Times New Roman" w:hAnsi="Times New Roman" w:cs="Times New Roman"/>
+          <w:b/>
+          <w:color w:val="000000"/>
+          <w:sz w:val="24"/>
+        </w:rPr>
+      </w:r>
+      <w:proofErr w:type="spellEnd"/>
+      <w:r>
+        <w:rPr>
+          <w:rFonts w:ascii="Times New Roman" w:hAnsi="Times New Roman" w:cs="Times New Roman"/>
+          <w:b/>
+          <w:color w:val="000000"/>
+          <w:sz w:val="24"/>
+        </w:rPr>
+      </w:r>
+      <w:proofErr w:type="spellStart"/>
+      <w:r>
+        <w:rPr>
+          <w:rFonts w:ascii="Times New Roman" w:hAnsi="Times New Roman" w:cs="Times New Roman"/>
+          <w:b/>
+          <w:color w:val="000000"/>
+          <w:sz w:val="24"/>
+        </w:rPr>
+      </w:r>
+      <w:proofErr w:type="spellEnd"/>
+      <w:r>
+        <w:rPr>
+          <w:rFonts w:ascii="Times New Roman" w:hAnsi="Times New Roman" w:cs="Times New Roman"/>
+          <w:b/>
+          <w:color w:val="000000"/>
+          <w:sz w:val="24"/>
+        </w:rPr>
+      </w:r>
+      <w:proofErr w:type="spellStart"/>
+      <w:r>
+        <w:rPr>
+          <w:rFonts w:ascii="Times New Roman" w:hAnsi="Times New Roman" w:cs="Times New Roman"/>
+          <w:b/>
+          <w:color w:val="000000"/>
+          <w:sz w:val="24"/>
+        </w:rPr>
+      </w:r>
+      <w:proofErr w:type="spellEnd"/>
+      <w:r>
+        <w:rPr>
+          <w:rFonts w:ascii="Times New Roman" w:hAnsi="Times New Roman" w:cs="Times New Roman"/>
+          <w:b/>
+          <w:color w:val="000000"/>
+          <w:sz w:val="24"/>
+        </w:rPr>
+      </w:r>
+      <w:proofErr w:type="spellStart"/>
+      <w:r>
+        <w:rPr>
+          <w:rFonts w:ascii="Times New Roman" w:hAnsi="Times New Roman" w:cs="Times New Roman"/>
+          <w:b/>
+          <w:color w:val="000000"/>
+          <w:sz w:val="24"/>
+        </w:rPr>
+      </w:r>
+      <w:proofErr w:type="spellEnd"/>
+      <w:r>
+        <w:rPr>
+          <w:rFonts w:ascii="Times New Roman" w:hAnsi="Times New Roman" w:cs="Times New Roman"/>
+          <w:b/>
+          <w:color w:val="000000"/>
+          <w:sz w:val="24"/>
+        </w:rPr>
+      </w:r>
+      <w:proofErr w:type="spellStart"/>
+      <w:r>
+        <w:rPr>
+          <w:rFonts w:ascii="Times New Roman" w:hAnsi="Times New Roman" w:cs="Times New Roman"/>
+          <w:b/>
+          <w:color w:val="000000"/>
+          <w:sz w:val="24"/>
+        </w:rPr>
+      </w:r>
+      <w:proofErr w:type="spellEnd"/>
+      <w:r>
+        <w:rPr>
+          <w:rFonts w:ascii="Times New Roman" w:hAnsi="Times New Roman" w:cs="Times New Roman"/>
+          <w:b/>
+          <w:color w:val="000000"/>
+          <w:sz w:val="24"/>
+        </w:rPr>
+      </w:r>
+      <w:proofErr w:type="spellStart"/>
+      <w:r>
+        <w:rPr>
+          <w:rFonts w:ascii="Times New Roman" w:hAnsi="Times New Roman" w:cs="Times New Roman"/>
+          <w:b/>
+          <w:color w:val="000000"/>
+          <w:sz w:val="24"/>
+        </w:rPr>
+      </w:r>
+      <w:proofErr w:type="spellEnd"/>
+      <w:r>
+        <w:rPr>
+          <w:rFonts w:ascii="Times New Roman" w:hAnsi="Times New Roman" w:cs="Times New Roman"/>
+          <w:b/>
+          <w:color w:val="000000"/>
+          <w:sz w:val="24"/>
+        </w:rPr>
+      </w:r>
+      <w:proofErr w:type="spellStart"/>
+      <w:r>
+        <w:rPr>
+          <w:rFonts w:ascii="Times New Roman" w:hAnsi="Times New Roman" w:cs="Times New Roman"/>
+          <w:b/>
+          <w:color w:val="000000"/>
+          <w:sz w:val="24"/>
+        </w:rPr>
+      </w:r>
+      <w:proofErr w:type="spellEnd"/>
+      <w:r>
+        <w:rPr>
+          <w:rFonts w:ascii="Times New Roman" w:hAnsi="Times New Roman" w:cs="Times New Roman"/>
+          <w:b/>
+          <w:color w:val="000000"/>
+          <w:sz w:val="24"/>
+        </w:rPr>
+      </w:r>
+      <w:proofErr w:type="spellStart"/>
+      <w:r>
+        <w:rPr>
+          <w:rFonts w:ascii="Times New Roman" w:hAnsi="Times New Roman" w:cs="Times New Roman"/>
+          <w:b/>
+          <w:color w:val="000000"/>
+          <w:sz w:val="24"/>
+        </w:rPr>
+      </w:r>
+      <w:proofErr w:type="spellEnd"/>
+      <w:r>
+        <w:rPr>
+          <w:rFonts w:ascii="Times New Roman" w:hAnsi="Times New Roman" w:cs="Times New Roman"/>
+          <w:b/>
+          <w:color w:val="000000"/>
+          <w:sz w:val="24"/>
+        </w:rPr>
+      </w:r>
+      <w:proofErr w:type="spellStart"/>
+      <w:r>
+        <w:rPr>
+          <w:rFonts w:ascii="Times New Roman" w:hAnsi="Times New Roman" w:cs="Times New Roman"/>
+          <w:b/>
+          <w:color w:val="000000"/>
+          <w:sz w:val="24"/>
+        </w:rPr>
+      </w:r>
+      <w:proofErr w:type="spellEnd"/>
+      <w:r>
+        <w:rPr>
+          <w:rFonts w:ascii="Times New Roman" w:hAnsi="Times New Roman" w:cs="Times New Roman"/>
+          <w:b/>
+          <w:color w:val="000000"/>
+          <w:sz w:val="24"/>
+        </w:rPr>
+      </w:r>
+      <w:proofErr w:type="spellStart"/>
+      <w:r>
+        <w:rPr>
+          <w:rFonts w:ascii="Times New Roman" w:hAnsi="Times New Roman" w:cs="Times New Roman"/>
+          <w:b/>
+          <w:color w:val="000000"/>
+          <w:sz w:val="24"/>
+        </w:rPr>
+      </w:r>
+      <w:proofErr w:type="spellEnd"/>
+      <w:r>
+        <w:rPr>
+          <w:rFonts w:ascii="Times New Roman" w:hAnsi="Times New Roman" w:cs="Times New Roman"/>
+          <w:b/>
+          <w:color w:val="000000"/>
+          <w:sz w:val="24"/>
+        </w:rPr>
+      </w:r>
+      <w:proofErr w:type="spellStart"/>
+      <w:r>
+        <w:rPr>
+          <w:rFonts w:ascii="Times New Roman" w:hAnsi="Times New Roman" w:cs="Times New Roman"/>
+          <w:b/>
+          <w:color w:val="000000"/>
+          <w:sz w:val="24"/>
+        </w:rPr>
+      </w:r>
+      <w:proofErr w:type="spellEnd"/>
+      <w:r>
+        <w:rPr>
+          <w:rFonts w:ascii="Times New Roman" w:hAnsi="Times New Roman" w:cs="Times New Roman"/>
+          <w:b/>
+          <w:color w:val="000000"/>
+          <w:sz w:val="24"/>
+        </w:rPr>
+      </w:r>
+      <w:proofErr w:type="spellStart"/>
+      <w:r>
+        <w:rPr>
+          <w:rFonts w:ascii="Times New Roman" w:hAnsi="Times New Roman" w:cs="Times New Roman"/>
+          <w:b/>
+          <w:color w:val="000000"/>
+          <w:sz w:val="24"/>
+        </w:rPr>
+      </w:r>
+      <w:proofErr w:type="spellEnd"/>
+      <w:r>
+        <w:rPr>
+          <w:rFonts w:ascii="Times New Roman" w:hAnsi="Times New Roman" w:cs="Times New Roman"/>
+          <w:b/>
+          <w:color w:val="000000"/>
+          <w:sz w:val="24"/>
+        </w:rPr>
+      </w:r>
+      <w:proofErr w:type="spellStart"/>
+      <w:r>
+        <w:rPr>
+          <w:rFonts w:ascii="Times New Roman" w:hAnsi="Times New Roman" w:cs="Times New Roman"/>
+          <w:b/>
+          <w:color w:val="000000"/>
+          <w:sz w:val="24"/>
+        </w:rPr>
+      </w:r>
+      <w:proofErr w:type="spellEnd"/>
+      <w:r>
+        <w:rPr>
+          <w:rFonts w:ascii="Times New Roman" w:hAnsi="Times New Roman" w:cs="Times New Roman"/>
+          <w:b/>
+          <w:color w:val="000000"/>
+          <w:sz w:val="24"/>
+        </w:rPr>
+      </w:r>
+      <w:proofErr w:type="spellStart"/>
+      <w:r>
+        <w:rPr>
+          <w:rFonts w:ascii="Times New Roman" w:hAnsi="Times New Roman" w:cs="Times New Roman"/>
+          <w:b/>
+          <w:color w:val="000000"/>
+          <w:sz w:val="24"/>
+        </w:rPr>
+      </w:r>
+      <w:proofErr w:type="spellEnd"/>
+      <w:r>
+        <w:rPr>
+          <w:rFonts w:ascii="Times New Roman" w:hAnsi="Times New Roman" w:cs="Times New Roman"/>
+          <w:b/>
+          <w:color w:val="000000"/>
+          <w:sz w:val="24"/>
+        </w:rPr>
+      </w:r>
+      <w:proofErr w:type="spellStart"/>
+      <w:r>
+        <w:rPr>
+          <w:rFonts w:ascii="Times New Roman" w:hAnsi="Times New Roman" w:cs="Times New Roman"/>
+          <w:b/>
+          <w:color w:val="000000"/>
+          <w:sz w:val="24"/>
+        </w:rPr>
+      </w:r>
+      <w:proofErr w:type="spellEnd"/>
+      <w:r>
+        <w:rPr>
+          <w:rFonts w:ascii="Times New Roman" w:hAnsi="Times New Roman" w:cs="Times New Roman"/>
+          <w:b/>
+          <w:color w:val="000000"/>
+          <w:sz w:val="24"/>
+        </w:rPr>
+      </w:r>
+      <w:proofErr w:type="spellStart"/>
+      <w:r>
+        <w:rPr>
+          <w:rFonts w:ascii="Times New Roman" w:hAnsi="Times New Roman" w:cs="Times New Roman"/>
+          <w:b/>
+          <w:color w:val="000000"/>
+          <w:sz w:val="24"/>
+        </w:rPr>
+      </w:r>
+      <w:proofErr w:type="spellEnd"/>
+      <w:r>
+        <w:rPr>
+          <w:rFonts w:ascii="Times New Roman" w:hAnsi="Times New Roman" w:cs="Times New Roman"/>
+          <w:b/>
+          <w:color w:val="000000"/>
+          <w:sz w:val="24"/>
+        </w:rPr>
+      </w:r>
+      <w:proofErr w:type="spellStart"/>
+      <w:r>
+        <w:rPr>
+          <w:rFonts w:ascii="Times New Roman" w:hAnsi="Times New Roman" w:cs="Times New Roman"/>
+          <w:b/>
+          <w:color w:val="000000"/>
+          <w:sz w:val="24"/>
+        </w:rPr>
+      </w:r>
+      <w:proofErr w:type="spellEnd"/>
+      <w:r>
+        <w:rPr>
+          <w:rFonts w:ascii="Times New Roman" w:hAnsi="Times New Roman" w:cs="Times New Roman"/>
+          <w:b/>
+          <w:color w:val="000000"/>
+          <w:sz w:val="24"/>
+        </w:rPr>
+      </w:r>
+      <w:proofErr w:type="spellStart"/>
+      <w:r>
+        <w:rPr>
+          <w:rFonts w:ascii="Times New Roman" w:hAnsi="Times New Roman" w:cs="Times New Roman"/>
+          <w:b/>
+          <w:color w:val="000000"/>
+          <w:sz w:val="24"/>
+        </w:rPr>
+      </w:r>
+      <w:proofErr w:type="spellEnd"/>
+      <w:r>
+        <w:rPr>
+          <w:rFonts w:ascii="Times New Roman" w:hAnsi="Times New Roman" w:cs="Times New Roman"/>
+          <w:b/>
+          <w:color w:val="000000"/>
+          <w:sz w:val="24"/>
+        </w:rPr>
+      </w:r>
+      <w:r>
+        <w:rPr>
+          <w:rFonts w:ascii="Times New Roman" w:hAnsi="Times New Roman" w:cs="Times New Roman"/>
+          <w:b/>
           <w:i/>
           <w:iCs/>
-        </w:rPr>
-      </w:r>
-      <w:r>
-        <w:rPr>
-          <w:rFonts w:ascii="Times New Roman" w:hAnsi="Times New Roman" w:cs="Times New Roman"/>
-        </w:rPr>
-      </w:r>
-      <w:proofErr w:type="spellStart"/>
-      <w:r>
-        <w:rPr>
-          <w:rFonts w:ascii="Times New Roman" w:hAnsi="Times New Roman" w:cs="Times New Roman"/>
-        </w:rPr>
-      </w:r>
-      <w:proofErr w:type="spellEnd"/>
-      <w:r>
-        <w:rPr>
-          <w:rFonts w:ascii="Times New Roman" w:hAnsi="Times New Roman" w:cs="Times New Roman"/>
-        </w:rPr>
-      </w:r>
-      <w:proofErr w:type="spellStart"/>
-      <w:r>
-        <w:rPr>
-          <w:rFonts w:ascii="Times New Roman" w:hAnsi="Times New Roman" w:cs="Times New Roman"/>
-        </w:rPr>
-      </w:r>
-      <w:proofErr w:type="spellEnd"/>
-      <w:r>
-        <w:rPr>
-          <w:rFonts w:ascii="Times New Roman" w:hAnsi="Times New Roman" w:cs="Times New Roman"/>
-        </w:rPr>
-      </w:r>
-      <w:proofErr w:type="spellStart"/>
-      <w:r>
-        <w:rPr>
-          <w:rFonts w:ascii="Times New Roman" w:hAnsi="Times New Roman" w:cs="Times New Roman"/>
-        </w:rPr>
-      </w:r>
-      <w:proofErr w:type="spellEnd"/>
-      <w:r>
-        <w:rPr>
-          <w:rFonts w:ascii="Times New Roman" w:hAnsi="Times New Roman" w:cs="Times New Roman"/>
-        </w:rPr>
-      </w:r>
-      <w:proofErr w:type="spellStart"/>
-      <w:r>
-        <w:rPr>
-          <w:rFonts w:ascii="Times New Roman" w:hAnsi="Times New Roman" w:cs="Times New Roman"/>
-        </w:rPr>
-      </w:r>
-      <w:proofErr w:type="spellEnd"/>
-      <w:r>
-        <w:rPr>
-          <w:rFonts w:ascii="Times New Roman" w:hAnsi="Times New Roman" w:cs="Times New Roman"/>
-        </w:rPr>
-      </w:r>
-      <w:proofErr w:type="spellStart"/>
-      <w:r>
-        <w:rPr>
-          <w:rFonts w:ascii="Times New Roman" w:hAnsi="Times New Roman" w:cs="Times New Roman"/>
-        </w:rPr>
-      </w:r>
-      <w:proofErr w:type="spellEnd"/>
-      <w:r>
-        <w:rPr>
-          <w:rFonts w:ascii="Times New Roman" w:hAnsi="Times New Roman" w:cs="Times New Roman"/>
-        </w:rPr>
-      </w:r>
-      <w:proofErr w:type="spellStart"/>
-      <w:r>
-        <w:rPr>
-          <w:rFonts w:ascii="Times New Roman" w:hAnsi="Times New Roman" w:cs="Times New Roman"/>
-        </w:rPr>
-      </w:r>
-      <w:proofErr w:type="spellEnd"/>
-      <w:r>
-        <w:rPr>
-          <w:rFonts w:ascii="Times New Roman" w:hAnsi="Times New Roman" w:cs="Times New Roman"/>
-        </w:rPr>
-      </w:r>
-      <w:proofErr w:type="spellStart"/>
-      <w:r>
-        <w:rPr>
-          <w:rFonts w:ascii="Times New Roman" w:hAnsi="Times New Roman" w:cs="Times New Roman"/>
-        </w:rPr>
-      </w:r>
-      <w:proofErr w:type="spellEnd"/>
-      <w:r>
-        <w:rPr>
-          <w:rFonts w:ascii="Times New Roman" w:hAnsi="Times New Roman" w:cs="Times New Roman"/>
-        </w:rPr>
-      </w:r>
-      <w:proofErr w:type="spellStart"/>
-      <w:r>
-        <w:rPr>
-          <w:rFonts w:ascii="Times New Roman" w:hAnsi="Times New Roman" w:cs="Times New Roman"/>
-        </w:rPr>
-      </w:r>
-      <w:proofErr w:type="spellEnd"/>
-      <w:r>
-        <w:rPr>
-          <w:rFonts w:ascii="Times New Roman" w:hAnsi="Times New Roman" w:cs="Times New Roman"/>
-        </w:rPr>
-      </w:r>
-      <w:proofErr w:type="spellStart"/>
-      <w:r>
-        <w:rPr>
-          <w:rFonts w:ascii="Times New Roman" w:hAnsi="Times New Roman" w:cs="Times New Roman"/>
-        </w:rPr>
-      </w:r>
-      <w:proofErr w:type="spellEnd"/>
-      <w:r>
-        <w:rPr>
-          <w:rFonts w:ascii="Times New Roman" w:hAnsi="Times New Roman" w:cs="Times New Roman"/>
+          <w:color w:val="000000"/>
+          <w:sz w:val="24"/>
+        </w:rPr>
+      </w:r>
+      <w:r>
+        <w:rPr>
+          <w:rFonts w:ascii="Times New Roman" w:hAnsi="Times New Roman" w:cs="Times New Roman"/>
+          <w:b/>
+          <w:color w:val="000000"/>
+          <w:sz w:val="24"/>
+        </w:rPr>
+      </w:r>
+      <w:proofErr w:type="spellStart"/>
+      <w:r>
+        <w:rPr>
+          <w:rFonts w:ascii="Times New Roman" w:hAnsi="Times New Roman" w:cs="Times New Roman"/>
+          <w:b/>
+          <w:color w:val="000000"/>
+          <w:sz w:val="24"/>
+        </w:rPr>
+      </w:r>
+      <w:proofErr w:type="spellEnd"/>
+      <w:r>
+        <w:rPr>
+          <w:rFonts w:ascii="Times New Roman" w:hAnsi="Times New Roman" w:cs="Times New Roman"/>
+          <w:b/>
+          <w:color w:val="000000"/>
+          <w:sz w:val="24"/>
+        </w:rPr>
+      </w:r>
+      <w:proofErr w:type="spellStart"/>
+      <w:r>
+        <w:rPr>
+          <w:rFonts w:ascii="Times New Roman" w:hAnsi="Times New Roman" w:cs="Times New Roman"/>
+          <w:b/>
+          <w:color w:val="000000"/>
+          <w:sz w:val="24"/>
+        </w:rPr>
+      </w:r>
+      <w:proofErr w:type="spellEnd"/>
+      <w:r>
+        <w:rPr>
+          <w:rFonts w:ascii="Times New Roman" w:hAnsi="Times New Roman" w:cs="Times New Roman"/>
+          <w:b/>
+          <w:color w:val="000000"/>
+          <w:sz w:val="24"/>
+        </w:rPr>
+      </w:r>
+      <w:proofErr w:type="spellStart"/>
+      <w:r>
+        <w:rPr>
+          <w:rFonts w:ascii="Times New Roman" w:hAnsi="Times New Roman" w:cs="Times New Roman"/>
+          <w:b/>
+          <w:color w:val="000000"/>
+          <w:sz w:val="24"/>
+        </w:rPr>
+      </w:r>
+      <w:proofErr w:type="spellEnd"/>
+      <w:r>
+        <w:rPr>
+          <w:rFonts w:ascii="Times New Roman" w:hAnsi="Times New Roman" w:cs="Times New Roman"/>
+          <w:b/>
+          <w:color w:val="000000"/>
+          <w:sz w:val="24"/>
+        </w:rPr>
+      </w:r>
+      <w:proofErr w:type="spellStart"/>
+      <w:r>
+        <w:rPr>
+          <w:rFonts w:ascii="Times New Roman" w:hAnsi="Times New Roman" w:cs="Times New Roman"/>
+          <w:b/>
+          <w:color w:val="000000"/>
+          <w:sz w:val="24"/>
+        </w:rPr>
+      </w:r>
+      <w:proofErr w:type="spellEnd"/>
+      <w:r>
+        <w:rPr>
+          <w:rFonts w:ascii="Times New Roman" w:hAnsi="Times New Roman" w:cs="Times New Roman"/>
+          <w:b/>
+          <w:color w:val="000000"/>
+          <w:sz w:val="24"/>
+        </w:rPr>
+      </w:r>
+      <w:proofErr w:type="spellStart"/>
+      <w:r>
+        <w:rPr>
+          <w:rFonts w:ascii="Times New Roman" w:hAnsi="Times New Roman" w:cs="Times New Roman"/>
+          <w:b/>
+          <w:color w:val="000000"/>
+          <w:sz w:val="24"/>
+        </w:rPr>
+      </w:r>
+      <w:proofErr w:type="spellEnd"/>
+      <w:r>
+        <w:rPr>
+          <w:rFonts w:ascii="Times New Roman" w:hAnsi="Times New Roman" w:cs="Times New Roman"/>
+          <w:b/>
+          <w:color w:val="000000"/>
+          <w:sz w:val="24"/>
+        </w:rPr>
+      </w:r>
+      <w:proofErr w:type="spellStart"/>
+      <w:r>
+        <w:rPr>
+          <w:rFonts w:ascii="Times New Roman" w:hAnsi="Times New Roman" w:cs="Times New Roman"/>
+          <w:b/>
+          <w:color w:val="000000"/>
+          <w:sz w:val="24"/>
+        </w:rPr>
+      </w:r>
+      <w:proofErr w:type="spellEnd"/>
+      <w:r>
+        <w:rPr>
+          <w:rFonts w:ascii="Times New Roman" w:hAnsi="Times New Roman" w:cs="Times New Roman"/>
+          <w:b/>
+          <w:color w:val="000000"/>
+          <w:sz w:val="24"/>
+        </w:rPr>
+      </w:r>
+      <w:proofErr w:type="spellStart"/>
+      <w:r>
+        <w:rPr>
+          <w:rFonts w:ascii="Times New Roman" w:hAnsi="Times New Roman" w:cs="Times New Roman"/>
+          <w:b/>
+          <w:color w:val="000000"/>
+          <w:sz w:val="24"/>
+        </w:rPr>
+      </w:r>
+      <w:proofErr w:type="spellEnd"/>
+      <w:r>
+        <w:rPr>
+          <w:rFonts w:ascii="Times New Roman" w:hAnsi="Times New Roman" w:cs="Times New Roman"/>
+          <w:b/>
+          <w:color w:val="000000"/>
+          <w:sz w:val="24"/>
+        </w:rPr>
+      </w:r>
+      <w:proofErr w:type="spellStart"/>
+      <w:r>
+        <w:rPr>
+          <w:rFonts w:ascii="Times New Roman" w:hAnsi="Times New Roman" w:cs="Times New Roman"/>
+          <w:b/>
+          <w:color w:val="000000"/>
+          <w:sz w:val="24"/>
+        </w:rPr>
+      </w:r>
+      <w:proofErr w:type="spellEnd"/>
+      <w:r>
+        <w:rPr>
+          <w:rFonts w:ascii="Times New Roman" w:hAnsi="Times New Roman" w:cs="Times New Roman"/>
+          <w:b/>
+          <w:color w:val="000000"/>
+          <w:sz w:val="24"/>
+        </w:rPr>
+      </w:r>
+      <w:proofErr w:type="spellStart"/>
+      <w:r>
+        <w:rPr>
+          <w:rFonts w:ascii="Times New Roman" w:hAnsi="Times New Roman" w:cs="Times New Roman"/>
+          <w:b/>
+          <w:color w:val="000000"/>
+          <w:sz w:val="24"/>
+        </w:rPr>
+      </w:r>
+      <w:proofErr w:type="spellEnd"/>
+      <w:r>
+        <w:rPr>
+          <w:rFonts w:ascii="Times New Roman" w:hAnsi="Times New Roman" w:cs="Times New Roman"/>
+          <w:b/>
+          <w:color w:val="000000"/>
+          <w:sz w:val="24"/>
         </w:rPr>
       </w:r>
     </w:p>
@@ -16167,77 +16501,841 @@
         <w:rPr>
           <w:rFonts w:ascii="Times New Roman" w:hAnsi="Times New Roman" w:cs="Times New Roman"/>
         </w:rPr>
-        <w:t>Dari sisi komersial, prototipe ini memiliki potensi untuk dikembangkan menjadi perangkat pendukung monitoring akuaponik yang menilai kelayakan panen dan kesehatan tanaman dalam satu sistem. Arsitektur yang menggunakan komputer papan tunggal, kamera, rumah kamera cetak tiga dimensi, dan konektivitas Internet of Things memungkinkan sistem dikembangkan secara modular sesuai kebutuhan pengguna dan skala instalasi.</w:t>
+        <w:t>Dari sisi komersial, prototipe ini memiliki potensi untuk dikembangkan menjadi perangkat pendukung monitoring akuaponik yang menilai kelayakan panen dan kesehatan tanaman dalam satu sistem. Arsitektur yang menggunakan komputer papan tunggal, kamera, rumah kamera cetak tiga dimensi, dan konektivitas Internet of Things memungkinkan sistem dikembangkan secara modular sesuai kebutuhan pengguna dan skala instalasi. Perbandingan prototipe terhadap produk pembanding lain diringkas pada Tabel 1.1.</w:t>
+      </w:r>
+      <w:proofErr w:type="spellStart"/>
+      <w:r>
+        <w:rPr>
+          <w:rFonts w:ascii="Times New Roman" w:hAnsi="Times New Roman" w:cs="Times New Roman"/>
+        </w:rPr>
+      </w:r>
+      <w:proofErr w:type="spellEnd"/>
+      <w:r>
+        <w:rPr>
+          <w:rFonts w:ascii="Times New Roman" w:hAnsi="Times New Roman" w:cs="Times New Roman"/>
+        </w:rPr>
+      </w:r>
+      <w:proofErr w:type="spellStart"/>
+      <w:r>
+        <w:rPr>
+          <w:rFonts w:ascii="Times New Roman" w:hAnsi="Times New Roman" w:cs="Times New Roman"/>
+        </w:rPr>
+      </w:r>
+      <w:proofErr w:type="spellEnd"/>
+      <w:r>
+        <w:rPr>
+          <w:rFonts w:ascii="Times New Roman" w:hAnsi="Times New Roman" w:cs="Times New Roman"/>
+        </w:rPr>
+      </w:r>
+      <w:proofErr w:type="spellStart"/>
+      <w:r>
+        <w:rPr>
+          <w:rFonts w:ascii="Times New Roman" w:hAnsi="Times New Roman" w:cs="Times New Roman"/>
+        </w:rPr>
+      </w:r>
+      <w:proofErr w:type="spellEnd"/>
+      <w:r>
+        <w:rPr>
+          <w:rFonts w:ascii="Times New Roman" w:hAnsi="Times New Roman" w:cs="Times New Roman"/>
+        </w:rPr>
+      </w:r>
+      <w:proofErr w:type="spellStart"/>
+      <w:r>
+        <w:rPr>
+          <w:rFonts w:ascii="Times New Roman" w:hAnsi="Times New Roman" w:cs="Times New Roman"/>
+        </w:rPr>
+      </w:r>
+      <w:proofErr w:type="spellEnd"/>
+      <w:r>
+        <w:rPr>
+          <w:rFonts w:ascii="Times New Roman" w:hAnsi="Times New Roman" w:cs="Times New Roman"/>
+        </w:rPr>
+      </w:r>
+      <w:proofErr w:type="spellStart"/>
+      <w:r>
+        <w:rPr>
+          <w:rFonts w:ascii="Times New Roman" w:hAnsi="Times New Roman" w:cs="Times New Roman"/>
+        </w:rPr>
+      </w:r>
+      <w:proofErr w:type="spellEnd"/>
+      <w:r>
+        <w:rPr>
+          <w:rFonts w:ascii="Times New Roman" w:hAnsi="Times New Roman" w:cs="Times New Roman"/>
+        </w:rPr>
+      </w:r>
+      <w:proofErr w:type="spellStart"/>
+      <w:r>
+        <w:rPr>
+          <w:rFonts w:ascii="Times New Roman" w:hAnsi="Times New Roman" w:cs="Times New Roman"/>
+        </w:rPr>
+      </w:r>
+      <w:proofErr w:type="spellEnd"/>
+      <w:r>
+        <w:rPr>
+          <w:rFonts w:ascii="Times New Roman" w:hAnsi="Times New Roman" w:cs="Times New Roman"/>
+        </w:rPr>
+      </w:r>
+      <w:proofErr w:type="spellStart"/>
+      <w:r>
+        <w:rPr>
+          <w:rFonts w:ascii="Times New Roman" w:hAnsi="Times New Roman" w:cs="Times New Roman"/>
+        </w:rPr>
+      </w:r>
+      <w:proofErr w:type="spellEnd"/>
+      <w:r>
+        <w:rPr>
+          <w:rFonts w:ascii="Times New Roman" w:hAnsi="Times New Roman" w:cs="Times New Roman"/>
+        </w:rPr>
+      </w:r>
+      <w:proofErr w:type="spellStart"/>
+      <w:r>
+        <w:rPr>
+          <w:rFonts w:ascii="Times New Roman" w:hAnsi="Times New Roman" w:cs="Times New Roman"/>
+        </w:rPr>
+      </w:r>
+      <w:proofErr w:type="spellEnd"/>
+      <w:r>
+        <w:rPr>
+          <w:rFonts w:ascii="Times New Roman" w:hAnsi="Times New Roman" w:cs="Times New Roman"/>
+        </w:rPr>
+      </w:r>
+      <w:proofErr w:type="spellStart"/>
+      <w:r>
+        <w:rPr>
+          <w:rFonts w:ascii="Times New Roman" w:hAnsi="Times New Roman" w:cs="Times New Roman"/>
+        </w:rPr>
+      </w:r>
+      <w:proofErr w:type="spellEnd"/>
+      <w:r>
+        <w:rPr>
+          <w:rFonts w:ascii="Times New Roman" w:hAnsi="Times New Roman" w:cs="Times New Roman"/>
+        </w:rPr>
+      </w:r>
+      <w:proofErr w:type="spellStart"/>
+      <w:r>
+        <w:rPr>
+          <w:rFonts w:ascii="Times New Roman" w:hAnsi="Times New Roman" w:cs="Times New Roman"/>
+        </w:rPr>
+      </w:r>
+      <w:proofErr w:type="spellEnd"/>
+      <w:r>
+        <w:rPr>
+          <w:rFonts w:ascii="Times New Roman" w:hAnsi="Times New Roman" w:cs="Times New Roman"/>
+        </w:rPr>
+      </w:r>
+      <w:proofErr w:type="spellStart"/>
+      <w:r>
+        <w:rPr>
+          <w:rFonts w:ascii="Times New Roman" w:hAnsi="Times New Roman" w:cs="Times New Roman"/>
+        </w:rPr>
+      </w:r>
+      <w:proofErr w:type="spellEnd"/>
+      <w:r>
+        <w:rPr>
+          <w:rFonts w:ascii="Times New Roman" w:hAnsi="Times New Roman" w:cs="Times New Roman"/>
+        </w:rPr>
+      </w:r>
+      <w:proofErr w:type="spellStart"/>
+      <w:r>
+        <w:rPr>
+          <w:rFonts w:ascii="Times New Roman" w:hAnsi="Times New Roman" w:cs="Times New Roman"/>
+        </w:rPr>
+      </w:r>
+      <w:proofErr w:type="spellEnd"/>
+      <w:r>
+        <w:rPr>
+          <w:rFonts w:ascii="Times New Roman" w:hAnsi="Times New Roman" w:cs="Times New Roman"/>
+        </w:rPr>
+      </w:r>
+      <w:proofErr w:type="spellStart"/>
+      <w:r>
+        <w:rPr>
+          <w:rFonts w:ascii="Times New Roman" w:hAnsi="Times New Roman" w:cs="Times New Roman"/>
+        </w:rPr>
+      </w:r>
+      <w:proofErr w:type="spellEnd"/>
+      <w:r>
+        <w:rPr>
+          <w:rFonts w:ascii="Times New Roman" w:hAnsi="Times New Roman" w:cs="Times New Roman"/>
+        </w:rPr>
+      </w:r>
+      <w:proofErr w:type="spellStart"/>
+      <w:r>
+        <w:rPr>
+          <w:rFonts w:ascii="Times New Roman" w:hAnsi="Times New Roman" w:cs="Times New Roman"/>
+        </w:rPr>
+      </w:r>
+      <w:proofErr w:type="spellEnd"/>
+      <w:r>
+        <w:rPr>
+          <w:rFonts w:ascii="Times New Roman" w:hAnsi="Times New Roman" w:cs="Times New Roman"/>
+        </w:rPr>
+      </w:r>
+      <w:proofErr w:type="spellStart"/>
+      <w:r>
+        <w:rPr>
+          <w:rFonts w:ascii="Times New Roman" w:hAnsi="Times New Roman" w:cs="Times New Roman"/>
+        </w:rPr>
+      </w:r>
+      <w:proofErr w:type="spellEnd"/>
+      <w:r>
+        <w:rPr>
+          <w:rFonts w:ascii="Times New Roman" w:hAnsi="Times New Roman" w:cs="Times New Roman"/>
+        </w:rPr>
+      </w:r>
+      <w:proofErr w:type="spellStart"/>
+      <w:r>
+        <w:rPr>
+          <w:rFonts w:ascii="Times New Roman" w:hAnsi="Times New Roman" w:cs="Times New Roman"/>
+        </w:rPr>
+      </w:r>
+      <w:proofErr w:type="spellEnd"/>
+      <w:r>
+        <w:rPr>
+          <w:rFonts w:ascii="Times New Roman" w:hAnsi="Times New Roman" w:cs="Times New Roman"/>
+        </w:rPr>
+      </w:r>
+      <w:proofErr w:type="spellStart"/>
+      <w:r>
+        <w:rPr>
+          <w:rFonts w:ascii="Times New Roman" w:hAnsi="Times New Roman" w:cs="Times New Roman"/>
+        </w:rPr>
+      </w:r>
+      <w:proofErr w:type="spellEnd"/>
+      <w:r>
+        <w:rPr>
+          <w:rFonts w:ascii="Times New Roman" w:hAnsi="Times New Roman" w:cs="Times New Roman"/>
+        </w:rPr>
+      </w:r>
+      <w:proofErr w:type="spellStart"/>
+      <w:r>
+        <w:rPr>
+          <w:rFonts w:ascii="Times New Roman" w:hAnsi="Times New Roman" w:cs="Times New Roman"/>
+        </w:rPr>
+      </w:r>
+      <w:proofErr w:type="spellEnd"/>
+      <w:r>
+        <w:rPr>
+          <w:rFonts w:ascii="Times New Roman" w:hAnsi="Times New Roman" w:cs="Times New Roman"/>
+        </w:rPr>
+      </w:r>
+      <w:proofErr w:type="spellStart"/>
+      <w:r>
+        <w:rPr>
+          <w:rFonts w:ascii="Times New Roman" w:hAnsi="Times New Roman" w:cs="Times New Roman"/>
+        </w:rPr>
+      </w:r>
+      <w:proofErr w:type="spellEnd"/>
+      <w:r>
+        <w:rPr>
+          <w:rFonts w:ascii="Times New Roman" w:hAnsi="Times New Roman" w:cs="Times New Roman"/>
+        </w:rPr>
+      </w:r>
+      <w:proofErr w:type="spellStart"/>
+      <w:r>
+        <w:rPr>
+          <w:rFonts w:ascii="Times New Roman" w:hAnsi="Times New Roman" w:cs="Times New Roman"/>
+        </w:rPr>
+      </w:r>
+      <w:proofErr w:type="spellEnd"/>
+      <w:r>
+        <w:rPr>
+          <w:rFonts w:ascii="Times New Roman" w:hAnsi="Times New Roman" w:cs="Times New Roman"/>
+        </w:rPr>
+      </w:r>
+      <w:proofErr w:type="spellStart"/>
+      <w:r>
+        <w:rPr>
+          <w:rFonts w:ascii="Times New Roman" w:hAnsi="Times New Roman" w:cs="Times New Roman"/>
+        </w:rPr>
+      </w:r>
+      <w:proofErr w:type="spellEnd"/>
+      <w:r>
+        <w:rPr>
+          <w:rFonts w:ascii="Times New Roman" w:hAnsi="Times New Roman" w:cs="Times New Roman"/>
+        </w:rPr>
+      </w:r>
+      <w:proofErr w:type="spellStart"/>
+      <w:r>
+        <w:rPr>
+          <w:rFonts w:ascii="Times New Roman" w:hAnsi="Times New Roman" w:cs="Times New Roman"/>
+        </w:rPr>
+      </w:r>
+      <w:proofErr w:type="spellEnd"/>
+      <w:r>
+        <w:rPr>
+          <w:rFonts w:ascii="Times New Roman" w:hAnsi="Times New Roman" w:cs="Times New Roman"/>
+        </w:rPr>
+      </w:r>
+      <w:proofErr w:type="spellStart"/>
+      <w:r>
+        <w:rPr>
+          <w:rFonts w:ascii="Times New Roman" w:hAnsi="Times New Roman" w:cs="Times New Roman"/>
+        </w:rPr>
+      </w:r>
+      <w:proofErr w:type="spellEnd"/>
+      <w:r>
+        <w:rPr>
+          <w:rFonts w:ascii="Times New Roman" w:hAnsi="Times New Roman" w:cs="Times New Roman"/>
+        </w:rPr>
+      </w:r>
+      <w:proofErr w:type="spellStart"/>
+      <w:r>
+        <w:rPr>
+          <w:rFonts w:ascii="Times New Roman" w:hAnsi="Times New Roman" w:cs="Times New Roman"/>
+        </w:rPr>
+      </w:r>
+      <w:proofErr w:type="spellEnd"/>
+      <w:r>
+        <w:rPr>
+          <w:rFonts w:ascii="Times New Roman" w:hAnsi="Times New Roman" w:cs="Times New Roman"/>
+        </w:rPr>
+      </w:r>
+      <w:proofErr w:type="spellStart"/>
+      <w:r>
+        <w:rPr>
+          <w:rFonts w:ascii="Times New Roman" w:hAnsi="Times New Roman" w:cs="Times New Roman"/>
+        </w:rPr>
+      </w:r>
+      <w:proofErr w:type="spellEnd"/>
+      <w:r>
+        <w:rPr>
+          <w:rFonts w:ascii="Times New Roman" w:hAnsi="Times New Roman" w:cs="Times New Roman"/>
+        </w:rPr>
+      </w:r>
+      <w:proofErr w:type="spellStart"/>
+      <w:r>
+        <w:rPr>
+          <w:rFonts w:ascii="Times New Roman" w:hAnsi="Times New Roman" w:cs="Times New Roman"/>
+        </w:rPr>
+      </w:r>
+      <w:proofErr w:type="spellEnd"/>
+      <w:r>
+        <w:rPr>
+          <w:rFonts w:ascii="Times New Roman" w:hAnsi="Times New Roman" w:cs="Times New Roman"/>
+        </w:rPr>
+      </w:r>
+      <w:proofErr w:type="spellStart"/>
+      <w:r>
+        <w:rPr>
+          <w:rFonts w:ascii="Times New Roman" w:hAnsi="Times New Roman" w:cs="Times New Roman"/>
+        </w:rPr>
+      </w:r>
+      <w:proofErr w:type="spellEnd"/>
+      <w:r>
+        <w:rPr>
+          <w:rFonts w:ascii="Times New Roman" w:hAnsi="Times New Roman" w:cs="Times New Roman"/>
+        </w:rPr>
+      </w:r>
+      <w:proofErr w:type="spellStart"/>
+      <w:r>
+        <w:rPr>
+          <w:rFonts w:ascii="Times New Roman" w:hAnsi="Times New Roman" w:cs="Times New Roman"/>
+        </w:rPr>
+      </w:r>
+      <w:proofErr w:type="spellEnd"/>
+      <w:r>
+        <w:rPr>
+          <w:rFonts w:ascii="Times New Roman" w:hAnsi="Times New Roman" w:cs="Times New Roman"/>
+        </w:rPr>
+      </w:r>
+      <w:proofErr w:type="spellStart"/>
+      <w:r>
+        <w:rPr>
+          <w:rFonts w:ascii="Times New Roman" w:hAnsi="Times New Roman" w:cs="Times New Roman"/>
+        </w:rPr>
+      </w:r>
+      <w:proofErr w:type="spellEnd"/>
+      <w:r>
+        <w:rPr>
+          <w:rFonts w:ascii="Times New Roman" w:hAnsi="Times New Roman" w:cs="Times New Roman"/>
+        </w:rPr>
+      </w:r>
+      <w:proofErr w:type="spellStart"/>
+      <w:r>
+        <w:rPr>
+          <w:rFonts w:ascii="Times New Roman" w:hAnsi="Times New Roman" w:cs="Times New Roman"/>
+        </w:rPr>
+      </w:r>
+      <w:proofErr w:type="spellEnd"/>
+      <w:r>
+        <w:rPr>
+          <w:rFonts w:ascii="Times New Roman" w:hAnsi="Times New Roman" w:cs="Times New Roman"/>
+        </w:rPr>
+      </w:r>
+      <w:proofErr w:type="spellStart"/>
+      <w:r>
+        <w:rPr>
+          <w:rFonts w:ascii="Times New Roman" w:hAnsi="Times New Roman" w:cs="Times New Roman"/>
+        </w:rPr>
+      </w:r>
+      <w:proofErr w:type="spellEnd"/>
+      <w:r>
+        <w:rPr>
+          <w:rFonts w:ascii="Times New Roman" w:hAnsi="Times New Roman" w:cs="Times New Roman"/>
+        </w:rPr>
+      </w:r>
+      <w:proofErr w:type="spellStart"/>
+      <w:r>
+        <w:rPr>
+          <w:rFonts w:ascii="Times New Roman" w:hAnsi="Times New Roman" w:cs="Times New Roman"/>
+        </w:rPr>
+      </w:r>
+      <w:proofErr w:type="spellEnd"/>
+      <w:r>
+        <w:rPr>
+          <w:rFonts w:ascii="Times New Roman" w:hAnsi="Times New Roman" w:cs="Times New Roman"/>
+        </w:rPr>
+      </w:r>
+      <w:proofErr w:type="spellStart"/>
+      <w:r>
+        <w:rPr>
+          <w:rFonts w:ascii="Times New Roman" w:hAnsi="Times New Roman" w:cs="Times New Roman"/>
+        </w:rPr>
+      </w:r>
+      <w:proofErr w:type="spellEnd"/>
+      <w:r>
+        <w:rPr>
+          <w:rFonts w:ascii="Times New Roman" w:hAnsi="Times New Roman" w:cs="Times New Roman"/>
+        </w:rPr>
+      </w:r>
+      <w:proofErr w:type="spellStart"/>
+      <w:r>
+        <w:rPr>
+          <w:rFonts w:ascii="Times New Roman" w:hAnsi="Times New Roman" w:cs="Times New Roman"/>
+        </w:rPr>
+      </w:r>
+      <w:proofErr w:type="spellEnd"/>
+      <w:r>
+        <w:rPr>
+          <w:rFonts w:ascii="Times New Roman" w:hAnsi="Times New Roman" w:cs="Times New Roman"/>
+        </w:rPr>
+      </w:r>
+      <w:proofErr w:type="spellStart"/>
+      <w:r>
+        <w:rPr>
+          <w:rFonts w:ascii="Times New Roman" w:hAnsi="Times New Roman" w:cs="Times New Roman"/>
+        </w:rPr>
+      </w:r>
+      <w:proofErr w:type="spellEnd"/>
+      <w:r>
+        <w:rPr>
+          <w:rFonts w:ascii="Times New Roman" w:hAnsi="Times New Roman" w:cs="Times New Roman"/>
+        </w:rPr>
+      </w:r>
+      <w:proofErr w:type="spellStart"/>
+      <w:r>
+        <w:rPr>
+          <w:rFonts w:ascii="Times New Roman" w:hAnsi="Times New Roman" w:cs="Times New Roman"/>
+        </w:rPr>
+      </w:r>
+      <w:proofErr w:type="spellEnd"/>
+      <w:r>
+        <w:rPr>
+          <w:rFonts w:ascii="Times New Roman" w:hAnsi="Times New Roman" w:cs="Times New Roman"/>
+        </w:rPr>
+      </w:r>
+      <w:proofErr w:type="spellStart"/>
+      <w:r>
+        <w:rPr>
+          <w:rFonts w:ascii="Times New Roman" w:hAnsi="Times New Roman" w:cs="Times New Roman"/>
+        </w:rPr>
+      </w:r>
+      <w:proofErr w:type="spellEnd"/>
+      <w:r>
+        <w:rPr>
+          <w:rFonts w:ascii="Times New Roman" w:hAnsi="Times New Roman" w:cs="Times New Roman"/>
+        </w:rPr>
+      </w:r>
+      <w:proofErr w:type="spellStart"/>
+      <w:r>
+        <w:rPr>
+          <w:rFonts w:ascii="Times New Roman" w:hAnsi="Times New Roman" w:cs="Times New Roman"/>
+        </w:rPr>
+      </w:r>
+      <w:proofErr w:type="spellEnd"/>
+      <w:r>
+        <w:rPr>
+          <w:rFonts w:ascii="Times New Roman" w:hAnsi="Times New Roman" w:cs="Times New Roman"/>
+        </w:rPr>
+      </w:r>
+      <w:proofErr w:type="spellStart"/>
+      <w:r>
+        <w:rPr>
+          <w:rFonts w:ascii="Times New Roman" w:hAnsi="Times New Roman" w:cs="Times New Roman"/>
+        </w:rPr>
+      </w:r>
+      <w:proofErr w:type="spellEnd"/>
+      <w:r>
+        <w:rPr>
+          <w:rFonts w:ascii="Times New Roman" w:hAnsi="Times New Roman" w:cs="Times New Roman"/>
+        </w:rPr>
+      </w:r>
+      <w:proofErr w:type="spellStart"/>
+      <w:r>
+        <w:rPr>
+          <w:rFonts w:ascii="Times New Roman" w:hAnsi="Times New Roman" w:cs="Times New Roman"/>
+        </w:rPr>
+      </w:r>
+      <w:proofErr w:type="spellEnd"/>
+      <w:r>
+        <w:rPr>
+          <w:rFonts w:ascii="Times New Roman" w:hAnsi="Times New Roman" w:cs="Times New Roman"/>
+        </w:rPr>
+      </w:r>
+      <w:proofErr w:type="spellStart"/>
+      <w:r>
+        <w:rPr>
+          <w:rFonts w:ascii="Times New Roman" w:hAnsi="Times New Roman" w:cs="Times New Roman"/>
+        </w:rPr>
+      </w:r>
+      <w:proofErr w:type="spellEnd"/>
+      <w:r>
+        <w:rPr>
+          <w:rFonts w:ascii="Times New Roman" w:hAnsi="Times New Roman" w:cs="Times New Roman"/>
+        </w:rPr>
+      </w:r>
+      <w:proofErr w:type="spellStart"/>
+      <w:r>
+        <w:rPr>
+          <w:rFonts w:ascii="Times New Roman" w:hAnsi="Times New Roman" w:cs="Times New Roman"/>
+        </w:rPr>
+      </w:r>
+      <w:proofErr w:type="spellEnd"/>
+      <w:r>
+        <w:rPr>
+          <w:rFonts w:ascii="Times New Roman" w:hAnsi="Times New Roman" w:cs="Times New Roman"/>
+        </w:rPr>
+      </w:r>
+      <w:proofErr w:type="spellStart"/>
+      <w:r>
+        <w:rPr>
+          <w:rFonts w:ascii="Times New Roman" w:hAnsi="Times New Roman" w:cs="Times New Roman"/>
+        </w:rPr>
+      </w:r>
+      <w:proofErr w:type="spellEnd"/>
+      <w:r>
+        <w:rPr>
+          <w:rFonts w:ascii="Times New Roman" w:hAnsi="Times New Roman" w:cs="Times New Roman"/>
+        </w:rPr>
+      </w:r>
+      <w:proofErr w:type="spellStart"/>
+      <w:r>
+        <w:rPr>
+          <w:rFonts w:ascii="Times New Roman" w:hAnsi="Times New Roman" w:cs="Times New Roman"/>
+        </w:rPr>
+      </w:r>
+      <w:proofErr w:type="spellEnd"/>
+      <w:r>
+        <w:rPr>
+          <w:rFonts w:ascii="Times New Roman" w:hAnsi="Times New Roman" w:cs="Times New Roman"/>
+        </w:rPr>
+      </w:r>
+      <w:proofErr w:type="spellStart"/>
+      <w:r>
+        <w:rPr>
+          <w:rFonts w:ascii="Times New Roman" w:hAnsi="Times New Roman" w:cs="Times New Roman"/>
+        </w:rPr>
+      </w:r>
+      <w:proofErr w:type="spellEnd"/>
+      <w:r>
+        <w:rPr>
+          <w:rFonts w:ascii="Times New Roman" w:hAnsi="Times New Roman" w:cs="Times New Roman"/>
+        </w:rPr>
+      </w:r>
+      <w:proofErr w:type="spellStart"/>
+      <w:r>
+        <w:rPr>
+          <w:rFonts w:ascii="Times New Roman" w:hAnsi="Times New Roman" w:cs="Times New Roman"/>
+        </w:rPr>
+      </w:r>
+      <w:proofErr w:type="spellEnd"/>
+      <w:r>
+        <w:rPr>
+          <w:rFonts w:ascii="Times New Roman" w:hAnsi="Times New Roman" w:cs="Times New Roman"/>
+        </w:rPr>
+      </w:r>
+      <w:proofErr w:type="spellStart"/>
+      <w:r>
+        <w:rPr>
+          <w:rFonts w:ascii="Times New Roman" w:hAnsi="Times New Roman" w:cs="Times New Roman"/>
+        </w:rPr>
+      </w:r>
+      <w:proofErr w:type="spellEnd"/>
+      <w:r>
+        <w:rPr>
+          <w:rFonts w:ascii="Times New Roman" w:hAnsi="Times New Roman" w:cs="Times New Roman"/>
+        </w:rPr>
+      </w:r>
+      <w:proofErr w:type="spellStart"/>
+      <w:r>
+        <w:rPr>
+          <w:rFonts w:ascii="Times New Roman" w:hAnsi="Times New Roman" w:cs="Times New Roman"/>
+        </w:rPr>
+      </w:r>
+      <w:proofErr w:type="spellEnd"/>
+      <w:r>
+        <w:rPr>
+          <w:rFonts w:ascii="Times New Roman" w:hAnsi="Times New Roman" w:cs="Times New Roman"/>
+        </w:rPr>
+      </w:r>
+      <w:proofErr w:type="spellStart"/>
+      <w:r>
+        <w:rPr>
+          <w:rFonts w:ascii="Times New Roman" w:hAnsi="Times New Roman" w:cs="Times New Roman"/>
+        </w:rPr>
+      </w:r>
+      <w:proofErr w:type="spellEnd"/>
+      <w:r>
+        <w:rPr>
+          <w:rFonts w:ascii="Times New Roman" w:hAnsi="Times New Roman" w:cs="Times New Roman"/>
+        </w:rPr>
+      </w:r>
+      <w:proofErr w:type="spellStart"/>
+      <w:r>
+        <w:rPr>
+          <w:rFonts w:ascii="Times New Roman" w:hAnsi="Times New Roman" w:cs="Times New Roman"/>
+        </w:rPr>
+      </w:r>
+      <w:proofErr w:type="spellEnd"/>
+      <w:r>
+        <w:rPr>
+          <w:rFonts w:ascii="Times New Roman" w:hAnsi="Times New Roman" w:cs="Times New Roman"/>
+        </w:rPr>
+      </w:r>
+      <w:proofErr w:type="spellStart"/>
+      <w:r>
+        <w:rPr>
+          <w:rFonts w:ascii="Times New Roman" w:hAnsi="Times New Roman" w:cs="Times New Roman"/>
+        </w:rPr>
+      </w:r>
+      <w:proofErr w:type="spellEnd"/>
+      <w:r>
+        <w:rPr>
+          <w:rFonts w:ascii="Times New Roman" w:hAnsi="Times New Roman" w:cs="Times New Roman"/>
+        </w:rPr>
+      </w:r>
+      <w:proofErr w:type="spellStart"/>
+      <w:r>
+        <w:rPr>
+          <w:rFonts w:ascii="Times New Roman" w:hAnsi="Times New Roman" w:cs="Times New Roman"/>
+        </w:rPr>
+      </w:r>
+      <w:proofErr w:type="spellEnd"/>
+      <w:r>
+        <w:rPr>
+          <w:rFonts w:ascii="Times New Roman" w:hAnsi="Times New Roman" w:cs="Times New Roman"/>
+        </w:rPr>
+      </w:r>
+      <w:proofErr w:type="spellStart"/>
+      <w:r>
+        <w:rPr>
+          <w:rFonts w:ascii="Times New Roman" w:hAnsi="Times New Roman" w:cs="Times New Roman"/>
+        </w:rPr>
+      </w:r>
+      <w:proofErr w:type="spellEnd"/>
+      <w:r>
+        <w:rPr>
+          <w:rFonts w:ascii="Times New Roman" w:hAnsi="Times New Roman" w:cs="Times New Roman"/>
+        </w:rPr>
+      </w:r>
+      <w:proofErr w:type="spellStart"/>
+      <w:r>
+        <w:rPr>
+          <w:rFonts w:ascii="Times New Roman" w:hAnsi="Times New Roman" w:cs="Times New Roman"/>
+        </w:rPr>
+      </w:r>
+      <w:proofErr w:type="spellEnd"/>
+      <w:r>
+        <w:rPr>
+          <w:rFonts w:ascii="Times New Roman" w:hAnsi="Times New Roman" w:cs="Times New Roman"/>
+        </w:rPr>
+      </w:r>
+      <w:proofErr w:type="spellStart"/>
+      <w:r>
+        <w:rPr>
+          <w:rFonts w:ascii="Times New Roman" w:hAnsi="Times New Roman" w:cs="Times New Roman"/>
+        </w:rPr>
+      </w:r>
+      <w:proofErr w:type="spellEnd"/>
+      <w:r>
+        <w:rPr>
+          <w:rFonts w:ascii="Times New Roman" w:hAnsi="Times New Roman" w:cs="Times New Roman"/>
+        </w:rPr>
+      </w:r>
+      <w:proofErr w:type="spellStart"/>
+      <w:r>
+        <w:rPr>
+          <w:rFonts w:ascii="Times New Roman" w:hAnsi="Times New Roman" w:cs="Times New Roman"/>
+        </w:rPr>
+      </w:r>
+      <w:proofErr w:type="spellEnd"/>
+      <w:r>
+        <w:rPr>
+          <w:rFonts w:ascii="Times New Roman" w:hAnsi="Times New Roman" w:cs="Times New Roman"/>
+        </w:rPr>
+      </w:r>
+      <w:proofErr w:type="spellStart"/>
+      <w:r>
+        <w:rPr>
+          <w:rFonts w:ascii="Times New Roman" w:hAnsi="Times New Roman" w:cs="Times New Roman"/>
+        </w:rPr>
+      </w:r>
+      <w:proofErr w:type="spellEnd"/>
+      <w:r>
+        <w:rPr>
+          <w:rFonts w:ascii="Times New Roman" w:hAnsi="Times New Roman" w:cs="Times New Roman"/>
+        </w:rPr>
+      </w:r>
+      <w:proofErr w:type="spellStart"/>
+      <w:r>
+        <w:rPr>
+          <w:rFonts w:ascii="Times New Roman" w:hAnsi="Times New Roman" w:cs="Times New Roman"/>
+        </w:rPr>
+      </w:r>
+      <w:proofErr w:type="spellEnd"/>
+      <w:r>
+        <w:rPr>
+          <w:rFonts w:ascii="Times New Roman" w:hAnsi="Times New Roman" w:cs="Times New Roman"/>
+        </w:rPr>
+      </w:r>
+      <w:proofErr w:type="spellStart"/>
+      <w:r>
+        <w:rPr>
+          <w:rFonts w:ascii="Times New Roman" w:hAnsi="Times New Roman" w:cs="Times New Roman"/>
+        </w:rPr>
+      </w:r>
+      <w:proofErr w:type="spellEnd"/>
+      <w:r>
+        <w:rPr>
+          <w:rFonts w:ascii="Times New Roman" w:hAnsi="Times New Roman" w:cs="Times New Roman"/>
+        </w:rPr>
+      </w:r>
+      <w:proofErr w:type="spellStart"/>
+      <w:r>
+        <w:rPr>
+          <w:rFonts w:ascii="Times New Roman" w:hAnsi="Times New Roman" w:cs="Times New Roman"/>
+        </w:rPr>
+      </w:r>
+      <w:proofErr w:type="spellEnd"/>
+      <w:r>
+        <w:rPr>
+          <w:rFonts w:ascii="Times New Roman" w:hAnsi="Times New Roman" w:cs="Times New Roman"/>
+        </w:rPr>
+      </w:r>
+      <w:proofErr w:type="spellStart"/>
+      <w:r>
+        <w:rPr>
+          <w:rFonts w:ascii="Times New Roman" w:hAnsi="Times New Roman" w:cs="Times New Roman"/>
+        </w:rPr>
+      </w:r>
+      <w:proofErr w:type="spellEnd"/>
+      <w:r>
+        <w:rPr>
+          <w:rFonts w:ascii="Times New Roman" w:hAnsi="Times New Roman" w:cs="Times New Roman"/>
+        </w:rPr>
+      </w:r>
+      <w:proofErr w:type="spellStart"/>
+      <w:r>
+        <w:rPr>
+          <w:rFonts w:ascii="Times New Roman" w:hAnsi="Times New Roman" w:cs="Times New Roman"/>
+        </w:rPr>
+      </w:r>
+      <w:proofErr w:type="spellEnd"/>
+      <w:r>
+        <w:rPr>
+          <w:rFonts w:ascii="Times New Roman" w:hAnsi="Times New Roman" w:cs="Times New Roman"/>
+        </w:rPr>
+      </w:r>
+      <w:proofErr w:type="spellStart"/>
+      <w:r>
+        <w:rPr>
+          <w:rFonts w:ascii="Times New Roman" w:hAnsi="Times New Roman" w:cs="Times New Roman"/>
+        </w:rPr>
+      </w:r>
+      <w:proofErr w:type="spellEnd"/>
+      <w:r>
+        <w:rPr>
+          <w:rFonts w:ascii="Times New Roman" w:hAnsi="Times New Roman" w:cs="Times New Roman"/>
+        </w:rPr>
       </w:r>
     </w:p>
     <w:p>
       <w:pPr>
         <w:pStyle w:val="Heading3"/>
-        <w:spacing w:after="0" w:line="360" w:lineRule="auto"/>
+        <w:spacing w:line="360" w:lineRule="auto"/>
+        <w:ind w:left="851"/>
         <w:jc w:val="both"/>
         <w:rPr>
           <w:rFonts w:ascii="Times New Roman" w:hAnsi="Times New Roman" w:cs="Times New Roman"/>
-          <w:b/>
-          <w:bCs/>
-        </w:rPr>
-      </w:pPr>
-      <w:r>
-        <w:rPr>
-          <w:rFonts w:ascii="Times New Roman" w:hAnsi="Times New Roman" w:cs="Times New Roman"/>
-          <w:b/>
-          <w:bCs/>
+        </w:rPr>
+      </w:pPr>
+      <w:r>
+        <w:rPr>
+          <w:rFonts w:ascii="Times New Roman" w:hAnsi="Times New Roman" w:cs="Times New Roman"/>
+          <w:b/>
           <w:color w:val="000000"/>
           <w:sz w:val="24"/>
         </w:rPr>
-        <w:t>1.5.3 Pengembangan lebih lanjut</w:t>
-      </w:r>
-      <w:proofErr w:type="spellStart"/>
-      <w:r>
+        <w:t>1.5.3  Pengembangan lebih lanjut</w:t>
+      </w:r>
+    </w:p>
+    <w:p>
+      <w:pPr>
+        <w:spacing w:after="0" w:line="360" w:lineRule="auto"/>
+        <w:ind w:firstLine="360"/>
+        <w:jc w:val="both"/>
         <w:rPr>
           <w:rFonts w:ascii="Times New Roman" w:hAnsi="Times New Roman" w:cs="Times New Roman"/>
           <w:b/>
           <w:bCs/>
-          <w:color w:val="000000"/>
-          <w:sz w:val="24"/>
-        </w:rPr>
-      </w:r>
-      <w:proofErr w:type="spellEnd"/>
-      <w:r>
-        <w:rPr>
-          <w:rFonts w:ascii="Times New Roman" w:hAnsi="Times New Roman" w:cs="Times New Roman"/>
-          <w:b/>
+        </w:rPr>
+      </w:pPr>
+      <w:r>
+        <w:rPr>
+          <w:rFonts w:ascii="Times New Roman" w:hAnsi="Times New Roman" w:cs="Times New Roman"/>
+          <w:b w:val="0"/>
           <w:bCs/>
-          <w:color w:val="000000"/>
-          <w:sz w:val="24"/>
-        </w:rPr>
-      </w:r>
-      <w:proofErr w:type="spellStart"/>
-      <w:r>
-        <w:rPr>
-          <w:rFonts w:ascii="Times New Roman" w:hAnsi="Times New Roman" w:cs="Times New Roman"/>
-          <w:b/>
+        </w:rPr>
+        <w:t>Dapat diarahkan pada penyederhanaan instalasi, peningkatan keandalan perangkat keras, pengembangan antarmuka pengguna, serta pengujian pada lebih banyak konfigurasi akuaponik. Dengan tahapan tersebut, prototipe dapat menjadi dasar pengembangan produk teknologi monitoring cerdas untuk kebutuhan pendidikan, penelitian, komunitas, maupun pelaku budidaya skala kecil dan menengah. Namun, penerapan secara komersial tetap memerlukan validasi tambahan untuk memastikan keandalan, konsistensi kinerja, kemudahan pemeliharaan, dan kesesuaian sistem terhadap kondisi operasional yang berbeda.</w:t>
+      </w:r>
+      <w:proofErr w:type="spellStart"/>
+      <w:r>
+        <w:rPr>
+          <w:rFonts w:ascii="Times New Roman" w:hAnsi="Times New Roman" w:cs="Times New Roman"/>
+          <w:b w:val="0"/>
           <w:bCs/>
-          <w:color w:val="000000"/>
-          <w:sz w:val="24"/>
-        </w:rPr>
-      </w:r>
-      <w:proofErr w:type="spellEnd"/>
-      <w:r>
-        <w:rPr>
-          <w:rFonts w:ascii="Times New Roman" w:hAnsi="Times New Roman" w:cs="Times New Roman"/>
-          <w:b/>
+        </w:rPr>
+      </w:r>
+      <w:proofErr w:type="spellEnd"/>
+      <w:r>
+        <w:rPr>
+          <w:rFonts w:ascii="Times New Roman" w:hAnsi="Times New Roman" w:cs="Times New Roman"/>
+          <w:b w:val="0"/>
           <w:bCs/>
-          <w:color w:val="000000"/>
-          <w:sz w:val="24"/>
-        </w:rPr>
-      </w:r>
-      <w:r>
-        <w:rPr>
-          <w:rFonts w:ascii="Times New Roman" w:hAnsi="Times New Roman" w:cs="Times New Roman"/>
-          <w:b/>
+        </w:rPr>
+      </w:r>
+      <w:proofErr w:type="spellStart"/>
+      <w:r>
+        <w:rPr>
+          <w:rFonts w:ascii="Times New Roman" w:hAnsi="Times New Roman" w:cs="Times New Roman"/>
+          <w:b w:val="0"/>
           <w:bCs/>
-          <w:color w:val="000000"/>
-          <w:sz w:val="24"/>
+        </w:rPr>
+      </w:r>
+      <w:proofErr w:type="spellEnd"/>
+      <w:r>
+        <w:rPr>
+          <w:rFonts w:ascii="Times New Roman" w:hAnsi="Times New Roman" w:cs="Times New Roman"/>
+          <w:b w:val="0"/>
+          <w:bCs/>
+        </w:rPr>
+      </w:r>
+      <w:r>
+        <w:rPr>
+          <w:rFonts w:ascii="Times New Roman" w:hAnsi="Times New Roman" w:cs="Times New Roman"/>
+          <w:b w:val="0"/>
+          <w:bCs/>
         </w:rPr>
       </w:r>
     </w:p>
@@ -16946,19 +18044,13 @@
     <w:p>
       <w:pPr>
         <w:pStyle w:val="ListParagraph"/>
-        <w:spacing w:line="360" w:lineRule="auto"/>
+        <w:spacing w:line="276" w:lineRule="auto"/>
         <w:ind w:left="851" w:firstLine="360"/>
         <w:jc w:val="both"/>
         <w:rPr>
           <w:rFonts w:ascii="Times New Roman" w:hAnsi="Times New Roman" w:cs="Times New Roman"/>
         </w:rPr>
       </w:pPr>
-      <w:r>
-        <w:rPr>
-          <w:rFonts w:ascii="Times New Roman" w:hAnsi="Times New Roman" w:cs="Times New Roman"/>
-        </w:rPr>
-        <w:t>Dapat diarahkan pada penyederhanaan instalasi, peningkatan keandalan perangkat keras, pengembangan antarmuka pengguna, serta pengujian pada lebih banyak konfigurasi akuaponik. Dengan tahapan tersebut, prototipe dapat menjadi dasar pengembangan produk teknologi monitoring cerdas untuk kebutuhan pendidikan, penelitian, komunitas, maupun pelaku budidaya skala kecil dan menengah. Namun, penerapan secara komersial tetap memerlukan validasi tambahan untuk memastikan keandalan, konsistensi kinerja, kemudahan pemeliharaan, dan kesesuaian sistem terhadap kondisi operasional yang berbeda.</w:t>
-      </w:r>
     </w:p>
     <w:p>
       <w:pPr>
@@ -17728,13 +18820,13 @@
           <w:rFonts w:ascii="Times New Roman" w:hAnsi="Times New Roman" w:cs="Times New Roman"/>
           <w:i/>
         </w:rPr>
-        <w:t xml:space="preserve">LiDAR</w:t>
-      </w:r>
-      <w:r>
-        <w:rPr>
-          <w:rFonts w:ascii="Times New Roman" w:hAnsi="Times New Roman" w:cs="Times New Roman"/>
-        </w:rPr>
-        <w:t xml:space="preserve">, serta Athanasiadis dkk. [23] meramalkan pertumbuhan tanaman dengan </w:t>
+        <w:t xml:space="preserve">Light Detection and Ranging</w:t>
+      </w:r>
+      <w:r>
+        <w:rPr>
+          <w:rFonts w:ascii="Times New Roman" w:hAnsi="Times New Roman" w:cs="Times New Roman"/>
+        </w:rPr>
+        <w:t xml:space="preserve"> (LiDAR), serta Athanasiadis dkk. [23] meramalkan pertumbuhan tanaman dengan </w:t>
       </w:r>
       <w:r>
         <w:rPr>
@@ -23503,7 +24595,7 @@
         <w:rPr>
           <w:rFonts w:ascii="Times New Roman" w:hAnsi="Times New Roman" w:cs="Times New Roman"/>
         </w:rPr>
-        <w:t xml:space="preserve"> skema v1.1 dengan payload 2-3 KB tiap 10 menit. Tahap dasbor menampilkan heatmap 4×6, grafik 24 jam, distribusi status, dan kartu PSI secara baca saja. Tahap kendali membaca PSI, PSI maksimum, dan jumlah zona sakit menjadi keputusan pompa dengan persetujuan manusia. Perancangan sensor, komputer papan tunggal, dan aktuator dalam satu skema terkendali sejalan dengan tren otomasi greenhouse yang dirangkum Shamshiri dkk. [25]. Blok diagram pada Gambar 3.1 meringkas aliran tersebut. Kode sumber pipeline, skema Firebase, dan dasbor tersedia pada Lampiran 1.</w:t>
+        <w:t xml:space="preserve"> skema v1.1 dengan payload 2-3 KB tiap 10 menit. Tahap dasbor menampilkan heatmap 4×6, grafik 24 jam, distribusi status, dan kartu PSI secara baca saja. Tahap kendali membaca PSI, PSI maksimum, dan jumlah zona sakit menjadi keputusan pompa dengan persetujuan manusia. Perancangan sensor, komputer papan tunggal, dan aktuator dalam satu skema terkendali sejalan dengan tren otomasi greenhouse yang dirangkum Shamshiri dkk. [25]. Blok diagram pada Gambar 3.1 meringkas aliran tersebut. Kode sumber pipeline, skema Firebase, dan dasbor tersedia pada Lampiran 1, biodata penulis pada Lampiran 2, serta sketsa rumah kamera pada Lampiran 3.</w:t>
       </w:r>
     </w:p>
     <w:p>
@@ -24073,7 +25165,7 @@
         </w:rPr>
         <w:drawing>
           <wp:inline xmlns:a="http://schemas.openxmlformats.org/drawingml/2006/main" xmlns:pic="http://schemas.openxmlformats.org/drawingml/2006/picture">
-            <wp:extent cx="2926080" cy="3762103"/>
+            <wp:extent cx="2926080" cy="3625501"/>
             <wp:docPr id="1969659842" name="Picture 1969659842"/>
             <wp:cNvGraphicFramePr>
               <a:graphicFrameLocks noChangeAspect="1"/>
@@ -24094,7 +25186,7 @@
                   <pic:spPr>
                     <a:xfrm>
                       <a:off x="0" y="0"/>
-                      <a:ext cx="2926080" cy="3762103"/>
+                      <a:ext cx="2926080" cy="3625501"/>
                     </a:xfrm>
                     <a:prstGeom prst="rect"/>
                   </pic:spPr>
@@ -26180,13 +27272,13 @@
           <w:rFonts w:ascii="Times New Roman" w:hAnsi="Times New Roman" w:cs="Times New Roman"/>
           <w:i/>
         </w:rPr>
-        <w:t xml:space="preserve">ExG</w:t>
-      </w:r>
-      <w:r>
-        <w:rPr>
-          <w:rFonts w:ascii="Times New Roman" w:hAnsi="Times New Roman" w:cs="Times New Roman"/>
-        </w:rPr>
-        <w:t xml:space="preserve"> dan ambang Otsu-Hue mengikuti prosedur Netto dkk. [26] sehingga keunggulan metode dapat diuji pada data lapangan yang sama. Metrik sistem terdiri atas keberhasilan siklus burn-in, suhu System on Chip (SoC) dalam °C, dan keterbacaan snapshot. Skenario pada Tabel 3.3 menguji tiap rumusan masalah secara kuantitatif dan divisualkan dengan plot pengujian agar pembaca tidak menelusuri angka mentah satu per satu.</w:t>
+        <w:t xml:space="preserve">Excess Green</w:t>
+      </w:r>
+      <w:r>
+        <w:rPr>
+          <w:rFonts w:ascii="Times New Roman" w:hAnsi="Times New Roman" w:cs="Times New Roman"/>
+        </w:rPr>
+        <w:t xml:space="preserve"> (ExG) dan ambang Otsu-Hue mengikuti prosedur Netto dkk. [26] sehingga keunggulan metode dapat diuji pada data lapangan yang sama. Metrik sistem terdiri atas keberhasilan siklus burn-in, suhu System on Chip (SoC) dalam °C, dan keterbacaan snapshot. Skenario pada Tabel 3.3 menguji tiap rumusan masalah secara kuantitatif dan divisualkan dengan plot pengujian agar pembaca tidak menelusuri angka mentah satu per satu.</w:t>
       </w:r>
     </w:p>
     <w:p>

</xml_diff>